<commit_message>
replaced dummy data of Tournament's StatsGroups with new endpoint; updated documentaiton to include new endpoint
</commit_message>
<xml_diff>
--- a/docs/QView API Documentation.docx
+++ b/docs/QView API Documentation.docx
@@ -14,11 +14,19 @@
       </w:r>
       <w:r>
         <w:rPr/>
-        <w:t>8</w:t>
-      </w:r>
-      <w:r>
-        <w:rPr/>
-        <w:t>_2026.06.23)</w:t>
+        <w:t>9</w:t>
+      </w:r>
+      <w:r>
+        <w:rPr/>
+        <w:t>_2026.0</w:t>
+      </w:r>
+      <w:r>
+        <w:rPr/>
+        <w:t>8.13</w:t>
+      </w:r>
+      <w:r>
+        <w:rPr/>
+        <w:t>)</w:t>
       </w:r>
     </w:p>
     <w:p>
@@ -16439,11 +16447,7 @@
       </w:pPr>
       <w:r>
         <w:rPr/>
-        <w:t>endpoint: {base_uri}/api/rooms/{id}/games-detailed?page={page_num}&amp;page_size={num_of_rows}</w:t>
-      </w:r>
-      <w:r>
-        <w:rPr/>
-        <w:t>&amp;pairing_code={pairing_code}</w:t>
+        <w:t>endpoint: {base_uri}/api/rooms/{id}/games-detailed?page={page_num}&amp;page_size={num_of_rows}&amp;pairing_code={pairing_code}</w:t>
       </w:r>
     </w:p>
     <w:p>
@@ -16670,23 +16674,7 @@
       </w:pPr>
       <w:r>
         <w:rPr/>
-        <w:t>pa</w:t>
-      </w:r>
-      <w:r>
-        <w:rPr/>
-        <w:t>iring_code</w:t>
-      </w:r>
-      <w:r>
-        <w:rPr/>
-        <w:t>={</w:t>
-      </w:r>
-      <w:r>
-        <w:rPr/>
-        <w:t>pairing_code</w:t>
-      </w:r>
-      <w:r>
-        <w:rPr/>
-        <w:t>}</w:t>
+        <w:t>pairing_code={pairing_code}</w:t>
       </w:r>
     </w:p>
     <w:p>
@@ -38786,7 +38774,323 @@
       </w:pPr>
       <w:r>
         <w:rPr/>
+        <w:t>returns:</w:t>
+      </w:r>
+    </w:p>
+    <w:p>
+      <w:pPr>
+        <w:pStyle w:val="normal1"/>
+        <w:numPr>
+          <w:ilvl w:val="0"/>
+          <w:numId w:val="1"/>
+        </w:numPr>
+        <w:ind w:hanging="360" w:left="720"/>
+        <w:rPr/>
+      </w:pPr>
+      <w:r>
+        <w:rPr/>
+        <w:t xml:space="preserve">GET StatsGroups of </w:t>
+      </w:r>
+      <w:r>
+        <w:rPr/>
+        <w:t>Tournament</w:t>
+      </w:r>
+    </w:p>
+    <w:p>
+      <w:pPr>
+        <w:pStyle w:val="normal1"/>
+        <w:numPr>
+          <w:ilvl w:val="1"/>
+          <w:numId w:val="1"/>
+        </w:numPr>
+        <w:ind w:hanging="360" w:left="1440"/>
+        <w:rPr/>
+      </w:pPr>
+      <w:r>
+        <w:rPr/>
+        <w:t xml:space="preserve">built_including_tests: </w:t>
+      </w:r>
+      <w:r>
+        <w:rPr>
+          <w:b/>
+          <w:bCs/>
+        </w:rPr>
+        <w:t>true</w:t>
+      </w:r>
+    </w:p>
+    <w:p>
+      <w:pPr>
+        <w:pStyle w:val="normal1"/>
+        <w:numPr>
+          <w:ilvl w:val="1"/>
+          <w:numId w:val="1"/>
+        </w:numPr>
+        <w:ind w:hanging="360" w:left="1440"/>
+        <w:rPr/>
+      </w:pPr>
+      <w:r>
+        <w:rPr/>
+        <w:t>HTTP method: ‘GET’</w:t>
+      </w:r>
+    </w:p>
+    <w:p>
+      <w:pPr>
+        <w:pStyle w:val="normal1"/>
+        <w:numPr>
+          <w:ilvl w:val="1"/>
+          <w:numId w:val="1"/>
+        </w:numPr>
+        <w:ind w:hanging="360" w:left="1440"/>
+        <w:rPr/>
+      </w:pPr>
+      <w:r>
+        <w:rPr/>
+        <w:t>endpoint: {base_uri}/api/</w:t>
+      </w:r>
+      <w:r>
+        <w:rPr/>
+        <w:t>tournaments</w:t>
+      </w:r>
+      <w:r>
+        <w:rPr/>
+        <w:t>/{id}/statsgroups?page={page_num}&amp;page_size={num_of_rows}</w:t>
+      </w:r>
+    </w:p>
+    <w:p>
+      <w:pPr>
+        <w:pStyle w:val="normal1"/>
+        <w:numPr>
+          <w:ilvl w:val="1"/>
+          <w:numId w:val="1"/>
+        </w:numPr>
+        <w:ind w:hanging="360" w:left="1440"/>
+        <w:rPr/>
+      </w:pPr>
+      <w:r>
+        <w:rPr/>
+        <w:t xml:space="preserve">description: </w:t>
+      </w:r>
+    </w:p>
+    <w:p>
+      <w:pPr>
+        <w:pStyle w:val="normal1"/>
+        <w:numPr>
+          <w:ilvl w:val="1"/>
+          <w:numId w:val="1"/>
+        </w:numPr>
+        <w:ind w:hanging="360" w:left="1440"/>
+        <w:rPr/>
+      </w:pPr>
+      <w:r>
+        <w:rPr/>
+        <w:t>parameters:</w:t>
+      </w:r>
+    </w:p>
+    <w:p>
+      <w:pPr>
+        <w:pStyle w:val="normal1"/>
+        <w:numPr>
+          <w:ilvl w:val="2"/>
+          <w:numId w:val="1"/>
+        </w:numPr>
+        <w:ind w:hanging="360" w:left="2160"/>
+        <w:rPr/>
+      </w:pPr>
+      <w:r>
+        <w:rPr/>
+        <w:t>id</w:t>
+      </w:r>
+    </w:p>
+    <w:p>
+      <w:pPr>
+        <w:pStyle w:val="normal1"/>
+        <w:numPr>
+          <w:ilvl w:val="3"/>
+          <w:numId w:val="1"/>
+        </w:numPr>
+        <w:ind w:hanging="360" w:left="2880"/>
+        <w:rPr>
+          <w:color w:val="FF0000"/>
+        </w:rPr>
+      </w:pPr>
+      <w:r>
+        <w:rPr>
+          <w:color w:val="FF0000"/>
+        </w:rPr>
+        <w:t>Required</w:t>
+      </w:r>
+    </w:p>
+    <w:p>
+      <w:pPr>
+        <w:pStyle w:val="normal1"/>
+        <w:numPr>
+          <w:ilvl w:val="3"/>
+          <w:numId w:val="1"/>
+        </w:numPr>
+        <w:ind w:hanging="360" w:left="2880"/>
+        <w:rPr/>
+      </w:pPr>
+      <w:r>
+        <w:rPr/>
+        <w:t xml:space="preserve">ID of the </w:t>
+      </w:r>
+      <w:r>
+        <w:rPr/>
+        <w:t>Tournament</w:t>
+      </w:r>
+    </w:p>
+    <w:p>
+      <w:pPr>
+        <w:pStyle w:val="normal1"/>
+        <w:numPr>
+          <w:ilvl w:val="2"/>
+          <w:numId w:val="1"/>
+        </w:numPr>
+        <w:ind w:hanging="360" w:left="2160"/>
+        <w:rPr/>
+      </w:pPr>
+      <w:r>
+        <w:rPr/>
+        <w:t>page={page_num}</w:t>
+      </w:r>
+    </w:p>
+    <w:p>
+      <w:pPr>
+        <w:pStyle w:val="normal1"/>
+        <w:numPr>
+          <w:ilvl w:val="3"/>
+          <w:numId w:val="1"/>
+        </w:numPr>
+        <w:ind w:hanging="360" w:left="2880"/>
+        <w:rPr>
+          <w:color w:val="FF0000"/>
+        </w:rPr>
+      </w:pPr>
+      <w:r>
+        <w:rPr>
+          <w:color w:val="FF0000"/>
+        </w:rPr>
+        <w:t>Required</w:t>
+      </w:r>
+    </w:p>
+    <w:p>
+      <w:pPr>
+        <w:pStyle w:val="normal1"/>
+        <w:numPr>
+          <w:ilvl w:val="3"/>
+          <w:numId w:val="1"/>
+        </w:numPr>
+        <w:ind w:hanging="360" w:left="2880"/>
+        <w:rPr/>
+      </w:pPr>
+      <w:r>
+        <w:rPr/>
+        <w:t>Defines which page to return</w:t>
+      </w:r>
+    </w:p>
+    <w:p>
+      <w:pPr>
+        <w:pStyle w:val="normal1"/>
+        <w:numPr>
+          <w:ilvl w:val="3"/>
+          <w:numId w:val="1"/>
+        </w:numPr>
+        <w:ind w:hanging="360" w:left="2880"/>
+        <w:rPr/>
+      </w:pPr>
+      <w:r>
+        <w:rPr/>
+        <w:t>First page = 0 (zero)</w:t>
+      </w:r>
+    </w:p>
+    <w:p>
+      <w:pPr>
+        <w:pStyle w:val="normal1"/>
+        <w:numPr>
+          <w:ilvl w:val="2"/>
+          <w:numId w:val="1"/>
+        </w:numPr>
+        <w:ind w:hanging="360" w:left="2160"/>
+        <w:rPr/>
+      </w:pPr>
+      <w:r>
+        <w:rPr/>
+        <w:t>page_size={num_of_rows}</w:t>
+      </w:r>
+    </w:p>
+    <w:p>
+      <w:pPr>
+        <w:pStyle w:val="normal1"/>
+        <w:numPr>
+          <w:ilvl w:val="3"/>
+          <w:numId w:val="1"/>
+        </w:numPr>
+        <w:ind w:hanging="360" w:left="2880"/>
+        <w:rPr>
+          <w:color w:val="FF0000"/>
+        </w:rPr>
+      </w:pPr>
+      <w:r>
+        <w:rPr>
+          <w:color w:val="FF0000"/>
+        </w:rPr>
+        <w:t>Required</w:t>
+      </w:r>
+    </w:p>
+    <w:p>
+      <w:pPr>
+        <w:pStyle w:val="normal1"/>
+        <w:numPr>
+          <w:ilvl w:val="3"/>
+          <w:numId w:val="1"/>
+        </w:numPr>
+        <w:ind w:hanging="360" w:left="2880"/>
+        <w:rPr/>
+      </w:pPr>
+      <w:r>
+        <w:rPr/>
+        <w:t>Defines how many rows to return for the selected page</w:t>
+      </w:r>
+    </w:p>
+    <w:p>
+      <w:pPr>
+        <w:pStyle w:val="normal1"/>
+        <w:numPr>
+          <w:ilvl w:val="1"/>
+          <w:numId w:val="1"/>
+        </w:numPr>
+        <w:ind w:hanging="360" w:left="1440"/>
+        <w:rPr/>
+      </w:pPr>
+      <w:r>
+        <w:rPr/>
         <w:t xml:space="preserve">returns: </w:t>
+      </w:r>
+    </w:p>
+    <w:p>
+      <w:pPr>
+        <w:pStyle w:val="normal1"/>
+        <w:numPr>
+          <w:ilvl w:val="1"/>
+          <w:numId w:val="1"/>
+        </w:numPr>
+        <w:ind w:hanging="360" w:left="1440"/>
+        <w:rPr>
+          <w:b/>
+          <w:bCs/>
+        </w:rPr>
+      </w:pPr>
+      <w:r>
+        <w:rPr>
+          <w:b w:val="false"/>
+          <w:bCs w:val="false"/>
+          <w:color w:val="000000"/>
+        </w:rPr>
+        <w:t>an array of StatsGroups</w:t>
+      </w:r>
+      <w:r>
+        <w:rPr/>
+        <w:t xml:space="preserve"> </w:t>
       </w:r>
     </w:p>
     <w:p>
@@ -49305,8 +49609,8 @@
       <w:u w:val="single"/>
     </w:rPr>
   </w:style>
-  <w:style w:type="character" w:styleId="Bulletsuser">
-    <w:name w:val="Bullets (user)"/>
+  <w:style w:type="character" w:styleId="Bullets">
+    <w:name w:val="Bullets"/>
     <w:qFormat/>
     <w:rPr>
       <w:rFonts w:ascii="OpenSymbol" w:hAnsi="OpenSymbol" w:eastAsia="OpenSymbol" w:cs="OpenSymbol"/>

</xml_diff>

<commit_message>
Replaced dummy data for Team Stats in Tournament's StatsGroup 'Team Stats' UI data table; fixed a validation check for the 'QT' event in the GameEventCalculator; added an integraiton test fo rthe new endpoint; new API endpoint is documented
</commit_message>
<xml_diff>
--- a/docs/QView API Documentation.docx
+++ b/docs/QView API Documentation.docx
@@ -10,23 +10,15 @@
       </w:pPr>
       <w:r>
         <w:rPr/>
-        <w:t>QView API Documentation (v15</w:t>
-      </w:r>
-      <w:r>
-        <w:rPr/>
-        <w:t>9</w:t>
-      </w:r>
-      <w:r>
-        <w:rPr/>
-        <w:t>_2026.0</w:t>
-      </w:r>
-      <w:r>
-        <w:rPr/>
-        <w:t>8.13</w:t>
-      </w:r>
-      <w:r>
-        <w:rPr/>
-        <w:t>)</w:t>
+        <w:t>QView API Documentation (v1</w:t>
+      </w:r>
+      <w:r>
+        <w:rPr/>
+        <w:t>60</w:t>
+      </w:r>
+      <w:r>
+        <w:rPr/>
+        <w:t>_2026.08.13)</w:t>
       </w:r>
     </w:p>
     <w:p>
@@ -38789,11 +38781,7 @@
       </w:pPr>
       <w:r>
         <w:rPr/>
-        <w:t xml:space="preserve">GET StatsGroups of </w:t>
-      </w:r>
-      <w:r>
-        <w:rPr/>
-        <w:t>Tournament</w:t>
+        <w:t>GET StatsGroups of Tournament</w:t>
       </w:r>
     </w:p>
     <w:p>
@@ -38845,15 +38833,7 @@
       </w:pPr>
       <w:r>
         <w:rPr/>
-        <w:t>endpoint: {base_uri}/api/</w:t>
-      </w:r>
-      <w:r>
-        <w:rPr/>
-        <w:t>tournaments</w:t>
-      </w:r>
-      <w:r>
-        <w:rPr/>
-        <w:t>/{id}/statsgroups?page={page_num}&amp;page_size={num_of_rows}</w:t>
+        <w:t>endpoint: {base_uri}/api/tournaments/{id}/statsgroups?page={page_num}&amp;page_size={num_of_rows}</w:t>
       </w:r>
     </w:p>
     <w:p>
@@ -38932,11 +38912,7 @@
       </w:pPr>
       <w:r>
         <w:rPr/>
-        <w:t xml:space="preserve">ID of the </w:t>
-      </w:r>
-      <w:r>
-        <w:rPr/>
-        <w:t>Tournament</w:t>
+        <w:t>ID of the Tournament</w:t>
       </w:r>
     </w:p>
     <w:p>
@@ -42712,7 +42688,392 @@
         <w:spacing w:lineRule="auto" w:line="276" w:before="0" w:after="0"/>
         <w:ind w:hanging="360" w:left="360" w:right="0"/>
         <w:jc w:val="left"/>
-        <w:rPr/>
+        <w:rPr>
+          <w:b/>
+          <w:bCs/>
+          <w:color w:val="000000"/>
+        </w:rPr>
+      </w:pPr>
+      <w:r>
+        <w:rPr>
+          <w:b/>
+          <w:bCs/>
+          <w:color w:val="000000"/>
+        </w:rPr>
+        <w:t>TeamsStats</w:t>
+      </w:r>
+    </w:p>
+    <w:p>
+      <w:pPr>
+        <w:pStyle w:val="normal1"/>
+        <w:numPr>
+          <w:ilvl w:val="0"/>
+          <w:numId w:val="1"/>
+        </w:numPr>
+        <w:ind w:hanging="360" w:left="720"/>
+        <w:rPr/>
+      </w:pPr>
+      <w:r>
+        <w:rPr/>
+        <w:t>GET Team</w:t>
+      </w:r>
+      <w:r>
+        <w:rPr/>
+        <w:t>Stat</w:t>
+      </w:r>
+      <w:r>
+        <w:rPr/>
+        <w:t xml:space="preserve">s of </w:t>
+      </w:r>
+      <w:r>
+        <w:rPr/>
+        <w:t>StatsGroup</w:t>
+      </w:r>
+    </w:p>
+    <w:p>
+      <w:pPr>
+        <w:pStyle w:val="normal1"/>
+        <w:numPr>
+          <w:ilvl w:val="1"/>
+          <w:numId w:val="1"/>
+        </w:numPr>
+        <w:ind w:hanging="360" w:left="1440"/>
+        <w:rPr/>
+      </w:pPr>
+      <w:r>
+        <w:rPr/>
+        <w:t xml:space="preserve">built_including_tests: </w:t>
+      </w:r>
+      <w:r>
+        <w:rPr>
+          <w:b/>
+          <w:bCs/>
+        </w:rPr>
+        <w:t>true</w:t>
+      </w:r>
+    </w:p>
+    <w:p>
+      <w:pPr>
+        <w:pStyle w:val="normal1"/>
+        <w:numPr>
+          <w:ilvl w:val="1"/>
+          <w:numId w:val="1"/>
+        </w:numPr>
+        <w:ind w:hanging="360" w:left="1440"/>
+        <w:rPr/>
+      </w:pPr>
+      <w:r>
+        <w:rPr/>
+        <w:t>HTTP method: ‘GET’</w:t>
+      </w:r>
+    </w:p>
+    <w:p>
+      <w:pPr>
+        <w:pStyle w:val="normal1"/>
+        <w:numPr>
+          <w:ilvl w:val="1"/>
+          <w:numId w:val="1"/>
+        </w:numPr>
+        <w:ind w:hanging="360" w:left="1440"/>
+        <w:rPr/>
+      </w:pPr>
+      <w:r>
+        <w:rPr/>
+        <w:t>endpoint: {base_uri}/api/</w:t>
+      </w:r>
+      <w:r>
+        <w:rPr/>
+        <w:t>statsgroups</w:t>
+      </w:r>
+      <w:r>
+        <w:rPr/>
+        <w:t>/{id}/team</w:t>
+      </w:r>
+      <w:r>
+        <w:rPr/>
+        <w:t>stat</w:t>
+      </w:r>
+      <w:r>
+        <w:rPr/>
+        <w:t>s?page={page_num}&amp;page_size={num_of_rows}</w:t>
+      </w:r>
+    </w:p>
+    <w:p>
+      <w:pPr>
+        <w:pStyle w:val="normal1"/>
+        <w:numPr>
+          <w:ilvl w:val="1"/>
+          <w:numId w:val="1"/>
+        </w:numPr>
+        <w:ind w:hanging="360" w:left="1440"/>
+        <w:rPr/>
+      </w:pPr>
+      <w:r>
+        <w:rPr/>
+        <w:t xml:space="preserve">description: </w:t>
+      </w:r>
+    </w:p>
+    <w:p>
+      <w:pPr>
+        <w:pStyle w:val="normal1"/>
+        <w:numPr>
+          <w:ilvl w:val="1"/>
+          <w:numId w:val="1"/>
+        </w:numPr>
+        <w:ind w:hanging="360" w:left="1440"/>
+        <w:rPr/>
+      </w:pPr>
+      <w:r>
+        <w:rPr/>
+        <w:t>parameters:</w:t>
+      </w:r>
+    </w:p>
+    <w:p>
+      <w:pPr>
+        <w:pStyle w:val="normal1"/>
+        <w:numPr>
+          <w:ilvl w:val="2"/>
+          <w:numId w:val="1"/>
+        </w:numPr>
+        <w:ind w:hanging="360" w:left="2160"/>
+        <w:rPr/>
+      </w:pPr>
+      <w:r>
+        <w:rPr/>
+        <w:t>id</w:t>
+      </w:r>
+    </w:p>
+    <w:p>
+      <w:pPr>
+        <w:pStyle w:val="normal1"/>
+        <w:numPr>
+          <w:ilvl w:val="3"/>
+          <w:numId w:val="1"/>
+        </w:numPr>
+        <w:ind w:hanging="360" w:left="2880"/>
+        <w:rPr>
+          <w:color w:val="FF0000"/>
+        </w:rPr>
+      </w:pPr>
+      <w:r>
+        <w:rPr>
+          <w:color w:val="FF0000"/>
+        </w:rPr>
+        <w:t>Required</w:t>
+      </w:r>
+    </w:p>
+    <w:p>
+      <w:pPr>
+        <w:pStyle w:val="normal1"/>
+        <w:numPr>
+          <w:ilvl w:val="3"/>
+          <w:numId w:val="1"/>
+        </w:numPr>
+        <w:ind w:hanging="360" w:left="2880"/>
+        <w:rPr/>
+      </w:pPr>
+      <w:r>
+        <w:rPr/>
+        <w:t xml:space="preserve">ID of the </w:t>
+      </w:r>
+      <w:r>
+        <w:rPr/>
+        <w:t>StatsGroup</w:t>
+      </w:r>
+    </w:p>
+    <w:p>
+      <w:pPr>
+        <w:pStyle w:val="normal1"/>
+        <w:numPr>
+          <w:ilvl w:val="2"/>
+          <w:numId w:val="1"/>
+        </w:numPr>
+        <w:ind w:hanging="360" w:left="2160"/>
+        <w:rPr/>
+      </w:pPr>
+      <w:r>
+        <w:rPr/>
+        <w:t>page={page_num}</w:t>
+      </w:r>
+    </w:p>
+    <w:p>
+      <w:pPr>
+        <w:pStyle w:val="normal1"/>
+        <w:numPr>
+          <w:ilvl w:val="3"/>
+          <w:numId w:val="1"/>
+        </w:numPr>
+        <w:ind w:hanging="360" w:left="2880"/>
+        <w:rPr>
+          <w:color w:val="FF0000"/>
+        </w:rPr>
+      </w:pPr>
+      <w:r>
+        <w:rPr>
+          <w:color w:val="FF0000"/>
+        </w:rPr>
+        <w:t>Required</w:t>
+      </w:r>
+    </w:p>
+    <w:p>
+      <w:pPr>
+        <w:pStyle w:val="normal1"/>
+        <w:numPr>
+          <w:ilvl w:val="3"/>
+          <w:numId w:val="1"/>
+        </w:numPr>
+        <w:ind w:hanging="360" w:left="2880"/>
+        <w:rPr/>
+      </w:pPr>
+      <w:r>
+        <w:rPr/>
+        <w:t>Defines which page to return</w:t>
+      </w:r>
+    </w:p>
+    <w:p>
+      <w:pPr>
+        <w:pStyle w:val="normal1"/>
+        <w:numPr>
+          <w:ilvl w:val="3"/>
+          <w:numId w:val="1"/>
+        </w:numPr>
+        <w:ind w:hanging="360" w:left="2880"/>
+        <w:rPr/>
+      </w:pPr>
+      <w:r>
+        <w:rPr/>
+        <w:t>First page = 0 (zero)</w:t>
+      </w:r>
+    </w:p>
+    <w:p>
+      <w:pPr>
+        <w:pStyle w:val="normal1"/>
+        <w:numPr>
+          <w:ilvl w:val="2"/>
+          <w:numId w:val="1"/>
+        </w:numPr>
+        <w:ind w:hanging="360" w:left="2160"/>
+        <w:rPr/>
+      </w:pPr>
+      <w:r>
+        <w:rPr/>
+        <w:t>page_size={num_of_rows}</w:t>
+      </w:r>
+    </w:p>
+    <w:p>
+      <w:pPr>
+        <w:pStyle w:val="normal1"/>
+        <w:numPr>
+          <w:ilvl w:val="3"/>
+          <w:numId w:val="1"/>
+        </w:numPr>
+        <w:ind w:hanging="360" w:left="2880"/>
+        <w:rPr>
+          <w:color w:val="FF0000"/>
+        </w:rPr>
+      </w:pPr>
+      <w:r>
+        <w:rPr>
+          <w:color w:val="FF0000"/>
+        </w:rPr>
+        <w:t>Required</w:t>
+      </w:r>
+    </w:p>
+    <w:p>
+      <w:pPr>
+        <w:pStyle w:val="normal1"/>
+        <w:widowControl/>
+        <w:numPr>
+          <w:ilvl w:val="3"/>
+          <w:numId w:val="1"/>
+        </w:numPr>
+        <w:suppressAutoHyphens w:val="true"/>
+        <w:bidi w:val="0"/>
+        <w:spacing w:lineRule="auto" w:line="276" w:before="0" w:after="0"/>
+        <w:ind w:hanging="360" w:left="2880" w:right="0"/>
+        <w:jc w:val="left"/>
+        <w:rPr/>
+      </w:pPr>
+      <w:r>
+        <w:rPr/>
+        <w:t>Defines how many rows to return for the selected page</w:t>
+      </w:r>
+    </w:p>
+    <w:p>
+      <w:pPr>
+        <w:pStyle w:val="normal1"/>
+        <w:numPr>
+          <w:ilvl w:val="1"/>
+          <w:numId w:val="1"/>
+        </w:numPr>
+        <w:ind w:hanging="360" w:left="1440"/>
+        <w:rPr/>
+      </w:pPr>
+      <w:r>
+        <w:rPr/>
+        <w:t>returns:</w:t>
+      </w:r>
+    </w:p>
+    <w:p>
+      <w:pPr>
+        <w:pStyle w:val="normal1"/>
+        <w:widowControl/>
+        <w:suppressAutoHyphens w:val="true"/>
+        <w:bidi w:val="0"/>
+        <w:spacing w:lineRule="auto" w:line="276" w:before="0" w:after="0"/>
+        <w:ind w:hanging="360" w:left="360" w:right="0"/>
+        <w:jc w:val="left"/>
+        <w:rPr>
+          <w:b/>
+          <w:bCs/>
+          <w:color w:val="000000"/>
+        </w:rPr>
+      </w:pPr>
+      <w:r>
+        <w:rPr>
+          <w:b/>
+          <w:bCs/>
+          <w:color w:val="000000"/>
+        </w:rPr>
+      </w:r>
+    </w:p>
+    <w:p>
+      <w:pPr>
+        <w:pStyle w:val="normal1"/>
+        <w:widowControl/>
+        <w:suppressAutoHyphens w:val="true"/>
+        <w:bidi w:val="0"/>
+        <w:spacing w:lineRule="auto" w:line="276" w:before="0" w:after="0"/>
+        <w:ind w:hanging="360" w:left="360" w:right="0"/>
+        <w:jc w:val="left"/>
+        <w:rPr>
+          <w:b/>
+          <w:bCs/>
+          <w:color w:val="000000"/>
+        </w:rPr>
+      </w:pPr>
+      <w:r>
+        <w:rPr>
+          <w:b/>
+          <w:bCs/>
+          <w:color w:val="000000"/>
+        </w:rPr>
+      </w:r>
+    </w:p>
+    <w:p>
+      <w:pPr>
+        <w:pStyle w:val="normal1"/>
+        <w:widowControl/>
+        <w:suppressAutoHyphens w:val="true"/>
+        <w:bidi w:val="0"/>
+        <w:spacing w:lineRule="auto" w:line="276" w:before="0" w:after="0"/>
+        <w:ind w:hanging="360" w:left="360" w:right="0"/>
+        <w:jc w:val="left"/>
+        <w:rPr>
+          <w:b/>
+          <w:bCs/>
+          <w:color w:val="000000"/>
+        </w:rPr>
       </w:pPr>
       <w:r>
         <w:rPr>
@@ -49609,8 +49970,8 @@
       <w:u w:val="single"/>
     </w:rPr>
   </w:style>
-  <w:style w:type="character" w:styleId="Bullets">
-    <w:name w:val="Bullets"/>
+  <w:style w:type="character" w:styleId="Bulletsuser">
+    <w:name w:val="Bullets (user)"/>
     <w:qFormat/>
     <w:rPr>
       <w:rFonts w:ascii="OpenSymbol" w:hAnsi="OpenSymbol" w:eastAsia="OpenSymbol" w:cs="OpenSymbol"/>

</xml_diff>

<commit_message>
Replaced dummy data for StatsGroups UI data table Individual Stats with a new API endpoint (fully documentated); widened the Team Name and Individual Name columns; refined the ranking logic; also updated the seed data game events so that they use the actual quizzer names of the fake teams
</commit_message>
<xml_diff>
--- a/docs/QView API Documentation.docx
+++ b/docs/QView API Documentation.docx
@@ -10,11 +10,11 @@
       </w:pPr>
       <w:r>
         <w:rPr/>
-        <w:t>QView API Documentation (v1</w:t>
-      </w:r>
-      <w:r>
-        <w:rPr/>
-        <w:t>60</w:t>
+        <w:t>QView API Documentation (v16</w:t>
+      </w:r>
+      <w:r>
+        <w:rPr/>
+        <w:t>1</w:t>
       </w:r>
       <w:r>
         <w:rPr/>
@@ -18356,6 +18356,329 @@
           <w:b/>
           <w:bCs/>
         </w:rPr>
+        <w:t>IndividualStats</w:t>
+      </w:r>
+    </w:p>
+    <w:p>
+      <w:pPr>
+        <w:pStyle w:val="normal1"/>
+        <w:numPr>
+          <w:ilvl w:val="0"/>
+          <w:numId w:val="1"/>
+        </w:numPr>
+        <w:ind w:hanging="360" w:left="720"/>
+        <w:rPr/>
+      </w:pPr>
+      <w:r>
+        <w:rPr/>
+        <w:t xml:space="preserve">GET </w:t>
+      </w:r>
+      <w:r>
+        <w:rPr/>
+        <w:t>IndividualStats</w:t>
+      </w:r>
+      <w:r>
+        <w:rPr/>
+        <w:t xml:space="preserve"> of StatsGroup</w:t>
+      </w:r>
+    </w:p>
+    <w:p>
+      <w:pPr>
+        <w:pStyle w:val="normal1"/>
+        <w:numPr>
+          <w:ilvl w:val="1"/>
+          <w:numId w:val="1"/>
+        </w:numPr>
+        <w:ind w:hanging="360" w:left="1440"/>
+        <w:rPr/>
+      </w:pPr>
+      <w:r>
+        <w:rPr/>
+        <w:t xml:space="preserve">built_including_tests: </w:t>
+      </w:r>
+      <w:r>
+        <w:rPr>
+          <w:b/>
+          <w:bCs/>
+        </w:rPr>
+        <w:t>true</w:t>
+      </w:r>
+    </w:p>
+    <w:p>
+      <w:pPr>
+        <w:pStyle w:val="normal1"/>
+        <w:numPr>
+          <w:ilvl w:val="1"/>
+          <w:numId w:val="1"/>
+        </w:numPr>
+        <w:ind w:hanging="360" w:left="1440"/>
+        <w:rPr/>
+      </w:pPr>
+      <w:r>
+        <w:rPr/>
+        <w:t>HTTP method: ‘GET’</w:t>
+      </w:r>
+    </w:p>
+    <w:p>
+      <w:pPr>
+        <w:pStyle w:val="normal1"/>
+        <w:numPr>
+          <w:ilvl w:val="1"/>
+          <w:numId w:val="1"/>
+        </w:numPr>
+        <w:ind w:hanging="360" w:left="1440"/>
+        <w:rPr/>
+      </w:pPr>
+      <w:r>
+        <w:rPr/>
+        <w:t>endpoint: {base_uri}/api/statsgroups/{id}/</w:t>
+      </w:r>
+      <w:r>
+        <w:rPr/>
+        <w:t>individualstats</w:t>
+      </w:r>
+      <w:r>
+        <w:rPr/>
+        <w:t>?page={page_num}&amp;page_size={num_of_rows}</w:t>
+      </w:r>
+    </w:p>
+    <w:p>
+      <w:pPr>
+        <w:pStyle w:val="normal1"/>
+        <w:numPr>
+          <w:ilvl w:val="1"/>
+          <w:numId w:val="1"/>
+        </w:numPr>
+        <w:ind w:hanging="360" w:left="1440"/>
+        <w:rPr/>
+      </w:pPr>
+      <w:r>
+        <w:rPr/>
+        <w:t xml:space="preserve">description: </w:t>
+      </w:r>
+    </w:p>
+    <w:p>
+      <w:pPr>
+        <w:pStyle w:val="normal1"/>
+        <w:numPr>
+          <w:ilvl w:val="1"/>
+          <w:numId w:val="1"/>
+        </w:numPr>
+        <w:ind w:hanging="360" w:left="1440"/>
+        <w:rPr/>
+      </w:pPr>
+      <w:r>
+        <w:rPr/>
+        <w:t>parameters:</w:t>
+      </w:r>
+    </w:p>
+    <w:p>
+      <w:pPr>
+        <w:pStyle w:val="normal1"/>
+        <w:numPr>
+          <w:ilvl w:val="2"/>
+          <w:numId w:val="1"/>
+        </w:numPr>
+        <w:ind w:hanging="360" w:left="2160"/>
+        <w:rPr/>
+      </w:pPr>
+      <w:r>
+        <w:rPr/>
+        <w:t>id</w:t>
+      </w:r>
+    </w:p>
+    <w:p>
+      <w:pPr>
+        <w:pStyle w:val="normal1"/>
+        <w:numPr>
+          <w:ilvl w:val="3"/>
+          <w:numId w:val="1"/>
+        </w:numPr>
+        <w:ind w:hanging="360" w:left="2880"/>
+        <w:rPr>
+          <w:color w:val="FF0000"/>
+        </w:rPr>
+      </w:pPr>
+      <w:r>
+        <w:rPr>
+          <w:color w:val="FF0000"/>
+        </w:rPr>
+        <w:t>Required</w:t>
+      </w:r>
+    </w:p>
+    <w:p>
+      <w:pPr>
+        <w:pStyle w:val="normal1"/>
+        <w:numPr>
+          <w:ilvl w:val="3"/>
+          <w:numId w:val="1"/>
+        </w:numPr>
+        <w:ind w:hanging="360" w:left="2880"/>
+        <w:rPr/>
+      </w:pPr>
+      <w:r>
+        <w:rPr/>
+        <w:t>ID of the StatsGroup</w:t>
+      </w:r>
+    </w:p>
+    <w:p>
+      <w:pPr>
+        <w:pStyle w:val="normal1"/>
+        <w:numPr>
+          <w:ilvl w:val="2"/>
+          <w:numId w:val="1"/>
+        </w:numPr>
+        <w:ind w:hanging="360" w:left="2160"/>
+        <w:rPr/>
+      </w:pPr>
+      <w:r>
+        <w:rPr/>
+        <w:t>page={page_num}</w:t>
+      </w:r>
+    </w:p>
+    <w:p>
+      <w:pPr>
+        <w:pStyle w:val="normal1"/>
+        <w:numPr>
+          <w:ilvl w:val="3"/>
+          <w:numId w:val="1"/>
+        </w:numPr>
+        <w:ind w:hanging="360" w:left="2880"/>
+        <w:rPr>
+          <w:color w:val="FF0000"/>
+        </w:rPr>
+      </w:pPr>
+      <w:r>
+        <w:rPr>
+          <w:color w:val="FF0000"/>
+        </w:rPr>
+        <w:t>Required</w:t>
+      </w:r>
+    </w:p>
+    <w:p>
+      <w:pPr>
+        <w:pStyle w:val="normal1"/>
+        <w:numPr>
+          <w:ilvl w:val="3"/>
+          <w:numId w:val="1"/>
+        </w:numPr>
+        <w:ind w:hanging="360" w:left="2880"/>
+        <w:rPr/>
+      </w:pPr>
+      <w:r>
+        <w:rPr/>
+        <w:t>Defines which page to return</w:t>
+      </w:r>
+    </w:p>
+    <w:p>
+      <w:pPr>
+        <w:pStyle w:val="normal1"/>
+        <w:numPr>
+          <w:ilvl w:val="3"/>
+          <w:numId w:val="1"/>
+        </w:numPr>
+        <w:ind w:hanging="360" w:left="2880"/>
+        <w:rPr/>
+      </w:pPr>
+      <w:r>
+        <w:rPr/>
+        <w:t>First page = 0 (zero)</w:t>
+      </w:r>
+    </w:p>
+    <w:p>
+      <w:pPr>
+        <w:pStyle w:val="normal1"/>
+        <w:numPr>
+          <w:ilvl w:val="2"/>
+          <w:numId w:val="1"/>
+        </w:numPr>
+        <w:ind w:hanging="360" w:left="2160"/>
+        <w:rPr/>
+      </w:pPr>
+      <w:r>
+        <w:rPr/>
+        <w:t>page_size={num_of_rows}</w:t>
+      </w:r>
+    </w:p>
+    <w:p>
+      <w:pPr>
+        <w:pStyle w:val="normal1"/>
+        <w:numPr>
+          <w:ilvl w:val="3"/>
+          <w:numId w:val="1"/>
+        </w:numPr>
+        <w:ind w:hanging="360" w:left="2880"/>
+        <w:rPr>
+          <w:color w:val="FF0000"/>
+        </w:rPr>
+      </w:pPr>
+      <w:r>
+        <w:rPr>
+          <w:color w:val="FF0000"/>
+        </w:rPr>
+        <w:t>Required</w:t>
+      </w:r>
+    </w:p>
+    <w:p>
+      <w:pPr>
+        <w:pStyle w:val="normal1"/>
+        <w:numPr>
+          <w:ilvl w:val="3"/>
+          <w:numId w:val="1"/>
+        </w:numPr>
+        <w:ind w:hanging="360" w:left="2880"/>
+        <w:rPr/>
+      </w:pPr>
+      <w:r>
+        <w:rPr/>
+        <w:t>Defines how many rows to return for the selected page</w:t>
+      </w:r>
+    </w:p>
+    <w:p>
+      <w:pPr>
+        <w:pStyle w:val="normal1"/>
+        <w:numPr>
+          <w:ilvl w:val="1"/>
+          <w:numId w:val="1"/>
+        </w:numPr>
+        <w:ind w:hanging="360" w:left="1440"/>
+        <w:rPr/>
+      </w:pPr>
+      <w:r>
+        <w:rPr/>
+        <w:t>returns:</w:t>
+      </w:r>
+    </w:p>
+    <w:p>
+      <w:pPr>
+        <w:pStyle w:val="normal1"/>
+        <w:rPr>
+          <w:highlight w:val="none"/>
+          <w:shd w:fill="auto" w:val="clear"/>
+        </w:rPr>
+      </w:pPr>
+      <w:r>
+        <w:rPr>
+          <w:b/>
+          <w:bCs/>
+          <w:shd w:fill="auto" w:val="clear"/>
+        </w:rPr>
+      </w:r>
+    </w:p>
+    <w:p>
+      <w:pPr>
+        <w:pStyle w:val="normal1"/>
+        <w:rPr>
+          <w:highlight w:val="none"/>
+          <w:shd w:fill="auto" w:val="clear"/>
+        </w:rPr>
+      </w:pPr>
+      <w:r>
+        <w:rPr>
+          <w:b/>
+          <w:bCs/>
+          <w:shd w:fill="auto" w:val="clear"/>
+        </w:rPr>
       </w:r>
     </w:p>
     <w:p>
@@ -42715,19 +43038,7 @@
       </w:pPr>
       <w:r>
         <w:rPr/>
-        <w:t>GET Team</w:t>
-      </w:r>
-      <w:r>
-        <w:rPr/>
-        <w:t>Stat</w:t>
-      </w:r>
-      <w:r>
-        <w:rPr/>
-        <w:t xml:space="preserve">s of </w:t>
-      </w:r>
-      <w:r>
-        <w:rPr/>
-        <w:t>StatsGroup</w:t>
+        <w:t>GET TeamStats of StatsGroup</w:t>
       </w:r>
     </w:p>
     <w:p>
@@ -42779,23 +43090,7 @@
       </w:pPr>
       <w:r>
         <w:rPr/>
-        <w:t>endpoint: {base_uri}/api/</w:t>
-      </w:r>
-      <w:r>
-        <w:rPr/>
-        <w:t>statsgroups</w:t>
-      </w:r>
-      <w:r>
-        <w:rPr/>
-        <w:t>/{id}/team</w:t>
-      </w:r>
-      <w:r>
-        <w:rPr/>
-        <w:t>stat</w:t>
-      </w:r>
-      <w:r>
-        <w:rPr/>
-        <w:t>s?page={page_num}&amp;page_size={num_of_rows}</w:t>
+        <w:t>endpoint: {base_uri}/api/statsgroups/{id}/teamstats?page={page_num}&amp;page_size={num_of_rows}</w:t>
       </w:r>
     </w:p>
     <w:p>
@@ -42874,11 +43169,7 @@
       </w:pPr>
       <w:r>
         <w:rPr/>
-        <w:t xml:space="preserve">ID of the </w:t>
-      </w:r>
-      <w:r>
-        <w:rPr/>
-        <w:t>StatsGroup</w:t>
+        <w:t>ID of the StatsGroup</w:t>
       </w:r>
     </w:p>
     <w:p>
@@ -49970,8 +50261,8 @@
       <w:u w:val="single"/>
     </w:rPr>
   </w:style>
-  <w:style w:type="character" w:styleId="Bulletsuser">
-    <w:name w:val="Bullets (user)"/>
+  <w:style w:type="character" w:styleId="Bullets">
+    <w:name w:val="Bullets"/>
     <w:qFormat/>
     <w:rPr>
       <w:rFonts w:ascii="OpenSymbol" w:hAnsi="OpenSymbol" w:eastAsia="OpenSymbol" w:cs="OpenSymbol"/>

</xml_diff>

<commit_message>
large commit; added gameevent import feature; 3 new endpoints, each one added to API documentation; 2-step preview/commit gameevent import data/error handling on per-Game basis; updated seed data to have full 20-question games instead of 15-20 quesiton games (some games never finished); Game Selection table DataOk and Done columns now use live data calculations; added a timer metric for timing how long it takes to re-populate the DB with data using seed_one.rs
</commit_message>
<xml_diff>
--- a/docs/QView API Documentation.docx
+++ b/docs/QView API Documentation.docx
@@ -14,11 +14,11 @@
       </w:r>
       <w:r>
         <w:rPr/>
-        <w:t>1</w:t>
-      </w:r>
-      <w:r>
-        <w:rPr/>
-        <w:t>_2026.08.13)</w:t>
+        <w:t>3</w:t>
+      </w:r>
+      <w:r>
+        <w:rPr/>
+        <w:t>_2026.08.14)</w:t>
       </w:r>
     </w:p>
     <w:p>
@@ -14068,7 +14068,7 @@
       </w:pPr>
       <w:r>
         <w:rPr/>
-        <w:t>GET Games where User is QuizMaster</w:t>
+        <w:t>GET Game by ID</w:t>
       </w:r>
     </w:p>
     <w:p>
@@ -14120,7 +14120,7 @@
       </w:pPr>
       <w:r>
         <w:rPr/>
-        <w:t>endpoint: {base_uri}/api/users/{id}/games-where-quizmaster?page={page_num}&amp;page_size={num_of_rows}</w:t>
+        <w:t>endpoint: {base_uri}/api/games/{id}</w:t>
       </w:r>
     </w:p>
     <w:p>
@@ -14150,7 +14150,7 @@
       </w:pPr>
       <w:r>
         <w:rPr/>
-        <w:t>parameters:</w:t>
+        <w:t xml:space="preserve">parameters: </w:t>
       </w:r>
     </w:p>
     <w:p>
@@ -14199,125 +14199,217 @@
       </w:pPr>
       <w:r>
         <w:rPr/>
-        <w:t>ID of the User</w:t>
-      </w:r>
-    </w:p>
-    <w:p>
-      <w:pPr>
-        <w:pStyle w:val="normal1"/>
+        <w:t>ID of the Game to receive</w:t>
+      </w:r>
+    </w:p>
+    <w:p>
+      <w:pPr>
+        <w:pStyle w:val="normal1"/>
+        <w:numPr>
+          <w:ilvl w:val="1"/>
+          <w:numId w:val="1"/>
+        </w:numPr>
+        <w:ind w:hanging="360" w:left="1440"/>
+        <w:rPr>
+          <w:b/>
+          <w:bCs/>
+        </w:rPr>
+      </w:pPr>
+      <w:r>
+        <w:rPr/>
+        <w:t xml:space="preserve">returns: </w:t>
+      </w:r>
+    </w:p>
+    <w:p>
+      <w:pPr>
+        <w:pStyle w:val="normal1"/>
+        <w:widowControl/>
         <w:numPr>
           <w:ilvl w:val="2"/>
-          <w:numId w:val="1"/>
-        </w:numPr>
-        <w:ind w:hanging="360" w:left="2160"/>
-        <w:rPr/>
-      </w:pPr>
-      <w:r>
-        <w:rPr/>
-        <w:t>page={page_num}</w:t>
-      </w:r>
-    </w:p>
-    <w:p>
-      <w:pPr>
-        <w:pStyle w:val="normal1"/>
-        <w:numPr>
-          <w:ilvl w:val="3"/>
-          <w:numId w:val="1"/>
-        </w:numPr>
-        <w:ind w:hanging="360" w:left="2880"/>
-        <w:rPr>
-          <w:color w:val="FF0000"/>
-        </w:rPr>
-      </w:pPr>
-      <w:r>
-        <w:rPr>
-          <w:color w:val="FF0000"/>
-        </w:rPr>
-        <w:t>Required</w:t>
-      </w:r>
-    </w:p>
-    <w:p>
-      <w:pPr>
-        <w:pStyle w:val="normal1"/>
-        <w:numPr>
-          <w:ilvl w:val="3"/>
-          <w:numId w:val="1"/>
-        </w:numPr>
-        <w:ind w:hanging="360" w:left="2880"/>
-        <w:rPr/>
-      </w:pPr>
-      <w:r>
-        <w:rPr/>
-        <w:t>Defines which page to return</w:t>
-      </w:r>
-    </w:p>
-    <w:p>
-      <w:pPr>
-        <w:pStyle w:val="normal1"/>
-        <w:numPr>
-          <w:ilvl w:val="3"/>
-          <w:numId w:val="1"/>
-        </w:numPr>
-        <w:ind w:hanging="360" w:left="2880"/>
-        <w:rPr/>
-      </w:pPr>
-      <w:r>
-        <w:rPr/>
-        <w:t>First page = 0 (zero)</w:t>
-      </w:r>
-    </w:p>
-    <w:p>
-      <w:pPr>
-        <w:pStyle w:val="normal1"/>
-        <w:numPr>
-          <w:ilvl w:val="2"/>
-          <w:numId w:val="1"/>
-        </w:numPr>
-        <w:ind w:hanging="360" w:left="2160"/>
-        <w:rPr/>
-      </w:pPr>
-      <w:r>
-        <w:rPr/>
-        <w:t>page_size={num_of_rows}</w:t>
-      </w:r>
-    </w:p>
-    <w:p>
-      <w:pPr>
-        <w:pStyle w:val="normal1"/>
-        <w:numPr>
-          <w:ilvl w:val="3"/>
-          <w:numId w:val="1"/>
-        </w:numPr>
-        <w:ind w:hanging="360" w:left="2880"/>
-        <w:rPr>
-          <w:color w:val="FF0000"/>
-        </w:rPr>
-      </w:pPr>
-      <w:r>
-        <w:rPr>
-          <w:color w:val="FF0000"/>
-        </w:rPr>
-        <w:t>Required</w:t>
-      </w:r>
-    </w:p>
-    <w:p>
-      <w:pPr>
-        <w:pStyle w:val="normal1"/>
-        <w:widowControl/>
-        <w:numPr>
-          <w:ilvl w:val="3"/>
           <w:numId w:val="1"/>
         </w:numPr>
         <w:suppressAutoHyphens w:val="true"/>
         <w:bidi w:val="0"/>
         <w:spacing w:lineRule="auto" w:line="276" w:before="0" w:after="0"/>
-        <w:ind w:hanging="360" w:left="2880" w:right="0"/>
+        <w:ind w:hanging="360" w:left="2160" w:right="0"/>
         <w:jc w:val="left"/>
-        <w:rPr/>
-      </w:pPr>
-      <w:r>
-        <w:rPr/>
-        <w:t>Defines how many rows to return for the selected page</w:t>
+        <w:rPr>
+          <w:b/>
+          <w:bCs/>
+        </w:rPr>
+      </w:pPr>
+      <w:r>
+        <w:rPr>
+          <w:b/>
+          <w:bCs/>
+        </w:rPr>
+        <w:t>a Game</w:t>
+      </w:r>
+    </w:p>
+    <w:p>
+      <w:pPr>
+        <w:pStyle w:val="normal1"/>
+        <w:numPr>
+          <w:ilvl w:val="0"/>
+          <w:numId w:val="1"/>
+        </w:numPr>
+        <w:ind w:hanging="360" w:left="720"/>
+        <w:rPr/>
+      </w:pPr>
+      <w:r>
+        <w:rPr/>
+        <w:t xml:space="preserve">GET Games </w:t>
+      </w:r>
+      <w:r>
+        <w:rPr/>
+        <w:t>Statuses</w:t>
+      </w:r>
+    </w:p>
+    <w:p>
+      <w:pPr>
+        <w:pStyle w:val="normal1"/>
+        <w:numPr>
+          <w:ilvl w:val="1"/>
+          <w:numId w:val="1"/>
+        </w:numPr>
+        <w:ind w:hanging="360" w:left="1440"/>
+        <w:rPr/>
+      </w:pPr>
+      <w:r>
+        <w:rPr/>
+        <w:t xml:space="preserve">built_including_tests: </w:t>
+      </w:r>
+      <w:r>
+        <w:rPr>
+          <w:b/>
+          <w:bCs/>
+        </w:rPr>
+        <w:t>false</w:t>
+      </w:r>
+    </w:p>
+    <w:p>
+      <w:pPr>
+        <w:pStyle w:val="normal1"/>
+        <w:numPr>
+          <w:ilvl w:val="1"/>
+          <w:numId w:val="1"/>
+        </w:numPr>
+        <w:ind w:hanging="360" w:left="1440"/>
+        <w:rPr/>
+      </w:pPr>
+      <w:r>
+        <w:rPr/>
+        <w:t>HTTP method: ‘GET’</w:t>
+      </w:r>
+    </w:p>
+    <w:p>
+      <w:pPr>
+        <w:pStyle w:val="normal1"/>
+        <w:numPr>
+          <w:ilvl w:val="1"/>
+          <w:numId w:val="1"/>
+        </w:numPr>
+        <w:ind w:hanging="360" w:left="1440"/>
+        <w:rPr/>
+      </w:pPr>
+      <w:r>
+        <w:rPr/>
+        <w:t>endpoint: {base_uri}/api/</w:t>
+      </w:r>
+      <w:r>
+        <w:rPr/>
+        <w:t>tournaments</w:t>
+      </w:r>
+      <w:r>
+        <w:rPr/>
+        <w:t>/{id}/</w:t>
+      </w:r>
+      <w:r>
+        <w:rPr/>
+        <w:t>gamestatuses</w:t>
+      </w:r>
+    </w:p>
+    <w:p>
+      <w:pPr>
+        <w:pStyle w:val="normal1"/>
+        <w:numPr>
+          <w:ilvl w:val="1"/>
+          <w:numId w:val="1"/>
+        </w:numPr>
+        <w:ind w:hanging="360" w:left="1440"/>
+        <w:rPr/>
+      </w:pPr>
+      <w:r>
+        <w:rPr/>
+        <w:t xml:space="preserve">description: </w:t>
+      </w:r>
+    </w:p>
+    <w:p>
+      <w:pPr>
+        <w:pStyle w:val="normal1"/>
+        <w:numPr>
+          <w:ilvl w:val="1"/>
+          <w:numId w:val="1"/>
+        </w:numPr>
+        <w:ind w:hanging="360" w:left="1440"/>
+        <w:rPr/>
+      </w:pPr>
+      <w:r>
+        <w:rPr/>
+        <w:t>parameters:</w:t>
+      </w:r>
+    </w:p>
+    <w:p>
+      <w:pPr>
+        <w:pStyle w:val="normal1"/>
+        <w:numPr>
+          <w:ilvl w:val="2"/>
+          <w:numId w:val="1"/>
+        </w:numPr>
+        <w:ind w:hanging="360" w:left="2160"/>
+        <w:rPr/>
+      </w:pPr>
+      <w:r>
+        <w:rPr/>
+        <w:t>id</w:t>
+      </w:r>
+    </w:p>
+    <w:p>
+      <w:pPr>
+        <w:pStyle w:val="normal1"/>
+        <w:numPr>
+          <w:ilvl w:val="3"/>
+          <w:numId w:val="1"/>
+        </w:numPr>
+        <w:ind w:hanging="360" w:left="2880"/>
+        <w:rPr>
+          <w:color w:val="FF0000"/>
+        </w:rPr>
+      </w:pPr>
+      <w:r>
+        <w:rPr>
+          <w:color w:val="FF0000"/>
+        </w:rPr>
+        <w:t>Required</w:t>
+      </w:r>
+    </w:p>
+    <w:p>
+      <w:pPr>
+        <w:pStyle w:val="normal1"/>
+        <w:numPr>
+          <w:ilvl w:val="3"/>
+          <w:numId w:val="1"/>
+        </w:numPr>
+        <w:ind w:hanging="360" w:left="2880"/>
+        <w:rPr/>
+      </w:pPr>
+      <w:r>
+        <w:rPr/>
+        <w:t xml:space="preserve">ID of the </w:t>
+      </w:r>
+      <w:r>
+        <w:rPr/>
+        <w:t>Tournament</w:t>
       </w:r>
     </w:p>
     <w:p>
@@ -18371,15 +18463,7 @@
       </w:pPr>
       <w:r>
         <w:rPr/>
-        <w:t xml:space="preserve">GET </w:t>
-      </w:r>
-      <w:r>
-        <w:rPr/>
-        <w:t>IndividualStats</w:t>
-      </w:r>
-      <w:r>
-        <w:rPr/>
-        <w:t xml:space="preserve"> of StatsGroup</w:t>
+        <w:t>GET IndividualStats of StatsGroup</w:t>
       </w:r>
     </w:p>
     <w:p>
@@ -18431,15 +18515,7 @@
       </w:pPr>
       <w:r>
         <w:rPr/>
-        <w:t>endpoint: {base_uri}/api/statsgroups/{id}/</w:t>
-      </w:r>
-      <w:r>
-        <w:rPr/>
-        <w:t>individualstats</w:t>
-      </w:r>
-      <w:r>
-        <w:rPr/>
-        <w:t>?page={page_num}&amp;page_size={num_of_rows}</w:t>
+        <w:t>endpoint: {base_uri}/api/statsgroups/{id}/individualstats?page={page_num}&amp;page_size={num_of_rows}</w:t>
       </w:r>
     </w:p>
     <w:p>
@@ -18659,24 +18735,20 @@
       </w:pPr>
       <w:r>
         <w:rPr>
-          <w:b/>
-          <w:bCs/>
-          <w:shd w:fill="auto" w:val="clear"/>
-        </w:rPr>
-      </w:r>
-    </w:p>
-    <w:p>
-      <w:pPr>
-        <w:pStyle w:val="normal1"/>
-        <w:rPr>
-          <w:highlight w:val="none"/>
-          <w:shd w:fill="auto" w:val="clear"/>
-        </w:rPr>
-      </w:pPr>
-      <w:r>
-        <w:rPr>
-          <w:b/>
-          <w:bCs/>
+          <w:shd w:fill="auto" w:val="clear"/>
+        </w:rPr>
+      </w:r>
+    </w:p>
+    <w:p>
+      <w:pPr>
+        <w:pStyle w:val="normal1"/>
+        <w:rPr>
+          <w:highlight w:val="none"/>
+          <w:shd w:fill="auto" w:val="clear"/>
+        </w:rPr>
+      </w:pPr>
+      <w:r>
+        <w:rPr>
           <w:shd w:fill="auto" w:val="clear"/>
         </w:rPr>
       </w:r>
@@ -28085,6 +28157,398 @@
       <w:r>
         <w:rPr/>
         <w:t>the created GameEvent</w:t>
+      </w:r>
+    </w:p>
+    <w:p>
+      <w:pPr>
+        <w:pStyle w:val="normal1"/>
+        <w:numPr>
+          <w:ilvl w:val="0"/>
+          <w:numId w:val="1"/>
+        </w:numPr>
+        <w:ind w:hanging="360" w:left="720"/>
+        <w:rPr/>
+      </w:pPr>
+      <w:r>
+        <w:rPr/>
+        <w:t>POST/Import GameEvents PREVIEW</w:t>
+      </w:r>
+    </w:p>
+    <w:p>
+      <w:pPr>
+        <w:pStyle w:val="normal1"/>
+        <w:numPr>
+          <w:ilvl w:val="1"/>
+          <w:numId w:val="1"/>
+        </w:numPr>
+        <w:ind w:hanging="360" w:left="1440"/>
+        <w:rPr/>
+      </w:pPr>
+      <w:r>
+        <w:rPr/>
+        <w:t xml:space="preserve">built_including_tests: </w:t>
+      </w:r>
+      <w:r>
+        <w:rPr>
+          <w:b/>
+          <w:bCs/>
+        </w:rPr>
+        <w:t>true</w:t>
+      </w:r>
+    </w:p>
+    <w:p>
+      <w:pPr>
+        <w:pStyle w:val="normal1"/>
+        <w:numPr>
+          <w:ilvl w:val="1"/>
+          <w:numId w:val="1"/>
+        </w:numPr>
+        <w:ind w:hanging="360" w:left="1440"/>
+        <w:rPr/>
+      </w:pPr>
+      <w:r>
+        <w:rPr/>
+        <w:t>HTTP method: ‘POST’</w:t>
+      </w:r>
+    </w:p>
+    <w:p>
+      <w:pPr>
+        <w:pStyle w:val="normal1"/>
+        <w:numPr>
+          <w:ilvl w:val="1"/>
+          <w:numId w:val="1"/>
+        </w:numPr>
+        <w:ind w:hanging="360" w:left="1440"/>
+        <w:rPr/>
+      </w:pPr>
+      <w:r>
+        <w:rPr/>
+        <w:t>endpoint: {base_uri}/api/scoreevents/{id}/gameevents/import/preview</w:t>
+      </w:r>
+    </w:p>
+    <w:p>
+      <w:pPr>
+        <w:pStyle w:val="normal1"/>
+        <w:numPr>
+          <w:ilvl w:val="1"/>
+          <w:numId w:val="1"/>
+        </w:numPr>
+        <w:ind w:hanging="360" w:left="1440"/>
+        <w:rPr/>
+      </w:pPr>
+      <w:r>
+        <w:rPr/>
+        <w:t>description:</w:t>
+      </w:r>
+    </w:p>
+    <w:p>
+      <w:pPr>
+        <w:pStyle w:val="normal1"/>
+        <w:widowControl/>
+        <w:numPr>
+          <w:ilvl w:val="2"/>
+          <w:numId w:val="1"/>
+        </w:numPr>
+        <w:suppressAutoHyphens w:val="true"/>
+        <w:bidi w:val="0"/>
+        <w:spacing w:lineRule="auto" w:line="276" w:before="0" w:after="0"/>
+        <w:ind w:hanging="360" w:left="2160" w:right="0"/>
+        <w:jc w:val="left"/>
+        <w:rPr/>
+      </w:pPr>
+      <w:r>
+        <w:rPr/>
+        <w:t>Used as step 1 of 2 for checking GameEvent import candidate records when importing from Quizzes.csv Game results file to determine if the GameEvent records can be imported for each applicable existing Game</w:t>
+      </w:r>
+    </w:p>
+    <w:p>
+      <w:pPr>
+        <w:pStyle w:val="normal1"/>
+        <w:numPr>
+          <w:ilvl w:val="1"/>
+          <w:numId w:val="1"/>
+        </w:numPr>
+        <w:ind w:hanging="360" w:left="1440"/>
+        <w:rPr/>
+      </w:pPr>
+      <w:r>
+        <w:rPr/>
+        <w:t xml:space="preserve">body: </w:t>
+      </w:r>
+    </w:p>
+    <w:p>
+      <w:pPr>
+        <w:pStyle w:val="normal1"/>
+        <w:numPr>
+          <w:ilvl w:val="1"/>
+          <w:numId w:val="1"/>
+        </w:numPr>
+        <w:ind w:hanging="360" w:left="1440"/>
+        <w:rPr/>
+      </w:pPr>
+      <w:r>
+        <w:rPr/>
+        <w:t xml:space="preserve">parameters: </w:t>
+      </w:r>
+    </w:p>
+    <w:p>
+      <w:pPr>
+        <w:pStyle w:val="normal1"/>
+        <w:numPr>
+          <w:ilvl w:val="2"/>
+          <w:numId w:val="1"/>
+        </w:numPr>
+        <w:ind w:hanging="360" w:left="2160"/>
+        <w:rPr/>
+      </w:pPr>
+      <w:r>
+        <w:rPr/>
+        <w:t>id</w:t>
+      </w:r>
+    </w:p>
+    <w:p>
+      <w:pPr>
+        <w:pStyle w:val="normal1"/>
+        <w:numPr>
+          <w:ilvl w:val="3"/>
+          <w:numId w:val="1"/>
+        </w:numPr>
+        <w:ind w:hanging="360" w:left="2880"/>
+        <w:rPr>
+          <w:color w:val="FF0000"/>
+        </w:rPr>
+      </w:pPr>
+      <w:r>
+        <w:rPr>
+          <w:color w:val="FF0000"/>
+        </w:rPr>
+        <w:t>Required</w:t>
+      </w:r>
+    </w:p>
+    <w:p>
+      <w:pPr>
+        <w:pStyle w:val="normal1"/>
+        <w:numPr>
+          <w:ilvl w:val="1"/>
+          <w:numId w:val="1"/>
+        </w:numPr>
+        <w:ind w:hanging="360" w:left="1440"/>
+        <w:rPr/>
+      </w:pPr>
+      <w:r>
+        <w:rPr/>
+        <w:t>ID of the Namelist to receive</w:t>
+      </w:r>
+    </w:p>
+    <w:p>
+      <w:pPr>
+        <w:pStyle w:val="normal1"/>
+        <w:numPr>
+          <w:ilvl w:val="1"/>
+          <w:numId w:val="1"/>
+        </w:numPr>
+        <w:ind w:hanging="360" w:left="1440"/>
+        <w:rPr/>
+      </w:pPr>
+      <w:r>
+        <w:rPr/>
+        <w:t xml:space="preserve">returns: </w:t>
+      </w:r>
+    </w:p>
+    <w:p>
+      <w:pPr>
+        <w:pStyle w:val="normal1"/>
+        <w:numPr>
+          <w:ilvl w:val="0"/>
+          <w:numId w:val="1"/>
+        </w:numPr>
+        <w:ind w:hanging="360" w:left="720"/>
+        <w:rPr/>
+      </w:pPr>
+      <w:r>
+        <w:rPr/>
+        <w:t>POST/Import GameEvents COMMIT</w:t>
+      </w:r>
+    </w:p>
+    <w:p>
+      <w:pPr>
+        <w:pStyle w:val="normal1"/>
+        <w:numPr>
+          <w:ilvl w:val="1"/>
+          <w:numId w:val="1"/>
+        </w:numPr>
+        <w:ind w:hanging="360" w:left="1440"/>
+        <w:rPr/>
+      </w:pPr>
+      <w:r>
+        <w:rPr/>
+        <w:t xml:space="preserve">built_including_tests: </w:t>
+      </w:r>
+      <w:r>
+        <w:rPr>
+          <w:b/>
+          <w:bCs/>
+        </w:rPr>
+        <w:t>true</w:t>
+      </w:r>
+    </w:p>
+    <w:p>
+      <w:pPr>
+        <w:pStyle w:val="normal1"/>
+        <w:numPr>
+          <w:ilvl w:val="1"/>
+          <w:numId w:val="1"/>
+        </w:numPr>
+        <w:ind w:hanging="360" w:left="1440"/>
+        <w:rPr/>
+      </w:pPr>
+      <w:r>
+        <w:rPr/>
+        <w:t>HTTP method: ‘POST’</w:t>
+      </w:r>
+    </w:p>
+    <w:p>
+      <w:pPr>
+        <w:pStyle w:val="normal1"/>
+        <w:numPr>
+          <w:ilvl w:val="1"/>
+          <w:numId w:val="1"/>
+        </w:numPr>
+        <w:ind w:hanging="360" w:left="1440"/>
+        <w:rPr/>
+      </w:pPr>
+      <w:r>
+        <w:rPr/>
+        <w:t>endpoint: {base_uri}/api/scoreevents/{id}/gameevents/import/commit</w:t>
+      </w:r>
+    </w:p>
+    <w:p>
+      <w:pPr>
+        <w:pStyle w:val="normal1"/>
+        <w:numPr>
+          <w:ilvl w:val="1"/>
+          <w:numId w:val="1"/>
+        </w:numPr>
+        <w:ind w:hanging="360" w:left="1440"/>
+        <w:rPr/>
+      </w:pPr>
+      <w:r>
+        <w:rPr/>
+        <w:t>description:</w:t>
+      </w:r>
+    </w:p>
+    <w:p>
+      <w:pPr>
+        <w:pStyle w:val="normal1"/>
+        <w:widowControl/>
+        <w:numPr>
+          <w:ilvl w:val="2"/>
+          <w:numId w:val="1"/>
+        </w:numPr>
+        <w:suppressAutoHyphens w:val="true"/>
+        <w:bidi w:val="0"/>
+        <w:spacing w:lineRule="auto" w:line="276" w:before="0" w:after="0"/>
+        <w:ind w:hanging="360" w:left="2160" w:right="0"/>
+        <w:jc w:val="left"/>
+        <w:rPr/>
+      </w:pPr>
+      <w:r>
+        <w:rPr/>
+        <w:t>Used as step 2 of 2 (after PREVIEW) to import GameEvent records from a Quizzes.csv GameEvent results file for a given Room(s).</w:t>
+      </w:r>
+    </w:p>
+    <w:p>
+      <w:pPr>
+        <w:pStyle w:val="normal1"/>
+        <w:numPr>
+          <w:ilvl w:val="1"/>
+          <w:numId w:val="1"/>
+        </w:numPr>
+        <w:ind w:hanging="360" w:left="1440"/>
+        <w:rPr/>
+      </w:pPr>
+      <w:r>
+        <w:rPr/>
+        <w:t xml:space="preserve">body: </w:t>
+      </w:r>
+    </w:p>
+    <w:p>
+      <w:pPr>
+        <w:pStyle w:val="normal1"/>
+        <w:numPr>
+          <w:ilvl w:val="1"/>
+          <w:numId w:val="1"/>
+        </w:numPr>
+        <w:ind w:hanging="360" w:left="1440"/>
+        <w:rPr/>
+      </w:pPr>
+      <w:r>
+        <w:rPr/>
+        <w:t xml:space="preserve">parameters: </w:t>
+      </w:r>
+    </w:p>
+    <w:p>
+      <w:pPr>
+        <w:pStyle w:val="normal1"/>
+        <w:numPr>
+          <w:ilvl w:val="2"/>
+          <w:numId w:val="1"/>
+        </w:numPr>
+        <w:ind w:hanging="360" w:left="2160"/>
+        <w:rPr/>
+      </w:pPr>
+      <w:r>
+        <w:rPr/>
+        <w:t>id</w:t>
+      </w:r>
+    </w:p>
+    <w:p>
+      <w:pPr>
+        <w:pStyle w:val="normal1"/>
+        <w:numPr>
+          <w:ilvl w:val="3"/>
+          <w:numId w:val="1"/>
+        </w:numPr>
+        <w:ind w:hanging="360" w:left="2880"/>
+        <w:rPr>
+          <w:color w:val="FF0000"/>
+        </w:rPr>
+      </w:pPr>
+      <w:r>
+        <w:rPr>
+          <w:color w:val="FF0000"/>
+        </w:rPr>
+        <w:t>Required</w:t>
+      </w:r>
+    </w:p>
+    <w:p>
+      <w:pPr>
+        <w:pStyle w:val="normal1"/>
+        <w:numPr>
+          <w:ilvl w:val="1"/>
+          <w:numId w:val="1"/>
+        </w:numPr>
+        <w:ind w:hanging="360" w:left="1440"/>
+        <w:rPr/>
+      </w:pPr>
+      <w:r>
+        <w:rPr/>
+        <w:t>ID of the Namelist to receive</w:t>
+      </w:r>
+    </w:p>
+    <w:p>
+      <w:pPr>
+        <w:pStyle w:val="normal1"/>
+        <w:numPr>
+          <w:ilvl w:val="1"/>
+          <w:numId w:val="1"/>
+        </w:numPr>
+        <w:ind w:hanging="360" w:left="1440"/>
+        <w:rPr/>
+      </w:pPr>
+      <w:r>
+        <w:rPr/>
+        <w:t xml:space="preserve">returns: </w:t>
       </w:r>
     </w:p>
     <w:p>

</xml_diff>

<commit_message>
Redefined the 'index' service function/endpoint for pingmsg.rs so that it is used how QMServer uses it: to receive check-ins that QuizMachine is still connected and active. Added 2 columns to the 'rooms' DB table (ping data stored). Included an integraiton test for the redefined endpoint. Redfined the endpoint's use in the API docs. Removed the other endpoints from the pingmsg.rs service (since they're not being used and are somewhat nonsensical). Updated themodel based on DB schema changes.
</commit_message>
<xml_diff>
--- a/docs/QView API Documentation.docx
+++ b/docs/QView API Documentation.docx
@@ -14,11 +14,19 @@
       </w:r>
       <w:r>
         <w:rPr/>
-        <w:t>3</w:t>
-      </w:r>
-      <w:r>
-        <w:rPr/>
-        <w:t>_2026.08.14)</w:t>
+        <w:t>4</w:t>
+      </w:r>
+      <w:r>
+        <w:rPr/>
+        <w:t>_2026.08.1</w:t>
+      </w:r>
+      <w:r>
+        <w:rPr/>
+        <w:t>7</w:t>
+      </w:r>
+      <w:r>
+        <w:rPr/>
+        <w:t>)</w:t>
       </w:r>
     </w:p>
     <w:p>
@@ -14258,11 +14266,7 @@
       </w:pPr>
       <w:r>
         <w:rPr/>
-        <w:t xml:space="preserve">GET Games </w:t>
-      </w:r>
-      <w:r>
-        <w:rPr/>
-        <w:t>Statuses</w:t>
+        <w:t>GET Games Statuses</w:t>
       </w:r>
     </w:p>
     <w:p>
@@ -14314,19 +14318,7 @@
       </w:pPr>
       <w:r>
         <w:rPr/>
-        <w:t>endpoint: {base_uri}/api/</w:t>
-      </w:r>
-      <w:r>
-        <w:rPr/>
-        <w:t>tournaments</w:t>
-      </w:r>
-      <w:r>
-        <w:rPr/>
-        <w:t>/{id}/</w:t>
-      </w:r>
-      <w:r>
-        <w:rPr/>
-        <w:t>gamestatuses</w:t>
+        <w:t>endpoint: {base_uri}/api/tournaments/{id}/gamestatuses</w:t>
       </w:r>
     </w:p>
     <w:p>
@@ -14405,11 +14397,7 @@
       </w:pPr>
       <w:r>
         <w:rPr/>
-        <w:t xml:space="preserve">ID of the </w:t>
-      </w:r>
-      <w:r>
-        <w:rPr/>
-        <w:t>Tournament</w:t>
+        <w:t>ID of the Tournament</w:t>
       </w:r>
     </w:p>
     <w:p>
@@ -30640,7 +30628,7 @@
       </w:pPr>
       <w:r>
         <w:rPr/>
-        <w:t>GET All PingMsgs</w:t>
+        <w:t>GET PingMsg</w:t>
       </w:r>
     </w:p>
     <w:p>
@@ -30662,7 +30650,7 @@
           <w:b/>
           <w:bCs/>
         </w:rPr>
-        <w:t>false</w:t>
+        <w:t>true</w:t>
       </w:r>
     </w:p>
     <w:p>
@@ -30692,16 +30680,25 @@
       </w:pPr>
       <w:r>
         <w:rPr/>
-        <w:t>endpoint: {base_uri}/pingmsg?page={page_num}&amp;page_size={num_of_rows}</w:t>
-      </w:r>
-    </w:p>
-    <w:p>
-      <w:pPr>
-        <w:pStyle w:val="normal1"/>
-        <w:numPr>
-          <w:ilvl w:val="1"/>
-          <w:numId w:val="1"/>
-        </w:numPr>
+        <w:t>endpoint: {base_uri}/</w:t>
+      </w:r>
+      <w:r>
+        <w:rPr/>
+        <w:t>api/</w:t>
+      </w:r>
+      <w:r>
+        <w:rPr/>
+        <w:t>pingmsg?gid={}&amp;bldgroom={}&amp;key={}&amp;tk={}&amp;tn={}&amp;dn={}&amp;rm={}&amp;rd={}&amp;qn={}&amp;qmv={}&amp;ts={}&amp;jp={}</w:t>
+      </w:r>
+    </w:p>
+    <w:p>
+      <w:pPr>
+        <w:pStyle w:val="normal1"/>
+        <w:numPr>
+          <w:ilvl w:val="1"/>
+          <w:numId w:val="1"/>
+        </w:numPr>
+        <w:bidi w:val="0"/>
         <w:ind w:hanging="360" w:left="1440"/>
         <w:rPr/>
       </w:pPr>
@@ -30709,6 +30706,10 @@
         <w:rPr/>
         <w:t xml:space="preserve">description: </w:t>
       </w:r>
+      <w:r>
+        <w:rPr/>
+        <w:t>constant check-in endpoint for QuizMachine; used for QView Room Monitor UI</w:t>
+      </w:r>
     </w:p>
     <w:p>
       <w:pPr>
@@ -30737,7 +30738,11 @@
       </w:pPr>
       <w:r>
         <w:rPr/>
-        <w:t>page={page_num}</w:t>
+        <w:t>gid</w:t>
+      </w:r>
+      <w:r>
+        <w:rPr/>
+        <w:t>={}</w:t>
       </w:r>
     </w:p>
     <w:p>
@@ -30778,6 +30783,25 @@
       <w:pPr>
         <w:pStyle w:val="normal1"/>
         <w:numPr>
+          <w:ilvl w:val="2"/>
+          <w:numId w:val="1"/>
+        </w:numPr>
+        <w:ind w:hanging="360" w:left="2160"/>
+        <w:rPr/>
+      </w:pPr>
+      <w:r>
+        <w:rPr/>
+        <w:t>bldgroom</w:t>
+      </w:r>
+      <w:r>
+        <w:rPr/>
+        <w:t>={}</w:t>
+      </w:r>
+    </w:p>
+    <w:p>
+      <w:pPr>
+        <w:pStyle w:val="normal1"/>
+        <w:numPr>
           <w:ilvl w:val="3"/>
           <w:numId w:val="1"/>
         </w:numPr>
@@ -30786,7 +30810,11 @@
       </w:pPr>
       <w:r>
         <w:rPr/>
-        <w:t>First page = 0 (zero)</w:t>
+        <w:t>“</w:t>
+      </w:r>
+      <w:r>
+        <w:rPr/>
+        <w:t>building room” – not used in QView; not required</w:t>
       </w:r>
     </w:p>
     <w:p>
@@ -30801,7 +30829,11 @@
       </w:pPr>
       <w:r>
         <w:rPr/>
-        <w:t>page_size={num_of_rows}</w:t>
+        <w:t>key</w:t>
+      </w:r>
+      <w:r>
+        <w:rPr/>
+        <w:t>={}</w:t>
       </w:r>
     </w:p>
     <w:p>
@@ -30812,6 +30844,83 @@
           <w:numId w:val="1"/>
         </w:numPr>
         <w:ind w:hanging="360" w:left="2880"/>
+        <w:rPr/>
+      </w:pPr>
+      <w:r>
+        <w:rPr/>
+        <w:t>“</w:t>
+      </w:r>
+      <w:r>
+        <w:rPr/>
+        <w:t>Key4Server” – not used in this endpoint currently</w:t>
+      </w:r>
+    </w:p>
+    <w:p>
+      <w:pPr>
+        <w:pStyle w:val="normal1"/>
+        <w:numPr>
+          <w:ilvl w:val="2"/>
+          <w:numId w:val="1"/>
+        </w:numPr>
+        <w:bidi w:val="0"/>
+        <w:ind w:hanging="360" w:left="2160"/>
+        <w:rPr/>
+      </w:pPr>
+      <w:r>
+        <w:rPr/>
+        <w:t>tk</w:t>
+      </w:r>
+      <w:r>
+        <w:rPr/>
+        <w:t>={}</w:t>
+      </w:r>
+    </w:p>
+    <w:p>
+      <w:pPr>
+        <w:pStyle w:val="normal1"/>
+        <w:numPr>
+          <w:ilvl w:val="3"/>
+          <w:numId w:val="1"/>
+        </w:numPr>
+        <w:ind w:hanging="360" w:left="2880"/>
+        <w:rPr/>
+      </w:pPr>
+      <w:r>
+        <w:rPr/>
+        <w:t>“</w:t>
+      </w:r>
+      <w:r>
+        <w:rPr/>
+        <w:t>tournament key” – not currently used in this endpoint</w:t>
+      </w:r>
+    </w:p>
+    <w:p>
+      <w:pPr>
+        <w:pStyle w:val="normal1"/>
+        <w:numPr>
+          <w:ilvl w:val="2"/>
+          <w:numId w:val="1"/>
+        </w:numPr>
+        <w:ind w:hanging="360" w:left="2160"/>
+        <w:rPr/>
+      </w:pPr>
+      <w:r>
+        <w:rPr/>
+        <w:t>tn</w:t>
+      </w:r>
+      <w:r>
+        <w:rPr/>
+        <w:t>={}</w:t>
+      </w:r>
+    </w:p>
+    <w:p>
+      <w:pPr>
+        <w:pStyle w:val="normal1"/>
+        <w:numPr>
+          <w:ilvl w:val="3"/>
+          <w:numId w:val="1"/>
+        </w:numPr>
+        <w:ind w:hanging="360" w:left="2880"/>
         <w:rPr>
           <w:color w:val="FF0000"/>
         </w:rPr>
@@ -30835,7 +30944,391 @@
       </w:pPr>
       <w:r>
         <w:rPr/>
-        <w:t>Defines how many rows to return for the selected page</w:t>
+        <w:t>“</w:t>
+      </w:r>
+      <w:r>
+        <w:rPr/>
+        <w:t>tournament name” – used as one part of a composite key as a backup when ‘gid’ has no/invalid data</w:t>
+      </w:r>
+    </w:p>
+    <w:p>
+      <w:pPr>
+        <w:pStyle w:val="normal1"/>
+        <w:numPr>
+          <w:ilvl w:val="2"/>
+          <w:numId w:val="1"/>
+        </w:numPr>
+        <w:ind w:hanging="360" w:left="2160"/>
+        <w:rPr/>
+      </w:pPr>
+      <w:r>
+        <w:rPr/>
+        <w:t>dn</w:t>
+      </w:r>
+      <w:r>
+        <w:rPr/>
+        <w:t>={}</w:t>
+      </w:r>
+    </w:p>
+    <w:p>
+      <w:pPr>
+        <w:pStyle w:val="normal1"/>
+        <w:numPr>
+          <w:ilvl w:val="3"/>
+          <w:numId w:val="1"/>
+        </w:numPr>
+        <w:ind w:hanging="360" w:left="2880"/>
+        <w:rPr>
+          <w:color w:val="FF0000"/>
+        </w:rPr>
+      </w:pPr>
+      <w:r>
+        <w:rPr>
+          <w:color w:val="FF0000"/>
+        </w:rPr>
+        <w:t>Required</w:t>
+      </w:r>
+    </w:p>
+    <w:p>
+      <w:pPr>
+        <w:pStyle w:val="normal1"/>
+        <w:numPr>
+          <w:ilvl w:val="3"/>
+          <w:numId w:val="1"/>
+        </w:numPr>
+        <w:ind w:hanging="360" w:left="2880"/>
+        <w:rPr/>
+      </w:pPr>
+      <w:r>
+        <w:rPr/>
+        <w:t>“</w:t>
+      </w:r>
+      <w:r>
+        <w:rPr/>
+        <w:t>division name” – used as one part of a composite key as a backup when ‘gid’ has no/invalid data</w:t>
+      </w:r>
+    </w:p>
+    <w:p>
+      <w:pPr>
+        <w:pStyle w:val="normal1"/>
+        <w:numPr>
+          <w:ilvl w:val="2"/>
+          <w:numId w:val="1"/>
+        </w:numPr>
+        <w:ind w:hanging="360" w:left="2160"/>
+        <w:rPr/>
+      </w:pPr>
+      <w:r>
+        <w:rPr/>
+        <w:t>rm</w:t>
+      </w:r>
+      <w:r>
+        <w:rPr/>
+        <w:t>={}</w:t>
+      </w:r>
+    </w:p>
+    <w:p>
+      <w:pPr>
+        <w:pStyle w:val="normal1"/>
+        <w:numPr>
+          <w:ilvl w:val="3"/>
+          <w:numId w:val="1"/>
+        </w:numPr>
+        <w:ind w:hanging="360" w:left="2880"/>
+        <w:rPr>
+          <w:color w:val="FF0000"/>
+        </w:rPr>
+      </w:pPr>
+      <w:r>
+        <w:rPr>
+          <w:color w:val="FF0000"/>
+        </w:rPr>
+        <w:t>Required</w:t>
+      </w:r>
+    </w:p>
+    <w:p>
+      <w:pPr>
+        <w:pStyle w:val="normal1"/>
+        <w:numPr>
+          <w:ilvl w:val="3"/>
+          <w:numId w:val="1"/>
+        </w:numPr>
+        <w:ind w:hanging="360" w:left="2880"/>
+        <w:rPr/>
+      </w:pPr>
+      <w:r>
+        <w:rPr/>
+        <w:t>“</w:t>
+      </w:r>
+      <w:r>
+        <w:rPr/>
+        <w:t>room (name)” – used as one part of a composite key as a backup when ‘gid’ has no/invalid data</w:t>
+      </w:r>
+    </w:p>
+    <w:p>
+      <w:pPr>
+        <w:pStyle w:val="normal1"/>
+        <w:numPr>
+          <w:ilvl w:val="2"/>
+          <w:numId w:val="1"/>
+        </w:numPr>
+        <w:ind w:hanging="360" w:left="2160"/>
+        <w:rPr/>
+      </w:pPr>
+      <w:r>
+        <w:rPr/>
+        <w:t>rd</w:t>
+      </w:r>
+      <w:r>
+        <w:rPr/>
+        <w:t>={}</w:t>
+      </w:r>
+    </w:p>
+    <w:p>
+      <w:pPr>
+        <w:pStyle w:val="normal1"/>
+        <w:numPr>
+          <w:ilvl w:val="3"/>
+          <w:numId w:val="1"/>
+        </w:numPr>
+        <w:ind w:hanging="360" w:left="2880"/>
+        <w:rPr>
+          <w:color w:val="FF0000"/>
+        </w:rPr>
+      </w:pPr>
+      <w:r>
+        <w:rPr>
+          <w:color w:val="FF0000"/>
+        </w:rPr>
+        <w:t>Required</w:t>
+      </w:r>
+    </w:p>
+    <w:p>
+      <w:pPr>
+        <w:pStyle w:val="normal1"/>
+        <w:numPr>
+          <w:ilvl w:val="3"/>
+          <w:numId w:val="1"/>
+        </w:numPr>
+        <w:ind w:hanging="360" w:left="2880"/>
+        <w:rPr/>
+      </w:pPr>
+      <w:r>
+        <w:rPr/>
+        <w:t>“</w:t>
+      </w:r>
+      <w:r>
+        <w:rPr/>
+        <w:t>round (name/number)” – used as one part of a composite key as a backup when ‘gid’ has no/invalid data</w:t>
+      </w:r>
+    </w:p>
+    <w:p>
+      <w:pPr>
+        <w:pStyle w:val="normal1"/>
+        <w:numPr>
+          <w:ilvl w:val="2"/>
+          <w:numId w:val="1"/>
+        </w:numPr>
+        <w:ind w:hanging="360" w:left="2160"/>
+        <w:rPr/>
+      </w:pPr>
+      <w:r>
+        <w:rPr/>
+        <w:t>qn</w:t>
+      </w:r>
+      <w:r>
+        <w:rPr/>
+        <w:t>={}</w:t>
+      </w:r>
+    </w:p>
+    <w:p>
+      <w:pPr>
+        <w:pStyle w:val="normal1"/>
+        <w:numPr>
+          <w:ilvl w:val="3"/>
+          <w:numId w:val="1"/>
+        </w:numPr>
+        <w:ind w:hanging="360" w:left="2880"/>
+        <w:rPr>
+          <w:color w:val="FF0000"/>
+        </w:rPr>
+      </w:pPr>
+      <w:r>
+        <w:rPr>
+          <w:color w:val="FF0000"/>
+        </w:rPr>
+        <w:t>Required</w:t>
+      </w:r>
+    </w:p>
+    <w:p>
+      <w:pPr>
+        <w:pStyle w:val="normal1"/>
+        <w:numPr>
+          <w:ilvl w:val="3"/>
+          <w:numId w:val="1"/>
+        </w:numPr>
+        <w:ind w:hanging="360" w:left="2880"/>
+        <w:rPr/>
+      </w:pPr>
+      <w:r>
+        <w:rPr/>
+        <w:t>“</w:t>
+      </w:r>
+      <w:r>
+        <w:rPr/>
+        <w:t>question number” – the current question QuizMachine client is on</w:t>
+      </w:r>
+    </w:p>
+    <w:p>
+      <w:pPr>
+        <w:pStyle w:val="normal1"/>
+        <w:numPr>
+          <w:ilvl w:val="2"/>
+          <w:numId w:val="1"/>
+        </w:numPr>
+        <w:ind w:hanging="360" w:left="2160"/>
+        <w:rPr/>
+      </w:pPr>
+      <w:r>
+        <w:rPr/>
+        <w:t>qmv</w:t>
+      </w:r>
+      <w:r>
+        <w:rPr/>
+        <w:t>={}</w:t>
+      </w:r>
+    </w:p>
+    <w:p>
+      <w:pPr>
+        <w:pStyle w:val="normal1"/>
+        <w:numPr>
+          <w:ilvl w:val="3"/>
+          <w:numId w:val="1"/>
+        </w:numPr>
+        <w:ind w:hanging="360" w:left="2880"/>
+        <w:rPr>
+          <w:color w:val="FF0000"/>
+        </w:rPr>
+      </w:pPr>
+      <w:r>
+        <w:rPr>
+          <w:color w:val="FF0000"/>
+        </w:rPr>
+        <w:t>Required</w:t>
+      </w:r>
+    </w:p>
+    <w:p>
+      <w:pPr>
+        <w:pStyle w:val="normal1"/>
+        <w:numPr>
+          <w:ilvl w:val="3"/>
+          <w:numId w:val="1"/>
+        </w:numPr>
+        <w:ind w:hanging="360" w:left="2880"/>
+        <w:rPr/>
+      </w:pPr>
+      <w:r>
+        <w:rPr/>
+        <w:t>“</w:t>
+      </w:r>
+      <w:r>
+        <w:rPr/>
+        <w:t>QuizMachine version” - self-explanatory</w:t>
+      </w:r>
+    </w:p>
+    <w:p>
+      <w:pPr>
+        <w:pStyle w:val="normal1"/>
+        <w:numPr>
+          <w:ilvl w:val="2"/>
+          <w:numId w:val="1"/>
+        </w:numPr>
+        <w:ind w:hanging="360" w:left="2160"/>
+        <w:rPr/>
+      </w:pPr>
+      <w:r>
+        <w:rPr/>
+        <w:t>ts</w:t>
+      </w:r>
+      <w:r>
+        <w:rPr/>
+        <w:t>={}</w:t>
+      </w:r>
+    </w:p>
+    <w:p>
+      <w:pPr>
+        <w:pStyle w:val="normal1"/>
+        <w:numPr>
+          <w:ilvl w:val="3"/>
+          <w:numId w:val="1"/>
+        </w:numPr>
+        <w:ind w:hanging="360" w:left="2880"/>
+        <w:rPr/>
+      </w:pPr>
+      <w:r>
+        <w:rPr/>
+        <w:t>“</w:t>
+      </w:r>
+      <w:r>
+        <w:rPr/>
+        <w:t>timestamp” (from client); not currently used in QView</w:t>
+      </w:r>
+    </w:p>
+    <w:p>
+      <w:pPr>
+        <w:pStyle w:val="normal1"/>
+        <w:numPr>
+          <w:ilvl w:val="2"/>
+          <w:numId w:val="1"/>
+        </w:numPr>
+        <w:ind w:hanging="360" w:left="2160"/>
+        <w:rPr/>
+      </w:pPr>
+      <w:r>
+        <w:rPr/>
+        <w:t>jp</w:t>
+      </w:r>
+      <w:r>
+        <w:rPr/>
+        <w:t>={}</w:t>
+      </w:r>
+    </w:p>
+    <w:p>
+      <w:pPr>
+        <w:pStyle w:val="normal1"/>
+        <w:numPr>
+          <w:ilvl w:val="3"/>
+          <w:numId w:val="1"/>
+        </w:numPr>
+        <w:ind w:hanging="360" w:left="2880"/>
+        <w:rPr>
+          <w:color w:val="FF0000"/>
+        </w:rPr>
+      </w:pPr>
+      <w:r>
+        <w:rPr>
+          <w:color w:val="FF0000"/>
+        </w:rPr>
+        <w:t>Required</w:t>
+      </w:r>
+    </w:p>
+    <w:p>
+      <w:pPr>
+        <w:pStyle w:val="normal1"/>
+        <w:numPr>
+          <w:ilvl w:val="3"/>
+          <w:numId w:val="1"/>
+        </w:numPr>
+        <w:ind w:hanging="360" w:left="2880"/>
+        <w:rPr/>
+      </w:pPr>
+      <w:r>
+        <w:rPr/>
+        <w:t>“</w:t>
+      </w:r>
+      <w:r>
+        <w:rPr/>
+        <w:t>jobs pending” – tells QView how many jobs QuizMachine client currently has pending</w:t>
       </w:r>
     </w:p>
     <w:p>
@@ -30851,693 +31344,6 @@
       <w:r>
         <w:rPr/>
         <w:t xml:space="preserve">returns: </w:t>
-      </w:r>
-    </w:p>
-    <w:p>
-      <w:pPr>
-        <w:pStyle w:val="normal1"/>
-        <w:numPr>
-          <w:ilvl w:val="0"/>
-          <w:numId w:val="1"/>
-        </w:numPr>
-        <w:ind w:hanging="360" w:left="720"/>
-        <w:rPr/>
-      </w:pPr>
-      <w:r>
-        <w:rPr/>
-        <w:t>GET PingMsg by ID</w:t>
-      </w:r>
-    </w:p>
-    <w:p>
-      <w:pPr>
-        <w:pStyle w:val="normal1"/>
-        <w:numPr>
-          <w:ilvl w:val="1"/>
-          <w:numId w:val="1"/>
-        </w:numPr>
-        <w:ind w:hanging="360" w:left="1440"/>
-        <w:rPr/>
-      </w:pPr>
-      <w:r>
-        <w:rPr/>
-        <w:t xml:space="preserve">built_including_tests: </w:t>
-      </w:r>
-      <w:r>
-        <w:rPr>
-          <w:b/>
-          <w:bCs/>
-        </w:rPr>
-        <w:t>false</w:t>
-      </w:r>
-    </w:p>
-    <w:p>
-      <w:pPr>
-        <w:pStyle w:val="normal1"/>
-        <w:numPr>
-          <w:ilvl w:val="1"/>
-          <w:numId w:val="1"/>
-        </w:numPr>
-        <w:ind w:hanging="360" w:left="1440"/>
-        <w:rPr/>
-      </w:pPr>
-      <w:r>
-        <w:rPr/>
-        <w:t>HTTP method: ‘GET’</w:t>
-      </w:r>
-    </w:p>
-    <w:p>
-      <w:pPr>
-        <w:pStyle w:val="normal1"/>
-        <w:numPr>
-          <w:ilvl w:val="1"/>
-          <w:numId w:val="1"/>
-        </w:numPr>
-        <w:ind w:hanging="360" w:left="1440"/>
-        <w:rPr/>
-      </w:pPr>
-      <w:r>
-        <w:rPr/>
-        <w:t>endpoint: {base_uri}/pingmsg/{id}</w:t>
-      </w:r>
-    </w:p>
-    <w:p>
-      <w:pPr>
-        <w:pStyle w:val="normal1"/>
-        <w:numPr>
-          <w:ilvl w:val="1"/>
-          <w:numId w:val="1"/>
-        </w:numPr>
-        <w:ind w:hanging="360" w:left="1440"/>
-        <w:rPr/>
-      </w:pPr>
-      <w:r>
-        <w:rPr/>
-        <w:t xml:space="preserve">description: </w:t>
-      </w:r>
-    </w:p>
-    <w:p>
-      <w:pPr>
-        <w:pStyle w:val="normal1"/>
-        <w:numPr>
-          <w:ilvl w:val="1"/>
-          <w:numId w:val="1"/>
-        </w:numPr>
-        <w:ind w:hanging="360" w:left="1440"/>
-        <w:rPr/>
-      </w:pPr>
-      <w:r>
-        <w:rPr/>
-        <w:t xml:space="preserve">parameters: </w:t>
-      </w:r>
-    </w:p>
-    <w:p>
-      <w:pPr>
-        <w:pStyle w:val="normal1"/>
-        <w:numPr>
-          <w:ilvl w:val="2"/>
-          <w:numId w:val="1"/>
-        </w:numPr>
-        <w:ind w:hanging="360" w:left="2160"/>
-        <w:rPr/>
-      </w:pPr>
-      <w:r>
-        <w:rPr/>
-        <w:t>id</w:t>
-      </w:r>
-    </w:p>
-    <w:p>
-      <w:pPr>
-        <w:pStyle w:val="normal1"/>
-        <w:numPr>
-          <w:ilvl w:val="3"/>
-          <w:numId w:val="1"/>
-        </w:numPr>
-        <w:ind w:hanging="360" w:left="2880"/>
-        <w:rPr>
-          <w:color w:val="FF0000"/>
-        </w:rPr>
-      </w:pPr>
-      <w:r>
-        <w:rPr>
-          <w:color w:val="FF0000"/>
-        </w:rPr>
-        <w:t>Required</w:t>
-      </w:r>
-    </w:p>
-    <w:p>
-      <w:pPr>
-        <w:pStyle w:val="normal1"/>
-        <w:numPr>
-          <w:ilvl w:val="3"/>
-          <w:numId w:val="1"/>
-        </w:numPr>
-        <w:ind w:hanging="360" w:left="2880"/>
-        <w:rPr/>
-      </w:pPr>
-      <w:r>
-        <w:rPr/>
-        <w:t>ID of the PingMsg to receive</w:t>
-      </w:r>
-    </w:p>
-    <w:p>
-      <w:pPr>
-        <w:pStyle w:val="normal1"/>
-        <w:widowControl/>
-        <w:numPr>
-          <w:ilvl w:val="1"/>
-          <w:numId w:val="1"/>
-        </w:numPr>
-        <w:suppressAutoHyphens w:val="true"/>
-        <w:bidi w:val="0"/>
-        <w:spacing w:lineRule="auto" w:line="276" w:before="0" w:after="0"/>
-        <w:ind w:hanging="360" w:left="1440" w:right="0"/>
-        <w:jc w:val="left"/>
-        <w:rPr/>
-      </w:pPr>
-      <w:r>
-        <w:rPr>
-          <w:b w:val="false"/>
-          <w:bCs w:val="false"/>
-          <w:color w:val="000000"/>
-        </w:rPr>
-        <w:t xml:space="preserve">returns: </w:t>
-      </w:r>
-    </w:p>
-    <w:p>
-      <w:pPr>
-        <w:pStyle w:val="normal1"/>
-        <w:numPr>
-          <w:ilvl w:val="0"/>
-          <w:numId w:val="1"/>
-        </w:numPr>
-        <w:ind w:hanging="360" w:left="720"/>
-        <w:rPr/>
-      </w:pPr>
-      <w:r>
-        <w:rPr/>
-        <w:t>POST/Create PingMsg</w:t>
-      </w:r>
-    </w:p>
-    <w:p>
-      <w:pPr>
-        <w:pStyle w:val="normal1"/>
-        <w:numPr>
-          <w:ilvl w:val="1"/>
-          <w:numId w:val="1"/>
-        </w:numPr>
-        <w:ind w:hanging="360" w:left="1440"/>
-        <w:rPr/>
-      </w:pPr>
-      <w:r>
-        <w:rPr/>
-        <w:t xml:space="preserve">built_including_tests: </w:t>
-      </w:r>
-      <w:r>
-        <w:rPr>
-          <w:b/>
-          <w:bCs/>
-        </w:rPr>
-        <w:t>false</w:t>
-      </w:r>
-    </w:p>
-    <w:p>
-      <w:pPr>
-        <w:pStyle w:val="normal1"/>
-        <w:numPr>
-          <w:ilvl w:val="1"/>
-          <w:numId w:val="1"/>
-        </w:numPr>
-        <w:ind w:hanging="360" w:left="1440"/>
-        <w:rPr/>
-      </w:pPr>
-      <w:r>
-        <w:rPr/>
-        <w:t>HTTP method: ‘POST’</w:t>
-      </w:r>
-    </w:p>
-    <w:p>
-      <w:pPr>
-        <w:pStyle w:val="normal1"/>
-        <w:numPr>
-          <w:ilvl w:val="1"/>
-          <w:numId w:val="1"/>
-        </w:numPr>
-        <w:ind w:hanging="360" w:left="1440"/>
-        <w:rPr/>
-      </w:pPr>
-      <w:r>
-        <w:rPr/>
-        <w:t>endpoint: {base_uri}/pingmsg</w:t>
-      </w:r>
-    </w:p>
-    <w:p>
-      <w:pPr>
-        <w:pStyle w:val="normal1"/>
-        <w:numPr>
-          <w:ilvl w:val="1"/>
-          <w:numId w:val="1"/>
-        </w:numPr>
-        <w:ind w:hanging="360" w:left="1440"/>
-        <w:rPr/>
-      </w:pPr>
-      <w:r>
-        <w:rPr/>
-        <w:t xml:space="preserve">description: </w:t>
-      </w:r>
-    </w:p>
-    <w:p>
-      <w:pPr>
-        <w:pStyle w:val="normal1"/>
-        <w:numPr>
-          <w:ilvl w:val="1"/>
-          <w:numId w:val="1"/>
-        </w:numPr>
-        <w:ind w:hanging="360" w:left="1440"/>
-        <w:rPr/>
-      </w:pPr>
-      <w:r>
-        <w:rPr/>
-        <w:t xml:space="preserve">body: </w:t>
-      </w:r>
-    </w:p>
-    <w:p>
-      <w:pPr>
-        <w:pStyle w:val="normal1"/>
-        <w:numPr>
-          <w:ilvl w:val="1"/>
-          <w:numId w:val="1"/>
-        </w:numPr>
-        <w:ind w:hanging="360" w:left="1440"/>
-        <w:rPr/>
-      </w:pPr>
-      <w:r>
-        <w:rPr/>
-        <w:t xml:space="preserve">parameters: </w:t>
-      </w:r>
-    </w:p>
-    <w:p>
-      <w:pPr>
-        <w:pStyle w:val="normal1"/>
-        <w:numPr>
-          <w:ilvl w:val="1"/>
-          <w:numId w:val="1"/>
-        </w:numPr>
-        <w:ind w:hanging="360" w:left="1440"/>
-        <w:rPr/>
-      </w:pPr>
-      <w:r>
-        <w:rPr/>
-        <w:t xml:space="preserve">returns: </w:t>
-      </w:r>
-    </w:p>
-    <w:p>
-      <w:pPr>
-        <w:pStyle w:val="normal1"/>
-        <w:widowControl/>
-        <w:numPr>
-          <w:ilvl w:val="2"/>
-          <w:numId w:val="1"/>
-        </w:numPr>
-        <w:suppressAutoHyphens w:val="true"/>
-        <w:bidi w:val="0"/>
-        <w:spacing w:lineRule="auto" w:line="276" w:before="0" w:after="0"/>
-        <w:ind w:hanging="360" w:left="2160" w:right="0"/>
-        <w:jc w:val="left"/>
-        <w:rPr/>
-      </w:pPr>
-      <w:r>
-        <w:rPr/>
-        <w:t>the created PingMsg</w:t>
-      </w:r>
-    </w:p>
-    <w:p>
-      <w:pPr>
-        <w:pStyle w:val="normal1"/>
-        <w:numPr>
-          <w:ilvl w:val="0"/>
-          <w:numId w:val="1"/>
-        </w:numPr>
-        <w:ind w:hanging="360" w:left="720"/>
-        <w:rPr/>
-      </w:pPr>
-      <w:r>
-        <w:rPr/>
-        <w:t>PUT/Update PingMsg</w:t>
-      </w:r>
-    </w:p>
-    <w:p>
-      <w:pPr>
-        <w:pStyle w:val="normal1"/>
-        <w:numPr>
-          <w:ilvl w:val="1"/>
-          <w:numId w:val="1"/>
-        </w:numPr>
-        <w:ind w:hanging="360" w:left="1440"/>
-        <w:rPr/>
-      </w:pPr>
-      <w:r>
-        <w:rPr/>
-        <w:t xml:space="preserve">built_including_tests: </w:t>
-      </w:r>
-      <w:r>
-        <w:rPr>
-          <w:b/>
-          <w:bCs/>
-        </w:rPr>
-        <w:t>false</w:t>
-      </w:r>
-    </w:p>
-    <w:p>
-      <w:pPr>
-        <w:pStyle w:val="normal1"/>
-        <w:numPr>
-          <w:ilvl w:val="1"/>
-          <w:numId w:val="1"/>
-        </w:numPr>
-        <w:ind w:hanging="360" w:left="1440"/>
-        <w:rPr/>
-      </w:pPr>
-      <w:r>
-        <w:rPr/>
-        <w:t>HTTP method: ‘PUT’</w:t>
-      </w:r>
-    </w:p>
-    <w:p>
-      <w:pPr>
-        <w:pStyle w:val="normal1"/>
-        <w:numPr>
-          <w:ilvl w:val="1"/>
-          <w:numId w:val="1"/>
-        </w:numPr>
-        <w:ind w:hanging="360" w:left="1440"/>
-        <w:rPr/>
-      </w:pPr>
-      <w:r>
-        <w:rPr/>
-        <w:t>endpoint: {base_uri}/pingmsg/{id}</w:t>
-      </w:r>
-    </w:p>
-    <w:p>
-      <w:pPr>
-        <w:pStyle w:val="normal1"/>
-        <w:numPr>
-          <w:ilvl w:val="1"/>
-          <w:numId w:val="1"/>
-        </w:numPr>
-        <w:ind w:hanging="360" w:left="1440"/>
-        <w:rPr/>
-      </w:pPr>
-      <w:r>
-        <w:rPr/>
-        <w:t xml:space="preserve">description: </w:t>
-      </w:r>
-    </w:p>
-    <w:p>
-      <w:pPr>
-        <w:pStyle w:val="normal1"/>
-        <w:numPr>
-          <w:ilvl w:val="1"/>
-          <w:numId w:val="1"/>
-        </w:numPr>
-        <w:ind w:hanging="360" w:left="1440"/>
-        <w:rPr/>
-      </w:pPr>
-      <w:r>
-        <w:rPr/>
-        <w:t xml:space="preserve">body: </w:t>
-      </w:r>
-    </w:p>
-    <w:p>
-      <w:pPr>
-        <w:pStyle w:val="normal1"/>
-        <w:widowControl/>
-        <w:numPr>
-          <w:ilvl w:val="2"/>
-          <w:numId w:val="1"/>
-        </w:numPr>
-        <w:suppressAutoHyphens w:val="true"/>
-        <w:bidi w:val="0"/>
-        <w:spacing w:lineRule="auto" w:line="276" w:before="0" w:after="0"/>
-        <w:ind w:hanging="360" w:left="2160" w:right="0"/>
-        <w:jc w:val="left"/>
-        <w:rPr/>
-      </w:pPr>
-      <w:r>
-        <w:rPr/>
-        <w:t>only fields that you want to update (other than ID in the URI path) need to be provided</w:t>
-      </w:r>
-    </w:p>
-    <w:p>
-      <w:pPr>
-        <w:pStyle w:val="normal1"/>
-        <w:numPr>
-          <w:ilvl w:val="1"/>
-          <w:numId w:val="1"/>
-        </w:numPr>
-        <w:ind w:hanging="360" w:left="1440"/>
-        <w:rPr/>
-      </w:pPr>
-      <w:r>
-        <w:rPr/>
-        <w:t>parameters:</w:t>
-      </w:r>
-    </w:p>
-    <w:p>
-      <w:pPr>
-        <w:pStyle w:val="normal1"/>
-        <w:numPr>
-          <w:ilvl w:val="2"/>
-          <w:numId w:val="1"/>
-        </w:numPr>
-        <w:ind w:hanging="360" w:left="2160"/>
-        <w:rPr/>
-      </w:pPr>
-      <w:r>
-        <w:rPr/>
-        <w:t>id</w:t>
-      </w:r>
-    </w:p>
-    <w:p>
-      <w:pPr>
-        <w:pStyle w:val="normal1"/>
-        <w:numPr>
-          <w:ilvl w:val="3"/>
-          <w:numId w:val="1"/>
-        </w:numPr>
-        <w:ind w:hanging="360" w:left="2880"/>
-        <w:rPr>
-          <w:color w:val="FF0000"/>
-        </w:rPr>
-      </w:pPr>
-      <w:r>
-        <w:rPr>
-          <w:color w:val="FF0000"/>
-        </w:rPr>
-        <w:t>Required</w:t>
-      </w:r>
-    </w:p>
-    <w:p>
-      <w:pPr>
-        <w:pStyle w:val="normal1"/>
-        <w:widowControl/>
-        <w:numPr>
-          <w:ilvl w:val="3"/>
-          <w:numId w:val="1"/>
-        </w:numPr>
-        <w:suppressAutoHyphens w:val="true"/>
-        <w:bidi w:val="0"/>
-        <w:spacing w:lineRule="auto" w:line="276" w:before="0" w:after="0"/>
-        <w:ind w:hanging="360" w:left="2880" w:right="0"/>
-        <w:jc w:val="left"/>
-        <w:rPr>
-          <w:color w:val="000000"/>
-        </w:rPr>
-      </w:pPr>
-      <w:r>
-        <w:rPr>
-          <w:color w:val="000000"/>
-        </w:rPr>
-        <w:t>ID of the PingMsg to be updated</w:t>
-      </w:r>
-    </w:p>
-    <w:p>
-      <w:pPr>
-        <w:pStyle w:val="normal1"/>
-        <w:numPr>
-          <w:ilvl w:val="1"/>
-          <w:numId w:val="1"/>
-        </w:numPr>
-        <w:ind w:hanging="360" w:left="1440"/>
-        <w:rPr>
-          <w:color w:val="000000"/>
-        </w:rPr>
-      </w:pPr>
-      <w:r>
-        <w:rPr/>
-        <w:t xml:space="preserve">returns: </w:t>
-      </w:r>
-    </w:p>
-    <w:p>
-      <w:pPr>
-        <w:pStyle w:val="normal1"/>
-        <w:widowControl/>
-        <w:numPr>
-          <w:ilvl w:val="2"/>
-          <w:numId w:val="1"/>
-        </w:numPr>
-        <w:suppressAutoHyphens w:val="true"/>
-        <w:bidi w:val="0"/>
-        <w:spacing w:lineRule="auto" w:line="276" w:before="0" w:after="0"/>
-        <w:ind w:hanging="360" w:left="2160" w:right="0"/>
-        <w:jc w:val="left"/>
-        <w:rPr>
-          <w:color w:val="000000"/>
-        </w:rPr>
-      </w:pPr>
-      <w:r>
-        <w:rPr>
-          <w:color w:val="000000"/>
-        </w:rPr>
-        <w:t>the updated PingMsg</w:t>
-      </w:r>
-    </w:p>
-    <w:p>
-      <w:pPr>
-        <w:pStyle w:val="normal1"/>
-        <w:numPr>
-          <w:ilvl w:val="0"/>
-          <w:numId w:val="1"/>
-        </w:numPr>
-        <w:ind w:hanging="360" w:left="720"/>
-        <w:rPr/>
-      </w:pPr>
-      <w:r>
-        <w:rPr/>
-        <w:t>DELETE PingMsg (by ID)</w:t>
-      </w:r>
-    </w:p>
-    <w:p>
-      <w:pPr>
-        <w:pStyle w:val="normal1"/>
-        <w:numPr>
-          <w:ilvl w:val="1"/>
-          <w:numId w:val="1"/>
-        </w:numPr>
-        <w:ind w:hanging="360" w:left="1440"/>
-        <w:rPr/>
-      </w:pPr>
-      <w:r>
-        <w:rPr/>
-        <w:t xml:space="preserve">built_including_tests: </w:t>
-      </w:r>
-      <w:r>
-        <w:rPr>
-          <w:b/>
-          <w:bCs/>
-        </w:rPr>
-        <w:t>false</w:t>
-      </w:r>
-    </w:p>
-    <w:p>
-      <w:pPr>
-        <w:pStyle w:val="normal1"/>
-        <w:numPr>
-          <w:ilvl w:val="1"/>
-          <w:numId w:val="1"/>
-        </w:numPr>
-        <w:ind w:hanging="360" w:left="1440"/>
-        <w:rPr/>
-      </w:pPr>
-      <w:r>
-        <w:rPr/>
-        <w:t>HTTP method: ‘DELETE’</w:t>
-      </w:r>
-    </w:p>
-    <w:p>
-      <w:pPr>
-        <w:pStyle w:val="normal1"/>
-        <w:numPr>
-          <w:ilvl w:val="1"/>
-          <w:numId w:val="1"/>
-        </w:numPr>
-        <w:ind w:hanging="360" w:left="1440"/>
-        <w:rPr/>
-      </w:pPr>
-      <w:r>
-        <w:rPr/>
-        <w:t>endpoint: {base_uri}/pingmsg/{id}</w:t>
-      </w:r>
-    </w:p>
-    <w:p>
-      <w:pPr>
-        <w:pStyle w:val="normal1"/>
-        <w:numPr>
-          <w:ilvl w:val="1"/>
-          <w:numId w:val="1"/>
-        </w:numPr>
-        <w:ind w:hanging="360" w:left="1440"/>
-        <w:rPr/>
-      </w:pPr>
-      <w:r>
-        <w:rPr/>
-        <w:t xml:space="preserve">description: </w:t>
-      </w:r>
-    </w:p>
-    <w:p>
-      <w:pPr>
-        <w:pStyle w:val="normal1"/>
-        <w:numPr>
-          <w:ilvl w:val="1"/>
-          <w:numId w:val="1"/>
-        </w:numPr>
-        <w:ind w:hanging="360" w:left="1440"/>
-        <w:rPr/>
-      </w:pPr>
-      <w:r>
-        <w:rPr/>
-        <w:t xml:space="preserve">parameters: </w:t>
-      </w:r>
-    </w:p>
-    <w:p>
-      <w:pPr>
-        <w:pStyle w:val="normal1"/>
-        <w:numPr>
-          <w:ilvl w:val="1"/>
-          <w:numId w:val="1"/>
-        </w:numPr>
-        <w:ind w:hanging="360" w:left="1440"/>
-        <w:rPr/>
-      </w:pPr>
-      <w:r>
-        <w:rPr/>
-        <w:t xml:space="preserve">returns: </w:t>
-      </w:r>
-    </w:p>
-    <w:p>
-      <w:pPr>
-        <w:pStyle w:val="normal1"/>
-        <w:widowControl/>
-        <w:numPr>
-          <w:ilvl w:val="2"/>
-          <w:numId w:val="1"/>
-        </w:numPr>
-        <w:suppressAutoHyphens w:val="true"/>
-        <w:bidi w:val="0"/>
-        <w:spacing w:lineRule="auto" w:line="276" w:before="0" w:after="0"/>
-        <w:ind w:hanging="360" w:left="2160" w:right="0"/>
-        <w:jc w:val="left"/>
-        <w:rPr>
-          <w:b w:val="false"/>
-          <w:bCs w:val="false"/>
-        </w:rPr>
-      </w:pPr>
-      <w:r>
-        <w:rPr>
-          <w:b w:val="false"/>
-          <w:bCs w:val="false"/>
-          <w:color w:val="000000"/>
-        </w:rPr>
-        <w:t>a 200 OK response only</w:t>
       </w:r>
     </w:p>
     <w:p>
@@ -50725,8 +50531,8 @@
       <w:u w:val="single"/>
     </w:rPr>
   </w:style>
-  <w:style w:type="character" w:styleId="Bullets">
-    <w:name w:val="Bullets"/>
+  <w:style w:type="character" w:styleId="Bulletsuser">
+    <w:name w:val="Bullets (user)"/>
     <w:qFormat/>
     <w:rPr>
       <w:rFonts w:ascii="OpenSymbol" w:hAnsi="OpenSymbol" w:eastAsia="OpenSymbol" w:cs="OpenSymbol"/>

</xml_diff>

<commit_message>
added Room Monitor logic, endpoint and API documentation of said endpoint; included 2 error types ('data incomplete, resend advised' and 'room not comunicating, late?'); made seed GameEvents toggle-able (for manual testing with and without gameevents); made game calculator fn more safe by preventing unneccesary panics; added a check on events to ensure that we're no calculating based off of invalid GameEvent sets (1 set = 1 Game's events)
</commit_message>
<xml_diff>
--- a/docs/QView API Documentation.docx
+++ b/docs/QView API Documentation.docx
@@ -14,19 +14,11 @@
       </w:r>
       <w:r>
         <w:rPr/>
-        <w:t>4</w:t>
-      </w:r>
-      <w:r>
-        <w:rPr/>
-        <w:t>_2026.08.1</w:t>
-      </w:r>
-      <w:r>
-        <w:rPr/>
-        <w:t>7</w:t>
-      </w:r>
-      <w:r>
-        <w:rPr/>
-        <w:t>)</w:t>
+        <w:t>5</w:t>
+      </w:r>
+      <w:r>
+        <w:rPr/>
+        <w:t>_2026.08.17)</w:t>
       </w:r>
     </w:p>
     <w:p>
@@ -30680,15 +30672,7 @@
       </w:pPr>
       <w:r>
         <w:rPr/>
-        <w:t>endpoint: {base_uri}/</w:t>
-      </w:r>
-      <w:r>
-        <w:rPr/>
-        <w:t>api/</w:t>
-      </w:r>
-      <w:r>
-        <w:rPr/>
-        <w:t>pingmsg?gid={}&amp;bldgroom={}&amp;key={}&amp;tk={}&amp;tn={}&amp;dn={}&amp;rm={}&amp;rd={}&amp;qn={}&amp;qmv={}&amp;ts={}&amp;jp={}</w:t>
+        <w:t>endpoint: {base_uri}/api/pingmsg?gid={}&amp;bldgroom={}&amp;key={}&amp;tk={}&amp;tn={}&amp;dn={}&amp;rm={}&amp;rd={}&amp;qn={}&amp;qmv={}&amp;ts={}&amp;jp={}</w:t>
       </w:r>
     </w:p>
     <w:p>
@@ -30704,11 +30688,7 @@
       </w:pPr>
       <w:r>
         <w:rPr/>
-        <w:t xml:space="preserve">description: </w:t>
-      </w:r>
-      <w:r>
-        <w:rPr/>
-        <w:t>constant check-in endpoint for QuizMachine; used for QView Room Monitor UI</w:t>
+        <w:t>description: constant check-in endpoint for QuizMachine; used for QView Room Monitor UI</w:t>
       </w:r>
     </w:p>
     <w:p>
@@ -30738,11 +30718,7 @@
       </w:pPr>
       <w:r>
         <w:rPr/>
-        <w:t>gid</w:t>
-      </w:r>
-      <w:r>
-        <w:rPr/>
-        <w:t>={}</w:t>
+        <w:t>gid={}</w:t>
       </w:r>
     </w:p>
     <w:p>
@@ -30791,11 +30767,7 @@
       </w:pPr>
       <w:r>
         <w:rPr/>
-        <w:t>bldgroom</w:t>
-      </w:r>
-      <w:r>
-        <w:rPr/>
-        <w:t>={}</w:t>
+        <w:t>bldgroom={}</w:t>
       </w:r>
     </w:p>
     <w:p>
@@ -30829,11 +30801,7 @@
       </w:pPr>
       <w:r>
         <w:rPr/>
-        <w:t>key</w:t>
-      </w:r>
-      <w:r>
-        <w:rPr/>
-        <w:t>={}</w:t>
+        <w:t>key={}</w:t>
       </w:r>
     </w:p>
     <w:p>
@@ -30868,11 +30836,7 @@
       </w:pPr>
       <w:r>
         <w:rPr/>
-        <w:t>tk</w:t>
-      </w:r>
-      <w:r>
-        <w:rPr/>
-        <w:t>={}</w:t>
+        <w:t>tk={}</w:t>
       </w:r>
     </w:p>
     <w:p>
@@ -30906,11 +30870,7 @@
       </w:pPr>
       <w:r>
         <w:rPr/>
-        <w:t>tn</w:t>
-      </w:r>
-      <w:r>
-        <w:rPr/>
-        <w:t>={}</w:t>
+        <w:t>tn={}</w:t>
       </w:r>
     </w:p>
     <w:p>
@@ -30963,11 +30923,7 @@
       </w:pPr>
       <w:r>
         <w:rPr/>
-        <w:t>dn</w:t>
-      </w:r>
-      <w:r>
-        <w:rPr/>
-        <w:t>={}</w:t>
+        <w:t>dn={}</w:t>
       </w:r>
     </w:p>
     <w:p>
@@ -31020,11 +30976,7 @@
       </w:pPr>
       <w:r>
         <w:rPr/>
-        <w:t>rm</w:t>
-      </w:r>
-      <w:r>
-        <w:rPr/>
-        <w:t>={}</w:t>
+        <w:t>rm={}</w:t>
       </w:r>
     </w:p>
     <w:p>
@@ -31077,11 +31029,7 @@
       </w:pPr>
       <w:r>
         <w:rPr/>
-        <w:t>rd</w:t>
-      </w:r>
-      <w:r>
-        <w:rPr/>
-        <w:t>={}</w:t>
+        <w:t>rd={}</w:t>
       </w:r>
     </w:p>
     <w:p>
@@ -31134,11 +31082,7 @@
       </w:pPr>
       <w:r>
         <w:rPr/>
-        <w:t>qn</w:t>
-      </w:r>
-      <w:r>
-        <w:rPr/>
-        <w:t>={}</w:t>
+        <w:t>qn={}</w:t>
       </w:r>
     </w:p>
     <w:p>
@@ -31191,11 +31135,7 @@
       </w:pPr>
       <w:r>
         <w:rPr/>
-        <w:t>qmv</w:t>
-      </w:r>
-      <w:r>
-        <w:rPr/>
-        <w:t>={}</w:t>
+        <w:t>qmv={}</w:t>
       </w:r>
     </w:p>
     <w:p>
@@ -31248,11 +31188,7 @@
       </w:pPr>
       <w:r>
         <w:rPr/>
-        <w:t>ts</w:t>
-      </w:r>
-      <w:r>
-        <w:rPr/>
-        <w:t>={}</w:t>
+        <w:t>ts={}</w:t>
       </w:r>
     </w:p>
     <w:p>
@@ -31286,11 +31222,7 @@
       </w:pPr>
       <w:r>
         <w:rPr/>
-        <w:t>jp</w:t>
-      </w:r>
-      <w:r>
-        <w:rPr/>
-        <w:t>={}</w:t>
+        <w:t>jp={}</w:t>
       </w:r>
     </w:p>
     <w:p>
@@ -33991,6 +33923,205 @@
       </w:pPr>
       <w:r>
         <w:rPr/>
+        <w:t xml:space="preserve">returns: </w:t>
+      </w:r>
+    </w:p>
+    <w:p>
+      <w:pPr>
+        <w:pStyle w:val="normal1"/>
+        <w:numPr>
+          <w:ilvl w:val="0"/>
+          <w:numId w:val="1"/>
+        </w:numPr>
+        <w:ind w:hanging="360" w:left="720"/>
+        <w:rPr/>
+      </w:pPr>
+      <w:r>
+        <w:rPr/>
+        <w:t xml:space="preserve">GET Room </w:t>
+      </w:r>
+      <w:r>
+        <w:rPr/>
+        <w:t>Monitor (Status)</w:t>
+      </w:r>
+      <w:r>
+        <w:rPr/>
+        <w:t xml:space="preserve"> by ID</w:t>
+      </w:r>
+    </w:p>
+    <w:p>
+      <w:pPr>
+        <w:pStyle w:val="normal1"/>
+        <w:numPr>
+          <w:ilvl w:val="1"/>
+          <w:numId w:val="1"/>
+        </w:numPr>
+        <w:ind w:hanging="360" w:left="1440"/>
+        <w:rPr/>
+      </w:pPr>
+      <w:r>
+        <w:rPr/>
+        <w:t xml:space="preserve">built_including_tests: </w:t>
+      </w:r>
+      <w:r>
+        <w:rPr>
+          <w:b/>
+          <w:bCs/>
+        </w:rPr>
+        <w:t>false</w:t>
+      </w:r>
+    </w:p>
+    <w:p>
+      <w:pPr>
+        <w:pStyle w:val="normal1"/>
+        <w:numPr>
+          <w:ilvl w:val="1"/>
+          <w:numId w:val="1"/>
+        </w:numPr>
+        <w:ind w:hanging="360" w:left="1440"/>
+        <w:rPr/>
+      </w:pPr>
+      <w:r>
+        <w:rPr/>
+        <w:t>HTTP method: ‘GET’</w:t>
+      </w:r>
+    </w:p>
+    <w:p>
+      <w:pPr>
+        <w:pStyle w:val="normal1"/>
+        <w:numPr>
+          <w:ilvl w:val="1"/>
+          <w:numId w:val="1"/>
+        </w:numPr>
+        <w:ind w:hanging="360" w:left="1440"/>
+        <w:rPr/>
+      </w:pPr>
+      <w:r>
+        <w:rPr/>
+        <w:t>endpoint: {base_uri}/api/</w:t>
+      </w:r>
+      <w:r>
+        <w:rPr/>
+        <w:t>tournaments/{id}/</w:t>
+      </w:r>
+      <w:r>
+        <w:rPr/>
+        <w:t>room</w:t>
+      </w:r>
+      <w:r>
+        <w:rPr/>
+        <w:t>monitor</w:t>
+      </w:r>
+    </w:p>
+    <w:p>
+      <w:pPr>
+        <w:pStyle w:val="normal1"/>
+        <w:numPr>
+          <w:ilvl w:val="1"/>
+          <w:numId w:val="1"/>
+        </w:numPr>
+        <w:ind w:hanging="360" w:left="1440"/>
+        <w:rPr/>
+      </w:pPr>
+      <w:r>
+        <w:rPr/>
+        <w:t xml:space="preserve">description: </w:t>
+      </w:r>
+    </w:p>
+    <w:p>
+      <w:pPr>
+        <w:pStyle w:val="normal1"/>
+        <w:numPr>
+          <w:ilvl w:val="1"/>
+          <w:numId w:val="1"/>
+        </w:numPr>
+        <w:ind w:hanging="360" w:left="1440"/>
+        <w:rPr/>
+      </w:pPr>
+      <w:r>
+        <w:rPr/>
+        <w:t xml:space="preserve">parameters: </w:t>
+      </w:r>
+    </w:p>
+    <w:p>
+      <w:pPr>
+        <w:pStyle w:val="normal1"/>
+        <w:numPr>
+          <w:ilvl w:val="2"/>
+          <w:numId w:val="1"/>
+        </w:numPr>
+        <w:ind w:hanging="360" w:left="2160"/>
+        <w:rPr/>
+      </w:pPr>
+      <w:r>
+        <w:rPr/>
+        <w:t>id</w:t>
+      </w:r>
+    </w:p>
+    <w:p>
+      <w:pPr>
+        <w:pStyle w:val="normal1"/>
+        <w:numPr>
+          <w:ilvl w:val="3"/>
+          <w:numId w:val="1"/>
+        </w:numPr>
+        <w:ind w:hanging="360" w:left="2880"/>
+        <w:rPr>
+          <w:color w:val="FF0000"/>
+        </w:rPr>
+      </w:pPr>
+      <w:r>
+        <w:rPr>
+          <w:color w:val="FF0000"/>
+        </w:rPr>
+        <w:t>Required</w:t>
+      </w:r>
+    </w:p>
+    <w:p>
+      <w:pPr>
+        <w:pStyle w:val="normal1"/>
+        <w:numPr>
+          <w:ilvl w:val="3"/>
+          <w:numId w:val="1"/>
+        </w:numPr>
+        <w:ind w:hanging="360" w:left="2880"/>
+        <w:rPr/>
+      </w:pPr>
+      <w:r>
+        <w:rPr/>
+        <w:t xml:space="preserve">ID of the </w:t>
+      </w:r>
+      <w:r>
+        <w:rPr/>
+        <w:t>Tournament</w:t>
+      </w:r>
+      <w:r>
+        <w:rPr/>
+        <w:t xml:space="preserve"> to receive </w:t>
+      </w:r>
+      <w:r>
+        <w:rPr/>
+        <w:t>Rooms status updates about (for connected QuizMachine clients that are emitting ping requests)</w:t>
+      </w:r>
+    </w:p>
+    <w:p>
+      <w:pPr>
+        <w:pStyle w:val="normal1"/>
+        <w:numPr>
+          <w:ilvl w:val="1"/>
+          <w:numId w:val="1"/>
+        </w:numPr>
+        <w:ind w:hanging="360" w:left="1440"/>
+        <w:rPr>
+          <w:b w:val="false"/>
+          <w:bCs w:val="false"/>
+        </w:rPr>
+      </w:pPr>
+      <w:r>
+        <w:rPr>
+          <w:b w:val="false"/>
+          <w:bCs w:val="false"/>
+        </w:rPr>
         <w:t xml:space="preserve">returns: </w:t>
       </w:r>
     </w:p>
@@ -50531,8 +50662,8 @@
       <w:u w:val="single"/>
     </w:rPr>
   </w:style>
-  <w:style w:type="character" w:styleId="Bulletsuser">
-    <w:name w:val="Bullets (user)"/>
+  <w:style w:type="character" w:styleId="Bullets">
+    <w:name w:val="Bullets"/>
     <w:qFormat/>
     <w:rPr>
       <w:rFonts w:ascii="OpenSymbol" w:hAnsi="OpenSymbol" w:eastAsia="OpenSymbol" w:cs="OpenSymbol"/>

</xml_diff>

<commit_message>
added a column to 'games' table for checking if a resend request is live so that it can be sent exactly one time instead of indefinitely until there are no missing gameevents in the sequence; made the 'Resend' button disabled in the UI when data is complete and active when incomplete (the only use case); added a new endpoint for request a resend (plus API documentation)
</commit_message>
<xml_diff>
--- a/docs/QView API Documentation.docx
+++ b/docs/QView API Documentation.docx
@@ -14,11 +14,15 @@
       </w:r>
       <w:r>
         <w:rPr/>
-        <w:t>5</w:t>
-      </w:r>
-      <w:r>
-        <w:rPr/>
-        <w:t>_2026.08.17)</w:t>
+        <w:t>6</w:t>
+      </w:r>
+      <w:r>
+        <w:rPr/>
+        <w:t>_2026.08.</w:t>
+      </w:r>
+      <w:r>
+        <w:rPr/>
+        <w:t>20)</w:t>
       </w:r>
     </w:p>
     <w:p>
@@ -17778,6 +17782,211 @@
       </w:pPr>
       <w:r>
         <w:rPr/>
+        <w:t xml:space="preserve">POST </w:t>
+      </w:r>
+      <w:r>
+        <w:rPr/>
+        <w:t>Resend Game’s Events (GameEvents)</w:t>
+      </w:r>
+    </w:p>
+    <w:p>
+      <w:pPr>
+        <w:pStyle w:val="normal1"/>
+        <w:numPr>
+          <w:ilvl w:val="1"/>
+          <w:numId w:val="1"/>
+        </w:numPr>
+        <w:ind w:hanging="360" w:left="1440"/>
+        <w:rPr/>
+      </w:pPr>
+      <w:r>
+        <w:rPr/>
+        <w:t xml:space="preserve">built_including_tests: </w:t>
+      </w:r>
+      <w:r>
+        <w:rPr>
+          <w:b/>
+          <w:bCs/>
+        </w:rPr>
+        <w:t>false</w:t>
+      </w:r>
+    </w:p>
+    <w:p>
+      <w:pPr>
+        <w:pStyle w:val="normal1"/>
+        <w:numPr>
+          <w:ilvl w:val="1"/>
+          <w:numId w:val="1"/>
+        </w:numPr>
+        <w:ind w:hanging="360" w:left="1440"/>
+        <w:rPr/>
+      </w:pPr>
+      <w:r>
+        <w:rPr/>
+        <w:t>HTTP method: ‘POST’</w:t>
+      </w:r>
+    </w:p>
+    <w:p>
+      <w:pPr>
+        <w:pStyle w:val="normal1"/>
+        <w:numPr>
+          <w:ilvl w:val="1"/>
+          <w:numId w:val="1"/>
+        </w:numPr>
+        <w:ind w:hanging="360" w:left="1440"/>
+        <w:rPr/>
+      </w:pPr>
+      <w:r>
+        <w:rPr/>
+        <w:t>endpoint: {base_uri}/api/</w:t>
+      </w:r>
+      <w:r>
+        <w:rPr/>
+        <w:t>games</w:t>
+      </w:r>
+      <w:r>
+        <w:rPr/>
+        <w:t>/{id}/</w:t>
+      </w:r>
+      <w:r>
+        <w:rPr/>
+        <w:t>request-resend</w:t>
+      </w:r>
+    </w:p>
+    <w:p>
+      <w:pPr>
+        <w:pStyle w:val="normal1"/>
+        <w:numPr>
+          <w:ilvl w:val="1"/>
+          <w:numId w:val="1"/>
+        </w:numPr>
+        <w:ind w:hanging="360" w:left="1440"/>
+        <w:rPr/>
+      </w:pPr>
+      <w:r>
+        <w:rPr/>
+        <w:t xml:space="preserve">description: </w:t>
+      </w:r>
+      <w:r>
+        <w:rPr/>
+        <w:t>Used by the user viewing the Room Monitor to ‘Resend’ all gameevents for that current game.</w:t>
+      </w:r>
+    </w:p>
+    <w:p>
+      <w:pPr>
+        <w:pStyle w:val="normal1"/>
+        <w:numPr>
+          <w:ilvl w:val="1"/>
+          <w:numId w:val="1"/>
+        </w:numPr>
+        <w:ind w:hanging="360" w:left="1440"/>
+        <w:rPr/>
+      </w:pPr>
+      <w:r>
+        <w:rPr/>
+        <w:t xml:space="preserve">body: </w:t>
+      </w:r>
+    </w:p>
+    <w:p>
+      <w:pPr>
+        <w:pStyle w:val="normal1"/>
+        <w:numPr>
+          <w:ilvl w:val="1"/>
+          <w:numId w:val="1"/>
+        </w:numPr>
+        <w:ind w:hanging="360" w:left="1440"/>
+        <w:rPr/>
+      </w:pPr>
+      <w:r>
+        <w:rPr/>
+        <w:t xml:space="preserve">parameters: </w:t>
+      </w:r>
+    </w:p>
+    <w:p>
+      <w:pPr>
+        <w:pStyle w:val="normal1"/>
+        <w:numPr>
+          <w:ilvl w:val="2"/>
+          <w:numId w:val="1"/>
+        </w:numPr>
+        <w:ind w:hanging="360" w:left="2160"/>
+        <w:rPr/>
+      </w:pPr>
+      <w:r>
+        <w:rPr/>
+        <w:t>id</w:t>
+      </w:r>
+    </w:p>
+    <w:p>
+      <w:pPr>
+        <w:pStyle w:val="normal1"/>
+        <w:numPr>
+          <w:ilvl w:val="3"/>
+          <w:numId w:val="1"/>
+        </w:numPr>
+        <w:ind w:hanging="360" w:left="2880"/>
+        <w:rPr>
+          <w:color w:val="FF0000"/>
+        </w:rPr>
+      </w:pPr>
+      <w:r>
+        <w:rPr>
+          <w:color w:val="FF0000"/>
+        </w:rPr>
+        <w:t>Required</w:t>
+      </w:r>
+    </w:p>
+    <w:p>
+      <w:pPr>
+        <w:pStyle w:val="normal1"/>
+        <w:widowControl/>
+        <w:numPr>
+          <w:ilvl w:val="3"/>
+          <w:numId w:val="1"/>
+        </w:numPr>
+        <w:suppressAutoHyphens w:val="true"/>
+        <w:bidi w:val="0"/>
+        <w:spacing w:lineRule="auto" w:line="276" w:before="0" w:after="0"/>
+        <w:ind w:hanging="360" w:left="2880" w:right="0"/>
+        <w:jc w:val="left"/>
+        <w:rPr/>
+      </w:pPr>
+      <w:r>
+        <w:rPr/>
+        <w:t xml:space="preserve">ID of Game to </w:t>
+      </w:r>
+      <w:r>
+        <w:rPr/>
+        <w:t>resend GameEvents for</w:t>
+      </w:r>
+    </w:p>
+    <w:p>
+      <w:pPr>
+        <w:pStyle w:val="normal1"/>
+        <w:numPr>
+          <w:ilvl w:val="1"/>
+          <w:numId w:val="1"/>
+        </w:numPr>
+        <w:ind w:hanging="360" w:left="1440"/>
+        <w:rPr/>
+      </w:pPr>
+      <w:r>
+        <w:rPr/>
+        <w:t xml:space="preserve">returns: </w:t>
+      </w:r>
+    </w:p>
+    <w:p>
+      <w:pPr>
+        <w:pStyle w:val="normal1"/>
+        <w:numPr>
+          <w:ilvl w:val="0"/>
+          <w:numId w:val="1"/>
+        </w:numPr>
+        <w:ind w:hanging="360" w:left="720"/>
+        <w:rPr/>
+      </w:pPr>
+      <w:r>
+        <w:rPr/>
         <w:t>PUT/Update Game</w:t>
       </w:r>
     </w:p>
@@ -33938,15 +34147,7 @@
       </w:pPr>
       <w:r>
         <w:rPr/>
-        <w:t xml:space="preserve">GET Room </w:t>
-      </w:r>
-      <w:r>
-        <w:rPr/>
-        <w:t>Monitor (Status)</w:t>
-      </w:r>
-      <w:r>
-        <w:rPr/>
-        <w:t xml:space="preserve"> by ID</w:t>
+        <w:t>GET Room Monitor (Status) by ID</w:t>
       </w:r>
     </w:p>
     <w:p>
@@ -33998,19 +34199,7 @@
       </w:pPr>
       <w:r>
         <w:rPr/>
-        <w:t>endpoint: {base_uri}/api/</w:t>
-      </w:r>
-      <w:r>
-        <w:rPr/>
-        <w:t>tournaments/{id}/</w:t>
-      </w:r>
-      <w:r>
-        <w:rPr/>
-        <w:t>room</w:t>
-      </w:r>
-      <w:r>
-        <w:rPr/>
-        <w:t>monitor</w:t>
+        <w:t>endpoint: {base_uri}/api/tournaments/{id}/roommonitor</w:t>
       </w:r>
     </w:p>
     <w:p>
@@ -34089,19 +34278,7 @@
       </w:pPr>
       <w:r>
         <w:rPr/>
-        <w:t xml:space="preserve">ID of the </w:t>
-      </w:r>
-      <w:r>
-        <w:rPr/>
-        <w:t>Tournament</w:t>
-      </w:r>
-      <w:r>
-        <w:rPr/>
-        <w:t xml:space="preserve"> to receive </w:t>
-      </w:r>
-      <w:r>
-        <w:rPr/>
-        <w:t>Rooms status updates about (for connected QuizMachine clients that are emitting ping requests)</w:t>
+        <w:t>ID of the Tournament to receive Rooms status updates about (for connected QuizMachine clients that are emitting ping requests)</w:t>
       </w:r>
     </w:p>
     <w:p>
@@ -50662,8 +50839,8 @@
       <w:u w:val="single"/>
     </w:rPr>
   </w:style>
-  <w:style w:type="character" w:styleId="Bullets">
-    <w:name w:val="Bullets"/>
+  <w:style w:type="character" w:styleId="Bulletsuser">
+    <w:name w:val="Bullets (user)"/>
     <w:qFormat/>
     <w:rPr>
       <w:rFonts w:ascii="OpenSymbol" w:hAnsi="OpenSymbol" w:eastAsia="OpenSymbol" w:cs="OpenSymbol"/>

</xml_diff>

<commit_message>
Tournaments model's read_between_dates fn now takes a visibility parameter, affecting 2 endpoints, so that default behavior of those 2 endpoints can be that only public Tournaments are returned by default, with optional overrides. Added a button to allow tournament managers to easily navigate from Tournament Finder to their Managed Tournaments.
</commit_message>
<xml_diff>
--- a/docs/QView API Documentation.docx
+++ b/docs/QView API Documentation.docx
@@ -14,15 +14,19 @@
       </w:r>
       <w:r>
         <w:rPr/>
-        <w:t>6</w:t>
-      </w:r>
-      <w:r>
-        <w:rPr/>
-        <w:t>_2026.08.</w:t>
-      </w:r>
-      <w:r>
-        <w:rPr/>
-        <w:t>20)</w:t>
+        <w:t>7</w:t>
+      </w:r>
+      <w:r>
+        <w:rPr/>
+        <w:t>_2026.0</w:t>
+      </w:r>
+      <w:r>
+        <w:rPr/>
+        <w:t>9.02</w:t>
+      </w:r>
+      <w:r>
+        <w:rPr/>
+        <w:t>)</w:t>
       </w:r>
     </w:p>
     <w:p>
@@ -17782,11 +17786,7 @@
       </w:pPr>
       <w:r>
         <w:rPr/>
-        <w:t xml:space="preserve">POST </w:t>
-      </w:r>
-      <w:r>
-        <w:rPr/>
-        <w:t>Resend Game’s Events (GameEvents)</w:t>
+        <w:t>POST Resend Game’s Events (GameEvents)</w:t>
       </w:r>
     </w:p>
     <w:p>
@@ -17838,38 +17838,22 @@
       </w:pPr>
       <w:r>
         <w:rPr/>
-        <w:t>endpoint: {base_uri}/api/</w:t>
-      </w:r>
-      <w:r>
-        <w:rPr/>
-        <w:t>games</w:t>
-      </w:r>
-      <w:r>
-        <w:rPr/>
-        <w:t>/{id}/</w:t>
-      </w:r>
-      <w:r>
-        <w:rPr/>
-        <w:t>request-resend</w:t>
-      </w:r>
-    </w:p>
-    <w:p>
-      <w:pPr>
-        <w:pStyle w:val="normal1"/>
-        <w:numPr>
-          <w:ilvl w:val="1"/>
-          <w:numId w:val="1"/>
-        </w:numPr>
-        <w:ind w:hanging="360" w:left="1440"/>
-        <w:rPr/>
-      </w:pPr>
-      <w:r>
-        <w:rPr/>
-        <w:t xml:space="preserve">description: </w:t>
-      </w:r>
-      <w:r>
-        <w:rPr/>
-        <w:t>Used by the user viewing the Room Monitor to ‘Resend’ all gameevents for that current game.</w:t>
+        <w:t>endpoint: {base_uri}/api/games/{id}/request-resend</w:t>
+      </w:r>
+    </w:p>
+    <w:p>
+      <w:pPr>
+        <w:pStyle w:val="normal1"/>
+        <w:numPr>
+          <w:ilvl w:val="1"/>
+          <w:numId w:val="1"/>
+        </w:numPr>
+        <w:ind w:hanging="360" w:left="1440"/>
+        <w:rPr/>
+      </w:pPr>
+      <w:r>
+        <w:rPr/>
+        <w:t>description: Used by the user viewing the Room Monitor to ‘Resend’ all gameevents for that current game.</w:t>
       </w:r>
     </w:p>
     <w:p>
@@ -17953,11 +17937,7 @@
       </w:pPr>
       <w:r>
         <w:rPr/>
-        <w:t xml:space="preserve">ID of Game to </w:t>
-      </w:r>
-      <w:r>
-        <w:rPr/>
-        <w:t>resend GameEvents for</w:t>
+        <w:t>ID of Game to resend GameEvents for</w:t>
       </w:r>
     </w:p>
     <w:p>
@@ -45674,6 +45654,10 @@
         <w:rPr/>
         <w:t>endpoint: {base_uri}/api/tournaments/filter?from_date={date}&amp;to_date={date}</w:t>
       </w:r>
+      <w:r>
+        <w:rPr/>
+        <w:t>&amp;visibility={}</w:t>
+      </w:r>
     </w:p>
     <w:p>
       <w:pPr>
@@ -45688,136 +45672,6 @@
       <w:r>
         <w:rPr/>
         <w:t xml:space="preserve">description: </w:t>
-      </w:r>
-    </w:p>
-    <w:p>
-      <w:pPr>
-        <w:pStyle w:val="normal1"/>
-        <w:numPr>
-          <w:ilvl w:val="1"/>
-          <w:numId w:val="1"/>
-        </w:numPr>
-        <w:ind w:hanging="360" w:left="1440"/>
-        <w:rPr/>
-      </w:pPr>
-      <w:r>
-        <w:rPr/>
-        <w:t xml:space="preserve">parameters: </w:t>
-      </w:r>
-    </w:p>
-    <w:p>
-      <w:pPr>
-        <w:pStyle w:val="normal1"/>
-        <w:numPr>
-          <w:ilvl w:val="2"/>
-          <w:numId w:val="1"/>
-        </w:numPr>
-        <w:ind w:hanging="360" w:left="2160"/>
-        <w:rPr/>
-      </w:pPr>
-      <w:r>
-        <w:rPr/>
-        <w:t>from_date={date}</w:t>
-      </w:r>
-    </w:p>
-    <w:p>
-      <w:pPr>
-        <w:pStyle w:val="normal1"/>
-        <w:numPr>
-          <w:ilvl w:val="3"/>
-          <w:numId w:val="1"/>
-        </w:numPr>
-        <w:ind w:hanging="360" w:left="2880"/>
-        <w:rPr>
-          <w:color w:val="FF0000"/>
-        </w:rPr>
-      </w:pPr>
-      <w:r>
-        <w:rPr>
-          <w:color w:val="FF0000"/>
-        </w:rPr>
-        <w:t>Required</w:t>
-      </w:r>
-    </w:p>
-    <w:p>
-      <w:pPr>
-        <w:pStyle w:val="normal1"/>
-        <w:numPr>
-          <w:ilvl w:val="3"/>
-          <w:numId w:val="1"/>
-        </w:numPr>
-        <w:ind w:hanging="360" w:left="2880"/>
-        <w:rPr>
-          <w:u w:val="none"/>
-        </w:rPr>
-      </w:pPr>
-      <w:r>
-        <w:rPr/>
-        <w:t>Defines the start of the date range (inclusive) for returning tournaments</w:t>
-      </w:r>
-    </w:p>
-    <w:p>
-      <w:pPr>
-        <w:pStyle w:val="normal1"/>
-        <w:numPr>
-          <w:ilvl w:val="2"/>
-          <w:numId w:val="1"/>
-        </w:numPr>
-        <w:ind w:hanging="360" w:left="2160"/>
-        <w:rPr/>
-      </w:pPr>
-      <w:r>
-        <w:rPr/>
-        <w:t>to_date={date}</w:t>
-      </w:r>
-    </w:p>
-    <w:p>
-      <w:pPr>
-        <w:pStyle w:val="normal1"/>
-        <w:numPr>
-          <w:ilvl w:val="3"/>
-          <w:numId w:val="1"/>
-        </w:numPr>
-        <w:ind w:hanging="360" w:left="2880"/>
-        <w:rPr>
-          <w:color w:val="FF0000"/>
-        </w:rPr>
-      </w:pPr>
-      <w:r>
-        <w:rPr>
-          <w:color w:val="FF0000"/>
-        </w:rPr>
-        <w:t>Required</w:t>
-      </w:r>
-    </w:p>
-    <w:p>
-      <w:pPr>
-        <w:pStyle w:val="normal1"/>
-        <w:numPr>
-          <w:ilvl w:val="3"/>
-          <w:numId w:val="1"/>
-        </w:numPr>
-        <w:ind w:hanging="360" w:left="2880"/>
-        <w:rPr/>
-      </w:pPr>
-      <w:r>
-        <w:rPr/>
-        <w:t>Defines the end of the date range (inclusive) for returning tournaments</w:t>
-      </w:r>
-    </w:p>
-    <w:p>
-      <w:pPr>
-        <w:pStyle w:val="normal1"/>
-        <w:numPr>
-          <w:ilvl w:val="1"/>
-          <w:numId w:val="1"/>
-        </w:numPr>
-        <w:ind w:hanging="360" w:left="1440"/>
-        <w:rPr/>
-      </w:pPr>
-      <w:r>
-        <w:rPr/>
-        <w:t xml:space="preserve">returns: </w:t>
       </w:r>
     </w:p>
     <w:p>
@@ -45837,89 +45691,122 @@
       </w:pPr>
       <w:r>
         <w:rPr/>
-        <w:t>all tournaments that fall partially or completely within the date range</w:t>
-      </w:r>
-    </w:p>
-    <w:p>
-      <w:pPr>
-        <w:pStyle w:val="normal1"/>
-        <w:numPr>
-          <w:ilvl w:val="0"/>
-          <w:numId w:val="1"/>
-        </w:numPr>
-        <w:ind w:hanging="360" w:left="720"/>
-        <w:rPr/>
-      </w:pPr>
-      <w:r>
-        <w:rPr/>
-        <w:t>GET All Tournaments Around Today’s Date</w:t>
-      </w:r>
-    </w:p>
-    <w:p>
-      <w:pPr>
-        <w:pStyle w:val="normal1"/>
-        <w:numPr>
-          <w:ilvl w:val="1"/>
-          <w:numId w:val="1"/>
-        </w:numPr>
-        <w:ind w:hanging="360" w:left="1440"/>
-        <w:rPr/>
-      </w:pPr>
-      <w:r>
-        <w:rPr/>
-        <w:t xml:space="preserve">built_including_tests: </w:t>
-      </w:r>
-      <w:r>
-        <w:rPr>
-          <w:b/>
-          <w:bCs/>
-        </w:rPr>
-        <w:t>true</w:t>
-      </w:r>
-    </w:p>
-    <w:p>
-      <w:pPr>
-        <w:pStyle w:val="normal1"/>
-        <w:numPr>
-          <w:ilvl w:val="1"/>
-          <w:numId w:val="1"/>
-        </w:numPr>
-        <w:ind w:hanging="360" w:left="1440"/>
-        <w:rPr/>
-      </w:pPr>
-      <w:r>
-        <w:rPr/>
-        <w:t>HTTP method: ‘GET’</w:t>
-      </w:r>
-    </w:p>
-    <w:p>
-      <w:pPr>
-        <w:pStyle w:val="normal1"/>
-        <w:numPr>
-          <w:ilvl w:val="1"/>
-          <w:numId w:val="1"/>
-        </w:numPr>
-        <w:ind w:hanging="360" w:left="1440"/>
-        <w:rPr/>
-      </w:pPr>
-      <w:r>
-        <w:rPr/>
-        <w:t>endpoint: {base_uri}/api/tournaments/today?page={page_num}&amp;page_size={num_of_rows}</w:t>
-      </w:r>
-    </w:p>
-    <w:p>
-      <w:pPr>
-        <w:pStyle w:val="normal1"/>
-        <w:numPr>
-          <w:ilvl w:val="1"/>
-          <w:numId w:val="1"/>
-        </w:numPr>
-        <w:ind w:hanging="360" w:left="1440"/>
-        <w:rPr/>
-      </w:pPr>
-      <w:r>
-        <w:rPr/>
-        <w:t xml:space="preserve">description: </w:t>
+        <w:t>Returns all public Tournaments within a date range</w:t>
+      </w:r>
+    </w:p>
+    <w:p>
+      <w:pPr>
+        <w:pStyle w:val="normal1"/>
+        <w:numPr>
+          <w:ilvl w:val="1"/>
+          <w:numId w:val="1"/>
+        </w:numPr>
+        <w:ind w:hanging="360" w:left="1440"/>
+        <w:rPr/>
+      </w:pPr>
+      <w:r>
+        <w:rPr/>
+        <w:t xml:space="preserve">parameters: </w:t>
+      </w:r>
+    </w:p>
+    <w:p>
+      <w:pPr>
+        <w:pStyle w:val="normal1"/>
+        <w:numPr>
+          <w:ilvl w:val="2"/>
+          <w:numId w:val="1"/>
+        </w:numPr>
+        <w:ind w:hanging="360" w:left="2160"/>
+        <w:rPr/>
+      </w:pPr>
+      <w:r>
+        <w:rPr/>
+        <w:t>from_date={date}</w:t>
+      </w:r>
+    </w:p>
+    <w:p>
+      <w:pPr>
+        <w:pStyle w:val="normal1"/>
+        <w:numPr>
+          <w:ilvl w:val="3"/>
+          <w:numId w:val="1"/>
+        </w:numPr>
+        <w:ind w:hanging="360" w:left="2880"/>
+        <w:rPr>
+          <w:color w:val="FF0000"/>
+        </w:rPr>
+      </w:pPr>
+      <w:r>
+        <w:rPr>
+          <w:color w:val="FF0000"/>
+        </w:rPr>
+        <w:t>Required</w:t>
+      </w:r>
+    </w:p>
+    <w:p>
+      <w:pPr>
+        <w:pStyle w:val="normal1"/>
+        <w:numPr>
+          <w:ilvl w:val="3"/>
+          <w:numId w:val="1"/>
+        </w:numPr>
+        <w:ind w:hanging="360" w:left="2880"/>
+        <w:rPr>
+          <w:u w:val="none"/>
+        </w:rPr>
+      </w:pPr>
+      <w:r>
+        <w:rPr/>
+        <w:t>Defines the start of the date range (inclusive) for returning tournaments</w:t>
+      </w:r>
+    </w:p>
+    <w:p>
+      <w:pPr>
+        <w:pStyle w:val="normal1"/>
+        <w:numPr>
+          <w:ilvl w:val="2"/>
+          <w:numId w:val="1"/>
+        </w:numPr>
+        <w:ind w:hanging="360" w:left="2160"/>
+        <w:rPr/>
+      </w:pPr>
+      <w:r>
+        <w:rPr/>
+        <w:t>to_date={date}</w:t>
+      </w:r>
+    </w:p>
+    <w:p>
+      <w:pPr>
+        <w:pStyle w:val="normal1"/>
+        <w:numPr>
+          <w:ilvl w:val="3"/>
+          <w:numId w:val="1"/>
+        </w:numPr>
+        <w:ind w:hanging="360" w:left="2880"/>
+        <w:rPr>
+          <w:color w:val="FF0000"/>
+        </w:rPr>
+      </w:pPr>
+      <w:r>
+        <w:rPr>
+          <w:color w:val="FF0000"/>
+        </w:rPr>
+        <w:t>Required</w:t>
+      </w:r>
+    </w:p>
+    <w:p>
+      <w:pPr>
+        <w:pStyle w:val="normal1"/>
+        <w:numPr>
+          <w:ilvl w:val="3"/>
+          <w:numId w:val="1"/>
+        </w:numPr>
+        <w:ind w:hanging="360" w:left="2880"/>
+        <w:rPr/>
+      </w:pPr>
+      <w:r>
+        <w:rPr/>
+        <w:t>Defines the end of the date range (inclusive) for returning tournaments</w:t>
       </w:r>
     </w:p>
     <w:p>
@@ -45939,22 +45826,255 @@
       </w:pPr>
       <w:r>
         <w:rPr/>
+        <w:t>visibility = OPTIONAL; return ‘all’ or ‘private’ Tournaments as opposed to default return of all public Tournaments</w:t>
+      </w:r>
+    </w:p>
+    <w:p>
+      <w:pPr>
+        <w:pStyle w:val="normal1"/>
+        <w:numPr>
+          <w:ilvl w:val="1"/>
+          <w:numId w:val="1"/>
+        </w:numPr>
+        <w:ind w:hanging="360" w:left="1440"/>
+        <w:rPr/>
+      </w:pPr>
+      <w:r>
+        <w:rPr/>
+        <w:t xml:space="preserve">returns: </w:t>
+      </w:r>
+    </w:p>
+    <w:p>
+      <w:pPr>
+        <w:pStyle w:val="normal1"/>
+        <w:widowControl/>
+        <w:numPr>
+          <w:ilvl w:val="2"/>
+          <w:numId w:val="1"/>
+        </w:numPr>
+        <w:suppressAutoHyphens w:val="true"/>
+        <w:bidi w:val="0"/>
+        <w:spacing w:lineRule="auto" w:line="276" w:before="0" w:after="0"/>
+        <w:ind w:hanging="360" w:left="2160" w:right="0"/>
+        <w:jc w:val="left"/>
+        <w:rPr/>
+      </w:pPr>
+      <w:r>
+        <w:rPr/>
+        <w:t>all tournaments that fall partially or completely within the date range</w:t>
+      </w:r>
+    </w:p>
+    <w:p>
+      <w:pPr>
+        <w:pStyle w:val="normal1"/>
+        <w:numPr>
+          <w:ilvl w:val="0"/>
+          <w:numId w:val="1"/>
+        </w:numPr>
+        <w:ind w:hanging="360" w:left="720"/>
+        <w:rPr/>
+      </w:pPr>
+      <w:r>
+        <w:rPr/>
+        <w:t>GET All Tournaments Around Today’s Date</w:t>
+      </w:r>
+    </w:p>
+    <w:p>
+      <w:pPr>
+        <w:pStyle w:val="normal1"/>
+        <w:numPr>
+          <w:ilvl w:val="1"/>
+          <w:numId w:val="1"/>
+        </w:numPr>
+        <w:ind w:hanging="360" w:left="1440"/>
+        <w:rPr/>
+      </w:pPr>
+      <w:r>
+        <w:rPr/>
+        <w:t xml:space="preserve">built_including_tests: </w:t>
+      </w:r>
+      <w:r>
+        <w:rPr>
+          <w:b/>
+          <w:bCs/>
+        </w:rPr>
+        <w:t>true</w:t>
+      </w:r>
+    </w:p>
+    <w:p>
+      <w:pPr>
+        <w:pStyle w:val="normal1"/>
+        <w:numPr>
+          <w:ilvl w:val="1"/>
+          <w:numId w:val="1"/>
+        </w:numPr>
+        <w:ind w:hanging="360" w:left="1440"/>
+        <w:rPr/>
+      </w:pPr>
+      <w:r>
+        <w:rPr/>
+        <w:t>HTTP method: ‘GET’</w:t>
+      </w:r>
+    </w:p>
+    <w:p>
+      <w:pPr>
+        <w:pStyle w:val="normal1"/>
+        <w:numPr>
+          <w:ilvl w:val="1"/>
+          <w:numId w:val="1"/>
+        </w:numPr>
+        <w:ind w:hanging="360" w:left="1440"/>
+        <w:rPr/>
+      </w:pPr>
+      <w:r>
+        <w:rPr/>
+        <w:t>endpoint: {base_uri}/api/tournaments/today?page={page_num}&amp;page_size={num_of_rows}</w:t>
+      </w:r>
+      <w:r>
+        <w:rPr/>
+        <w:t>&amp;visibility={}</w:t>
+      </w:r>
+    </w:p>
+    <w:p>
+      <w:pPr>
+        <w:pStyle w:val="normal1"/>
+        <w:numPr>
+          <w:ilvl w:val="1"/>
+          <w:numId w:val="1"/>
+        </w:numPr>
+        <w:ind w:hanging="360" w:left="1440"/>
+        <w:rPr/>
+      </w:pPr>
+      <w:r>
+        <w:rPr/>
+        <w:t xml:space="preserve">description: </w:t>
+      </w:r>
+    </w:p>
+    <w:p>
+      <w:pPr>
+        <w:pStyle w:val="normal1"/>
+        <w:widowControl/>
+        <w:numPr>
+          <w:ilvl w:val="2"/>
+          <w:numId w:val="1"/>
+        </w:numPr>
+        <w:suppressAutoHyphens w:val="true"/>
+        <w:bidi w:val="0"/>
+        <w:spacing w:lineRule="auto" w:line="276" w:before="0" w:after="0"/>
+        <w:ind w:hanging="360" w:left="2160" w:right="0"/>
+        <w:jc w:val="left"/>
+        <w:rPr/>
+      </w:pPr>
+      <w:r>
+        <w:rPr/>
         <w:t>Looks at today’s data and returns tournaments up to 31 days before and after the current date (today). If the total number of tournaments returned is &gt; 100, then tournaments are removed from the beginning and end of the list until there are 100 or 99 tournaments. Includes the rooms of the tournaments also.</w:t>
       </w:r>
     </w:p>
     <w:p>
       <w:pPr>
         <w:pStyle w:val="normal1"/>
-        <w:numPr>
-          <w:ilvl w:val="1"/>
-          <w:numId w:val="1"/>
-        </w:numPr>
-        <w:ind w:hanging="360" w:left="1440"/>
-        <w:rPr/>
-      </w:pPr>
-      <w:r>
-        <w:rPr/>
-        <w:t>parameters: none</w:t>
+        <w:widowControl/>
+        <w:numPr>
+          <w:ilvl w:val="2"/>
+          <w:numId w:val="1"/>
+        </w:numPr>
+        <w:suppressAutoHyphens w:val="true"/>
+        <w:bidi w:val="0"/>
+        <w:spacing w:lineRule="auto" w:line="276" w:before="0" w:after="0"/>
+        <w:ind w:hanging="360" w:left="2160" w:right="0"/>
+        <w:jc w:val="left"/>
+        <w:rPr/>
+      </w:pPr>
+      <w:r>
+        <w:rPr/>
+        <w:t>Defaults to returning only public Tournaments; use ‘visibility’ query parameter to get ‘all’ or ‘private’ Tournaments</w:t>
+      </w:r>
+    </w:p>
+    <w:p>
+      <w:pPr>
+        <w:pStyle w:val="normal1"/>
+        <w:numPr>
+          <w:ilvl w:val="1"/>
+          <w:numId w:val="1"/>
+        </w:numPr>
+        <w:ind w:hanging="360" w:left="1440"/>
+        <w:rPr/>
+      </w:pPr>
+      <w:r>
+        <w:rPr/>
+        <w:t>parameters:</w:t>
+      </w:r>
+    </w:p>
+    <w:p>
+      <w:pPr>
+        <w:pStyle w:val="normal1"/>
+        <w:widowControl/>
+        <w:numPr>
+          <w:ilvl w:val="2"/>
+          <w:numId w:val="1"/>
+        </w:numPr>
+        <w:suppressAutoHyphens w:val="true"/>
+        <w:bidi w:val="0"/>
+        <w:spacing w:lineRule="auto" w:line="276" w:before="0" w:after="0"/>
+        <w:ind w:hanging="360" w:left="2160" w:right="0"/>
+        <w:jc w:val="left"/>
+        <w:rPr/>
+      </w:pPr>
+      <w:r>
+        <w:rPr/>
+        <w:t>‘</w:t>
+      </w:r>
+      <w:r>
+        <w:rPr/>
+        <w:t>page’ = which page of results to return (based on page_size)</w:t>
+      </w:r>
+    </w:p>
+    <w:p>
+      <w:pPr>
+        <w:pStyle w:val="normal1"/>
+        <w:widowControl/>
+        <w:numPr>
+          <w:ilvl w:val="2"/>
+          <w:numId w:val="1"/>
+        </w:numPr>
+        <w:suppressAutoHyphens w:val="true"/>
+        <w:bidi w:val="0"/>
+        <w:spacing w:lineRule="auto" w:line="276" w:before="0" w:after="0"/>
+        <w:ind w:hanging="360" w:left="2160" w:right="0"/>
+        <w:jc w:val="left"/>
+        <w:rPr/>
+      </w:pPr>
+      <w:r>
+        <w:rPr/>
+        <w:t>‘</w:t>
+      </w:r>
+      <w:r>
+        <w:rPr/>
+        <w:t>page_size’ = how many results to return per page</w:t>
+      </w:r>
+    </w:p>
+    <w:p>
+      <w:pPr>
+        <w:pStyle w:val="normal1"/>
+        <w:widowControl/>
+        <w:numPr>
+          <w:ilvl w:val="2"/>
+          <w:numId w:val="1"/>
+        </w:numPr>
+        <w:suppressAutoHyphens w:val="true"/>
+        <w:bidi w:val="0"/>
+        <w:spacing w:lineRule="auto" w:line="276" w:before="0" w:after="0"/>
+        <w:ind w:hanging="360" w:left="2160" w:right="0"/>
+        <w:jc w:val="left"/>
+        <w:rPr/>
+      </w:pPr>
+      <w:r>
+        <w:rPr/>
+        <w:t>‘</w:t>
+      </w:r>
+      <w:r>
+        <w:rPr/>
+        <w:t>visibility’ = OPTIONAL; return ‘all’ or ‘private’ Tournaments as opposed to default return of all public Tournaments</w:t>
       </w:r>
     </w:p>
     <w:p>
@@ -50839,8 +50959,8 @@
       <w:u w:val="single"/>
     </w:rPr>
   </w:style>
-  <w:style w:type="character" w:styleId="Bulletsuser">
-    <w:name w:val="Bullets (user)"/>
+  <w:style w:type="character" w:styleId="Bullets">
+    <w:name w:val="Bullets"/>
     <w:qFormat/>
     <w:rPr>
       <w:rFonts w:ascii="OpenSymbol" w:hAnsi="OpenSymbol" w:eastAsia="OpenSymbol" w:cs="OpenSymbol"/>

</xml_diff>

<commit_message>
Standardized data tables so that there exists only one data table component that is used in multiple profiles (potentially), with the correct permissions in all data table consumer locations/profiles. Also made the QuizzersTable use a single API endpoint in all consumer locations. Fixed scheduled start time since some consumers were not using it as an Optoin type on the backend.
</commit_message>
<xml_diff>
--- a/docs/QView API Documentation.docx
+++ b/docs/QView API Documentation.docx
@@ -14,15 +14,15 @@
       </w:r>
       <w:r>
         <w:rPr/>
-        <w:t>7</w:t>
-      </w:r>
-      <w:r>
-        <w:rPr/>
-        <w:t>_2026.0</w:t>
-      </w:r>
-      <w:r>
-        <w:rPr/>
-        <w:t>9.02</w:t>
+        <w:t>8</w:t>
+      </w:r>
+      <w:r>
+        <w:rPr/>
+        <w:t>_2026.09.0</w:t>
+      </w:r>
+      <w:r>
+        <w:rPr/>
+        <w:t>4</w:t>
       </w:r>
       <w:r>
         <w:rPr/>
@@ -32035,15 +32035,460 @@
         <w:spacing w:lineRule="auto" w:line="276" w:before="0" w:after="0"/>
         <w:ind w:hanging="360" w:left="2160" w:right="0"/>
         <w:jc w:val="left"/>
-        <w:rPr/>
-      </w:pPr>
-      <w:r>
         <w:rPr>
           <w:b w:val="false"/>
           <w:bCs w:val="false"/>
           <w:color w:val="000000"/>
         </w:rPr>
+      </w:pPr>
+      <w:r>
+        <w:rPr>
+          <w:b w:val="false"/>
+          <w:bCs w:val="false"/>
+          <w:color w:val="000000"/>
+        </w:rPr>
         <w:t>array of Users who are assigned to Teams of Tournament</w:t>
+      </w:r>
+    </w:p>
+    <w:p>
+      <w:pPr>
+        <w:pStyle w:val="normal1"/>
+        <w:numPr>
+          <w:ilvl w:val="0"/>
+          <w:numId w:val="1"/>
+        </w:numPr>
+        <w:ind w:hanging="360" w:left="720"/>
+        <w:rPr/>
+      </w:pPr>
+      <w:r>
+        <w:rPr/>
+        <w:t xml:space="preserve">GET Quizzer </w:t>
+      </w:r>
+      <w:r>
+        <w:rPr/>
+        <w:t>Row</w:t>
+      </w:r>
+      <w:r>
+        <w:rPr/>
+        <w:t>s of Tournament</w:t>
+      </w:r>
+    </w:p>
+    <w:p>
+      <w:pPr>
+        <w:pStyle w:val="normal1"/>
+        <w:numPr>
+          <w:ilvl w:val="1"/>
+          <w:numId w:val="1"/>
+        </w:numPr>
+        <w:ind w:hanging="360" w:left="1440"/>
+        <w:rPr/>
+      </w:pPr>
+      <w:r>
+        <w:rPr/>
+        <w:t xml:space="preserve">built_including_tests: </w:t>
+      </w:r>
+      <w:r>
+        <w:rPr>
+          <w:b/>
+          <w:bCs/>
+        </w:rPr>
+        <w:t>true</w:t>
+      </w:r>
+    </w:p>
+    <w:p>
+      <w:pPr>
+        <w:pStyle w:val="normal1"/>
+        <w:numPr>
+          <w:ilvl w:val="1"/>
+          <w:numId w:val="1"/>
+        </w:numPr>
+        <w:ind w:hanging="360" w:left="1440"/>
+        <w:rPr/>
+      </w:pPr>
+      <w:r>
+        <w:rPr/>
+        <w:t>HTTP method: ‘GET’</w:t>
+      </w:r>
+    </w:p>
+    <w:p>
+      <w:pPr>
+        <w:pStyle w:val="normal1"/>
+        <w:numPr>
+          <w:ilvl w:val="1"/>
+          <w:numId w:val="1"/>
+        </w:numPr>
+        <w:ind w:hanging="360" w:left="1440"/>
+        <w:rPr/>
+      </w:pPr>
+      <w:r>
+        <w:rPr/>
+        <w:t>endpoint: {base_uri}/api/tournaments/{id}/quizzer-</w:t>
+      </w:r>
+      <w:r>
+        <w:rPr/>
+        <w:t>row</w:t>
+      </w:r>
+      <w:r>
+        <w:rPr/>
+        <w:t>s</w:t>
+      </w:r>
+    </w:p>
+    <w:p>
+      <w:pPr>
+        <w:pStyle w:val="normal1"/>
+        <w:numPr>
+          <w:ilvl w:val="1"/>
+          <w:numId w:val="1"/>
+        </w:numPr>
+        <w:ind w:hanging="360" w:left="1440"/>
+        <w:rPr/>
+      </w:pPr>
+      <w:r>
+        <w:rPr/>
+        <w:t xml:space="preserve">description: </w:t>
+      </w:r>
+    </w:p>
+    <w:p>
+      <w:pPr>
+        <w:pStyle w:val="normal1"/>
+        <w:widowControl/>
+        <w:numPr>
+          <w:ilvl w:val="2"/>
+          <w:numId w:val="1"/>
+        </w:numPr>
+        <w:suppressAutoHyphens w:val="true"/>
+        <w:bidi w:val="0"/>
+        <w:spacing w:lineRule="auto" w:line="276" w:before="0" w:after="0"/>
+        <w:ind w:hanging="360" w:left="2160" w:right="0"/>
+        <w:jc w:val="left"/>
+        <w:rPr/>
+      </w:pPr>
+      <w:r>
+        <w:rPr/>
+        <w:t>An endpoint that specifically returns rows of data for the Quizzer data table in the UI when it is located in the Tournament profile. It returns only that data.</w:t>
+      </w:r>
+    </w:p>
+    <w:p>
+      <w:pPr>
+        <w:pStyle w:val="normal1"/>
+        <w:numPr>
+          <w:ilvl w:val="1"/>
+          <w:numId w:val="1"/>
+        </w:numPr>
+        <w:ind w:hanging="360" w:left="1440"/>
+        <w:rPr/>
+      </w:pPr>
+      <w:r>
+        <w:rPr/>
+        <w:t xml:space="preserve">parameters: </w:t>
+      </w:r>
+    </w:p>
+    <w:p>
+      <w:pPr>
+        <w:pStyle w:val="normal1"/>
+        <w:numPr>
+          <w:ilvl w:val="2"/>
+          <w:numId w:val="1"/>
+        </w:numPr>
+        <w:ind w:hanging="360" w:left="2160"/>
+        <w:rPr/>
+      </w:pPr>
+      <w:r>
+        <w:rPr/>
+        <w:t>id</w:t>
+      </w:r>
+    </w:p>
+    <w:p>
+      <w:pPr>
+        <w:pStyle w:val="normal1"/>
+        <w:numPr>
+          <w:ilvl w:val="3"/>
+          <w:numId w:val="1"/>
+        </w:numPr>
+        <w:ind w:hanging="360" w:left="2880"/>
+        <w:rPr>
+          <w:color w:val="FF0000"/>
+        </w:rPr>
+      </w:pPr>
+      <w:r>
+        <w:rPr>
+          <w:color w:val="FF0000"/>
+        </w:rPr>
+        <w:t>Required</w:t>
+      </w:r>
+    </w:p>
+    <w:p>
+      <w:pPr>
+        <w:pStyle w:val="normal1"/>
+        <w:numPr>
+          <w:ilvl w:val="3"/>
+          <w:numId w:val="1"/>
+        </w:numPr>
+        <w:ind w:hanging="360" w:left="2880"/>
+        <w:rPr/>
+      </w:pPr>
+      <w:r>
+        <w:rPr/>
+        <w:t>ID of the Tournament</w:t>
+      </w:r>
+    </w:p>
+    <w:p>
+      <w:pPr>
+        <w:pStyle w:val="normal1"/>
+        <w:widowControl/>
+        <w:numPr>
+          <w:ilvl w:val="1"/>
+          <w:numId w:val="1"/>
+        </w:numPr>
+        <w:suppressAutoHyphens w:val="true"/>
+        <w:bidi w:val="0"/>
+        <w:spacing w:lineRule="auto" w:line="276" w:before="0" w:after="0"/>
+        <w:ind w:hanging="360" w:left="1440" w:right="0"/>
+        <w:jc w:val="left"/>
+        <w:rPr/>
+      </w:pPr>
+      <w:r>
+        <w:rPr>
+          <w:b w:val="false"/>
+          <w:bCs w:val="false"/>
+          <w:color w:val="000000"/>
+        </w:rPr>
+        <w:t xml:space="preserve">returns: </w:t>
+      </w:r>
+      <w:r>
+        <w:rPr>
+          <w:b w:val="false"/>
+          <w:bCs w:val="false"/>
+          <w:color w:val="000000"/>
+        </w:rPr>
+        <w:t>*see description</w:t>
+      </w:r>
+    </w:p>
+    <w:p>
+      <w:pPr>
+        <w:pStyle w:val="normal1"/>
+        <w:numPr>
+          <w:ilvl w:val="0"/>
+          <w:numId w:val="1"/>
+        </w:numPr>
+        <w:bidi w:val="0"/>
+        <w:ind w:hanging="360" w:left="720"/>
+        <w:rPr/>
+      </w:pPr>
+      <w:r>
+        <w:rPr/>
+        <w:t xml:space="preserve">GET Quizzer </w:t>
+      </w:r>
+      <w:r>
+        <w:rPr/>
+        <w:t>Row</w:t>
+      </w:r>
+      <w:r>
+        <w:rPr/>
+        <w:t xml:space="preserve">s of </w:t>
+      </w:r>
+      <w:r>
+        <w:rPr/>
+        <w:t>Division</w:t>
+      </w:r>
+    </w:p>
+    <w:p>
+      <w:pPr>
+        <w:pStyle w:val="normal1"/>
+        <w:numPr>
+          <w:ilvl w:val="1"/>
+          <w:numId w:val="1"/>
+        </w:numPr>
+        <w:ind w:hanging="360" w:left="1440"/>
+        <w:rPr/>
+      </w:pPr>
+      <w:r>
+        <w:rPr/>
+        <w:t xml:space="preserve">built_including_tests: </w:t>
+      </w:r>
+      <w:r>
+        <w:rPr>
+          <w:b/>
+          <w:bCs/>
+        </w:rPr>
+        <w:t>true</w:t>
+      </w:r>
+    </w:p>
+    <w:p>
+      <w:pPr>
+        <w:pStyle w:val="normal1"/>
+        <w:numPr>
+          <w:ilvl w:val="1"/>
+          <w:numId w:val="1"/>
+        </w:numPr>
+        <w:ind w:hanging="360" w:left="1440"/>
+        <w:rPr/>
+      </w:pPr>
+      <w:r>
+        <w:rPr/>
+        <w:t>HTTP method: ‘GET’</w:t>
+      </w:r>
+    </w:p>
+    <w:p>
+      <w:pPr>
+        <w:pStyle w:val="normal1"/>
+        <w:numPr>
+          <w:ilvl w:val="1"/>
+          <w:numId w:val="1"/>
+        </w:numPr>
+        <w:ind w:hanging="360" w:left="1440"/>
+        <w:rPr/>
+      </w:pPr>
+      <w:r>
+        <w:rPr/>
+        <w:t>endpoint: {base_uri}/api/</w:t>
+      </w:r>
+      <w:r>
+        <w:rPr/>
+        <w:t>divisions</w:t>
+      </w:r>
+      <w:r>
+        <w:rPr/>
+        <w:t>/{id}/quizzer-</w:t>
+      </w:r>
+      <w:r>
+        <w:rPr/>
+        <w:t>row</w:t>
+      </w:r>
+      <w:r>
+        <w:rPr/>
+        <w:t>s</w:t>
+      </w:r>
+    </w:p>
+    <w:p>
+      <w:pPr>
+        <w:pStyle w:val="normal1"/>
+        <w:numPr>
+          <w:ilvl w:val="1"/>
+          <w:numId w:val="1"/>
+        </w:numPr>
+        <w:ind w:hanging="360" w:left="1440"/>
+        <w:rPr/>
+      </w:pPr>
+      <w:r>
+        <w:rPr/>
+        <w:t xml:space="preserve">description: </w:t>
+      </w:r>
+    </w:p>
+    <w:p>
+      <w:pPr>
+        <w:pStyle w:val="normal1"/>
+        <w:widowControl/>
+        <w:numPr>
+          <w:ilvl w:val="2"/>
+          <w:numId w:val="1"/>
+        </w:numPr>
+        <w:suppressAutoHyphens w:val="true"/>
+        <w:bidi w:val="0"/>
+        <w:spacing w:lineRule="auto" w:line="276" w:before="0" w:after="0"/>
+        <w:ind w:hanging="360" w:left="2160" w:right="0"/>
+        <w:jc w:val="left"/>
+        <w:rPr/>
+      </w:pPr>
+      <w:r>
+        <w:rPr/>
+        <w:t>An endpoint that specifically returns rows of data for the Quizzer data table in the UI when it is located in the Division profile. It returns only that data.</w:t>
+      </w:r>
+    </w:p>
+    <w:p>
+      <w:pPr>
+        <w:pStyle w:val="normal1"/>
+        <w:numPr>
+          <w:ilvl w:val="1"/>
+          <w:numId w:val="1"/>
+        </w:numPr>
+        <w:ind w:hanging="360" w:left="1440"/>
+        <w:rPr/>
+      </w:pPr>
+      <w:r>
+        <w:rPr/>
+        <w:t xml:space="preserve">parameters: </w:t>
+      </w:r>
+    </w:p>
+    <w:p>
+      <w:pPr>
+        <w:pStyle w:val="normal1"/>
+        <w:numPr>
+          <w:ilvl w:val="2"/>
+          <w:numId w:val="1"/>
+        </w:numPr>
+        <w:ind w:hanging="360" w:left="2160"/>
+        <w:rPr/>
+      </w:pPr>
+      <w:r>
+        <w:rPr/>
+        <w:t>id</w:t>
+      </w:r>
+    </w:p>
+    <w:p>
+      <w:pPr>
+        <w:pStyle w:val="normal1"/>
+        <w:numPr>
+          <w:ilvl w:val="3"/>
+          <w:numId w:val="1"/>
+        </w:numPr>
+        <w:ind w:hanging="360" w:left="2880"/>
+        <w:rPr>
+          <w:color w:val="FF0000"/>
+        </w:rPr>
+      </w:pPr>
+      <w:r>
+        <w:rPr>
+          <w:color w:val="FF0000"/>
+        </w:rPr>
+        <w:t>Required</w:t>
+      </w:r>
+    </w:p>
+    <w:p>
+      <w:pPr>
+        <w:pStyle w:val="normal1"/>
+        <w:numPr>
+          <w:ilvl w:val="3"/>
+          <w:numId w:val="1"/>
+        </w:numPr>
+        <w:ind w:hanging="360" w:left="2880"/>
+        <w:rPr/>
+      </w:pPr>
+      <w:r>
+        <w:rPr/>
+        <w:t xml:space="preserve">ID of the </w:t>
+      </w:r>
+      <w:r>
+        <w:rPr/>
+        <w:t>Division</w:t>
+      </w:r>
+    </w:p>
+    <w:p>
+      <w:pPr>
+        <w:pStyle w:val="normal1"/>
+        <w:widowControl/>
+        <w:numPr>
+          <w:ilvl w:val="1"/>
+          <w:numId w:val="1"/>
+        </w:numPr>
+        <w:suppressAutoHyphens w:val="true"/>
+        <w:bidi w:val="0"/>
+        <w:spacing w:lineRule="auto" w:line="276" w:before="0" w:after="0"/>
+        <w:ind w:hanging="360" w:left="1440" w:right="0"/>
+        <w:jc w:val="left"/>
+        <w:rPr>
+          <w:b w:val="false"/>
+          <w:bCs w:val="false"/>
+          <w:color w:val="000000"/>
+        </w:rPr>
+      </w:pPr>
+      <w:r>
+        <w:rPr>
+          <w:b w:val="false"/>
+          <w:bCs w:val="false"/>
+          <w:color w:val="000000"/>
+        </w:rPr>
+        <w:t>returns: *see description</w:t>
       </w:r>
     </w:p>
     <w:p>
@@ -45652,11 +46097,7 @@
       </w:pPr>
       <w:r>
         <w:rPr/>
-        <w:t>endpoint: {base_uri}/api/tournaments/filter?from_date={date}&amp;to_date={date}</w:t>
-      </w:r>
-      <w:r>
-        <w:rPr/>
-        <w:t>&amp;visibility={}</w:t>
+        <w:t>endpoint: {base_uri}/api/tournaments/filter?from_date={date}&amp;to_date={date}&amp;visibility={}</w:t>
       </w:r>
     </w:p>
     <w:p>
@@ -45928,11 +46369,7 @@
       </w:pPr>
       <w:r>
         <w:rPr/>
-        <w:t>endpoint: {base_uri}/api/tournaments/today?page={page_num}&amp;page_size={num_of_rows}</w:t>
-      </w:r>
-      <w:r>
-        <w:rPr/>
-        <w:t>&amp;visibility={}</w:t>
+        <w:t>endpoint: {base_uri}/api/tournaments/today?page={page_num}&amp;page_size={num_of_rows}&amp;visibility={}</w:t>
       </w:r>
     </w:p>
     <w:p>
@@ -50959,8 +51396,8 @@
       <w:u w:val="single"/>
     </w:rPr>
   </w:style>
-  <w:style w:type="character" w:styleId="Bullets">
-    <w:name w:val="Bullets"/>
+  <w:style w:type="character" w:styleId="Bulletsuser">
+    <w:name w:val="Bullets (user)"/>
     <w:qFormat/>
     <w:rPr>
       <w:rFonts w:ascii="OpenSymbol" w:hAnsi="OpenSymbol" w:eastAsia="OpenSymbol" w:cs="OpenSymbol"/>

</xml_diff>

<commit_message>
Updated the Teams data table to use new endpoints so that only one API call is made per data table load. New endpoints have been documented.
</commit_message>
<xml_diff>
--- a/docs/QView API Documentation.docx
+++ b/docs/QView API Documentation.docx
@@ -14,19 +14,11 @@
       </w:r>
       <w:r>
         <w:rPr/>
-        <w:t>8</w:t>
-      </w:r>
-      <w:r>
-        <w:rPr/>
-        <w:t>_2026.09.0</w:t>
-      </w:r>
-      <w:r>
-        <w:rPr/>
-        <w:t>4</w:t>
-      </w:r>
-      <w:r>
-        <w:rPr/>
-        <w:t>)</w:t>
+        <w:t>9</w:t>
+      </w:r>
+      <w:r>
+        <w:rPr/>
+        <w:t>_2026.09.04)</w:t>
       </w:r>
     </w:p>
     <w:p>
@@ -32062,15 +32054,7 @@
       </w:pPr>
       <w:r>
         <w:rPr/>
-        <w:t xml:space="preserve">GET Quizzer </w:t>
-      </w:r>
-      <w:r>
-        <w:rPr/>
-        <w:t>Row</w:t>
-      </w:r>
-      <w:r>
-        <w:rPr/>
-        <w:t>s of Tournament</w:t>
+        <w:t>GET Quizzer Rows of Tournament</w:t>
       </w:r>
     </w:p>
     <w:p>
@@ -32122,15 +32106,7 @@
       </w:pPr>
       <w:r>
         <w:rPr/>
-        <w:t>endpoint: {base_uri}/api/tournaments/{id}/quizzer-</w:t>
-      </w:r>
-      <w:r>
-        <w:rPr/>
-        <w:t>row</w:t>
-      </w:r>
-      <w:r>
-        <w:rPr/>
-        <w:t>s</w:t>
+        <w:t>endpoint: {base_uri}/api/tournaments/{id}/quizzer-rows</w:t>
       </w:r>
     </w:p>
     <w:p>
@@ -32253,15 +32229,7 @@
           <w:bCs w:val="false"/>
           <w:color w:val="000000"/>
         </w:rPr>
-        <w:t xml:space="preserve">returns: </w:t>
-      </w:r>
-      <w:r>
-        <w:rPr>
-          <w:b w:val="false"/>
-          <w:bCs w:val="false"/>
-          <w:color w:val="000000"/>
-        </w:rPr>
-        <w:t>*see description</w:t>
+        <w:t>returns: *see description</w:t>
       </w:r>
     </w:p>
     <w:p>
@@ -32277,19 +32245,7 @@
       </w:pPr>
       <w:r>
         <w:rPr/>
-        <w:t xml:space="preserve">GET Quizzer </w:t>
-      </w:r>
-      <w:r>
-        <w:rPr/>
-        <w:t>Row</w:t>
-      </w:r>
-      <w:r>
-        <w:rPr/>
-        <w:t xml:space="preserve">s of </w:t>
-      </w:r>
-      <w:r>
-        <w:rPr/>
-        <w:t>Division</w:t>
+        <w:t>GET Quizzer Rows of Division</w:t>
       </w:r>
     </w:p>
     <w:p>
@@ -32341,23 +32297,7 @@
       </w:pPr>
       <w:r>
         <w:rPr/>
-        <w:t>endpoint: {base_uri}/api/</w:t>
-      </w:r>
-      <w:r>
-        <w:rPr/>
-        <w:t>divisions</w:t>
-      </w:r>
-      <w:r>
-        <w:rPr/>
-        <w:t>/{id}/quizzer-</w:t>
-      </w:r>
-      <w:r>
-        <w:rPr/>
-        <w:t>row</w:t>
-      </w:r>
-      <w:r>
-        <w:rPr/>
-        <w:t>s</w:t>
+        <w:t>endpoint: {base_uri}/api/divisions/{id}/quizzer-rows</w:t>
       </w:r>
     </w:p>
     <w:p>
@@ -32456,11 +32396,7 @@
       </w:pPr>
       <w:r>
         <w:rPr/>
-        <w:t xml:space="preserve">ID of the </w:t>
-      </w:r>
-      <w:r>
-        <w:rPr/>
-        <w:t>Division</w:t>
+        <w:t>ID of the Division</w:t>
       </w:r>
     </w:p>
     <w:p>
@@ -41655,6 +41591,566 @@
       <w:r>
         <w:rPr/>
         <w:t xml:space="preserve">returns: </w:t>
+      </w:r>
+    </w:p>
+    <w:p>
+      <w:pPr>
+        <w:pStyle w:val="normal1"/>
+        <w:numPr>
+          <w:ilvl w:val="0"/>
+          <w:numId w:val="1"/>
+        </w:numPr>
+        <w:ind w:hanging="360" w:left="720"/>
+        <w:rPr/>
+      </w:pPr>
+      <w:r>
+        <w:rPr/>
+        <w:t xml:space="preserve">GET Team </w:t>
+      </w:r>
+      <w:r>
+        <w:rPr/>
+        <w:t>Rows by Tournament</w:t>
+      </w:r>
+    </w:p>
+    <w:p>
+      <w:pPr>
+        <w:pStyle w:val="normal1"/>
+        <w:numPr>
+          <w:ilvl w:val="1"/>
+          <w:numId w:val="1"/>
+        </w:numPr>
+        <w:ind w:hanging="360" w:left="1440"/>
+        <w:rPr/>
+      </w:pPr>
+      <w:r>
+        <w:rPr/>
+        <w:t xml:space="preserve">built_including_tests: </w:t>
+      </w:r>
+      <w:r>
+        <w:rPr>
+          <w:b/>
+          <w:bCs/>
+        </w:rPr>
+        <w:t>true</w:t>
+      </w:r>
+    </w:p>
+    <w:p>
+      <w:pPr>
+        <w:pStyle w:val="normal1"/>
+        <w:numPr>
+          <w:ilvl w:val="1"/>
+          <w:numId w:val="1"/>
+        </w:numPr>
+        <w:ind w:hanging="360" w:left="1440"/>
+        <w:rPr/>
+      </w:pPr>
+      <w:r>
+        <w:rPr/>
+        <w:t>HTTP method: ‘GET’</w:t>
+      </w:r>
+    </w:p>
+    <w:p>
+      <w:pPr>
+        <w:pStyle w:val="normal1"/>
+        <w:numPr>
+          <w:ilvl w:val="1"/>
+          <w:numId w:val="1"/>
+        </w:numPr>
+        <w:ind w:hanging="360" w:left="1440"/>
+        <w:rPr/>
+      </w:pPr>
+      <w:r>
+        <w:rPr/>
+        <w:t>endpoint: {base_uri}/api/</w:t>
+      </w:r>
+      <w:r>
+        <w:rPr/>
+        <w:t>tournaments/{tid}/team-rows</w:t>
+      </w:r>
+      <w:r>
+        <w:rPr/>
+        <w:t>?page={page_num}&amp;page_size={num_of_rows}</w:t>
+      </w:r>
+    </w:p>
+    <w:p>
+      <w:pPr>
+        <w:pStyle w:val="normal1"/>
+        <w:numPr>
+          <w:ilvl w:val="1"/>
+          <w:numId w:val="1"/>
+        </w:numPr>
+        <w:ind w:hanging="360" w:left="1440"/>
+        <w:rPr/>
+      </w:pPr>
+      <w:r>
+        <w:rPr/>
+        <w:t xml:space="preserve">description: </w:t>
+      </w:r>
+    </w:p>
+    <w:p>
+      <w:pPr>
+        <w:pStyle w:val="normal1"/>
+        <w:widowControl/>
+        <w:numPr>
+          <w:ilvl w:val="2"/>
+          <w:numId w:val="1"/>
+        </w:numPr>
+        <w:suppressAutoHyphens w:val="true"/>
+        <w:bidi w:val="0"/>
+        <w:spacing w:lineRule="auto" w:line="276" w:before="0" w:after="0"/>
+        <w:ind w:hanging="360" w:left="2160" w:right="0"/>
+        <w:jc w:val="left"/>
+        <w:rPr/>
+      </w:pPr>
+      <w:r>
+        <w:rPr/>
+        <w:t>Is used by the Teams data table in the UI with the goal of having a single call to the backend whenever that data table is loaded.</w:t>
+      </w:r>
+    </w:p>
+    <w:p>
+      <w:pPr>
+        <w:pStyle w:val="normal1"/>
+        <w:numPr>
+          <w:ilvl w:val="1"/>
+          <w:numId w:val="1"/>
+        </w:numPr>
+        <w:ind w:hanging="360" w:left="1440"/>
+        <w:rPr/>
+      </w:pPr>
+      <w:r>
+        <w:rPr/>
+        <w:t xml:space="preserve">parameters: </w:t>
+      </w:r>
+    </w:p>
+    <w:p>
+      <w:pPr>
+        <w:pStyle w:val="normal1"/>
+        <w:numPr>
+          <w:ilvl w:val="2"/>
+          <w:numId w:val="1"/>
+        </w:numPr>
+        <w:ind w:hanging="360" w:left="2160"/>
+        <w:rPr/>
+      </w:pPr>
+      <w:r>
+        <w:rPr/>
+        <w:t>page={page_num}</w:t>
+      </w:r>
+    </w:p>
+    <w:p>
+      <w:pPr>
+        <w:pStyle w:val="normal1"/>
+        <w:numPr>
+          <w:ilvl w:val="3"/>
+          <w:numId w:val="1"/>
+        </w:numPr>
+        <w:ind w:hanging="360" w:left="2880"/>
+        <w:rPr>
+          <w:color w:val="FF0000"/>
+        </w:rPr>
+      </w:pPr>
+      <w:r>
+        <w:rPr>
+          <w:color w:val="FF0000"/>
+        </w:rPr>
+        <w:t>Required</w:t>
+      </w:r>
+    </w:p>
+    <w:p>
+      <w:pPr>
+        <w:pStyle w:val="normal1"/>
+        <w:numPr>
+          <w:ilvl w:val="3"/>
+          <w:numId w:val="1"/>
+        </w:numPr>
+        <w:ind w:hanging="360" w:left="2880"/>
+        <w:rPr/>
+      </w:pPr>
+      <w:r>
+        <w:rPr/>
+        <w:t>Defines which page to return</w:t>
+      </w:r>
+    </w:p>
+    <w:p>
+      <w:pPr>
+        <w:pStyle w:val="normal1"/>
+        <w:numPr>
+          <w:ilvl w:val="3"/>
+          <w:numId w:val="1"/>
+        </w:numPr>
+        <w:ind w:hanging="360" w:left="2880"/>
+        <w:rPr/>
+      </w:pPr>
+      <w:r>
+        <w:rPr/>
+        <w:t>First page = 0 (zero)</w:t>
+      </w:r>
+    </w:p>
+    <w:p>
+      <w:pPr>
+        <w:pStyle w:val="normal1"/>
+        <w:numPr>
+          <w:ilvl w:val="2"/>
+          <w:numId w:val="1"/>
+        </w:numPr>
+        <w:ind w:hanging="360" w:left="2160"/>
+        <w:rPr/>
+      </w:pPr>
+      <w:r>
+        <w:rPr/>
+        <w:t>page_size={num_of_rows}</w:t>
+      </w:r>
+    </w:p>
+    <w:p>
+      <w:pPr>
+        <w:pStyle w:val="normal1"/>
+        <w:numPr>
+          <w:ilvl w:val="3"/>
+          <w:numId w:val="1"/>
+        </w:numPr>
+        <w:ind w:hanging="360" w:left="2880"/>
+        <w:rPr>
+          <w:color w:val="FF0000"/>
+        </w:rPr>
+      </w:pPr>
+      <w:r>
+        <w:rPr>
+          <w:color w:val="FF0000"/>
+        </w:rPr>
+        <w:t>Required</w:t>
+      </w:r>
+    </w:p>
+    <w:p>
+      <w:pPr>
+        <w:pStyle w:val="normal1"/>
+        <w:numPr>
+          <w:ilvl w:val="3"/>
+          <w:numId w:val="1"/>
+        </w:numPr>
+        <w:ind w:hanging="360" w:left="2880"/>
+        <w:rPr/>
+      </w:pPr>
+      <w:r>
+        <w:rPr/>
+        <w:t>Defines how many rows to return for the selected page</w:t>
+      </w:r>
+    </w:p>
+    <w:p>
+      <w:pPr>
+        <w:pStyle w:val="normal1"/>
+        <w:numPr>
+          <w:ilvl w:val="1"/>
+          <w:numId w:val="1"/>
+        </w:numPr>
+        <w:ind w:hanging="360" w:left="1440"/>
+        <w:rPr>
+          <w:b/>
+          <w:bCs/>
+        </w:rPr>
+      </w:pPr>
+      <w:r>
+        <w:rPr>
+          <w:b w:val="false"/>
+          <w:bCs w:val="false"/>
+        </w:rPr>
+        <w:t xml:space="preserve">returns: </w:t>
+      </w:r>
+    </w:p>
+    <w:p>
+      <w:pPr>
+        <w:pStyle w:val="normal1"/>
+        <w:numPr>
+          <w:ilvl w:val="0"/>
+          <w:numId w:val="1"/>
+        </w:numPr>
+        <w:ind w:hanging="360" w:left="720"/>
+        <w:rPr/>
+      </w:pPr>
+      <w:r>
+        <w:rPr/>
+        <w:t xml:space="preserve">GET Team </w:t>
+      </w:r>
+      <w:r>
+        <w:rPr/>
+        <w:t xml:space="preserve">Rows by </w:t>
+      </w:r>
+      <w:r>
+        <w:rPr/>
+        <w:t>Division</w:t>
+      </w:r>
+    </w:p>
+    <w:p>
+      <w:pPr>
+        <w:pStyle w:val="normal1"/>
+        <w:numPr>
+          <w:ilvl w:val="1"/>
+          <w:numId w:val="1"/>
+        </w:numPr>
+        <w:ind w:hanging="360" w:left="1440"/>
+        <w:rPr/>
+      </w:pPr>
+      <w:r>
+        <w:rPr/>
+        <w:t xml:space="preserve">built_including_tests: </w:t>
+      </w:r>
+      <w:r>
+        <w:rPr>
+          <w:b/>
+          <w:bCs/>
+        </w:rPr>
+        <w:t>true</w:t>
+      </w:r>
+    </w:p>
+    <w:p>
+      <w:pPr>
+        <w:pStyle w:val="normal1"/>
+        <w:numPr>
+          <w:ilvl w:val="1"/>
+          <w:numId w:val="1"/>
+        </w:numPr>
+        <w:ind w:hanging="360" w:left="1440"/>
+        <w:rPr/>
+      </w:pPr>
+      <w:r>
+        <w:rPr/>
+        <w:t>HTTP method: ‘GET’</w:t>
+      </w:r>
+    </w:p>
+    <w:p>
+      <w:pPr>
+        <w:pStyle w:val="normal1"/>
+        <w:numPr>
+          <w:ilvl w:val="1"/>
+          <w:numId w:val="1"/>
+        </w:numPr>
+        <w:ind w:hanging="360" w:left="1440"/>
+        <w:rPr/>
+      </w:pPr>
+      <w:r>
+        <w:rPr/>
+        <w:t>endpoint: {base_uri}/api/</w:t>
+      </w:r>
+      <w:r>
+        <w:rPr/>
+        <w:t>divisions</w:t>
+      </w:r>
+      <w:r>
+        <w:rPr/>
+        <w:t>/{tid}/team-rows</w:t>
+      </w:r>
+      <w:r>
+        <w:rPr/>
+        <w:t>?page={page_num}&amp;page_size={num_of_rows}</w:t>
+      </w:r>
+    </w:p>
+    <w:p>
+      <w:pPr>
+        <w:pStyle w:val="normal1"/>
+        <w:numPr>
+          <w:ilvl w:val="1"/>
+          <w:numId w:val="1"/>
+        </w:numPr>
+        <w:ind w:hanging="360" w:left="1440"/>
+        <w:rPr/>
+      </w:pPr>
+      <w:r>
+        <w:rPr/>
+        <w:t xml:space="preserve">description: </w:t>
+      </w:r>
+    </w:p>
+    <w:p>
+      <w:pPr>
+        <w:pStyle w:val="normal1"/>
+        <w:widowControl/>
+        <w:numPr>
+          <w:ilvl w:val="2"/>
+          <w:numId w:val="1"/>
+        </w:numPr>
+        <w:suppressAutoHyphens w:val="true"/>
+        <w:bidi w:val="0"/>
+        <w:spacing w:lineRule="auto" w:line="276" w:before="0" w:after="0"/>
+        <w:ind w:hanging="360" w:left="2160" w:right="0"/>
+        <w:jc w:val="left"/>
+        <w:rPr/>
+      </w:pPr>
+      <w:r>
+        <w:rPr/>
+        <w:t>Is used by the Teams data table in the UI with the goal of having a single call to the backend whenever that data table is loaded.</w:t>
+      </w:r>
+    </w:p>
+    <w:p>
+      <w:pPr>
+        <w:pStyle w:val="normal1"/>
+        <w:numPr>
+          <w:ilvl w:val="1"/>
+          <w:numId w:val="1"/>
+        </w:numPr>
+        <w:ind w:hanging="360" w:left="1440"/>
+        <w:rPr/>
+      </w:pPr>
+      <w:r>
+        <w:rPr/>
+        <w:t xml:space="preserve">parameters: </w:t>
+      </w:r>
+    </w:p>
+    <w:p>
+      <w:pPr>
+        <w:pStyle w:val="normal1"/>
+        <w:numPr>
+          <w:ilvl w:val="2"/>
+          <w:numId w:val="1"/>
+        </w:numPr>
+        <w:ind w:hanging="360" w:left="2160"/>
+        <w:rPr/>
+      </w:pPr>
+      <w:r>
+        <w:rPr/>
+        <w:t>page={page_num}</w:t>
+      </w:r>
+    </w:p>
+    <w:p>
+      <w:pPr>
+        <w:pStyle w:val="normal1"/>
+        <w:numPr>
+          <w:ilvl w:val="3"/>
+          <w:numId w:val="1"/>
+        </w:numPr>
+        <w:ind w:hanging="360" w:left="2880"/>
+        <w:rPr>
+          <w:color w:val="FF0000"/>
+        </w:rPr>
+      </w:pPr>
+      <w:r>
+        <w:rPr>
+          <w:color w:val="FF0000"/>
+        </w:rPr>
+        <w:t>Required</w:t>
+      </w:r>
+    </w:p>
+    <w:p>
+      <w:pPr>
+        <w:pStyle w:val="normal1"/>
+        <w:numPr>
+          <w:ilvl w:val="3"/>
+          <w:numId w:val="1"/>
+        </w:numPr>
+        <w:ind w:hanging="360" w:left="2880"/>
+        <w:rPr/>
+      </w:pPr>
+      <w:r>
+        <w:rPr/>
+        <w:t>Defines which page to return</w:t>
+      </w:r>
+    </w:p>
+    <w:p>
+      <w:pPr>
+        <w:pStyle w:val="normal1"/>
+        <w:numPr>
+          <w:ilvl w:val="3"/>
+          <w:numId w:val="1"/>
+        </w:numPr>
+        <w:ind w:hanging="360" w:left="2880"/>
+        <w:rPr/>
+      </w:pPr>
+      <w:r>
+        <w:rPr/>
+        <w:t>First page = 0 (zero)</w:t>
+      </w:r>
+    </w:p>
+    <w:p>
+      <w:pPr>
+        <w:pStyle w:val="normal1"/>
+        <w:numPr>
+          <w:ilvl w:val="2"/>
+          <w:numId w:val="1"/>
+        </w:numPr>
+        <w:ind w:hanging="360" w:left="2160"/>
+        <w:rPr/>
+      </w:pPr>
+      <w:r>
+        <w:rPr/>
+        <w:t>page_size={num_of_rows}</w:t>
+      </w:r>
+    </w:p>
+    <w:p>
+      <w:pPr>
+        <w:pStyle w:val="normal1"/>
+        <w:widowControl/>
+        <w:numPr>
+          <w:ilvl w:val="3"/>
+          <w:numId w:val="1"/>
+        </w:numPr>
+        <w:suppressAutoHyphens w:val="true"/>
+        <w:bidi w:val="0"/>
+        <w:spacing w:lineRule="auto" w:line="276" w:before="0" w:after="0"/>
+        <w:ind w:hanging="360" w:left="2880" w:right="0"/>
+        <w:jc w:val="left"/>
+        <w:rPr>
+          <w:color w:val="FF0000"/>
+        </w:rPr>
+      </w:pPr>
+      <w:r>
+        <w:rPr>
+          <w:color w:val="FF0000"/>
+        </w:rPr>
+        <w:t>Required</w:t>
+      </w:r>
+    </w:p>
+    <w:p>
+      <w:pPr>
+        <w:pStyle w:val="normal1"/>
+        <w:widowControl/>
+        <w:numPr>
+          <w:ilvl w:val="3"/>
+          <w:numId w:val="1"/>
+        </w:numPr>
+        <w:suppressAutoHyphens w:val="true"/>
+        <w:bidi w:val="0"/>
+        <w:spacing w:lineRule="auto" w:line="276" w:before="0" w:after="0"/>
+        <w:ind w:hanging="360" w:left="2880" w:right="0"/>
+        <w:jc w:val="left"/>
+        <w:rPr/>
+      </w:pPr>
+      <w:r>
+        <w:rPr>
+          <w:b w:val="false"/>
+          <w:bCs w:val="false"/>
+          <w:color w:val="auto"/>
+        </w:rPr>
+        <w:t>Defines</w:t>
+      </w:r>
+      <w:r>
+        <w:rPr>
+          <w:b w:val="false"/>
+          <w:bCs w:val="false"/>
+        </w:rPr>
+        <w:t xml:space="preserve"> how many rows to return for the selected page</w:t>
+      </w:r>
+    </w:p>
+    <w:p>
+      <w:pPr>
+        <w:pStyle w:val="normal1"/>
+        <w:widowControl/>
+        <w:numPr>
+          <w:ilvl w:val="1"/>
+          <w:numId w:val="1"/>
+        </w:numPr>
+        <w:suppressAutoHyphens w:val="true"/>
+        <w:bidi w:val="0"/>
+        <w:spacing w:lineRule="auto" w:line="276" w:before="0" w:after="0"/>
+        <w:ind w:hanging="360" w:left="1440" w:right="0"/>
+        <w:jc w:val="left"/>
+        <w:rPr>
+          <w:b w:val="false"/>
+          <w:bCs w:val="false"/>
+        </w:rPr>
+      </w:pPr>
+      <w:r>
+        <w:rPr>
+          <w:b w:val="false"/>
+          <w:bCs w:val="false"/>
+        </w:rPr>
+        <w:t>returns:</w:t>
       </w:r>
     </w:p>
     <w:p>
@@ -51396,8 +51892,8 @@
       <w:u w:val="single"/>
     </w:rPr>
   </w:style>
-  <w:style w:type="character" w:styleId="Bulletsuser">
-    <w:name w:val="Bullets (user)"/>
+  <w:style w:type="character" w:styleId="Bullets">
+    <w:name w:val="Bullets"/>
     <w:qFormat/>
     <w:rPr>
       <w:rFonts w:ascii="OpenSymbol" w:hAnsi="OpenSymbol" w:eastAsia="OpenSymbol" w:cs="OpenSymbol"/>

</xml_diff>

<commit_message>
Made Rounds data table use a single API call at the Tournament and Divisions profile levels. Added documentaiton fo rthe 2 new API endpoints. Sorting and pagination capabilities were preserved.
</commit_message>
<xml_diff>
--- a/docs/QView API Documentation.docx
+++ b/docs/QView API Documentation.docx
@@ -10,11 +10,11 @@
       </w:pPr>
       <w:r>
         <w:rPr/>
-        <w:t>QView API Documentation (v16</w:t>
-      </w:r>
-      <w:r>
-        <w:rPr/>
-        <w:t>9</w:t>
+        <w:t>QView API Documentation (v1</w:t>
+      </w:r>
+      <w:r>
+        <w:rPr/>
+        <w:t>70</w:t>
       </w:r>
       <w:r>
         <w:rPr/>
@@ -39077,6 +39077,556 @@
     <w:p>
       <w:pPr>
         <w:pStyle w:val="normal1"/>
+        <w:widowControl/>
+        <w:numPr>
+          <w:ilvl w:val="0"/>
+          <w:numId w:val="1"/>
+        </w:numPr>
+        <w:suppressAutoHyphens w:val="true"/>
+        <w:bidi w:val="0"/>
+        <w:spacing w:lineRule="auto" w:line="276" w:before="0" w:after="0"/>
+        <w:ind w:hanging="360" w:left="720" w:right="0"/>
+        <w:jc w:val="left"/>
+        <w:rPr/>
+      </w:pPr>
+      <w:r>
+        <w:rPr/>
+        <w:t xml:space="preserve">GET Round </w:t>
+      </w:r>
+      <w:r>
+        <w:rPr/>
+        <w:t>Row</w:t>
+      </w:r>
+      <w:r>
+        <w:rPr/>
+        <w:t xml:space="preserve">s </w:t>
+      </w:r>
+      <w:r>
+        <w:rPr/>
+        <w:t>of Tournament</w:t>
+      </w:r>
+    </w:p>
+    <w:p>
+      <w:pPr>
+        <w:pStyle w:val="normal1"/>
+        <w:numPr>
+          <w:ilvl w:val="1"/>
+          <w:numId w:val="1"/>
+        </w:numPr>
+        <w:ind w:hanging="360" w:left="1440"/>
+        <w:rPr/>
+      </w:pPr>
+      <w:r>
+        <w:rPr/>
+        <w:t xml:space="preserve">built_including_tests: </w:t>
+      </w:r>
+      <w:r>
+        <w:rPr>
+          <w:b/>
+          <w:bCs/>
+        </w:rPr>
+        <w:t>true</w:t>
+      </w:r>
+    </w:p>
+    <w:p>
+      <w:pPr>
+        <w:pStyle w:val="normal1"/>
+        <w:numPr>
+          <w:ilvl w:val="1"/>
+          <w:numId w:val="1"/>
+        </w:numPr>
+        <w:ind w:hanging="360" w:left="1440"/>
+        <w:rPr/>
+      </w:pPr>
+      <w:r>
+        <w:rPr/>
+        <w:t>HTTP method: ‘GET’</w:t>
+      </w:r>
+    </w:p>
+    <w:p>
+      <w:pPr>
+        <w:pStyle w:val="normal1"/>
+        <w:numPr>
+          <w:ilvl w:val="1"/>
+          <w:numId w:val="1"/>
+        </w:numPr>
+        <w:ind w:hanging="360" w:left="1440"/>
+        <w:rPr/>
+      </w:pPr>
+      <w:r>
+        <w:rPr/>
+        <w:t>endpoint: {base_uri}/api/</w:t>
+      </w:r>
+      <w:r>
+        <w:rPr/>
+        <w:t>tournaments/{id}/round-rows</w:t>
+      </w:r>
+      <w:r>
+        <w:rPr/>
+        <w:t>?page={page_num}&amp;page_size={num_of_rows}</w:t>
+      </w:r>
+    </w:p>
+    <w:p>
+      <w:pPr>
+        <w:pStyle w:val="normal1"/>
+        <w:numPr>
+          <w:ilvl w:val="1"/>
+          <w:numId w:val="1"/>
+        </w:numPr>
+        <w:ind w:hanging="360" w:left="1440"/>
+        <w:rPr/>
+      </w:pPr>
+      <w:r>
+        <w:rPr/>
+        <w:t xml:space="preserve">description: </w:t>
+      </w:r>
+    </w:p>
+    <w:p>
+      <w:pPr>
+        <w:pStyle w:val="normal1"/>
+        <w:widowControl/>
+        <w:numPr>
+          <w:ilvl w:val="2"/>
+          <w:numId w:val="1"/>
+        </w:numPr>
+        <w:suppressAutoHyphens w:val="true"/>
+        <w:bidi w:val="0"/>
+        <w:spacing w:lineRule="auto" w:line="276" w:before="0" w:after="0"/>
+        <w:ind w:hanging="360" w:left="2160" w:right="0"/>
+        <w:jc w:val="left"/>
+        <w:rPr/>
+      </w:pPr>
+      <w:r>
+        <w:rPr/>
+        <w:t>Designed to offer a single API call for the Rounds UI data table scoped to a Tournament.</w:t>
+      </w:r>
+    </w:p>
+    <w:p>
+      <w:pPr>
+        <w:pStyle w:val="normal1"/>
+        <w:numPr>
+          <w:ilvl w:val="1"/>
+          <w:numId w:val="1"/>
+        </w:numPr>
+        <w:ind w:hanging="360" w:left="1440"/>
+        <w:rPr/>
+      </w:pPr>
+      <w:r>
+        <w:rPr/>
+        <w:t xml:space="preserve">parameters: </w:t>
+      </w:r>
+    </w:p>
+    <w:p>
+      <w:pPr>
+        <w:pStyle w:val="normal1"/>
+        <w:numPr>
+          <w:ilvl w:val="2"/>
+          <w:numId w:val="1"/>
+        </w:numPr>
+        <w:ind w:hanging="360" w:left="2160"/>
+        <w:rPr/>
+      </w:pPr>
+      <w:r>
+        <w:rPr/>
+        <w:t>page={page_num}</w:t>
+      </w:r>
+    </w:p>
+    <w:p>
+      <w:pPr>
+        <w:pStyle w:val="normal1"/>
+        <w:numPr>
+          <w:ilvl w:val="3"/>
+          <w:numId w:val="1"/>
+        </w:numPr>
+        <w:ind w:hanging="360" w:left="2880"/>
+        <w:rPr>
+          <w:color w:val="FF0000"/>
+        </w:rPr>
+      </w:pPr>
+      <w:r>
+        <w:rPr>
+          <w:color w:val="FF0000"/>
+        </w:rPr>
+        <w:t>Required</w:t>
+      </w:r>
+    </w:p>
+    <w:p>
+      <w:pPr>
+        <w:pStyle w:val="normal1"/>
+        <w:numPr>
+          <w:ilvl w:val="3"/>
+          <w:numId w:val="1"/>
+        </w:numPr>
+        <w:ind w:hanging="360" w:left="2880"/>
+        <w:rPr/>
+      </w:pPr>
+      <w:r>
+        <w:rPr/>
+        <w:t>Defines which page to return</w:t>
+      </w:r>
+    </w:p>
+    <w:p>
+      <w:pPr>
+        <w:pStyle w:val="normal1"/>
+        <w:numPr>
+          <w:ilvl w:val="3"/>
+          <w:numId w:val="1"/>
+        </w:numPr>
+        <w:ind w:hanging="360" w:left="2880"/>
+        <w:rPr/>
+      </w:pPr>
+      <w:r>
+        <w:rPr/>
+        <w:t>First page = 0 (zero)</w:t>
+      </w:r>
+    </w:p>
+    <w:p>
+      <w:pPr>
+        <w:pStyle w:val="normal1"/>
+        <w:numPr>
+          <w:ilvl w:val="2"/>
+          <w:numId w:val="1"/>
+        </w:numPr>
+        <w:ind w:hanging="360" w:left="2160"/>
+        <w:rPr/>
+      </w:pPr>
+      <w:r>
+        <w:rPr/>
+        <w:t>page_size={num_of_rows}</w:t>
+      </w:r>
+    </w:p>
+    <w:p>
+      <w:pPr>
+        <w:pStyle w:val="normal1"/>
+        <w:numPr>
+          <w:ilvl w:val="3"/>
+          <w:numId w:val="1"/>
+        </w:numPr>
+        <w:ind w:hanging="360" w:left="2880"/>
+        <w:rPr>
+          <w:color w:val="FF0000"/>
+        </w:rPr>
+      </w:pPr>
+      <w:r>
+        <w:rPr>
+          <w:color w:val="FF0000"/>
+        </w:rPr>
+        <w:t>Required</w:t>
+      </w:r>
+    </w:p>
+    <w:p>
+      <w:pPr>
+        <w:pStyle w:val="normal1"/>
+        <w:numPr>
+          <w:ilvl w:val="3"/>
+          <w:numId w:val="1"/>
+        </w:numPr>
+        <w:ind w:hanging="360" w:left="2880"/>
+        <w:rPr/>
+      </w:pPr>
+      <w:r>
+        <w:rPr/>
+        <w:t>Defines how many rows to return for the selected page</w:t>
+      </w:r>
+    </w:p>
+    <w:p>
+      <w:pPr>
+        <w:pStyle w:val="normal1"/>
+        <w:widowControl/>
+        <w:numPr>
+          <w:ilvl w:val="2"/>
+          <w:numId w:val="1"/>
+        </w:numPr>
+        <w:suppressAutoHyphens w:val="true"/>
+        <w:bidi w:val="0"/>
+        <w:spacing w:lineRule="auto" w:line="276" w:before="0" w:after="0"/>
+        <w:ind w:hanging="360" w:left="2160" w:right="0"/>
+        <w:jc w:val="left"/>
+        <w:rPr/>
+      </w:pPr>
+      <w:r>
+        <w:rPr/>
+        <w:t xml:space="preserve">returns: </w:t>
+      </w:r>
+    </w:p>
+    <w:p>
+      <w:pPr>
+        <w:pStyle w:val="normal1"/>
+        <w:widowControl/>
+        <w:numPr>
+          <w:ilvl w:val="0"/>
+          <w:numId w:val="1"/>
+        </w:numPr>
+        <w:suppressAutoHyphens w:val="true"/>
+        <w:bidi w:val="0"/>
+        <w:spacing w:lineRule="auto" w:line="276" w:before="0" w:after="0"/>
+        <w:ind w:hanging="360" w:left="720" w:right="0"/>
+        <w:jc w:val="left"/>
+        <w:rPr/>
+      </w:pPr>
+      <w:r>
+        <w:rPr/>
+        <w:t xml:space="preserve">GET Round </w:t>
+      </w:r>
+      <w:r>
+        <w:rPr/>
+        <w:t>Row</w:t>
+      </w:r>
+      <w:r>
+        <w:rPr/>
+        <w:t xml:space="preserve">s </w:t>
+      </w:r>
+      <w:r>
+        <w:rPr/>
+        <w:t>of Division</w:t>
+      </w:r>
+    </w:p>
+    <w:p>
+      <w:pPr>
+        <w:pStyle w:val="normal1"/>
+        <w:numPr>
+          <w:ilvl w:val="1"/>
+          <w:numId w:val="1"/>
+        </w:numPr>
+        <w:ind w:hanging="360" w:left="1440"/>
+        <w:rPr/>
+      </w:pPr>
+      <w:r>
+        <w:rPr/>
+        <w:t xml:space="preserve">built_including_tests: </w:t>
+      </w:r>
+      <w:r>
+        <w:rPr>
+          <w:b/>
+          <w:bCs/>
+        </w:rPr>
+        <w:t>true</w:t>
+      </w:r>
+    </w:p>
+    <w:p>
+      <w:pPr>
+        <w:pStyle w:val="normal1"/>
+        <w:numPr>
+          <w:ilvl w:val="1"/>
+          <w:numId w:val="1"/>
+        </w:numPr>
+        <w:ind w:hanging="360" w:left="1440"/>
+        <w:rPr/>
+      </w:pPr>
+      <w:r>
+        <w:rPr/>
+        <w:t>HTTP method: ‘GET’</w:t>
+      </w:r>
+    </w:p>
+    <w:p>
+      <w:pPr>
+        <w:pStyle w:val="normal1"/>
+        <w:numPr>
+          <w:ilvl w:val="1"/>
+          <w:numId w:val="1"/>
+        </w:numPr>
+        <w:ind w:hanging="360" w:left="1440"/>
+        <w:rPr/>
+      </w:pPr>
+      <w:r>
+        <w:rPr/>
+        <w:t>endpoint: {base_uri}/api/</w:t>
+      </w:r>
+      <w:r>
+        <w:rPr/>
+        <w:t>divisions/{id}/round-rows</w:t>
+      </w:r>
+      <w:r>
+        <w:rPr/>
+        <w:t>?page={page_num}&amp;page_size={num_of_rows}</w:t>
+      </w:r>
+    </w:p>
+    <w:p>
+      <w:pPr>
+        <w:pStyle w:val="normal1"/>
+        <w:numPr>
+          <w:ilvl w:val="1"/>
+          <w:numId w:val="1"/>
+        </w:numPr>
+        <w:ind w:hanging="360" w:left="1440"/>
+        <w:rPr/>
+      </w:pPr>
+      <w:r>
+        <w:rPr/>
+        <w:t xml:space="preserve">description: </w:t>
+      </w:r>
+    </w:p>
+    <w:p>
+      <w:pPr>
+        <w:pStyle w:val="normal1"/>
+        <w:widowControl/>
+        <w:numPr>
+          <w:ilvl w:val="2"/>
+          <w:numId w:val="1"/>
+        </w:numPr>
+        <w:suppressAutoHyphens w:val="true"/>
+        <w:bidi w:val="0"/>
+        <w:spacing w:lineRule="auto" w:line="276" w:before="0" w:after="0"/>
+        <w:ind w:hanging="360" w:left="2160" w:right="0"/>
+        <w:jc w:val="left"/>
+        <w:rPr/>
+      </w:pPr>
+      <w:r>
+        <w:rPr/>
+        <w:t>Designed to offer a single API call for the Rounds UI data table scoped to a Division.</w:t>
+      </w:r>
+    </w:p>
+    <w:p>
+      <w:pPr>
+        <w:pStyle w:val="normal1"/>
+        <w:numPr>
+          <w:ilvl w:val="1"/>
+          <w:numId w:val="1"/>
+        </w:numPr>
+        <w:ind w:hanging="360" w:left="1440"/>
+        <w:rPr/>
+      </w:pPr>
+      <w:r>
+        <w:rPr/>
+        <w:t xml:space="preserve">parameters: </w:t>
+      </w:r>
+    </w:p>
+    <w:p>
+      <w:pPr>
+        <w:pStyle w:val="normal1"/>
+        <w:numPr>
+          <w:ilvl w:val="2"/>
+          <w:numId w:val="1"/>
+        </w:numPr>
+        <w:ind w:hanging="360" w:left="2160"/>
+        <w:rPr/>
+      </w:pPr>
+      <w:r>
+        <w:rPr/>
+        <w:t>page={page_num}</w:t>
+      </w:r>
+    </w:p>
+    <w:p>
+      <w:pPr>
+        <w:pStyle w:val="normal1"/>
+        <w:numPr>
+          <w:ilvl w:val="3"/>
+          <w:numId w:val="1"/>
+        </w:numPr>
+        <w:ind w:hanging="360" w:left="2880"/>
+        <w:rPr>
+          <w:color w:val="FF0000"/>
+        </w:rPr>
+      </w:pPr>
+      <w:r>
+        <w:rPr>
+          <w:color w:val="FF0000"/>
+        </w:rPr>
+        <w:t>Required</w:t>
+      </w:r>
+    </w:p>
+    <w:p>
+      <w:pPr>
+        <w:pStyle w:val="normal1"/>
+        <w:numPr>
+          <w:ilvl w:val="3"/>
+          <w:numId w:val="1"/>
+        </w:numPr>
+        <w:ind w:hanging="360" w:left="2880"/>
+        <w:rPr/>
+      </w:pPr>
+      <w:r>
+        <w:rPr/>
+        <w:t>Defines which page to return</w:t>
+      </w:r>
+    </w:p>
+    <w:p>
+      <w:pPr>
+        <w:pStyle w:val="normal1"/>
+        <w:numPr>
+          <w:ilvl w:val="3"/>
+          <w:numId w:val="1"/>
+        </w:numPr>
+        <w:ind w:hanging="360" w:left="2880"/>
+        <w:rPr/>
+      </w:pPr>
+      <w:r>
+        <w:rPr/>
+        <w:t>First page = 0 (zero)</w:t>
+      </w:r>
+    </w:p>
+    <w:p>
+      <w:pPr>
+        <w:pStyle w:val="normal1"/>
+        <w:numPr>
+          <w:ilvl w:val="2"/>
+          <w:numId w:val="1"/>
+        </w:numPr>
+        <w:ind w:hanging="360" w:left="2160"/>
+        <w:rPr/>
+      </w:pPr>
+      <w:r>
+        <w:rPr/>
+        <w:t>page_size={num_of_rows}</w:t>
+      </w:r>
+    </w:p>
+    <w:p>
+      <w:pPr>
+        <w:pStyle w:val="normal1"/>
+        <w:numPr>
+          <w:ilvl w:val="3"/>
+          <w:numId w:val="1"/>
+        </w:numPr>
+        <w:ind w:hanging="360" w:left="2880"/>
+        <w:rPr>
+          <w:color w:val="FF0000"/>
+        </w:rPr>
+      </w:pPr>
+      <w:r>
+        <w:rPr>
+          <w:color w:val="FF0000"/>
+        </w:rPr>
+        <w:t>Required</w:t>
+      </w:r>
+    </w:p>
+    <w:p>
+      <w:pPr>
+        <w:pStyle w:val="normal1"/>
+        <w:numPr>
+          <w:ilvl w:val="3"/>
+          <w:numId w:val="1"/>
+        </w:numPr>
+        <w:ind w:hanging="360" w:left="2880"/>
+        <w:rPr/>
+      </w:pPr>
+      <w:r>
+        <w:rPr/>
+        <w:t>Defines how many rows to return for the selected page</w:t>
+      </w:r>
+    </w:p>
+    <w:p>
+      <w:pPr>
+        <w:pStyle w:val="normal1"/>
+        <w:widowControl/>
+        <w:numPr>
+          <w:ilvl w:val="2"/>
+          <w:numId w:val="1"/>
+        </w:numPr>
+        <w:suppressAutoHyphens w:val="true"/>
+        <w:bidi w:val="0"/>
+        <w:spacing w:lineRule="auto" w:line="276" w:before="0" w:after="0"/>
+        <w:ind w:hanging="360" w:left="2160" w:right="0"/>
+        <w:jc w:val="left"/>
+        <w:rPr/>
+      </w:pPr>
+      <w:r>
+        <w:rPr/>
+        <w:t xml:space="preserve">returns: </w:t>
+      </w:r>
+    </w:p>
+    <w:p>
+      <w:pPr>
+        <w:pStyle w:val="normal1"/>
         <w:numPr>
           <w:ilvl w:val="0"/>
           <w:numId w:val="1"/>
@@ -41605,11 +42155,7 @@
       </w:pPr>
       <w:r>
         <w:rPr/>
-        <w:t xml:space="preserve">GET Team </w:t>
-      </w:r>
-      <w:r>
-        <w:rPr/>
-        <w:t>Rows by Tournament</w:t>
+        <w:t>GET Team Rows by Tournament</w:t>
       </w:r>
     </w:p>
     <w:p>
@@ -41661,15 +42207,7 @@
       </w:pPr>
       <w:r>
         <w:rPr/>
-        <w:t>endpoint: {base_uri}/api/</w:t>
-      </w:r>
-      <w:r>
-        <w:rPr/>
-        <w:t>tournaments/{tid}/team-rows</w:t>
-      </w:r>
-      <w:r>
-        <w:rPr/>
-        <w:t>?page={page_num}&amp;page_size={num_of_rows}</w:t>
+        <w:t>endpoint: {base_uri}/api/tournaments/{tid}/team-rows?page={page_num}&amp;page_size={num_of_rows}</w:t>
       </w:r>
     </w:p>
     <w:p>
@@ -41868,15 +42406,7 @@
       </w:pPr>
       <w:r>
         <w:rPr/>
-        <w:t xml:space="preserve">GET Team </w:t>
-      </w:r>
-      <w:r>
-        <w:rPr/>
-        <w:t xml:space="preserve">Rows by </w:t>
-      </w:r>
-      <w:r>
-        <w:rPr/>
-        <w:t>Division</w:t>
+        <w:t>GET Team Rows by Division</w:t>
       </w:r>
     </w:p>
     <w:p>
@@ -41928,19 +42458,7 @@
       </w:pPr>
       <w:r>
         <w:rPr/>
-        <w:t>endpoint: {base_uri}/api/</w:t>
-      </w:r>
-      <w:r>
-        <w:rPr/>
-        <w:t>divisions</w:t>
-      </w:r>
-      <w:r>
-        <w:rPr/>
-        <w:t>/{tid}/team-rows</w:t>
-      </w:r>
-      <w:r>
-        <w:rPr/>
-        <w:t>?page={page_num}&amp;page_size={num_of_rows}</w:t>
+        <w:t>endpoint: {base_uri}/api/divisions/{tid}/team-rows?page={page_num}&amp;page_size={num_of_rows}</w:t>
       </w:r>
     </w:p>
     <w:p>
@@ -51892,8 +52410,8 @@
       <w:u w:val="single"/>
     </w:rPr>
   </w:style>
-  <w:style w:type="character" w:styleId="Bullets">
-    <w:name w:val="Bullets"/>
+  <w:style w:type="character" w:styleId="Bulletsuser">
+    <w:name w:val="Bullets (user)"/>
     <w:qFormat/>
     <w:rPr>
       <w:rFonts w:ascii="OpenSymbol" w:hAnsi="OpenSymbol" w:eastAsia="OpenSymbol" w:cs="OpenSymbol"/>

</xml_diff>

<commit_message>
Optimized the Games UI data table so that it makes a single API call per load. Frontend data processing now exists on the backend instead. New API endpoints (4) have also been documented.
</commit_message>
<xml_diff>
--- a/docs/QView API Documentation.docx
+++ b/docs/QView API Documentation.docx
@@ -10,11 +10,11 @@
       </w:pPr>
       <w:r>
         <w:rPr/>
-        <w:t>QView API Documentation (v1</w:t>
-      </w:r>
-      <w:r>
-        <w:rPr/>
-        <w:t>70</w:t>
+        <w:t>QView API Documentation (v17</w:t>
+      </w:r>
+      <w:r>
+        <w:rPr/>
+        <w:t>1</w:t>
       </w:r>
       <w:r>
         <w:rPr/>
@@ -17430,6 +17430,1086 @@
       </w:pPr>
       <w:r>
         <w:rPr/>
+        <w:t xml:space="preserve">GET Game </w:t>
+      </w:r>
+      <w:r>
+        <w:rPr/>
+        <w:t>Row</w:t>
+      </w:r>
+      <w:r>
+        <w:rPr/>
+        <w:t xml:space="preserve">s </w:t>
+      </w:r>
+      <w:r>
+        <w:rPr/>
+        <w:t>of Tournament</w:t>
+      </w:r>
+    </w:p>
+    <w:p>
+      <w:pPr>
+        <w:pStyle w:val="normal1"/>
+        <w:numPr>
+          <w:ilvl w:val="1"/>
+          <w:numId w:val="1"/>
+        </w:numPr>
+        <w:ind w:hanging="360" w:left="1440"/>
+        <w:rPr/>
+      </w:pPr>
+      <w:r>
+        <w:rPr/>
+        <w:t xml:space="preserve">built_including_tests: </w:t>
+      </w:r>
+      <w:r>
+        <w:rPr>
+          <w:b/>
+          <w:bCs/>
+        </w:rPr>
+        <w:t>true</w:t>
+      </w:r>
+    </w:p>
+    <w:p>
+      <w:pPr>
+        <w:pStyle w:val="normal1"/>
+        <w:numPr>
+          <w:ilvl w:val="1"/>
+          <w:numId w:val="1"/>
+        </w:numPr>
+        <w:ind w:hanging="360" w:left="1440"/>
+        <w:rPr/>
+      </w:pPr>
+      <w:r>
+        <w:rPr/>
+        <w:t>HTTP method: ‘GET’</w:t>
+      </w:r>
+    </w:p>
+    <w:p>
+      <w:pPr>
+        <w:pStyle w:val="normal1"/>
+        <w:numPr>
+          <w:ilvl w:val="1"/>
+          <w:numId w:val="1"/>
+        </w:numPr>
+        <w:ind w:hanging="360" w:left="1440"/>
+        <w:rPr/>
+      </w:pPr>
+      <w:r>
+        <w:rPr/>
+        <w:t>endpoint: {base_uri}/api/</w:t>
+      </w:r>
+      <w:r>
+        <w:rPr/>
+        <w:t>tournaments/{id}/game-rows</w:t>
+      </w:r>
+      <w:r>
+        <w:rPr/>
+        <w:t>?page={page_num}&amp;page_size={num_of_rows}</w:t>
+      </w:r>
+    </w:p>
+    <w:p>
+      <w:pPr>
+        <w:pStyle w:val="normal1"/>
+        <w:numPr>
+          <w:ilvl w:val="1"/>
+          <w:numId w:val="1"/>
+        </w:numPr>
+        <w:ind w:hanging="360" w:left="1440"/>
+        <w:rPr/>
+      </w:pPr>
+      <w:r>
+        <w:rPr/>
+        <w:t xml:space="preserve">description: </w:t>
+      </w:r>
+    </w:p>
+    <w:p>
+      <w:pPr>
+        <w:pStyle w:val="normal1"/>
+        <w:widowControl/>
+        <w:numPr>
+          <w:ilvl w:val="2"/>
+          <w:numId w:val="1"/>
+        </w:numPr>
+        <w:suppressAutoHyphens w:val="true"/>
+        <w:bidi w:val="0"/>
+        <w:spacing w:lineRule="auto" w:line="276" w:before="0" w:after="0"/>
+        <w:ind w:hanging="360" w:left="2160" w:right="0"/>
+        <w:jc w:val="left"/>
+        <w:rPr/>
+      </w:pPr>
+      <w:r>
+        <w:rPr/>
+        <w:t>Designed so that a single API call could be made for use by the Games UI data table when scoped to the Tournament profile.</w:t>
+      </w:r>
+    </w:p>
+    <w:p>
+      <w:pPr>
+        <w:pStyle w:val="normal1"/>
+        <w:numPr>
+          <w:ilvl w:val="1"/>
+          <w:numId w:val="1"/>
+        </w:numPr>
+        <w:ind w:hanging="360" w:left="1440"/>
+        <w:rPr/>
+      </w:pPr>
+      <w:r>
+        <w:rPr/>
+        <w:t xml:space="preserve">parameters: </w:t>
+      </w:r>
+    </w:p>
+    <w:p>
+      <w:pPr>
+        <w:pStyle w:val="normal1"/>
+        <w:numPr>
+          <w:ilvl w:val="2"/>
+          <w:numId w:val="1"/>
+        </w:numPr>
+        <w:ind w:hanging="360" w:left="2160"/>
+        <w:rPr/>
+      </w:pPr>
+      <w:r>
+        <w:rPr/>
+        <w:t>page={page_num}</w:t>
+      </w:r>
+    </w:p>
+    <w:p>
+      <w:pPr>
+        <w:pStyle w:val="normal1"/>
+        <w:numPr>
+          <w:ilvl w:val="3"/>
+          <w:numId w:val="1"/>
+        </w:numPr>
+        <w:ind w:hanging="360" w:left="2880"/>
+        <w:rPr>
+          <w:color w:val="FF0000"/>
+        </w:rPr>
+      </w:pPr>
+      <w:r>
+        <w:rPr>
+          <w:color w:val="FF0000"/>
+        </w:rPr>
+        <w:t>Required</w:t>
+      </w:r>
+    </w:p>
+    <w:p>
+      <w:pPr>
+        <w:pStyle w:val="normal1"/>
+        <w:numPr>
+          <w:ilvl w:val="3"/>
+          <w:numId w:val="1"/>
+        </w:numPr>
+        <w:ind w:hanging="360" w:left="2880"/>
+        <w:rPr/>
+      </w:pPr>
+      <w:r>
+        <w:rPr/>
+        <w:t>Defines which page to return</w:t>
+      </w:r>
+    </w:p>
+    <w:p>
+      <w:pPr>
+        <w:pStyle w:val="normal1"/>
+        <w:numPr>
+          <w:ilvl w:val="3"/>
+          <w:numId w:val="1"/>
+        </w:numPr>
+        <w:ind w:hanging="360" w:left="2880"/>
+        <w:rPr/>
+      </w:pPr>
+      <w:r>
+        <w:rPr/>
+        <w:t>First page = 0 (zero)</w:t>
+      </w:r>
+    </w:p>
+    <w:p>
+      <w:pPr>
+        <w:pStyle w:val="normal1"/>
+        <w:numPr>
+          <w:ilvl w:val="2"/>
+          <w:numId w:val="1"/>
+        </w:numPr>
+        <w:ind w:hanging="360" w:left="2160"/>
+        <w:rPr/>
+      </w:pPr>
+      <w:r>
+        <w:rPr/>
+        <w:t>page_size={num_of_rows}</w:t>
+      </w:r>
+    </w:p>
+    <w:p>
+      <w:pPr>
+        <w:pStyle w:val="normal1"/>
+        <w:numPr>
+          <w:ilvl w:val="3"/>
+          <w:numId w:val="1"/>
+        </w:numPr>
+        <w:ind w:hanging="360" w:left="2880"/>
+        <w:rPr>
+          <w:color w:val="FF0000"/>
+        </w:rPr>
+      </w:pPr>
+      <w:r>
+        <w:rPr>
+          <w:color w:val="FF0000"/>
+        </w:rPr>
+        <w:t>Required</w:t>
+      </w:r>
+    </w:p>
+    <w:p>
+      <w:pPr>
+        <w:pStyle w:val="normal1"/>
+        <w:numPr>
+          <w:ilvl w:val="3"/>
+          <w:numId w:val="1"/>
+        </w:numPr>
+        <w:ind w:hanging="360" w:left="2880"/>
+        <w:rPr/>
+      </w:pPr>
+      <w:r>
+        <w:rPr/>
+        <w:t>Defines how many rows to return for the selected page</w:t>
+      </w:r>
+    </w:p>
+    <w:p>
+      <w:pPr>
+        <w:pStyle w:val="normal1"/>
+        <w:widowControl/>
+        <w:numPr>
+          <w:ilvl w:val="2"/>
+          <w:numId w:val="1"/>
+        </w:numPr>
+        <w:suppressAutoHyphens w:val="true"/>
+        <w:bidi w:val="0"/>
+        <w:spacing w:lineRule="auto" w:line="276" w:before="0" w:after="0"/>
+        <w:ind w:hanging="360" w:left="2160" w:right="0"/>
+        <w:jc w:val="left"/>
+        <w:rPr/>
+      </w:pPr>
+      <w:r>
+        <w:rPr/>
+        <w:t xml:space="preserve">returns: </w:t>
+      </w:r>
+    </w:p>
+    <w:p>
+      <w:pPr>
+        <w:pStyle w:val="normal1"/>
+        <w:numPr>
+          <w:ilvl w:val="0"/>
+          <w:numId w:val="1"/>
+        </w:numPr>
+        <w:ind w:hanging="360" w:left="720"/>
+        <w:rPr/>
+      </w:pPr>
+      <w:r>
+        <w:rPr/>
+        <w:t xml:space="preserve">GET Game </w:t>
+      </w:r>
+      <w:r>
+        <w:rPr/>
+        <w:t>Row</w:t>
+      </w:r>
+      <w:r>
+        <w:rPr/>
+        <w:t xml:space="preserve">s </w:t>
+      </w:r>
+      <w:r>
+        <w:rPr/>
+        <w:t>of Division</w:t>
+      </w:r>
+    </w:p>
+    <w:p>
+      <w:pPr>
+        <w:pStyle w:val="normal1"/>
+        <w:numPr>
+          <w:ilvl w:val="1"/>
+          <w:numId w:val="1"/>
+        </w:numPr>
+        <w:ind w:hanging="360" w:left="1440"/>
+        <w:rPr/>
+      </w:pPr>
+      <w:r>
+        <w:rPr/>
+        <w:t xml:space="preserve">built_including_tests: </w:t>
+      </w:r>
+      <w:r>
+        <w:rPr>
+          <w:b/>
+          <w:bCs/>
+        </w:rPr>
+        <w:t>true</w:t>
+      </w:r>
+    </w:p>
+    <w:p>
+      <w:pPr>
+        <w:pStyle w:val="normal1"/>
+        <w:numPr>
+          <w:ilvl w:val="1"/>
+          <w:numId w:val="1"/>
+        </w:numPr>
+        <w:ind w:hanging="360" w:left="1440"/>
+        <w:rPr/>
+      </w:pPr>
+      <w:r>
+        <w:rPr/>
+        <w:t>HTTP method: ‘GET’</w:t>
+      </w:r>
+    </w:p>
+    <w:p>
+      <w:pPr>
+        <w:pStyle w:val="normal1"/>
+        <w:numPr>
+          <w:ilvl w:val="1"/>
+          <w:numId w:val="1"/>
+        </w:numPr>
+        <w:ind w:hanging="360" w:left="1440"/>
+        <w:rPr/>
+      </w:pPr>
+      <w:r>
+        <w:rPr/>
+        <w:t>endpoint: {base_uri}/api/</w:t>
+      </w:r>
+      <w:r>
+        <w:rPr/>
+        <w:t>divisions/{id}/game-rows</w:t>
+      </w:r>
+      <w:r>
+        <w:rPr/>
+        <w:t>?page={page_num}&amp;page_size={num_of_rows}</w:t>
+      </w:r>
+    </w:p>
+    <w:p>
+      <w:pPr>
+        <w:pStyle w:val="normal1"/>
+        <w:numPr>
+          <w:ilvl w:val="1"/>
+          <w:numId w:val="1"/>
+        </w:numPr>
+        <w:ind w:hanging="360" w:left="1440"/>
+        <w:rPr/>
+      </w:pPr>
+      <w:r>
+        <w:rPr/>
+        <w:t xml:space="preserve">description: </w:t>
+      </w:r>
+    </w:p>
+    <w:p>
+      <w:pPr>
+        <w:pStyle w:val="normal1"/>
+        <w:widowControl/>
+        <w:numPr>
+          <w:ilvl w:val="2"/>
+          <w:numId w:val="1"/>
+        </w:numPr>
+        <w:suppressAutoHyphens w:val="true"/>
+        <w:bidi w:val="0"/>
+        <w:spacing w:lineRule="auto" w:line="276" w:before="0" w:after="0"/>
+        <w:ind w:hanging="360" w:left="2160" w:right="0"/>
+        <w:jc w:val="left"/>
+        <w:rPr/>
+      </w:pPr>
+      <w:r>
+        <w:rPr/>
+        <w:t>Designed so that a single API call could be made for use by the Games UI data table when scoped to the Division profile.</w:t>
+      </w:r>
+    </w:p>
+    <w:p>
+      <w:pPr>
+        <w:pStyle w:val="normal1"/>
+        <w:numPr>
+          <w:ilvl w:val="1"/>
+          <w:numId w:val="1"/>
+        </w:numPr>
+        <w:ind w:hanging="360" w:left="1440"/>
+        <w:rPr/>
+      </w:pPr>
+      <w:r>
+        <w:rPr/>
+        <w:t xml:space="preserve">parameters: </w:t>
+      </w:r>
+    </w:p>
+    <w:p>
+      <w:pPr>
+        <w:pStyle w:val="normal1"/>
+        <w:numPr>
+          <w:ilvl w:val="2"/>
+          <w:numId w:val="1"/>
+        </w:numPr>
+        <w:ind w:hanging="360" w:left="2160"/>
+        <w:rPr/>
+      </w:pPr>
+      <w:r>
+        <w:rPr/>
+        <w:t>page={page_num}</w:t>
+      </w:r>
+    </w:p>
+    <w:p>
+      <w:pPr>
+        <w:pStyle w:val="normal1"/>
+        <w:numPr>
+          <w:ilvl w:val="3"/>
+          <w:numId w:val="1"/>
+        </w:numPr>
+        <w:ind w:hanging="360" w:left="2880"/>
+        <w:rPr>
+          <w:color w:val="FF0000"/>
+        </w:rPr>
+      </w:pPr>
+      <w:r>
+        <w:rPr>
+          <w:color w:val="FF0000"/>
+        </w:rPr>
+        <w:t>Required</w:t>
+      </w:r>
+    </w:p>
+    <w:p>
+      <w:pPr>
+        <w:pStyle w:val="normal1"/>
+        <w:numPr>
+          <w:ilvl w:val="3"/>
+          <w:numId w:val="1"/>
+        </w:numPr>
+        <w:ind w:hanging="360" w:left="2880"/>
+        <w:rPr/>
+      </w:pPr>
+      <w:r>
+        <w:rPr/>
+        <w:t>Defines which page to return</w:t>
+      </w:r>
+    </w:p>
+    <w:p>
+      <w:pPr>
+        <w:pStyle w:val="normal1"/>
+        <w:numPr>
+          <w:ilvl w:val="3"/>
+          <w:numId w:val="1"/>
+        </w:numPr>
+        <w:ind w:hanging="360" w:left="2880"/>
+        <w:rPr/>
+      </w:pPr>
+      <w:r>
+        <w:rPr/>
+        <w:t>First page = 0 (zero)</w:t>
+      </w:r>
+    </w:p>
+    <w:p>
+      <w:pPr>
+        <w:pStyle w:val="normal1"/>
+        <w:numPr>
+          <w:ilvl w:val="2"/>
+          <w:numId w:val="1"/>
+        </w:numPr>
+        <w:ind w:hanging="360" w:left="2160"/>
+        <w:rPr/>
+      </w:pPr>
+      <w:r>
+        <w:rPr/>
+        <w:t>page_size={num_of_rows}</w:t>
+      </w:r>
+    </w:p>
+    <w:p>
+      <w:pPr>
+        <w:pStyle w:val="normal1"/>
+        <w:numPr>
+          <w:ilvl w:val="3"/>
+          <w:numId w:val="1"/>
+        </w:numPr>
+        <w:ind w:hanging="360" w:left="2880"/>
+        <w:rPr>
+          <w:color w:val="FF0000"/>
+        </w:rPr>
+      </w:pPr>
+      <w:r>
+        <w:rPr>
+          <w:color w:val="FF0000"/>
+        </w:rPr>
+        <w:t>Required</w:t>
+      </w:r>
+    </w:p>
+    <w:p>
+      <w:pPr>
+        <w:pStyle w:val="normal1"/>
+        <w:numPr>
+          <w:ilvl w:val="3"/>
+          <w:numId w:val="1"/>
+        </w:numPr>
+        <w:ind w:hanging="360" w:left="2880"/>
+        <w:rPr/>
+      </w:pPr>
+      <w:r>
+        <w:rPr/>
+        <w:t>Defines how many rows to return for the selected page</w:t>
+      </w:r>
+    </w:p>
+    <w:p>
+      <w:pPr>
+        <w:pStyle w:val="normal1"/>
+        <w:widowControl/>
+        <w:numPr>
+          <w:ilvl w:val="2"/>
+          <w:numId w:val="1"/>
+        </w:numPr>
+        <w:suppressAutoHyphens w:val="true"/>
+        <w:bidi w:val="0"/>
+        <w:spacing w:lineRule="auto" w:line="276" w:before="0" w:after="0"/>
+        <w:ind w:hanging="360" w:left="2160" w:right="0"/>
+        <w:jc w:val="left"/>
+        <w:rPr/>
+      </w:pPr>
+      <w:r>
+        <w:rPr/>
+        <w:t>returns:</w:t>
+      </w:r>
+    </w:p>
+    <w:p>
+      <w:pPr>
+        <w:pStyle w:val="normal1"/>
+        <w:numPr>
+          <w:ilvl w:val="0"/>
+          <w:numId w:val="1"/>
+        </w:numPr>
+        <w:ind w:hanging="360" w:left="720"/>
+        <w:rPr/>
+      </w:pPr>
+      <w:r>
+        <w:rPr/>
+        <w:t xml:space="preserve">GET Game </w:t>
+      </w:r>
+      <w:r>
+        <w:rPr/>
+        <w:t>Row</w:t>
+      </w:r>
+      <w:r>
+        <w:rPr/>
+        <w:t xml:space="preserve">s </w:t>
+      </w:r>
+      <w:r>
+        <w:rPr/>
+        <w:t>of Round</w:t>
+      </w:r>
+    </w:p>
+    <w:p>
+      <w:pPr>
+        <w:pStyle w:val="normal1"/>
+        <w:numPr>
+          <w:ilvl w:val="1"/>
+          <w:numId w:val="1"/>
+        </w:numPr>
+        <w:ind w:hanging="360" w:left="1440"/>
+        <w:rPr/>
+      </w:pPr>
+      <w:r>
+        <w:rPr/>
+        <w:t xml:space="preserve">built_including_tests: </w:t>
+      </w:r>
+      <w:r>
+        <w:rPr>
+          <w:b/>
+          <w:bCs/>
+        </w:rPr>
+        <w:t>true</w:t>
+      </w:r>
+    </w:p>
+    <w:p>
+      <w:pPr>
+        <w:pStyle w:val="normal1"/>
+        <w:numPr>
+          <w:ilvl w:val="1"/>
+          <w:numId w:val="1"/>
+        </w:numPr>
+        <w:ind w:hanging="360" w:left="1440"/>
+        <w:rPr/>
+      </w:pPr>
+      <w:r>
+        <w:rPr/>
+        <w:t>HTTP method: ‘GET’</w:t>
+      </w:r>
+    </w:p>
+    <w:p>
+      <w:pPr>
+        <w:pStyle w:val="normal1"/>
+        <w:numPr>
+          <w:ilvl w:val="1"/>
+          <w:numId w:val="1"/>
+        </w:numPr>
+        <w:ind w:hanging="360" w:left="1440"/>
+        <w:rPr/>
+      </w:pPr>
+      <w:r>
+        <w:rPr/>
+        <w:t>endpoint: {base_uri}/api/</w:t>
+      </w:r>
+      <w:r>
+        <w:rPr/>
+        <w:t>rounds/{id}/game-rows</w:t>
+      </w:r>
+      <w:r>
+        <w:rPr/>
+        <w:t>?page={page_num}&amp;page_size={num_of_rows}</w:t>
+      </w:r>
+    </w:p>
+    <w:p>
+      <w:pPr>
+        <w:pStyle w:val="normal1"/>
+        <w:numPr>
+          <w:ilvl w:val="1"/>
+          <w:numId w:val="1"/>
+        </w:numPr>
+        <w:ind w:hanging="360" w:left="1440"/>
+        <w:rPr/>
+      </w:pPr>
+      <w:r>
+        <w:rPr/>
+        <w:t xml:space="preserve">description: </w:t>
+      </w:r>
+    </w:p>
+    <w:p>
+      <w:pPr>
+        <w:pStyle w:val="normal1"/>
+        <w:widowControl/>
+        <w:numPr>
+          <w:ilvl w:val="2"/>
+          <w:numId w:val="1"/>
+        </w:numPr>
+        <w:suppressAutoHyphens w:val="true"/>
+        <w:bidi w:val="0"/>
+        <w:spacing w:lineRule="auto" w:line="276" w:before="0" w:after="0"/>
+        <w:ind w:hanging="360" w:left="2160" w:right="0"/>
+        <w:jc w:val="left"/>
+        <w:rPr/>
+      </w:pPr>
+      <w:r>
+        <w:rPr/>
+        <w:t>Designed so that a single API call could be made for use by the Games UI data table when scoped to the Round profile.</w:t>
+      </w:r>
+    </w:p>
+    <w:p>
+      <w:pPr>
+        <w:pStyle w:val="normal1"/>
+        <w:numPr>
+          <w:ilvl w:val="1"/>
+          <w:numId w:val="1"/>
+        </w:numPr>
+        <w:ind w:hanging="360" w:left="1440"/>
+        <w:rPr/>
+      </w:pPr>
+      <w:r>
+        <w:rPr/>
+        <w:t xml:space="preserve">parameters: </w:t>
+      </w:r>
+    </w:p>
+    <w:p>
+      <w:pPr>
+        <w:pStyle w:val="normal1"/>
+        <w:numPr>
+          <w:ilvl w:val="2"/>
+          <w:numId w:val="1"/>
+        </w:numPr>
+        <w:ind w:hanging="360" w:left="2160"/>
+        <w:rPr/>
+      </w:pPr>
+      <w:r>
+        <w:rPr/>
+        <w:t>page={page_num}</w:t>
+      </w:r>
+    </w:p>
+    <w:p>
+      <w:pPr>
+        <w:pStyle w:val="normal1"/>
+        <w:numPr>
+          <w:ilvl w:val="3"/>
+          <w:numId w:val="1"/>
+        </w:numPr>
+        <w:ind w:hanging="360" w:left="2880"/>
+        <w:rPr>
+          <w:color w:val="FF0000"/>
+        </w:rPr>
+      </w:pPr>
+      <w:r>
+        <w:rPr>
+          <w:color w:val="FF0000"/>
+        </w:rPr>
+        <w:t>Required</w:t>
+      </w:r>
+    </w:p>
+    <w:p>
+      <w:pPr>
+        <w:pStyle w:val="normal1"/>
+        <w:numPr>
+          <w:ilvl w:val="3"/>
+          <w:numId w:val="1"/>
+        </w:numPr>
+        <w:ind w:hanging="360" w:left="2880"/>
+        <w:rPr/>
+      </w:pPr>
+      <w:r>
+        <w:rPr/>
+        <w:t>Defines which page to return</w:t>
+      </w:r>
+    </w:p>
+    <w:p>
+      <w:pPr>
+        <w:pStyle w:val="normal1"/>
+        <w:numPr>
+          <w:ilvl w:val="3"/>
+          <w:numId w:val="1"/>
+        </w:numPr>
+        <w:ind w:hanging="360" w:left="2880"/>
+        <w:rPr/>
+      </w:pPr>
+      <w:r>
+        <w:rPr/>
+        <w:t>First page = 0 (zero)</w:t>
+      </w:r>
+    </w:p>
+    <w:p>
+      <w:pPr>
+        <w:pStyle w:val="normal1"/>
+        <w:numPr>
+          <w:ilvl w:val="2"/>
+          <w:numId w:val="1"/>
+        </w:numPr>
+        <w:ind w:hanging="360" w:left="2160"/>
+        <w:rPr/>
+      </w:pPr>
+      <w:r>
+        <w:rPr/>
+        <w:t>page_size={num_of_rows}</w:t>
+      </w:r>
+    </w:p>
+    <w:p>
+      <w:pPr>
+        <w:pStyle w:val="normal1"/>
+        <w:numPr>
+          <w:ilvl w:val="3"/>
+          <w:numId w:val="1"/>
+        </w:numPr>
+        <w:ind w:hanging="360" w:left="2880"/>
+        <w:rPr>
+          <w:color w:val="FF0000"/>
+        </w:rPr>
+      </w:pPr>
+      <w:r>
+        <w:rPr>
+          <w:color w:val="FF0000"/>
+        </w:rPr>
+        <w:t>Required</w:t>
+      </w:r>
+    </w:p>
+    <w:p>
+      <w:pPr>
+        <w:pStyle w:val="normal1"/>
+        <w:numPr>
+          <w:ilvl w:val="3"/>
+          <w:numId w:val="1"/>
+        </w:numPr>
+        <w:ind w:hanging="360" w:left="2880"/>
+        <w:rPr/>
+      </w:pPr>
+      <w:r>
+        <w:rPr/>
+        <w:t>Defines how many rows to return for the selected page</w:t>
+      </w:r>
+    </w:p>
+    <w:p>
+      <w:pPr>
+        <w:pStyle w:val="normal1"/>
+        <w:widowControl/>
+        <w:numPr>
+          <w:ilvl w:val="2"/>
+          <w:numId w:val="1"/>
+        </w:numPr>
+        <w:suppressAutoHyphens w:val="true"/>
+        <w:bidi w:val="0"/>
+        <w:spacing w:lineRule="auto" w:line="276" w:before="0" w:after="0"/>
+        <w:ind w:hanging="360" w:left="2160" w:right="0"/>
+        <w:jc w:val="left"/>
+        <w:rPr/>
+      </w:pPr>
+      <w:r>
+        <w:rPr/>
+        <w:t>returns:</w:t>
+      </w:r>
+    </w:p>
+    <w:p>
+      <w:pPr>
+        <w:pStyle w:val="normal1"/>
+        <w:numPr>
+          <w:ilvl w:val="0"/>
+          <w:numId w:val="1"/>
+        </w:numPr>
+        <w:ind w:hanging="360" w:left="720"/>
+        <w:rPr/>
+      </w:pPr>
+      <w:r>
+        <w:rPr/>
+        <w:t xml:space="preserve">GET Game </w:t>
+      </w:r>
+      <w:r>
+        <w:rPr/>
+        <w:t>Row</w:t>
+      </w:r>
+      <w:r>
+        <w:rPr/>
+        <w:t xml:space="preserve">s </w:t>
+      </w:r>
+      <w:r>
+        <w:rPr/>
+        <w:t>of Room</w:t>
+      </w:r>
+    </w:p>
+    <w:p>
+      <w:pPr>
+        <w:pStyle w:val="normal1"/>
+        <w:numPr>
+          <w:ilvl w:val="1"/>
+          <w:numId w:val="1"/>
+        </w:numPr>
+        <w:ind w:hanging="360" w:left="1440"/>
+        <w:rPr/>
+      </w:pPr>
+      <w:r>
+        <w:rPr/>
+        <w:t xml:space="preserve">built_including_tests: </w:t>
+      </w:r>
+      <w:r>
+        <w:rPr>
+          <w:b/>
+          <w:bCs/>
+        </w:rPr>
+        <w:t>true</w:t>
+      </w:r>
+    </w:p>
+    <w:p>
+      <w:pPr>
+        <w:pStyle w:val="normal1"/>
+        <w:numPr>
+          <w:ilvl w:val="1"/>
+          <w:numId w:val="1"/>
+        </w:numPr>
+        <w:ind w:hanging="360" w:left="1440"/>
+        <w:rPr/>
+      </w:pPr>
+      <w:r>
+        <w:rPr/>
+        <w:t>HTTP method: ‘GET’</w:t>
+      </w:r>
+    </w:p>
+    <w:p>
+      <w:pPr>
+        <w:pStyle w:val="normal1"/>
+        <w:numPr>
+          <w:ilvl w:val="1"/>
+          <w:numId w:val="1"/>
+        </w:numPr>
+        <w:ind w:hanging="360" w:left="1440"/>
+        <w:rPr/>
+      </w:pPr>
+      <w:r>
+        <w:rPr/>
+        <w:t>endpoint: {base_uri}/api/</w:t>
+      </w:r>
+      <w:r>
+        <w:rPr/>
+        <w:t>rooms/{id}/game-rows</w:t>
+      </w:r>
+      <w:r>
+        <w:rPr/>
+        <w:t>?page={page_num}&amp;page_size={num_of_rows}</w:t>
+      </w:r>
+    </w:p>
+    <w:p>
+      <w:pPr>
+        <w:pStyle w:val="normal1"/>
+        <w:numPr>
+          <w:ilvl w:val="1"/>
+          <w:numId w:val="1"/>
+        </w:numPr>
+        <w:ind w:hanging="360" w:left="1440"/>
+        <w:rPr/>
+      </w:pPr>
+      <w:r>
+        <w:rPr/>
+        <w:t xml:space="preserve">description: </w:t>
+      </w:r>
+    </w:p>
+    <w:p>
+      <w:pPr>
+        <w:pStyle w:val="normal1"/>
+        <w:widowControl/>
+        <w:numPr>
+          <w:ilvl w:val="2"/>
+          <w:numId w:val="1"/>
+        </w:numPr>
+        <w:suppressAutoHyphens w:val="true"/>
+        <w:bidi w:val="0"/>
+        <w:spacing w:lineRule="auto" w:line="276" w:before="0" w:after="0"/>
+        <w:ind w:hanging="360" w:left="2160" w:right="0"/>
+        <w:jc w:val="left"/>
+        <w:rPr/>
+      </w:pPr>
+      <w:r>
+        <w:rPr/>
+        <w:t>Designed so that a single API call could be made for use by the Games UI data table when scoped to the Room profile.</w:t>
+      </w:r>
+    </w:p>
+    <w:p>
+      <w:pPr>
+        <w:pStyle w:val="normal1"/>
+        <w:numPr>
+          <w:ilvl w:val="1"/>
+          <w:numId w:val="1"/>
+        </w:numPr>
+        <w:ind w:hanging="360" w:left="1440"/>
+        <w:rPr/>
+      </w:pPr>
+      <w:r>
+        <w:rPr/>
+        <w:t xml:space="preserve">parameters: </w:t>
+      </w:r>
+    </w:p>
+    <w:p>
+      <w:pPr>
+        <w:pStyle w:val="normal1"/>
+        <w:numPr>
+          <w:ilvl w:val="2"/>
+          <w:numId w:val="1"/>
+        </w:numPr>
+        <w:ind w:hanging="360" w:left="2160"/>
+        <w:rPr/>
+      </w:pPr>
+      <w:r>
+        <w:rPr/>
+        <w:t>page={page_num}</w:t>
+      </w:r>
+    </w:p>
+    <w:p>
+      <w:pPr>
+        <w:pStyle w:val="normal1"/>
+        <w:numPr>
+          <w:ilvl w:val="3"/>
+          <w:numId w:val="1"/>
+        </w:numPr>
+        <w:ind w:hanging="360" w:left="2880"/>
+        <w:rPr>
+          <w:color w:val="FF0000"/>
+        </w:rPr>
+      </w:pPr>
+      <w:r>
+        <w:rPr>
+          <w:color w:val="FF0000"/>
+        </w:rPr>
+        <w:t>Required</w:t>
+      </w:r>
+    </w:p>
+    <w:p>
+      <w:pPr>
+        <w:pStyle w:val="normal1"/>
+        <w:numPr>
+          <w:ilvl w:val="3"/>
+          <w:numId w:val="1"/>
+        </w:numPr>
+        <w:ind w:hanging="360" w:left="2880"/>
+        <w:rPr/>
+      </w:pPr>
+      <w:r>
+        <w:rPr/>
+        <w:t>Defines which page to return</w:t>
+      </w:r>
+    </w:p>
+    <w:p>
+      <w:pPr>
+        <w:pStyle w:val="normal1"/>
+        <w:numPr>
+          <w:ilvl w:val="3"/>
+          <w:numId w:val="1"/>
+        </w:numPr>
+        <w:ind w:hanging="360" w:left="2880"/>
+        <w:rPr/>
+      </w:pPr>
+      <w:r>
+        <w:rPr/>
+        <w:t>First page = 0 (zero)</w:t>
+      </w:r>
+    </w:p>
+    <w:p>
+      <w:pPr>
+        <w:pStyle w:val="normal1"/>
+        <w:numPr>
+          <w:ilvl w:val="2"/>
+          <w:numId w:val="1"/>
+        </w:numPr>
+        <w:ind w:hanging="360" w:left="2160"/>
+        <w:rPr/>
+      </w:pPr>
+      <w:r>
+        <w:rPr/>
+        <w:t>page_size={num_of_rows}</w:t>
+      </w:r>
+    </w:p>
+    <w:p>
+      <w:pPr>
+        <w:pStyle w:val="normal1"/>
+        <w:numPr>
+          <w:ilvl w:val="3"/>
+          <w:numId w:val="1"/>
+        </w:numPr>
+        <w:ind w:hanging="360" w:left="2880"/>
+        <w:rPr>
+          <w:color w:val="FF0000"/>
+        </w:rPr>
+      </w:pPr>
+      <w:r>
+        <w:rPr>
+          <w:color w:val="FF0000"/>
+        </w:rPr>
+        <w:t>Required</w:t>
+      </w:r>
+    </w:p>
+    <w:p>
+      <w:pPr>
+        <w:pStyle w:val="normal1"/>
+        <w:numPr>
+          <w:ilvl w:val="3"/>
+          <w:numId w:val="1"/>
+        </w:numPr>
+        <w:ind w:hanging="360" w:left="2880"/>
+        <w:rPr/>
+      </w:pPr>
+      <w:r>
+        <w:rPr/>
+        <w:t>Defines how many rows to return for the selected page</w:t>
+      </w:r>
+    </w:p>
+    <w:p>
+      <w:pPr>
+        <w:pStyle w:val="normal1"/>
+        <w:widowControl/>
+        <w:numPr>
+          <w:ilvl w:val="2"/>
+          <w:numId w:val="1"/>
+        </w:numPr>
+        <w:suppressAutoHyphens w:val="true"/>
+        <w:bidi w:val="0"/>
+        <w:spacing w:lineRule="auto" w:line="276" w:before="0" w:after="0"/>
+        <w:ind w:hanging="360" w:left="2160" w:right="0"/>
+        <w:jc w:val="left"/>
+        <w:rPr/>
+      </w:pPr>
+      <w:r>
+        <w:rPr/>
+        <w:t>returns:</w:t>
+      </w:r>
+    </w:p>
+    <w:p>
+      <w:pPr>
+        <w:pStyle w:val="normal1"/>
+        <w:numPr>
+          <w:ilvl w:val="0"/>
+          <w:numId w:val="1"/>
+        </w:numPr>
+        <w:ind w:hanging="360" w:left="720"/>
+        <w:rPr/>
+      </w:pPr>
+      <w:r>
+        <w:rPr/>
         <w:t>POST/Create Game</w:t>
       </w:r>
     </w:p>
@@ -39091,19 +40171,7 @@
       </w:pPr>
       <w:r>
         <w:rPr/>
-        <w:t xml:space="preserve">GET Round </w:t>
-      </w:r>
-      <w:r>
-        <w:rPr/>
-        <w:t>Row</w:t>
-      </w:r>
-      <w:r>
-        <w:rPr/>
-        <w:t xml:space="preserve">s </w:t>
-      </w:r>
-      <w:r>
-        <w:rPr/>
-        <w:t>of Tournament</w:t>
+        <w:t>GET Round Rows of Tournament</w:t>
       </w:r>
     </w:p>
     <w:p>
@@ -39155,15 +40223,7 @@
       </w:pPr>
       <w:r>
         <w:rPr/>
-        <w:t>endpoint: {base_uri}/api/</w:t>
-      </w:r>
-      <w:r>
-        <w:rPr/>
-        <w:t>tournaments/{id}/round-rows</w:t>
-      </w:r>
-      <w:r>
-        <w:rPr/>
-        <w:t>?page={page_num}&amp;page_size={num_of_rows}</w:t>
+        <w:t>endpoint: {base_uri}/api/tournaments/{id}/round-rows?page={page_num}&amp;page_size={num_of_rows}</w:t>
       </w:r>
     </w:p>
     <w:p>
@@ -39366,19 +40426,7 @@
       </w:pPr>
       <w:r>
         <w:rPr/>
-        <w:t xml:space="preserve">GET Round </w:t>
-      </w:r>
-      <w:r>
-        <w:rPr/>
-        <w:t>Row</w:t>
-      </w:r>
-      <w:r>
-        <w:rPr/>
-        <w:t xml:space="preserve">s </w:t>
-      </w:r>
-      <w:r>
-        <w:rPr/>
-        <w:t>of Division</w:t>
+        <w:t>GET Round Rows of Division</w:t>
       </w:r>
     </w:p>
     <w:p>
@@ -39430,15 +40478,7 @@
       </w:pPr>
       <w:r>
         <w:rPr/>
-        <w:t>endpoint: {base_uri}/api/</w:t>
-      </w:r>
-      <w:r>
-        <w:rPr/>
-        <w:t>divisions/{id}/round-rows</w:t>
-      </w:r>
-      <w:r>
-        <w:rPr/>
-        <w:t>?page={page_num}&amp;page_size={num_of_rows}</w:t>
+        <w:t>endpoint: {base_uri}/api/divisions/{id}/round-rows?page={page_num}&amp;page_size={num_of_rows}</w:t>
       </w:r>
     </w:p>
     <w:p>
@@ -52410,8 +53450,8 @@
       <w:u w:val="single"/>
     </w:rPr>
   </w:style>
-  <w:style w:type="character" w:styleId="Bulletsuser">
-    <w:name w:val="Bullets (user)"/>
+  <w:style w:type="character" w:styleId="Bullets">
+    <w:name w:val="Bullets"/>
     <w:qFormat/>
     <w:rPr>
       <w:rFonts w:ascii="OpenSymbol" w:hAnsi="OpenSymbol" w:eastAsia="OpenSymbol" w:cs="OpenSymbol"/>

</xml_diff>

<commit_message>
Gave DB tables 'tournaments', 'tournamentgroups', 'teams', 'divisions', 'games', 'rounds' and 'rooms' a 'last_modified_user' column. Need is for Tournament Managers and Admins to trobleshoot why something was changed. Added 3 new endpoints for UI data tables so that they could include this information. Updated the API docs for the 3 new endpoints. Updated existing test fixtures to use this new field. Fixed at least 2 tests related to this change.
</commit_message>
<xml_diff>
--- a/docs/QView API Documentation.docx
+++ b/docs/QView API Documentation.docx
@@ -14,11 +14,19 @@
       </w:r>
       <w:r>
         <w:rPr/>
-        <w:t>1</w:t>
-      </w:r>
-      <w:r>
-        <w:rPr/>
-        <w:t>_2026.09.04)</w:t>
+        <w:t>2</w:t>
+      </w:r>
+      <w:r>
+        <w:rPr/>
+        <w:t>_2026.09.0</w:t>
+      </w:r>
+      <w:r>
+        <w:rPr/>
+        <w:t>5</w:t>
+      </w:r>
+      <w:r>
+        <w:rPr/>
+        <w:t>)</w:t>
       </w:r>
     </w:p>
     <w:p>
@@ -6362,6 +6370,283 @@
       </w:pPr>
       <w:r>
         <w:rPr/>
+        <w:t xml:space="preserve">GET Division </w:t>
+      </w:r>
+      <w:r>
+        <w:rPr/>
+        <w:t>Row</w:t>
+      </w:r>
+      <w:r>
+        <w:rPr/>
+        <w:t xml:space="preserve">s </w:t>
+      </w:r>
+      <w:r>
+        <w:rPr/>
+        <w:t>by Tournament</w:t>
+      </w:r>
+    </w:p>
+    <w:p>
+      <w:pPr>
+        <w:pStyle w:val="normal1"/>
+        <w:numPr>
+          <w:ilvl w:val="1"/>
+          <w:numId w:val="1"/>
+        </w:numPr>
+        <w:ind w:hanging="360" w:left="1440"/>
+        <w:rPr/>
+      </w:pPr>
+      <w:r>
+        <w:rPr/>
+        <w:t xml:space="preserve">built_including_tests: </w:t>
+      </w:r>
+      <w:r>
+        <w:rPr>
+          <w:b/>
+          <w:bCs/>
+        </w:rPr>
+        <w:t>false</w:t>
+      </w:r>
+    </w:p>
+    <w:p>
+      <w:pPr>
+        <w:pStyle w:val="normal1"/>
+        <w:numPr>
+          <w:ilvl w:val="1"/>
+          <w:numId w:val="1"/>
+        </w:numPr>
+        <w:ind w:hanging="360" w:left="1440"/>
+        <w:rPr/>
+      </w:pPr>
+      <w:r>
+        <w:rPr/>
+        <w:t>HTTP method: ‘GET’</w:t>
+      </w:r>
+    </w:p>
+    <w:p>
+      <w:pPr>
+        <w:pStyle w:val="normal1"/>
+        <w:numPr>
+          <w:ilvl w:val="1"/>
+          <w:numId w:val="1"/>
+        </w:numPr>
+        <w:ind w:hanging="360" w:left="1440"/>
+        <w:rPr/>
+      </w:pPr>
+      <w:r>
+        <w:rPr/>
+        <w:t>endpoint: {base_uri}/api/</w:t>
+      </w:r>
+      <w:r>
+        <w:rPr/>
+        <w:t>tournaments/{id}/division-rows</w:t>
+      </w:r>
+      <w:r>
+        <w:rPr/>
+        <w:t>?page={page_num}&amp;page_size={num_of_rows}</w:t>
+      </w:r>
+    </w:p>
+    <w:p>
+      <w:pPr>
+        <w:pStyle w:val="normal1"/>
+        <w:numPr>
+          <w:ilvl w:val="1"/>
+          <w:numId w:val="1"/>
+        </w:numPr>
+        <w:ind w:hanging="360" w:left="1440"/>
+        <w:rPr/>
+      </w:pPr>
+      <w:r>
+        <w:rPr/>
+        <w:t xml:space="preserve">description: </w:t>
+      </w:r>
+    </w:p>
+    <w:p>
+      <w:pPr>
+        <w:pStyle w:val="normal1"/>
+        <w:widowControl/>
+        <w:numPr>
+          <w:ilvl w:val="2"/>
+          <w:numId w:val="1"/>
+        </w:numPr>
+        <w:suppressAutoHyphens w:val="true"/>
+        <w:bidi w:val="0"/>
+        <w:spacing w:lineRule="auto" w:line="276" w:before="0" w:after="0"/>
+        <w:ind w:hanging="360" w:left="2160" w:right="0"/>
+        <w:jc w:val="left"/>
+        <w:rPr/>
+      </w:pPr>
+      <w:r>
+        <w:rPr/>
+        <w:t>Designed for use by the Division UI data table to be a single API endpoint that returns all necessary data for that data table scoped to the Tournament context.</w:t>
+      </w:r>
+    </w:p>
+    <w:p>
+      <w:pPr>
+        <w:pStyle w:val="normal1"/>
+        <w:numPr>
+          <w:ilvl w:val="1"/>
+          <w:numId w:val="1"/>
+        </w:numPr>
+        <w:ind w:hanging="360" w:left="1440"/>
+        <w:rPr/>
+      </w:pPr>
+      <w:r>
+        <w:rPr/>
+        <w:t xml:space="preserve">parameters: </w:t>
+      </w:r>
+    </w:p>
+    <w:p>
+      <w:pPr>
+        <w:pStyle w:val="normal1"/>
+        <w:numPr>
+          <w:ilvl w:val="2"/>
+          <w:numId w:val="1"/>
+        </w:numPr>
+        <w:ind w:hanging="360" w:left="2160"/>
+        <w:rPr/>
+      </w:pPr>
+      <w:r>
+        <w:rPr/>
+        <w:t>page={page_num}</w:t>
+      </w:r>
+    </w:p>
+    <w:p>
+      <w:pPr>
+        <w:pStyle w:val="normal1"/>
+        <w:numPr>
+          <w:ilvl w:val="3"/>
+          <w:numId w:val="1"/>
+        </w:numPr>
+        <w:ind w:hanging="360" w:left="2880"/>
+        <w:rPr>
+          <w:color w:val="FF0000"/>
+        </w:rPr>
+      </w:pPr>
+      <w:r>
+        <w:rPr>
+          <w:color w:val="FF0000"/>
+        </w:rPr>
+        <w:t>Required</w:t>
+      </w:r>
+    </w:p>
+    <w:p>
+      <w:pPr>
+        <w:pStyle w:val="normal1"/>
+        <w:numPr>
+          <w:ilvl w:val="3"/>
+          <w:numId w:val="1"/>
+        </w:numPr>
+        <w:ind w:hanging="360" w:left="2880"/>
+        <w:rPr/>
+      </w:pPr>
+      <w:r>
+        <w:rPr/>
+        <w:t>Defines which page to return</w:t>
+      </w:r>
+    </w:p>
+    <w:p>
+      <w:pPr>
+        <w:pStyle w:val="normal1"/>
+        <w:numPr>
+          <w:ilvl w:val="3"/>
+          <w:numId w:val="1"/>
+        </w:numPr>
+        <w:ind w:hanging="360" w:left="2880"/>
+        <w:rPr/>
+      </w:pPr>
+      <w:r>
+        <w:rPr/>
+        <w:t>First page = 0 (zero)</w:t>
+      </w:r>
+    </w:p>
+    <w:p>
+      <w:pPr>
+        <w:pStyle w:val="normal1"/>
+        <w:numPr>
+          <w:ilvl w:val="2"/>
+          <w:numId w:val="1"/>
+        </w:numPr>
+        <w:ind w:hanging="360" w:left="2160"/>
+        <w:rPr/>
+      </w:pPr>
+      <w:r>
+        <w:rPr/>
+        <w:t>page_size={num_of_rows}</w:t>
+      </w:r>
+    </w:p>
+    <w:p>
+      <w:pPr>
+        <w:pStyle w:val="normal1"/>
+        <w:numPr>
+          <w:ilvl w:val="3"/>
+          <w:numId w:val="1"/>
+        </w:numPr>
+        <w:ind w:hanging="360" w:left="2880"/>
+        <w:rPr>
+          <w:color w:val="FF0000"/>
+        </w:rPr>
+      </w:pPr>
+      <w:r>
+        <w:rPr>
+          <w:color w:val="FF0000"/>
+        </w:rPr>
+        <w:t>Required</w:t>
+      </w:r>
+    </w:p>
+    <w:p>
+      <w:pPr>
+        <w:pStyle w:val="normal1"/>
+        <w:numPr>
+          <w:ilvl w:val="3"/>
+          <w:numId w:val="1"/>
+        </w:numPr>
+        <w:ind w:hanging="360" w:left="2880"/>
+        <w:rPr/>
+      </w:pPr>
+      <w:r>
+        <w:rPr/>
+        <w:t>Defines how many rows to return for the selected page</w:t>
+      </w:r>
+    </w:p>
+    <w:p>
+      <w:pPr>
+        <w:pStyle w:val="normal1"/>
+        <w:widowControl/>
+        <w:numPr>
+          <w:ilvl w:val="2"/>
+          <w:numId w:val="1"/>
+        </w:numPr>
+        <w:suppressAutoHyphens w:val="true"/>
+        <w:bidi w:val="0"/>
+        <w:spacing w:lineRule="auto" w:line="276" w:before="0" w:after="0"/>
+        <w:ind w:hanging="360" w:left="2160" w:right="0"/>
+        <w:jc w:val="left"/>
+        <w:rPr>
+          <w:b w:val="false"/>
+          <w:bCs w:val="false"/>
+        </w:rPr>
+      </w:pPr>
+      <w:r>
+        <w:rPr>
+          <w:b w:val="false"/>
+          <w:bCs w:val="false"/>
+          <w:color w:val="000000"/>
+        </w:rPr>
+        <w:t xml:space="preserve">returns: </w:t>
+      </w:r>
+    </w:p>
+    <w:p>
+      <w:pPr>
+        <w:pStyle w:val="normal1"/>
+        <w:numPr>
+          <w:ilvl w:val="0"/>
+          <w:numId w:val="1"/>
+        </w:numPr>
+        <w:ind w:hanging="360" w:left="720"/>
+        <w:rPr/>
+      </w:pPr>
+      <w:r>
+        <w:rPr/>
         <w:t>POST/Create Division</w:t>
       </w:r>
     </w:p>
@@ -17430,19 +17715,7 @@
       </w:pPr>
       <w:r>
         <w:rPr/>
-        <w:t xml:space="preserve">GET Game </w:t>
-      </w:r>
-      <w:r>
-        <w:rPr/>
-        <w:t>Row</w:t>
-      </w:r>
-      <w:r>
-        <w:rPr/>
-        <w:t xml:space="preserve">s </w:t>
-      </w:r>
-      <w:r>
-        <w:rPr/>
-        <w:t>of Tournament</w:t>
+        <w:t>GET Game Rows of Tournament</w:t>
       </w:r>
     </w:p>
     <w:p>
@@ -17494,15 +17767,7 @@
       </w:pPr>
       <w:r>
         <w:rPr/>
-        <w:t>endpoint: {base_uri}/api/</w:t>
-      </w:r>
-      <w:r>
-        <w:rPr/>
-        <w:t>tournaments/{id}/game-rows</w:t>
-      </w:r>
-      <w:r>
-        <w:rPr/>
-        <w:t>?page={page_num}&amp;page_size={num_of_rows}</w:t>
+        <w:t>endpoint: {base_uri}/api/tournaments/{id}/game-rows?page={page_num}&amp;page_size={num_of_rows}</w:t>
       </w:r>
     </w:p>
     <w:p>
@@ -17700,19 +17965,7 @@
       </w:pPr>
       <w:r>
         <w:rPr/>
-        <w:t xml:space="preserve">GET Game </w:t>
-      </w:r>
-      <w:r>
-        <w:rPr/>
-        <w:t>Row</w:t>
-      </w:r>
-      <w:r>
-        <w:rPr/>
-        <w:t xml:space="preserve">s </w:t>
-      </w:r>
-      <w:r>
-        <w:rPr/>
-        <w:t>of Division</w:t>
+        <w:t>GET Game Rows of Division</w:t>
       </w:r>
     </w:p>
     <w:p>
@@ -17764,15 +18017,7 @@
       </w:pPr>
       <w:r>
         <w:rPr/>
-        <w:t>endpoint: {base_uri}/api/</w:t>
-      </w:r>
-      <w:r>
-        <w:rPr/>
-        <w:t>divisions/{id}/game-rows</w:t>
-      </w:r>
-      <w:r>
-        <w:rPr/>
-        <w:t>?page={page_num}&amp;page_size={num_of_rows}</w:t>
+        <w:t>endpoint: {base_uri}/api/divisions/{id}/game-rows?page={page_num}&amp;page_size={num_of_rows}</w:t>
       </w:r>
     </w:p>
     <w:p>
@@ -17970,19 +18215,7 @@
       </w:pPr>
       <w:r>
         <w:rPr/>
-        <w:t xml:space="preserve">GET Game </w:t>
-      </w:r>
-      <w:r>
-        <w:rPr/>
-        <w:t>Row</w:t>
-      </w:r>
-      <w:r>
-        <w:rPr/>
-        <w:t xml:space="preserve">s </w:t>
-      </w:r>
-      <w:r>
-        <w:rPr/>
-        <w:t>of Round</w:t>
+        <w:t>GET Game Rows of Round</w:t>
       </w:r>
     </w:p>
     <w:p>
@@ -18034,15 +18267,7 @@
       </w:pPr>
       <w:r>
         <w:rPr/>
-        <w:t>endpoint: {base_uri}/api/</w:t>
-      </w:r>
-      <w:r>
-        <w:rPr/>
-        <w:t>rounds/{id}/game-rows</w:t>
-      </w:r>
-      <w:r>
-        <w:rPr/>
-        <w:t>?page={page_num}&amp;page_size={num_of_rows}</w:t>
+        <w:t>endpoint: {base_uri}/api/rounds/{id}/game-rows?page={page_num}&amp;page_size={num_of_rows}</w:t>
       </w:r>
     </w:p>
     <w:p>
@@ -18240,19 +18465,7 @@
       </w:pPr>
       <w:r>
         <w:rPr/>
-        <w:t xml:space="preserve">GET Game </w:t>
-      </w:r>
-      <w:r>
-        <w:rPr/>
-        <w:t>Row</w:t>
-      </w:r>
-      <w:r>
-        <w:rPr/>
-        <w:t xml:space="preserve">s </w:t>
-      </w:r>
-      <w:r>
-        <w:rPr/>
-        <w:t>of Room</w:t>
+        <w:t>GET Game Rows of Room</w:t>
       </w:r>
     </w:p>
     <w:p>
@@ -18304,15 +18517,7 @@
       </w:pPr>
       <w:r>
         <w:rPr/>
-        <w:t>endpoint: {base_uri}/api/</w:t>
-      </w:r>
-      <w:r>
-        <w:rPr/>
-        <w:t>rooms/{id}/game-rows</w:t>
-      </w:r>
-      <w:r>
-        <w:rPr/>
-        <w:t>?page={page_num}&amp;page_size={num_of_rows}</w:t>
+        <w:t>endpoint: {base_uri}/api/rooms/{id}/game-rows?page={page_num}&amp;page_size={num_of_rows}</w:t>
       </w:r>
     </w:p>
     <w:p>
@@ -36049,6 +36254,284 @@
       </w:pPr>
       <w:r>
         <w:rPr/>
+        <w:t xml:space="preserve">GET Room </w:t>
+      </w:r>
+      <w:r>
+        <w:rPr/>
+        <w:t>Row</w:t>
+      </w:r>
+      <w:r>
+        <w:rPr/>
+        <w:t xml:space="preserve">s </w:t>
+      </w:r>
+      <w:r>
+        <w:rPr/>
+        <w:t>by Tournament</w:t>
+      </w:r>
+    </w:p>
+    <w:p>
+      <w:pPr>
+        <w:pStyle w:val="normal1"/>
+        <w:numPr>
+          <w:ilvl w:val="1"/>
+          <w:numId w:val="1"/>
+        </w:numPr>
+        <w:ind w:hanging="360" w:left="1440"/>
+        <w:rPr/>
+      </w:pPr>
+      <w:r>
+        <w:rPr/>
+        <w:t xml:space="preserve">built_including_tests: </w:t>
+      </w:r>
+      <w:r>
+        <w:rPr>
+          <w:b/>
+          <w:bCs/>
+        </w:rPr>
+        <w:t>false</w:t>
+      </w:r>
+    </w:p>
+    <w:p>
+      <w:pPr>
+        <w:pStyle w:val="normal1"/>
+        <w:numPr>
+          <w:ilvl w:val="1"/>
+          <w:numId w:val="1"/>
+        </w:numPr>
+        <w:ind w:hanging="360" w:left="1440"/>
+        <w:rPr/>
+      </w:pPr>
+      <w:r>
+        <w:rPr/>
+        <w:t>HTTP method: ‘GET’</w:t>
+      </w:r>
+    </w:p>
+    <w:p>
+      <w:pPr>
+        <w:pStyle w:val="normal1"/>
+        <w:numPr>
+          <w:ilvl w:val="1"/>
+          <w:numId w:val="1"/>
+        </w:numPr>
+        <w:ind w:hanging="360" w:left="1440"/>
+        <w:rPr/>
+      </w:pPr>
+      <w:r>
+        <w:rPr/>
+        <w:t>endpoint: {base_uri}/api/</w:t>
+      </w:r>
+      <w:r>
+        <w:rPr/>
+        <w:t>tournaments/{id}/</w:t>
+      </w:r>
+      <w:r>
+        <w:rPr/>
+        <w:t>room-</w:t>
+      </w:r>
+      <w:r>
+        <w:rPr/>
+        <w:t>row</w:t>
+      </w:r>
+      <w:r>
+        <w:rPr/>
+        <w:t>s?page={page_num}&amp;page_size={num_of_rows}</w:t>
+      </w:r>
+    </w:p>
+    <w:p>
+      <w:pPr>
+        <w:pStyle w:val="normal1"/>
+        <w:numPr>
+          <w:ilvl w:val="1"/>
+          <w:numId w:val="1"/>
+        </w:numPr>
+        <w:ind w:hanging="360" w:left="1440"/>
+        <w:rPr/>
+      </w:pPr>
+      <w:r>
+        <w:rPr/>
+        <w:t xml:space="preserve">description: </w:t>
+      </w:r>
+    </w:p>
+    <w:p>
+      <w:pPr>
+        <w:pStyle w:val="normal1"/>
+        <w:widowControl/>
+        <w:numPr>
+          <w:ilvl w:val="2"/>
+          <w:numId w:val="1"/>
+        </w:numPr>
+        <w:suppressAutoHyphens w:val="true"/>
+        <w:bidi w:val="0"/>
+        <w:spacing w:lineRule="auto" w:line="276" w:before="0" w:after="0"/>
+        <w:ind w:hanging="360" w:left="2160" w:right="0"/>
+        <w:jc w:val="left"/>
+        <w:rPr/>
+      </w:pPr>
+      <w:r>
+        <w:rPr/>
+        <w:t>Designed for the Room UI data table to offer an endpoint that returns all necessary data for this UI data table via a single API call scoped to the Tournament context.</w:t>
+      </w:r>
+    </w:p>
+    <w:p>
+      <w:pPr>
+        <w:pStyle w:val="normal1"/>
+        <w:numPr>
+          <w:ilvl w:val="1"/>
+          <w:numId w:val="1"/>
+        </w:numPr>
+        <w:ind w:hanging="360" w:left="1440"/>
+        <w:rPr/>
+      </w:pPr>
+      <w:r>
+        <w:rPr/>
+        <w:t xml:space="preserve">parameters: </w:t>
+      </w:r>
+    </w:p>
+    <w:p>
+      <w:pPr>
+        <w:pStyle w:val="normal1"/>
+        <w:numPr>
+          <w:ilvl w:val="2"/>
+          <w:numId w:val="1"/>
+        </w:numPr>
+        <w:ind w:hanging="360" w:left="2160"/>
+        <w:rPr/>
+      </w:pPr>
+      <w:r>
+        <w:rPr/>
+        <w:t>page={page_num}</w:t>
+      </w:r>
+    </w:p>
+    <w:p>
+      <w:pPr>
+        <w:pStyle w:val="normal1"/>
+        <w:numPr>
+          <w:ilvl w:val="3"/>
+          <w:numId w:val="1"/>
+        </w:numPr>
+        <w:ind w:hanging="360" w:left="2880"/>
+        <w:rPr>
+          <w:color w:val="FF0000"/>
+        </w:rPr>
+      </w:pPr>
+      <w:r>
+        <w:rPr>
+          <w:color w:val="FF0000"/>
+        </w:rPr>
+        <w:t>Required</w:t>
+      </w:r>
+    </w:p>
+    <w:p>
+      <w:pPr>
+        <w:pStyle w:val="normal1"/>
+        <w:numPr>
+          <w:ilvl w:val="3"/>
+          <w:numId w:val="1"/>
+        </w:numPr>
+        <w:ind w:hanging="360" w:left="2880"/>
+        <w:rPr/>
+      </w:pPr>
+      <w:r>
+        <w:rPr/>
+        <w:t>Defines which page to return</w:t>
+      </w:r>
+    </w:p>
+    <w:p>
+      <w:pPr>
+        <w:pStyle w:val="normal1"/>
+        <w:numPr>
+          <w:ilvl w:val="3"/>
+          <w:numId w:val="1"/>
+        </w:numPr>
+        <w:ind w:hanging="360" w:left="2880"/>
+        <w:rPr/>
+      </w:pPr>
+      <w:r>
+        <w:rPr/>
+        <w:t>First page = 0 (zero)</w:t>
+      </w:r>
+    </w:p>
+    <w:p>
+      <w:pPr>
+        <w:pStyle w:val="normal1"/>
+        <w:numPr>
+          <w:ilvl w:val="2"/>
+          <w:numId w:val="1"/>
+        </w:numPr>
+        <w:ind w:hanging="360" w:left="2160"/>
+        <w:rPr/>
+      </w:pPr>
+      <w:r>
+        <w:rPr/>
+        <w:t>page_size={num_of_rows}</w:t>
+      </w:r>
+    </w:p>
+    <w:p>
+      <w:pPr>
+        <w:pStyle w:val="normal1"/>
+        <w:numPr>
+          <w:ilvl w:val="3"/>
+          <w:numId w:val="1"/>
+        </w:numPr>
+        <w:ind w:hanging="360" w:left="2880"/>
+        <w:rPr>
+          <w:color w:val="FF0000"/>
+        </w:rPr>
+      </w:pPr>
+      <w:r>
+        <w:rPr>
+          <w:color w:val="FF0000"/>
+        </w:rPr>
+        <w:t>Required</w:t>
+      </w:r>
+    </w:p>
+    <w:p>
+      <w:pPr>
+        <w:pStyle w:val="normal1"/>
+        <w:numPr>
+          <w:ilvl w:val="3"/>
+          <w:numId w:val="1"/>
+        </w:numPr>
+        <w:ind w:hanging="360" w:left="2880"/>
+        <w:rPr/>
+      </w:pPr>
+      <w:r>
+        <w:rPr/>
+        <w:t>Defines how many rows to return for the selected page</w:t>
+      </w:r>
+    </w:p>
+    <w:p>
+      <w:pPr>
+        <w:pStyle w:val="normal1"/>
+        <w:widowControl/>
+        <w:numPr>
+          <w:ilvl w:val="2"/>
+          <w:numId w:val="1"/>
+        </w:numPr>
+        <w:suppressAutoHyphens w:val="true"/>
+        <w:bidi w:val="0"/>
+        <w:spacing w:lineRule="auto" w:line="276" w:before="0" w:after="0"/>
+        <w:ind w:hanging="360" w:left="2160" w:right="0"/>
+        <w:jc w:val="left"/>
+        <w:rPr/>
+      </w:pPr>
+      <w:r>
+        <w:rPr/>
+        <w:t xml:space="preserve">returns: </w:t>
+      </w:r>
+    </w:p>
+    <w:p>
+      <w:pPr>
+        <w:pStyle w:val="normal1"/>
+        <w:numPr>
+          <w:ilvl w:val="0"/>
+          <w:numId w:val="1"/>
+        </w:numPr>
+        <w:ind w:hanging="360" w:left="720"/>
+        <w:rPr/>
+      </w:pPr>
+      <w:r>
+        <w:rPr/>
         <w:t>POST/Create Room</w:t>
       </w:r>
     </w:p>
@@ -47105,7 +47588,11 @@
         <w:spacing w:lineRule="auto" w:line="276" w:before="0" w:after="0"/>
         <w:ind w:hanging="360" w:left="2160" w:right="0"/>
         <w:jc w:val="left"/>
-        <w:rPr/>
+        <w:rPr>
+          <w:b/>
+          <w:bCs/>
+          <w:color w:val="000000"/>
+        </w:rPr>
       </w:pPr>
       <w:r>
         <w:rPr>
@@ -47114,6 +47601,292 @@
           <w:color w:val="000000"/>
         </w:rPr>
         <w:t>an array of  TournamentGroups</w:t>
+      </w:r>
+    </w:p>
+    <w:p>
+      <w:pPr>
+        <w:pStyle w:val="normal1"/>
+        <w:numPr>
+          <w:ilvl w:val="0"/>
+          <w:numId w:val="1"/>
+        </w:numPr>
+        <w:ind w:hanging="360" w:left="720"/>
+        <w:rPr/>
+      </w:pPr>
+      <w:r>
+        <w:rPr/>
+        <w:t xml:space="preserve">GET TournamentGroup </w:t>
+      </w:r>
+      <w:r>
+        <w:rPr/>
+        <w:t>Row</w:t>
+      </w:r>
+      <w:r>
+        <w:rPr/>
+        <w:t xml:space="preserve">s </w:t>
+      </w:r>
+      <w:r>
+        <w:rPr/>
+        <w:t>of Tournament</w:t>
+      </w:r>
+    </w:p>
+    <w:p>
+      <w:pPr>
+        <w:pStyle w:val="normal1"/>
+        <w:numPr>
+          <w:ilvl w:val="1"/>
+          <w:numId w:val="1"/>
+        </w:numPr>
+        <w:ind w:hanging="360" w:left="1440"/>
+        <w:rPr/>
+      </w:pPr>
+      <w:r>
+        <w:rPr/>
+        <w:t xml:space="preserve">built_including_tests: </w:t>
+      </w:r>
+      <w:r>
+        <w:rPr>
+          <w:b/>
+          <w:bCs/>
+        </w:rPr>
+        <w:t>false</w:t>
+      </w:r>
+    </w:p>
+    <w:p>
+      <w:pPr>
+        <w:pStyle w:val="normal1"/>
+        <w:numPr>
+          <w:ilvl w:val="1"/>
+          <w:numId w:val="1"/>
+        </w:numPr>
+        <w:ind w:hanging="360" w:left="1440"/>
+        <w:rPr/>
+      </w:pPr>
+      <w:r>
+        <w:rPr/>
+        <w:t>HTTP method: ‘GET’</w:t>
+      </w:r>
+    </w:p>
+    <w:p>
+      <w:pPr>
+        <w:pStyle w:val="normal1"/>
+        <w:numPr>
+          <w:ilvl w:val="1"/>
+          <w:numId w:val="1"/>
+        </w:numPr>
+        <w:ind w:hanging="360" w:left="1440"/>
+        <w:rPr/>
+      </w:pPr>
+      <w:r>
+        <w:rPr/>
+        <w:t>endpoint: {base_uri}/api/</w:t>
+      </w:r>
+      <w:r>
+        <w:rPr/>
+        <w:t>tournaments/{id}/</w:t>
+      </w:r>
+      <w:r>
+        <w:rPr/>
+        <w:t>tournamentgroup-</w:t>
+      </w:r>
+      <w:r>
+        <w:rPr/>
+        <w:t>row</w:t>
+      </w:r>
+      <w:r>
+        <w:rPr/>
+        <w:t>s?page={page_num}&amp;page_size={num_of_rows}</w:t>
+      </w:r>
+    </w:p>
+    <w:p>
+      <w:pPr>
+        <w:pStyle w:val="normal1"/>
+        <w:numPr>
+          <w:ilvl w:val="1"/>
+          <w:numId w:val="1"/>
+        </w:numPr>
+        <w:ind w:hanging="360" w:left="1440"/>
+        <w:rPr/>
+      </w:pPr>
+      <w:r>
+        <w:rPr/>
+        <w:t xml:space="preserve">description: </w:t>
+      </w:r>
+    </w:p>
+    <w:p>
+      <w:pPr>
+        <w:pStyle w:val="normal1"/>
+        <w:widowControl/>
+        <w:numPr>
+          <w:ilvl w:val="2"/>
+          <w:numId w:val="1"/>
+        </w:numPr>
+        <w:suppressAutoHyphens w:val="true"/>
+        <w:bidi w:val="0"/>
+        <w:spacing w:lineRule="auto" w:line="276" w:before="0" w:after="0"/>
+        <w:ind w:hanging="360" w:left="2160" w:right="0"/>
+        <w:jc w:val="left"/>
+        <w:rPr/>
+      </w:pPr>
+      <w:r>
+        <w:rPr/>
+        <w:t>Designed to be a single endpoint that the TournamentGroup UI data table can call 1 time to get all of its data (scoped to a Tournament’s context).</w:t>
+      </w:r>
+    </w:p>
+    <w:p>
+      <w:pPr>
+        <w:pStyle w:val="normal1"/>
+        <w:numPr>
+          <w:ilvl w:val="1"/>
+          <w:numId w:val="1"/>
+        </w:numPr>
+        <w:ind w:hanging="360" w:left="1440"/>
+        <w:rPr/>
+      </w:pPr>
+      <w:r>
+        <w:rPr/>
+        <w:t xml:space="preserve">parameters: </w:t>
+      </w:r>
+    </w:p>
+    <w:p>
+      <w:pPr>
+        <w:pStyle w:val="normal1"/>
+        <w:numPr>
+          <w:ilvl w:val="2"/>
+          <w:numId w:val="1"/>
+        </w:numPr>
+        <w:ind w:hanging="360" w:left="2160"/>
+        <w:rPr/>
+      </w:pPr>
+      <w:r>
+        <w:rPr/>
+        <w:t>page={page_num}</w:t>
+      </w:r>
+    </w:p>
+    <w:p>
+      <w:pPr>
+        <w:pStyle w:val="normal1"/>
+        <w:numPr>
+          <w:ilvl w:val="3"/>
+          <w:numId w:val="1"/>
+        </w:numPr>
+        <w:ind w:hanging="360" w:left="2880"/>
+        <w:rPr>
+          <w:color w:val="FF0000"/>
+        </w:rPr>
+      </w:pPr>
+      <w:r>
+        <w:rPr>
+          <w:color w:val="FF0000"/>
+        </w:rPr>
+        <w:t>Required</w:t>
+      </w:r>
+    </w:p>
+    <w:p>
+      <w:pPr>
+        <w:pStyle w:val="normal1"/>
+        <w:numPr>
+          <w:ilvl w:val="3"/>
+          <w:numId w:val="1"/>
+        </w:numPr>
+        <w:ind w:hanging="360" w:left="2880"/>
+        <w:rPr/>
+      </w:pPr>
+      <w:r>
+        <w:rPr/>
+        <w:t>Defines which page to return</w:t>
+      </w:r>
+    </w:p>
+    <w:p>
+      <w:pPr>
+        <w:pStyle w:val="normal1"/>
+        <w:numPr>
+          <w:ilvl w:val="3"/>
+          <w:numId w:val="1"/>
+        </w:numPr>
+        <w:ind w:hanging="360" w:left="2880"/>
+        <w:rPr/>
+      </w:pPr>
+      <w:r>
+        <w:rPr/>
+        <w:t>First page = 0 (zero)</w:t>
+      </w:r>
+    </w:p>
+    <w:p>
+      <w:pPr>
+        <w:pStyle w:val="normal1"/>
+        <w:numPr>
+          <w:ilvl w:val="2"/>
+          <w:numId w:val="1"/>
+        </w:numPr>
+        <w:ind w:hanging="360" w:left="2160"/>
+        <w:rPr/>
+      </w:pPr>
+      <w:r>
+        <w:rPr/>
+        <w:t>page_size={num_of_rows}</w:t>
+      </w:r>
+    </w:p>
+    <w:p>
+      <w:pPr>
+        <w:pStyle w:val="normal1"/>
+        <w:numPr>
+          <w:ilvl w:val="3"/>
+          <w:numId w:val="1"/>
+        </w:numPr>
+        <w:ind w:hanging="360" w:left="2880"/>
+        <w:rPr>
+          <w:color w:val="FF0000"/>
+        </w:rPr>
+      </w:pPr>
+      <w:r>
+        <w:rPr>
+          <w:color w:val="FF0000"/>
+        </w:rPr>
+        <w:t>Required</w:t>
+      </w:r>
+    </w:p>
+    <w:p>
+      <w:pPr>
+        <w:pStyle w:val="normal1"/>
+        <w:numPr>
+          <w:ilvl w:val="3"/>
+          <w:numId w:val="1"/>
+        </w:numPr>
+        <w:ind w:hanging="360" w:left="2880"/>
+        <w:rPr/>
+      </w:pPr>
+      <w:r>
+        <w:rPr/>
+        <w:t>Defines how many rows to return for the selected page</w:t>
+      </w:r>
+    </w:p>
+    <w:p>
+      <w:pPr>
+        <w:pStyle w:val="normal1"/>
+        <w:widowControl/>
+        <w:numPr>
+          <w:ilvl w:val="2"/>
+          <w:numId w:val="1"/>
+        </w:numPr>
+        <w:suppressAutoHyphens w:val="true"/>
+        <w:bidi w:val="0"/>
+        <w:spacing w:lineRule="auto" w:line="276" w:before="0" w:after="0"/>
+        <w:ind w:hanging="360" w:left="2160" w:right="0"/>
+        <w:jc w:val="left"/>
+        <w:rPr>
+          <w:b w:val="false"/>
+          <w:bCs w:val="false"/>
+          <w:color w:val="000000"/>
+        </w:rPr>
+      </w:pPr>
+      <w:r>
+        <w:rPr>
+          <w:b w:val="false"/>
+          <w:bCs w:val="false"/>
+          <w:color w:val="000000"/>
+        </w:rPr>
+        <w:t xml:space="preserve">returns: </w:t>
       </w:r>
     </w:p>
     <w:p>
@@ -53450,8 +54223,8 @@
       <w:u w:val="single"/>
     </w:rPr>
   </w:style>
-  <w:style w:type="character" w:styleId="Bullets">
-    <w:name w:val="Bullets"/>
+  <w:style w:type="character" w:styleId="Bulletsuser">
+    <w:name w:val="Bullets (user)"/>
     <w:qFormat/>
     <w:rPr>
       <w:rFonts w:ascii="OpenSymbol" w:hAnsi="OpenSymbol" w:eastAsia="OpenSymbol" w:cs="OpenSymbol"/>

</xml_diff>

<commit_message>
Added three integration tests for the three endpoints added in the last commit. Also updated the API docs to track that these have been added.
</commit_message>
<xml_diff>
--- a/docs/QView API Documentation.docx
+++ b/docs/QView API Documentation.docx
@@ -14,7 +14,7 @@
       </w:r>
       <w:r>
         <w:rPr/>
-        <w:t>2</w:t>
+        <w:t>3</w:t>
       </w:r>
       <w:r>
         <w:rPr/>
@@ -22,7 +22,7 @@
       </w:r>
       <w:r>
         <w:rPr/>
-        <w:t>5</w:t>
+        <w:t>6</w:t>
       </w:r>
       <w:r>
         <w:rPr/>
@@ -6370,19 +6370,7 @@
       </w:pPr>
       <w:r>
         <w:rPr/>
-        <w:t xml:space="preserve">GET Division </w:t>
-      </w:r>
-      <w:r>
-        <w:rPr/>
-        <w:t>Row</w:t>
-      </w:r>
-      <w:r>
-        <w:rPr/>
-        <w:t xml:space="preserve">s </w:t>
-      </w:r>
-      <w:r>
-        <w:rPr/>
-        <w:t>by Tournament</w:t>
+        <w:t>GET Division Rows by Tournament</w:t>
       </w:r>
     </w:p>
     <w:p>
@@ -6404,7 +6392,7 @@
           <w:b/>
           <w:bCs/>
         </w:rPr>
-        <w:t>false</w:t>
+        <w:t>true</w:t>
       </w:r>
     </w:p>
     <w:p>
@@ -6434,15 +6422,7 @@
       </w:pPr>
       <w:r>
         <w:rPr/>
-        <w:t>endpoint: {base_uri}/api/</w:t>
-      </w:r>
-      <w:r>
-        <w:rPr/>
-        <w:t>tournaments/{id}/division-rows</w:t>
-      </w:r>
-      <w:r>
-        <w:rPr/>
-        <w:t>?page={page_num}&amp;page_size={num_of_rows}</w:t>
+        <w:t>endpoint: {base_uri}/api/tournaments/{id}/division-rows?page={page_num}&amp;page_size={num_of_rows}</w:t>
       </w:r>
     </w:p>
     <w:p>
@@ -36254,19 +36234,7 @@
       </w:pPr>
       <w:r>
         <w:rPr/>
-        <w:t xml:space="preserve">GET Room </w:t>
-      </w:r>
-      <w:r>
-        <w:rPr/>
-        <w:t>Row</w:t>
-      </w:r>
-      <w:r>
-        <w:rPr/>
-        <w:t xml:space="preserve">s </w:t>
-      </w:r>
-      <w:r>
-        <w:rPr/>
-        <w:t>by Tournament</w:t>
+        <w:t>GET Room Rows by Tournament</w:t>
       </w:r>
     </w:p>
     <w:p>
@@ -36288,7 +36256,7 @@
           <w:b/>
           <w:bCs/>
         </w:rPr>
-        <w:t>false</w:t>
+        <w:t>true</w:t>
       </w:r>
     </w:p>
     <w:p>
@@ -36318,23 +36286,7 @@
       </w:pPr>
       <w:r>
         <w:rPr/>
-        <w:t>endpoint: {base_uri}/api/</w:t>
-      </w:r>
-      <w:r>
-        <w:rPr/>
-        <w:t>tournaments/{id}/</w:t>
-      </w:r>
-      <w:r>
-        <w:rPr/>
-        <w:t>room-</w:t>
-      </w:r>
-      <w:r>
-        <w:rPr/>
-        <w:t>row</w:t>
-      </w:r>
-      <w:r>
-        <w:rPr/>
-        <w:t>s?page={page_num}&amp;page_size={num_of_rows}</w:t>
+        <w:t>endpoint: {base_uri}/api/tournaments/{id}/room-rows?page={page_num}&amp;page_size={num_of_rows}</w:t>
       </w:r>
     </w:p>
     <w:p>
@@ -47615,19 +47567,7 @@
       </w:pPr>
       <w:r>
         <w:rPr/>
-        <w:t xml:space="preserve">GET TournamentGroup </w:t>
-      </w:r>
-      <w:r>
-        <w:rPr/>
-        <w:t>Row</w:t>
-      </w:r>
-      <w:r>
-        <w:rPr/>
-        <w:t xml:space="preserve">s </w:t>
-      </w:r>
-      <w:r>
-        <w:rPr/>
-        <w:t>of Tournament</w:t>
+        <w:t>GET TournamentGroup Rows of Tournament</w:t>
       </w:r>
     </w:p>
     <w:p>
@@ -47649,7 +47589,7 @@
           <w:b/>
           <w:bCs/>
         </w:rPr>
-        <w:t>false</w:t>
+        <w:t>true</w:t>
       </w:r>
     </w:p>
     <w:p>
@@ -47679,23 +47619,7 @@
       </w:pPr>
       <w:r>
         <w:rPr/>
-        <w:t>endpoint: {base_uri}/api/</w:t>
-      </w:r>
-      <w:r>
-        <w:rPr/>
-        <w:t>tournaments/{id}/</w:t>
-      </w:r>
-      <w:r>
-        <w:rPr/>
-        <w:t>tournamentgroup-</w:t>
-      </w:r>
-      <w:r>
-        <w:rPr/>
-        <w:t>row</w:t>
-      </w:r>
-      <w:r>
-        <w:rPr/>
-        <w:t>s?page={page_num}&amp;page_size={num_of_rows}</w:t>
+        <w:t>endpoint: {base_uri}/api/tournaments/{id}/tournamentgroup-rows?page={page_num}&amp;page_size={num_of_rows}</w:t>
       </w:r>
     </w:p>
     <w:p>
@@ -54223,8 +54147,8 @@
       <w:u w:val="single"/>
     </w:rPr>
   </w:style>
-  <w:style w:type="character" w:styleId="Bulletsuser">
-    <w:name w:val="Bullets (user)"/>
+  <w:style w:type="character" w:styleId="Bullets">
+    <w:name w:val="Bullets"/>
     <w:qFormat/>
     <w:rPr>
       <w:rFonts w:ascii="OpenSymbol" w:hAnsi="OpenSymbol" w:eastAsia="OpenSymbol" w:cs="OpenSymbol"/>

</xml_diff>

<commit_message>
Converted API endpoints used by frontend User profile data tables to single-call endpoints. Each now supports audit data trail columns (3). 5 new endpoints (and their integration tests and API docs) were added for this purpose.
</commit_message>
<xml_diff>
--- a/docs/QView API Documentation.docx
+++ b/docs/QView API Documentation.docx
@@ -14,19 +14,11 @@
       </w:r>
       <w:r>
         <w:rPr/>
-        <w:t>3</w:t>
-      </w:r>
-      <w:r>
-        <w:rPr/>
-        <w:t>_2026.09.0</w:t>
-      </w:r>
-      <w:r>
-        <w:rPr/>
-        <w:t>6</w:t>
-      </w:r>
-      <w:r>
-        <w:rPr/>
-        <w:t>)</w:t>
+        <w:t>4</w:t>
+      </w:r>
+      <w:r>
+        <w:rPr/>
+        <w:t>_2026.09.06)</w:t>
       </w:r>
     </w:p>
     <w:p>
@@ -8350,6 +8342,349 @@
         <w:rPr>
           <w:shd w:fill="auto" w:val="clear"/>
         </w:rPr>
+        <w:t xml:space="preserve">GET </w:t>
+      </w:r>
+      <w:r>
+        <w:rPr>
+          <w:b w:val="false"/>
+          <w:bCs w:val="false"/>
+          <w:shd w:fill="auto" w:val="clear"/>
+        </w:rPr>
+        <w:t xml:space="preserve">Equipment </w:t>
+      </w:r>
+      <w:r>
+        <w:rPr>
+          <w:b w:val="false"/>
+          <w:bCs w:val="false"/>
+          <w:shd w:fill="auto" w:val="clear"/>
+        </w:rPr>
+        <w:t>Rows of User</w:t>
+      </w:r>
+    </w:p>
+    <w:p>
+      <w:pPr>
+        <w:pStyle w:val="normal1"/>
+        <w:numPr>
+          <w:ilvl w:val="1"/>
+          <w:numId w:val="1"/>
+        </w:numPr>
+        <w:ind w:hanging="360" w:left="1440"/>
+        <w:rPr>
+          <w:highlight w:val="none"/>
+          <w:shd w:fill="auto" w:val="clear"/>
+        </w:rPr>
+      </w:pPr>
+      <w:r>
+        <w:rPr>
+          <w:shd w:fill="auto" w:val="clear"/>
+        </w:rPr>
+        <w:t xml:space="preserve">built_including_tests: </w:t>
+      </w:r>
+      <w:r>
+        <w:rPr>
+          <w:b/>
+          <w:bCs/>
+          <w:shd w:fill="auto" w:val="clear"/>
+        </w:rPr>
+        <w:t>true</w:t>
+      </w:r>
+    </w:p>
+    <w:p>
+      <w:pPr>
+        <w:pStyle w:val="normal1"/>
+        <w:numPr>
+          <w:ilvl w:val="1"/>
+          <w:numId w:val="1"/>
+        </w:numPr>
+        <w:ind w:hanging="360" w:left="1440"/>
+        <w:rPr>
+          <w:highlight w:val="none"/>
+          <w:shd w:fill="auto" w:val="clear"/>
+        </w:rPr>
+      </w:pPr>
+      <w:r>
+        <w:rPr>
+          <w:shd w:fill="auto" w:val="clear"/>
+        </w:rPr>
+        <w:t>HTTP method: ‘GET’</w:t>
+      </w:r>
+    </w:p>
+    <w:p>
+      <w:pPr>
+        <w:pStyle w:val="normal1"/>
+        <w:numPr>
+          <w:ilvl w:val="1"/>
+          <w:numId w:val="1"/>
+        </w:numPr>
+        <w:ind w:hanging="360" w:left="1440"/>
+        <w:rPr>
+          <w:highlight w:val="none"/>
+          <w:shd w:fill="auto" w:val="clear"/>
+        </w:rPr>
+      </w:pPr>
+      <w:r>
+        <w:rPr>
+          <w:shd w:fill="auto" w:val="clear"/>
+        </w:rPr>
+        <w:t>endpoint: {base_uri}/api/</w:t>
+      </w:r>
+      <w:r>
+        <w:rPr>
+          <w:shd w:fill="auto" w:val="clear"/>
+        </w:rPr>
+        <w:t>users/{id}/gear-rows</w:t>
+      </w:r>
+      <w:r>
+        <w:rPr>
+          <w:shd w:fill="auto" w:val="clear"/>
+        </w:rPr>
+        <w:t>?page={page_num}&amp;page_size={num_of_rows}</w:t>
+      </w:r>
+    </w:p>
+    <w:p>
+      <w:pPr>
+        <w:pStyle w:val="normal1"/>
+        <w:numPr>
+          <w:ilvl w:val="1"/>
+          <w:numId w:val="1"/>
+        </w:numPr>
+        <w:ind w:hanging="360" w:left="1440"/>
+        <w:rPr>
+          <w:highlight w:val="none"/>
+          <w:shd w:fill="auto" w:val="clear"/>
+        </w:rPr>
+      </w:pPr>
+      <w:r>
+        <w:rPr>
+          <w:shd w:fill="auto" w:val="clear"/>
+        </w:rPr>
+        <w:t xml:space="preserve">description: </w:t>
+      </w:r>
+    </w:p>
+    <w:p>
+      <w:pPr>
+        <w:pStyle w:val="normal1"/>
+        <w:widowControl/>
+        <w:numPr>
+          <w:ilvl w:val="2"/>
+          <w:numId w:val="1"/>
+        </w:numPr>
+        <w:suppressAutoHyphens w:val="true"/>
+        <w:bidi w:val="0"/>
+        <w:spacing w:lineRule="auto" w:line="276" w:before="0" w:after="0"/>
+        <w:ind w:hanging="360" w:left="2160" w:right="0"/>
+        <w:jc w:val="left"/>
+        <w:rPr>
+          <w:highlight w:val="none"/>
+          <w:shd w:fill="auto" w:val="clear"/>
+        </w:rPr>
+      </w:pPr>
+      <w:r>
+        <w:rPr>
+          <w:shd w:fill="auto" w:val="clear"/>
+        </w:rPr>
+        <w:t>Designed to be a single-call endpoint for the Users profile’s ‘My Gear’ UI data table.</w:t>
+      </w:r>
+    </w:p>
+    <w:p>
+      <w:pPr>
+        <w:pStyle w:val="normal1"/>
+        <w:numPr>
+          <w:ilvl w:val="1"/>
+          <w:numId w:val="1"/>
+        </w:numPr>
+        <w:ind w:hanging="360" w:left="1440"/>
+        <w:rPr>
+          <w:highlight w:val="none"/>
+          <w:shd w:fill="auto" w:val="clear"/>
+        </w:rPr>
+      </w:pPr>
+      <w:r>
+        <w:rPr>
+          <w:shd w:fill="auto" w:val="clear"/>
+        </w:rPr>
+        <w:t xml:space="preserve">parameters: </w:t>
+      </w:r>
+    </w:p>
+    <w:p>
+      <w:pPr>
+        <w:pStyle w:val="normal1"/>
+        <w:numPr>
+          <w:ilvl w:val="2"/>
+          <w:numId w:val="1"/>
+        </w:numPr>
+        <w:ind w:hanging="360" w:left="2160"/>
+        <w:rPr>
+          <w:highlight w:val="none"/>
+          <w:shd w:fill="auto" w:val="clear"/>
+        </w:rPr>
+      </w:pPr>
+      <w:r>
+        <w:rPr>
+          <w:shd w:fill="auto" w:val="clear"/>
+        </w:rPr>
+        <w:t>page={page_num}</w:t>
+      </w:r>
+    </w:p>
+    <w:p>
+      <w:pPr>
+        <w:pStyle w:val="normal1"/>
+        <w:numPr>
+          <w:ilvl w:val="3"/>
+          <w:numId w:val="1"/>
+        </w:numPr>
+        <w:ind w:hanging="360" w:left="2880"/>
+        <w:rPr>
+          <w:highlight w:val="none"/>
+          <w:shd w:fill="auto" w:val="clear"/>
+        </w:rPr>
+      </w:pPr>
+      <w:r>
+        <w:rPr>
+          <w:color w:val="FF0000"/>
+          <w:shd w:fill="auto" w:val="clear"/>
+        </w:rPr>
+        <w:t>Required</w:t>
+      </w:r>
+    </w:p>
+    <w:p>
+      <w:pPr>
+        <w:pStyle w:val="normal1"/>
+        <w:numPr>
+          <w:ilvl w:val="3"/>
+          <w:numId w:val="1"/>
+        </w:numPr>
+        <w:ind w:hanging="360" w:left="2880"/>
+        <w:rPr>
+          <w:highlight w:val="none"/>
+          <w:shd w:fill="auto" w:val="clear"/>
+        </w:rPr>
+      </w:pPr>
+      <w:r>
+        <w:rPr>
+          <w:shd w:fill="auto" w:val="clear"/>
+        </w:rPr>
+        <w:t>Defines which page to return</w:t>
+      </w:r>
+    </w:p>
+    <w:p>
+      <w:pPr>
+        <w:pStyle w:val="normal1"/>
+        <w:numPr>
+          <w:ilvl w:val="3"/>
+          <w:numId w:val="1"/>
+        </w:numPr>
+        <w:ind w:hanging="360" w:left="2880"/>
+        <w:rPr>
+          <w:highlight w:val="none"/>
+          <w:shd w:fill="auto" w:val="clear"/>
+        </w:rPr>
+      </w:pPr>
+      <w:r>
+        <w:rPr>
+          <w:shd w:fill="auto" w:val="clear"/>
+        </w:rPr>
+        <w:t>First page = 0 (zero)</w:t>
+      </w:r>
+    </w:p>
+    <w:p>
+      <w:pPr>
+        <w:pStyle w:val="normal1"/>
+        <w:numPr>
+          <w:ilvl w:val="2"/>
+          <w:numId w:val="1"/>
+        </w:numPr>
+        <w:ind w:hanging="360" w:left="2160"/>
+        <w:rPr>
+          <w:highlight w:val="none"/>
+          <w:shd w:fill="auto" w:val="clear"/>
+        </w:rPr>
+      </w:pPr>
+      <w:r>
+        <w:rPr>
+          <w:shd w:fill="auto" w:val="clear"/>
+        </w:rPr>
+        <w:t>page_size={num_of_rows}</w:t>
+      </w:r>
+    </w:p>
+    <w:p>
+      <w:pPr>
+        <w:pStyle w:val="normal1"/>
+        <w:numPr>
+          <w:ilvl w:val="3"/>
+          <w:numId w:val="1"/>
+        </w:numPr>
+        <w:ind w:hanging="360" w:left="2880"/>
+        <w:rPr>
+          <w:highlight w:val="none"/>
+          <w:shd w:fill="auto" w:val="clear"/>
+        </w:rPr>
+      </w:pPr>
+      <w:r>
+        <w:rPr>
+          <w:color w:val="FF0000"/>
+          <w:shd w:fill="auto" w:val="clear"/>
+        </w:rPr>
+        <w:t>Required</w:t>
+      </w:r>
+    </w:p>
+    <w:p>
+      <w:pPr>
+        <w:pStyle w:val="normal1"/>
+        <w:numPr>
+          <w:ilvl w:val="3"/>
+          <w:numId w:val="1"/>
+        </w:numPr>
+        <w:ind w:hanging="360" w:left="2880"/>
+        <w:rPr>
+          <w:highlight w:val="none"/>
+          <w:shd w:fill="auto" w:val="clear"/>
+        </w:rPr>
+      </w:pPr>
+      <w:r>
+        <w:rPr>
+          <w:shd w:fill="auto" w:val="clear"/>
+        </w:rPr>
+        <w:t>Defines how many rows to return for the selected page</w:t>
+      </w:r>
+    </w:p>
+    <w:p>
+      <w:pPr>
+        <w:pStyle w:val="normal1"/>
+        <w:numPr>
+          <w:ilvl w:val="1"/>
+          <w:numId w:val="1"/>
+        </w:numPr>
+        <w:ind w:hanging="360" w:left="1440"/>
+        <w:rPr>
+          <w:highlight w:val="none"/>
+          <w:shd w:fill="auto" w:val="clear"/>
+        </w:rPr>
+      </w:pPr>
+      <w:r>
+        <w:rPr>
+          <w:shd w:fill="auto" w:val="clear"/>
+        </w:rPr>
+        <w:t xml:space="preserve">returns: </w:t>
+      </w:r>
+    </w:p>
+    <w:p>
+      <w:pPr>
+        <w:pStyle w:val="normal1"/>
+        <w:numPr>
+          <w:ilvl w:val="0"/>
+          <w:numId w:val="1"/>
+        </w:numPr>
+        <w:ind w:hanging="360" w:left="720"/>
+        <w:rPr>
+          <w:highlight w:val="none"/>
+          <w:shd w:fill="auto" w:val="clear"/>
+        </w:rPr>
+      </w:pPr>
+      <w:r>
+        <w:rPr>
+          <w:shd w:fill="auto" w:val="clear"/>
+        </w:rPr>
         <w:t xml:space="preserve">POST/Create </w:t>
       </w:r>
       <w:r>
@@ -38009,6 +38344,278 @@
       </w:pPr>
       <w:r>
         <w:rPr/>
+        <w:t xml:space="preserve">GET Rosters </w:t>
+      </w:r>
+      <w:r>
+        <w:rPr/>
+        <w:t>Quizzers of User (*typically the User is the Coach)</w:t>
+      </w:r>
+    </w:p>
+    <w:p>
+      <w:pPr>
+        <w:pStyle w:val="normal1"/>
+        <w:numPr>
+          <w:ilvl w:val="1"/>
+          <w:numId w:val="1"/>
+        </w:numPr>
+        <w:ind w:hanging="360" w:left="1440"/>
+        <w:rPr/>
+      </w:pPr>
+      <w:r>
+        <w:rPr/>
+        <w:t xml:space="preserve">built_including_tests: </w:t>
+      </w:r>
+      <w:r>
+        <w:rPr>
+          <w:b/>
+          <w:bCs/>
+        </w:rPr>
+        <w:t>true</w:t>
+      </w:r>
+    </w:p>
+    <w:p>
+      <w:pPr>
+        <w:pStyle w:val="normal1"/>
+        <w:numPr>
+          <w:ilvl w:val="1"/>
+          <w:numId w:val="1"/>
+        </w:numPr>
+        <w:ind w:hanging="360" w:left="1440"/>
+        <w:rPr/>
+      </w:pPr>
+      <w:r>
+        <w:rPr/>
+        <w:t>HTTP method: ‘GET’</w:t>
+      </w:r>
+    </w:p>
+    <w:p>
+      <w:pPr>
+        <w:pStyle w:val="normal1"/>
+        <w:numPr>
+          <w:ilvl w:val="1"/>
+          <w:numId w:val="1"/>
+        </w:numPr>
+        <w:ind w:hanging="360" w:left="1440"/>
+        <w:rPr/>
+      </w:pPr>
+      <w:r>
+        <w:rPr/>
+        <w:t>endpoint: {base_uri}/api/</w:t>
+      </w:r>
+      <w:r>
+        <w:rPr/>
+        <w:t>users/{id}/</w:t>
+      </w:r>
+      <w:r>
+        <w:rPr/>
+        <w:t>roster-</w:t>
+      </w:r>
+      <w:r>
+        <w:rPr/>
+        <w:t>quizzer-row</w:t>
+      </w:r>
+      <w:r>
+        <w:rPr/>
+        <w:t>s?page={page_num}&amp;page_size={num_of_rows}</w:t>
+      </w:r>
+    </w:p>
+    <w:p>
+      <w:pPr>
+        <w:pStyle w:val="normal1"/>
+        <w:numPr>
+          <w:ilvl w:val="1"/>
+          <w:numId w:val="1"/>
+        </w:numPr>
+        <w:ind w:hanging="360" w:left="1440"/>
+        <w:rPr/>
+      </w:pPr>
+      <w:r>
+        <w:rPr/>
+        <w:t xml:space="preserve">description: </w:t>
+      </w:r>
+    </w:p>
+    <w:p>
+      <w:pPr>
+        <w:pStyle w:val="normal1"/>
+        <w:widowControl/>
+        <w:numPr>
+          <w:ilvl w:val="2"/>
+          <w:numId w:val="1"/>
+        </w:numPr>
+        <w:suppressAutoHyphens w:val="true"/>
+        <w:bidi w:val="0"/>
+        <w:spacing w:lineRule="auto" w:line="276" w:before="0" w:after="0"/>
+        <w:ind w:hanging="360" w:left="2160" w:right="0"/>
+        <w:jc w:val="left"/>
+        <w:rPr/>
+      </w:pPr>
+      <w:r>
+        <w:rPr/>
+        <w:t>Designed to be a single-call endpoint for the Rosters UI data table in the Users profile.</w:t>
+      </w:r>
+    </w:p>
+    <w:p>
+      <w:pPr>
+        <w:pStyle w:val="normal1"/>
+        <w:numPr>
+          <w:ilvl w:val="1"/>
+          <w:numId w:val="1"/>
+        </w:numPr>
+        <w:ind w:hanging="360" w:left="1440"/>
+        <w:rPr/>
+      </w:pPr>
+      <w:r>
+        <w:rPr/>
+        <w:t xml:space="preserve">parameters: </w:t>
+      </w:r>
+    </w:p>
+    <w:p>
+      <w:pPr>
+        <w:pStyle w:val="normal1"/>
+        <w:numPr>
+          <w:ilvl w:val="2"/>
+          <w:numId w:val="1"/>
+        </w:numPr>
+        <w:ind w:hanging="360" w:left="2160"/>
+        <w:rPr/>
+      </w:pPr>
+      <w:r>
+        <w:rPr/>
+        <w:t>page={page_num}</w:t>
+      </w:r>
+    </w:p>
+    <w:p>
+      <w:pPr>
+        <w:pStyle w:val="normal1"/>
+        <w:numPr>
+          <w:ilvl w:val="3"/>
+          <w:numId w:val="1"/>
+        </w:numPr>
+        <w:ind w:hanging="360" w:left="2880"/>
+        <w:rPr>
+          <w:color w:val="FF0000"/>
+        </w:rPr>
+      </w:pPr>
+      <w:r>
+        <w:rPr>
+          <w:color w:val="FF0000"/>
+        </w:rPr>
+        <w:t>Required</w:t>
+      </w:r>
+    </w:p>
+    <w:p>
+      <w:pPr>
+        <w:pStyle w:val="normal1"/>
+        <w:numPr>
+          <w:ilvl w:val="3"/>
+          <w:numId w:val="1"/>
+        </w:numPr>
+        <w:ind w:hanging="360" w:left="2880"/>
+        <w:rPr/>
+      </w:pPr>
+      <w:r>
+        <w:rPr/>
+        <w:t>Defines which page to return</w:t>
+      </w:r>
+    </w:p>
+    <w:p>
+      <w:pPr>
+        <w:pStyle w:val="normal1"/>
+        <w:numPr>
+          <w:ilvl w:val="3"/>
+          <w:numId w:val="1"/>
+        </w:numPr>
+        <w:ind w:hanging="360" w:left="2880"/>
+        <w:rPr/>
+      </w:pPr>
+      <w:r>
+        <w:rPr/>
+        <w:t>First page = 0 (zero)</w:t>
+      </w:r>
+    </w:p>
+    <w:p>
+      <w:pPr>
+        <w:pStyle w:val="normal1"/>
+        <w:numPr>
+          <w:ilvl w:val="2"/>
+          <w:numId w:val="1"/>
+        </w:numPr>
+        <w:ind w:hanging="360" w:left="2160"/>
+        <w:rPr/>
+      </w:pPr>
+      <w:r>
+        <w:rPr/>
+        <w:t>page_size={num_of_rows}</w:t>
+      </w:r>
+    </w:p>
+    <w:p>
+      <w:pPr>
+        <w:pStyle w:val="normal1"/>
+        <w:numPr>
+          <w:ilvl w:val="3"/>
+          <w:numId w:val="1"/>
+        </w:numPr>
+        <w:ind w:hanging="360" w:left="2880"/>
+        <w:rPr>
+          <w:color w:val="FF0000"/>
+        </w:rPr>
+      </w:pPr>
+      <w:r>
+        <w:rPr>
+          <w:color w:val="FF0000"/>
+        </w:rPr>
+        <w:t>Required</w:t>
+      </w:r>
+    </w:p>
+    <w:p>
+      <w:pPr>
+        <w:pStyle w:val="normal1"/>
+        <w:numPr>
+          <w:ilvl w:val="3"/>
+          <w:numId w:val="1"/>
+        </w:numPr>
+        <w:ind w:hanging="360" w:left="2880"/>
+        <w:rPr/>
+      </w:pPr>
+      <w:r>
+        <w:rPr/>
+        <w:t>Defines how many rows to return for the selected page</w:t>
+      </w:r>
+    </w:p>
+    <w:p>
+      <w:pPr>
+        <w:pStyle w:val="normal1"/>
+        <w:numPr>
+          <w:ilvl w:val="1"/>
+          <w:numId w:val="1"/>
+        </w:numPr>
+        <w:ind w:hanging="360" w:left="1440"/>
+        <w:rPr>
+          <w:b w:val="false"/>
+          <w:bCs w:val="false"/>
+        </w:rPr>
+      </w:pPr>
+      <w:r>
+        <w:rPr>
+          <w:b w:val="false"/>
+          <w:bCs w:val="false"/>
+          <w:color w:val="000000"/>
+        </w:rPr>
+        <w:t xml:space="preserve">returns: </w:t>
+      </w:r>
+    </w:p>
+    <w:p>
+      <w:pPr>
+        <w:pStyle w:val="normal1"/>
+        <w:numPr>
+          <w:ilvl w:val="0"/>
+          <w:numId w:val="1"/>
+        </w:numPr>
+        <w:ind w:hanging="360" w:left="720"/>
+        <w:rPr/>
+      </w:pPr>
+      <w:r>
+        <w:rPr/>
         <w:t>POST/Create Roster</w:t>
       </w:r>
     </w:p>
@@ -45951,6 +46558,291 @@
       </w:pPr>
       <w:r>
         <w:rPr/>
+        <w:t xml:space="preserve">GET Team </w:t>
+      </w:r>
+      <w:r>
+        <w:rPr/>
+        <w:t>Row</w:t>
+      </w:r>
+      <w:r>
+        <w:rPr/>
+        <w:t xml:space="preserve">s </w:t>
+      </w:r>
+      <w:r>
+        <w:rPr/>
+        <w:t>of User</w:t>
+      </w:r>
+    </w:p>
+    <w:p>
+      <w:pPr>
+        <w:pStyle w:val="normal1"/>
+        <w:numPr>
+          <w:ilvl w:val="1"/>
+          <w:numId w:val="1"/>
+        </w:numPr>
+        <w:ind w:hanging="360" w:left="1440"/>
+        <w:rPr/>
+      </w:pPr>
+      <w:r>
+        <w:rPr/>
+        <w:t xml:space="preserve">built_including_tests: </w:t>
+      </w:r>
+      <w:r>
+        <w:rPr>
+          <w:b/>
+          <w:bCs/>
+        </w:rPr>
+        <w:t>true</w:t>
+      </w:r>
+    </w:p>
+    <w:p>
+      <w:pPr>
+        <w:pStyle w:val="normal1"/>
+        <w:numPr>
+          <w:ilvl w:val="1"/>
+          <w:numId w:val="1"/>
+        </w:numPr>
+        <w:ind w:hanging="360" w:left="1440"/>
+        <w:rPr/>
+      </w:pPr>
+      <w:r>
+        <w:rPr/>
+        <w:t>HTTP method: ‘GET’</w:t>
+      </w:r>
+    </w:p>
+    <w:p>
+      <w:pPr>
+        <w:pStyle w:val="normal1"/>
+        <w:numPr>
+          <w:ilvl w:val="1"/>
+          <w:numId w:val="1"/>
+        </w:numPr>
+        <w:ind w:hanging="360" w:left="1440"/>
+        <w:rPr/>
+      </w:pPr>
+      <w:r>
+        <w:rPr/>
+        <w:t>endpoint: {base_uri}/api/</w:t>
+      </w:r>
+      <w:r>
+        <w:rPr/>
+        <w:t>users/{id}/</w:t>
+      </w:r>
+      <w:r>
+        <w:rPr/>
+        <w:t>team-</w:t>
+      </w:r>
+      <w:r>
+        <w:rPr/>
+        <w:t>row</w:t>
+      </w:r>
+      <w:r>
+        <w:rPr/>
+        <w:t>s?page={page_num}&amp;page_size={num_of_rows}</w:t>
+      </w:r>
+    </w:p>
+    <w:p>
+      <w:pPr>
+        <w:pStyle w:val="normal1"/>
+        <w:numPr>
+          <w:ilvl w:val="1"/>
+          <w:numId w:val="1"/>
+        </w:numPr>
+        <w:ind w:hanging="360" w:left="1440"/>
+        <w:rPr/>
+      </w:pPr>
+      <w:r>
+        <w:rPr/>
+        <w:t xml:space="preserve">description: </w:t>
+      </w:r>
+    </w:p>
+    <w:p>
+      <w:pPr>
+        <w:pStyle w:val="normal1"/>
+        <w:widowControl/>
+        <w:numPr>
+          <w:ilvl w:val="2"/>
+          <w:numId w:val="1"/>
+        </w:numPr>
+        <w:suppressAutoHyphens w:val="true"/>
+        <w:bidi w:val="0"/>
+        <w:spacing w:lineRule="auto" w:line="276" w:before="0" w:after="0"/>
+        <w:ind w:hanging="360" w:left="2160" w:right="0"/>
+        <w:jc w:val="left"/>
+        <w:rPr/>
+      </w:pPr>
+      <w:r>
+        <w:rPr/>
+        <w:t>Designed to return rows of Teams given a specific User (in the User’s profile notably) as a single-call endpoint for that UI data table.</w:t>
+      </w:r>
+    </w:p>
+    <w:p>
+      <w:pPr>
+        <w:pStyle w:val="normal1"/>
+        <w:numPr>
+          <w:ilvl w:val="1"/>
+          <w:numId w:val="1"/>
+        </w:numPr>
+        <w:ind w:hanging="360" w:left="1440"/>
+        <w:rPr/>
+      </w:pPr>
+      <w:r>
+        <w:rPr/>
+        <w:t xml:space="preserve">parameters: </w:t>
+      </w:r>
+    </w:p>
+    <w:p>
+      <w:pPr>
+        <w:pStyle w:val="normal1"/>
+        <w:numPr>
+          <w:ilvl w:val="2"/>
+          <w:numId w:val="1"/>
+        </w:numPr>
+        <w:ind w:hanging="360" w:left="2160"/>
+        <w:rPr/>
+      </w:pPr>
+      <w:r>
+        <w:rPr/>
+        <w:t>page={page_num}</w:t>
+      </w:r>
+    </w:p>
+    <w:p>
+      <w:pPr>
+        <w:pStyle w:val="normal1"/>
+        <w:numPr>
+          <w:ilvl w:val="3"/>
+          <w:numId w:val="1"/>
+        </w:numPr>
+        <w:ind w:hanging="360" w:left="2880"/>
+        <w:rPr>
+          <w:color w:val="FF0000"/>
+        </w:rPr>
+      </w:pPr>
+      <w:r>
+        <w:rPr>
+          <w:color w:val="FF0000"/>
+        </w:rPr>
+        <w:t>Required</w:t>
+      </w:r>
+    </w:p>
+    <w:p>
+      <w:pPr>
+        <w:pStyle w:val="normal1"/>
+        <w:numPr>
+          <w:ilvl w:val="3"/>
+          <w:numId w:val="1"/>
+        </w:numPr>
+        <w:ind w:hanging="360" w:left="2880"/>
+        <w:rPr/>
+      </w:pPr>
+      <w:r>
+        <w:rPr/>
+        <w:t>Defines which page to return</w:t>
+      </w:r>
+    </w:p>
+    <w:p>
+      <w:pPr>
+        <w:pStyle w:val="normal1"/>
+        <w:numPr>
+          <w:ilvl w:val="3"/>
+          <w:numId w:val="1"/>
+        </w:numPr>
+        <w:ind w:hanging="360" w:left="2880"/>
+        <w:rPr/>
+      </w:pPr>
+      <w:r>
+        <w:rPr/>
+        <w:t>First page = 0 (zero)</w:t>
+      </w:r>
+    </w:p>
+    <w:p>
+      <w:pPr>
+        <w:pStyle w:val="normal1"/>
+        <w:numPr>
+          <w:ilvl w:val="2"/>
+          <w:numId w:val="1"/>
+        </w:numPr>
+        <w:ind w:hanging="360" w:left="2160"/>
+        <w:rPr/>
+      </w:pPr>
+      <w:r>
+        <w:rPr/>
+        <w:t>page_size={num_of_rows}</w:t>
+      </w:r>
+    </w:p>
+    <w:p>
+      <w:pPr>
+        <w:pStyle w:val="normal1"/>
+        <w:numPr>
+          <w:ilvl w:val="3"/>
+          <w:numId w:val="1"/>
+        </w:numPr>
+        <w:ind w:hanging="360" w:left="2880"/>
+        <w:rPr>
+          <w:color w:val="FF0000"/>
+        </w:rPr>
+      </w:pPr>
+      <w:r>
+        <w:rPr>
+          <w:color w:val="FF0000"/>
+        </w:rPr>
+        <w:t>Required</w:t>
+      </w:r>
+    </w:p>
+    <w:p>
+      <w:pPr>
+        <w:pStyle w:val="normal1"/>
+        <w:numPr>
+          <w:ilvl w:val="3"/>
+          <w:numId w:val="1"/>
+        </w:numPr>
+        <w:ind w:hanging="360" w:left="2880"/>
+        <w:rPr/>
+      </w:pPr>
+      <w:r>
+        <w:rPr/>
+        <w:t>Defines how many rows to return for the selected page</w:t>
+      </w:r>
+    </w:p>
+    <w:p>
+      <w:pPr>
+        <w:pStyle w:val="normal1"/>
+        <w:widowControl/>
+        <w:numPr>
+          <w:ilvl w:val="2"/>
+          <w:numId w:val="1"/>
+        </w:numPr>
+        <w:suppressAutoHyphens w:val="true"/>
+        <w:bidi w:val="0"/>
+        <w:spacing w:lineRule="auto" w:line="276" w:before="0" w:after="0"/>
+        <w:ind w:hanging="360" w:left="2160" w:right="0"/>
+        <w:jc w:val="left"/>
+        <w:rPr>
+          <w:b/>
+          <w:bCs/>
+        </w:rPr>
+      </w:pPr>
+      <w:r>
+        <w:rPr>
+          <w:b/>
+          <w:bCs/>
+          <w:color w:val="000000"/>
+        </w:rPr>
+        <w:t xml:space="preserve">returns: </w:t>
+      </w:r>
+    </w:p>
+    <w:p>
+      <w:pPr>
+        <w:pStyle w:val="normal1"/>
+        <w:numPr>
+          <w:ilvl w:val="0"/>
+          <w:numId w:val="1"/>
+        </w:numPr>
+        <w:ind w:hanging="360" w:left="720"/>
+        <w:rPr/>
+      </w:pPr>
+      <w:r>
+        <w:rPr/>
         <w:t>POST/Create Team</w:t>
       </w:r>
     </w:p>
@@ -47825,6 +48717,284 @@
       </w:pPr>
       <w:r>
         <w:rPr/>
+        <w:t xml:space="preserve">GET TournamentGroups </w:t>
+      </w:r>
+      <w:r>
+        <w:rPr/>
+        <w:t>Managed by User</w:t>
+      </w:r>
+    </w:p>
+    <w:p>
+      <w:pPr>
+        <w:pStyle w:val="normal1"/>
+        <w:numPr>
+          <w:ilvl w:val="1"/>
+          <w:numId w:val="1"/>
+        </w:numPr>
+        <w:ind w:hanging="360" w:left="1440"/>
+        <w:rPr/>
+      </w:pPr>
+      <w:r>
+        <w:rPr/>
+        <w:t xml:space="preserve">built_including_tests: </w:t>
+      </w:r>
+      <w:r>
+        <w:rPr>
+          <w:b/>
+          <w:bCs/>
+        </w:rPr>
+        <w:t>true</w:t>
+      </w:r>
+    </w:p>
+    <w:p>
+      <w:pPr>
+        <w:pStyle w:val="normal1"/>
+        <w:numPr>
+          <w:ilvl w:val="1"/>
+          <w:numId w:val="1"/>
+        </w:numPr>
+        <w:ind w:hanging="360" w:left="1440"/>
+        <w:rPr/>
+      </w:pPr>
+      <w:r>
+        <w:rPr/>
+        <w:t>HTTP method: ‘GET’</w:t>
+      </w:r>
+    </w:p>
+    <w:p>
+      <w:pPr>
+        <w:pStyle w:val="normal1"/>
+        <w:numPr>
+          <w:ilvl w:val="1"/>
+          <w:numId w:val="1"/>
+        </w:numPr>
+        <w:ind w:hanging="360" w:left="1440"/>
+        <w:rPr/>
+      </w:pPr>
+      <w:r>
+        <w:rPr/>
+        <w:t>endpoint: {base_uri}/api/</w:t>
+      </w:r>
+      <w:r>
+        <w:rPr/>
+        <w:t>users/{id}/managed-</w:t>
+      </w:r>
+      <w:r>
+        <w:rPr/>
+        <w:t>tournamentgroup-</w:t>
+      </w:r>
+      <w:r>
+        <w:rPr/>
+        <w:t>row</w:t>
+      </w:r>
+      <w:r>
+        <w:rPr/>
+        <w:t>s?page={page_num}&amp;page_size={num_of_rows}</w:t>
+      </w:r>
+    </w:p>
+    <w:p>
+      <w:pPr>
+        <w:pStyle w:val="normal1"/>
+        <w:numPr>
+          <w:ilvl w:val="1"/>
+          <w:numId w:val="1"/>
+        </w:numPr>
+        <w:ind w:hanging="360" w:left="1440"/>
+        <w:rPr/>
+      </w:pPr>
+      <w:r>
+        <w:rPr/>
+        <w:t xml:space="preserve">description: </w:t>
+      </w:r>
+    </w:p>
+    <w:p>
+      <w:pPr>
+        <w:pStyle w:val="normal1"/>
+        <w:widowControl/>
+        <w:numPr>
+          <w:ilvl w:val="2"/>
+          <w:numId w:val="1"/>
+        </w:numPr>
+        <w:suppressAutoHyphens w:val="true"/>
+        <w:bidi w:val="0"/>
+        <w:spacing w:lineRule="auto" w:line="276" w:before="0" w:after="0"/>
+        <w:ind w:hanging="360" w:left="2160" w:right="0"/>
+        <w:jc w:val="left"/>
+        <w:rPr/>
+      </w:pPr>
+      <w:r>
+        <w:rPr/>
+        <w:t>Designed as a single-call endpoint for the User profile’s Managed TournamentGroups UI data table.</w:t>
+      </w:r>
+    </w:p>
+    <w:p>
+      <w:pPr>
+        <w:pStyle w:val="normal1"/>
+        <w:numPr>
+          <w:ilvl w:val="1"/>
+          <w:numId w:val="1"/>
+        </w:numPr>
+        <w:ind w:hanging="360" w:left="1440"/>
+        <w:rPr/>
+      </w:pPr>
+      <w:r>
+        <w:rPr/>
+        <w:t xml:space="preserve">parameters: </w:t>
+      </w:r>
+    </w:p>
+    <w:p>
+      <w:pPr>
+        <w:pStyle w:val="normal1"/>
+        <w:numPr>
+          <w:ilvl w:val="2"/>
+          <w:numId w:val="1"/>
+        </w:numPr>
+        <w:ind w:hanging="360" w:left="2160"/>
+        <w:rPr/>
+      </w:pPr>
+      <w:r>
+        <w:rPr/>
+        <w:t>page={page_num}</w:t>
+      </w:r>
+    </w:p>
+    <w:p>
+      <w:pPr>
+        <w:pStyle w:val="normal1"/>
+        <w:numPr>
+          <w:ilvl w:val="3"/>
+          <w:numId w:val="1"/>
+        </w:numPr>
+        <w:ind w:hanging="360" w:left="2880"/>
+        <w:rPr>
+          <w:color w:val="FF0000"/>
+        </w:rPr>
+      </w:pPr>
+      <w:r>
+        <w:rPr>
+          <w:color w:val="FF0000"/>
+        </w:rPr>
+        <w:t>Required</w:t>
+      </w:r>
+    </w:p>
+    <w:p>
+      <w:pPr>
+        <w:pStyle w:val="normal1"/>
+        <w:numPr>
+          <w:ilvl w:val="3"/>
+          <w:numId w:val="1"/>
+        </w:numPr>
+        <w:ind w:hanging="360" w:left="2880"/>
+        <w:rPr/>
+      </w:pPr>
+      <w:r>
+        <w:rPr/>
+        <w:t>Defines which page to return</w:t>
+      </w:r>
+    </w:p>
+    <w:p>
+      <w:pPr>
+        <w:pStyle w:val="normal1"/>
+        <w:numPr>
+          <w:ilvl w:val="3"/>
+          <w:numId w:val="1"/>
+        </w:numPr>
+        <w:ind w:hanging="360" w:left="2880"/>
+        <w:rPr/>
+      </w:pPr>
+      <w:r>
+        <w:rPr/>
+        <w:t>First page = 0 (zero)</w:t>
+      </w:r>
+    </w:p>
+    <w:p>
+      <w:pPr>
+        <w:pStyle w:val="normal1"/>
+        <w:numPr>
+          <w:ilvl w:val="2"/>
+          <w:numId w:val="1"/>
+        </w:numPr>
+        <w:ind w:hanging="360" w:left="2160"/>
+        <w:rPr/>
+      </w:pPr>
+      <w:r>
+        <w:rPr/>
+        <w:t>page_size={num_of_rows}</w:t>
+      </w:r>
+    </w:p>
+    <w:p>
+      <w:pPr>
+        <w:pStyle w:val="normal1"/>
+        <w:numPr>
+          <w:ilvl w:val="3"/>
+          <w:numId w:val="1"/>
+        </w:numPr>
+        <w:ind w:hanging="360" w:left="2880"/>
+        <w:rPr>
+          <w:color w:val="FF0000"/>
+        </w:rPr>
+      </w:pPr>
+      <w:r>
+        <w:rPr>
+          <w:color w:val="FF0000"/>
+        </w:rPr>
+        <w:t>Required</w:t>
+      </w:r>
+    </w:p>
+    <w:p>
+      <w:pPr>
+        <w:pStyle w:val="normal1"/>
+        <w:numPr>
+          <w:ilvl w:val="3"/>
+          <w:numId w:val="1"/>
+        </w:numPr>
+        <w:ind w:hanging="360" w:left="2880"/>
+        <w:rPr/>
+      </w:pPr>
+      <w:r>
+        <w:rPr/>
+        <w:t>Defines how many rows to return for the selected page</w:t>
+      </w:r>
+    </w:p>
+    <w:p>
+      <w:pPr>
+        <w:pStyle w:val="normal1"/>
+        <w:widowControl/>
+        <w:numPr>
+          <w:ilvl w:val="2"/>
+          <w:numId w:val="1"/>
+        </w:numPr>
+        <w:suppressAutoHyphens w:val="true"/>
+        <w:bidi w:val="0"/>
+        <w:spacing w:lineRule="auto" w:line="276" w:before="0" w:after="0"/>
+        <w:ind w:hanging="360" w:left="2160" w:right="0"/>
+        <w:jc w:val="left"/>
+        <w:rPr>
+          <w:b w:val="false"/>
+          <w:bCs w:val="false"/>
+          <w:color w:val="000000"/>
+        </w:rPr>
+      </w:pPr>
+      <w:r>
+        <w:rPr>
+          <w:b w:val="false"/>
+          <w:bCs w:val="false"/>
+          <w:color w:val="000000"/>
+        </w:rPr>
+        <w:t xml:space="preserve">returns: </w:t>
+      </w:r>
+    </w:p>
+    <w:p>
+      <w:pPr>
+        <w:pStyle w:val="normal1"/>
+        <w:numPr>
+          <w:ilvl w:val="0"/>
+          <w:numId w:val="1"/>
+        </w:numPr>
+        <w:ind w:hanging="360" w:left="720"/>
+        <w:rPr/>
+      </w:pPr>
+      <w:r>
+        <w:rPr/>
         <w:t>POST/Create TournamentGroup</w:t>
       </w:r>
     </w:p>
@@ -50196,7 +51366,10 @@
         <w:spacing w:lineRule="auto" w:line="276" w:before="0" w:after="0"/>
         <w:ind w:hanging="360" w:left="2160" w:right="0"/>
         <w:jc w:val="left"/>
-        <w:rPr/>
+        <w:rPr>
+          <w:b/>
+          <w:bCs/>
+        </w:rPr>
       </w:pPr>
       <w:r>
         <w:rPr>
@@ -50205,6 +51378,290 @@
           <w:color w:val="000000"/>
         </w:rPr>
         <w:t>an array of Games</w:t>
+      </w:r>
+    </w:p>
+    <w:p>
+      <w:pPr>
+        <w:pStyle w:val="normal1"/>
+        <w:numPr>
+          <w:ilvl w:val="0"/>
+          <w:numId w:val="1"/>
+        </w:numPr>
+        <w:ind w:hanging="360" w:left="720"/>
+        <w:rPr/>
+      </w:pPr>
+      <w:r>
+        <w:rPr/>
+        <w:t xml:space="preserve">GET Tournaments </w:t>
+      </w:r>
+      <w:r>
+        <w:rPr/>
+        <w:t>Managed by User</w:t>
+      </w:r>
+    </w:p>
+    <w:p>
+      <w:pPr>
+        <w:pStyle w:val="normal1"/>
+        <w:numPr>
+          <w:ilvl w:val="1"/>
+          <w:numId w:val="1"/>
+        </w:numPr>
+        <w:ind w:hanging="360" w:left="1440"/>
+        <w:rPr/>
+      </w:pPr>
+      <w:r>
+        <w:rPr/>
+        <w:t xml:space="preserve">built_including_tests: </w:t>
+      </w:r>
+      <w:r>
+        <w:rPr>
+          <w:b/>
+          <w:bCs/>
+        </w:rPr>
+        <w:t>true</w:t>
+      </w:r>
+    </w:p>
+    <w:p>
+      <w:pPr>
+        <w:pStyle w:val="normal1"/>
+        <w:numPr>
+          <w:ilvl w:val="1"/>
+          <w:numId w:val="1"/>
+        </w:numPr>
+        <w:ind w:hanging="360" w:left="1440"/>
+        <w:rPr/>
+      </w:pPr>
+      <w:r>
+        <w:rPr/>
+        <w:t>HTTP method: ‘GET’</w:t>
+      </w:r>
+    </w:p>
+    <w:p>
+      <w:pPr>
+        <w:pStyle w:val="normal1"/>
+        <w:numPr>
+          <w:ilvl w:val="1"/>
+          <w:numId w:val="1"/>
+        </w:numPr>
+        <w:ind w:hanging="360" w:left="1440"/>
+        <w:rPr/>
+      </w:pPr>
+      <w:r>
+        <w:rPr/>
+        <w:t>endpoint: {base_uri}/api/</w:t>
+      </w:r>
+      <w:r>
+        <w:rPr/>
+        <w:t>users/{id}/managed-</w:t>
+      </w:r>
+      <w:r>
+        <w:rPr/>
+        <w:t>tournament-</w:t>
+      </w:r>
+      <w:r>
+        <w:rPr/>
+        <w:t>row</w:t>
+      </w:r>
+      <w:r>
+        <w:rPr/>
+        <w:t>s?page={page_num}&amp;page_size={num_of_rows}</w:t>
+      </w:r>
+    </w:p>
+    <w:p>
+      <w:pPr>
+        <w:pStyle w:val="normal1"/>
+        <w:numPr>
+          <w:ilvl w:val="1"/>
+          <w:numId w:val="1"/>
+        </w:numPr>
+        <w:ind w:hanging="360" w:left="1440"/>
+        <w:rPr/>
+      </w:pPr>
+      <w:r>
+        <w:rPr/>
+        <w:t xml:space="preserve">description: </w:t>
+      </w:r>
+    </w:p>
+    <w:p>
+      <w:pPr>
+        <w:pStyle w:val="normal1"/>
+        <w:widowControl/>
+        <w:numPr>
+          <w:ilvl w:val="2"/>
+          <w:numId w:val="1"/>
+        </w:numPr>
+        <w:suppressAutoHyphens w:val="true"/>
+        <w:bidi w:val="0"/>
+        <w:spacing w:lineRule="auto" w:line="276" w:before="0" w:after="0"/>
+        <w:ind w:hanging="360" w:left="2160" w:right="0"/>
+        <w:jc w:val="left"/>
+        <w:rPr/>
+      </w:pPr>
+      <w:r>
+        <w:rPr/>
+        <w:t>Designed for the User’s profile’s Managed Tournaments UI data table as a way to return all necessary data with a single Api call.</w:t>
+      </w:r>
+    </w:p>
+    <w:p>
+      <w:pPr>
+        <w:pStyle w:val="normal1"/>
+        <w:numPr>
+          <w:ilvl w:val="1"/>
+          <w:numId w:val="1"/>
+        </w:numPr>
+        <w:ind w:hanging="360" w:left="1440"/>
+        <w:rPr/>
+      </w:pPr>
+      <w:r>
+        <w:rPr/>
+        <w:t xml:space="preserve">parameters: </w:t>
+      </w:r>
+    </w:p>
+    <w:p>
+      <w:pPr>
+        <w:pStyle w:val="normal1"/>
+        <w:numPr>
+          <w:ilvl w:val="2"/>
+          <w:numId w:val="1"/>
+        </w:numPr>
+        <w:ind w:hanging="360" w:left="2160"/>
+        <w:rPr/>
+      </w:pPr>
+      <w:r>
+        <w:rPr/>
+        <w:t>page={page_num}</w:t>
+      </w:r>
+    </w:p>
+    <w:p>
+      <w:pPr>
+        <w:pStyle w:val="normal1"/>
+        <w:numPr>
+          <w:ilvl w:val="3"/>
+          <w:numId w:val="1"/>
+        </w:numPr>
+        <w:ind w:hanging="360" w:left="2880"/>
+        <w:rPr>
+          <w:color w:val="FF0000"/>
+        </w:rPr>
+      </w:pPr>
+      <w:r>
+        <w:rPr>
+          <w:color w:val="FF0000"/>
+        </w:rPr>
+        <w:t>Required</w:t>
+      </w:r>
+    </w:p>
+    <w:p>
+      <w:pPr>
+        <w:pStyle w:val="normal1"/>
+        <w:numPr>
+          <w:ilvl w:val="3"/>
+          <w:numId w:val="1"/>
+        </w:numPr>
+        <w:ind w:hanging="360" w:left="2880"/>
+        <w:rPr>
+          <w:u w:val="none"/>
+        </w:rPr>
+      </w:pPr>
+      <w:r>
+        <w:rPr/>
+        <w:t>Defines which page to return</w:t>
+      </w:r>
+    </w:p>
+    <w:p>
+      <w:pPr>
+        <w:pStyle w:val="normal1"/>
+        <w:numPr>
+          <w:ilvl w:val="3"/>
+          <w:numId w:val="1"/>
+        </w:numPr>
+        <w:ind w:hanging="360" w:left="2880"/>
+        <w:rPr>
+          <w:u w:val="none"/>
+        </w:rPr>
+      </w:pPr>
+      <w:r>
+        <w:rPr/>
+        <w:t>First page = 0 (zero)</w:t>
+      </w:r>
+    </w:p>
+    <w:p>
+      <w:pPr>
+        <w:pStyle w:val="normal1"/>
+        <w:numPr>
+          <w:ilvl w:val="2"/>
+          <w:numId w:val="1"/>
+        </w:numPr>
+        <w:ind w:hanging="360" w:left="2160"/>
+        <w:rPr/>
+      </w:pPr>
+      <w:r>
+        <w:rPr/>
+        <w:t>page_size={num_of_rows}</w:t>
+      </w:r>
+    </w:p>
+    <w:p>
+      <w:pPr>
+        <w:pStyle w:val="normal1"/>
+        <w:numPr>
+          <w:ilvl w:val="3"/>
+          <w:numId w:val="1"/>
+        </w:numPr>
+        <w:ind w:hanging="360" w:left="2880"/>
+        <w:rPr>
+          <w:color w:val="FF0000"/>
+        </w:rPr>
+      </w:pPr>
+      <w:r>
+        <w:rPr>
+          <w:color w:val="FF0000"/>
+        </w:rPr>
+        <w:t>Required</w:t>
+      </w:r>
+    </w:p>
+    <w:p>
+      <w:pPr>
+        <w:pStyle w:val="normal1"/>
+        <w:numPr>
+          <w:ilvl w:val="3"/>
+          <w:numId w:val="1"/>
+        </w:numPr>
+        <w:ind w:hanging="360" w:left="2880"/>
+        <w:rPr>
+          <w:u w:val="none"/>
+        </w:rPr>
+      </w:pPr>
+      <w:r>
+        <w:rPr/>
+        <w:t>Defines how many rows to return for the selected page</w:t>
+      </w:r>
+    </w:p>
+    <w:p>
+      <w:pPr>
+        <w:pStyle w:val="normal1"/>
+        <w:widowControl/>
+        <w:numPr>
+          <w:ilvl w:val="2"/>
+          <w:numId w:val="1"/>
+        </w:numPr>
+        <w:suppressAutoHyphens w:val="true"/>
+        <w:bidi w:val="0"/>
+        <w:spacing w:lineRule="auto" w:line="276" w:before="0" w:after="0"/>
+        <w:ind w:hanging="360" w:left="2160" w:right="0"/>
+        <w:jc w:val="left"/>
+        <w:rPr>
+          <w:b w:val="false"/>
+          <w:bCs w:val="false"/>
+          <w:color w:val="000000"/>
+        </w:rPr>
+      </w:pPr>
+      <w:r>
+        <w:rPr>
+          <w:b w:val="false"/>
+          <w:bCs w:val="false"/>
+          <w:color w:val="000000"/>
+        </w:rPr>
+        <w:t xml:space="preserve">returns: </w:t>
       </w:r>
     </w:p>
     <w:p>
@@ -54147,8 +55604,8 @@
       <w:u w:val="single"/>
     </w:rPr>
   </w:style>
-  <w:style w:type="character" w:styleId="Bullets">
-    <w:name w:val="Bullets"/>
+  <w:style w:type="character" w:styleId="Bulletsuser">
+    <w:name w:val="Bullets (user)"/>
     <w:qFormat/>
     <w:rPr>
       <w:rFonts w:ascii="OpenSymbol" w:hAnsi="OpenSymbol" w:eastAsia="OpenSymbol" w:cs="OpenSymbol"/>

</xml_diff>

<commit_message>
Added GET PoolBrackets by Division endpoint documentation.
</commit_message>
<xml_diff>
--- a/docs/QView API Documentation.docx
+++ b/docs/QView API Documentation.docx
@@ -14,15 +14,15 @@
       </w:r>
       <w:r>
         <w:rPr/>
-        <w:t>5</w:t>
-      </w:r>
-      <w:r>
-        <w:rPr/>
-        <w:t>_2026.09.0</w:t>
-      </w:r>
-      <w:r>
-        <w:rPr/>
         <w:t>6</w:t>
+      </w:r>
+      <w:r>
+        <w:rPr/>
+        <w:t>_2026.09.</w:t>
+      </w:r>
+      <w:r>
+        <w:rPr/>
+        <w:t>10</w:t>
       </w:r>
       <w:r>
         <w:rPr/>
@@ -24904,6 +24904,391 @@
         <w:rPr>
           <w:b/>
           <w:bCs/>
+        </w:rPr>
+      </w:r>
+    </w:p>
+    <w:p>
+      <w:pPr>
+        <w:pStyle w:val="normal1"/>
+        <w:widowControl/>
+        <w:suppressAutoHyphens w:val="true"/>
+        <w:bidi w:val="0"/>
+        <w:spacing w:lineRule="auto" w:line="276" w:before="0" w:after="0"/>
+        <w:ind w:hanging="360" w:left="360" w:right="0"/>
+        <w:jc w:val="left"/>
+        <w:rPr>
+          <w:b/>
+          <w:bCs/>
+        </w:rPr>
+      </w:pPr>
+      <w:r>
+        <w:rPr>
+          <w:b/>
+          <w:bCs/>
+          <w:color w:val="000000"/>
+        </w:rPr>
+        <w:t>PoolBrackets</w:t>
+      </w:r>
+    </w:p>
+    <w:p>
+      <w:pPr>
+        <w:pStyle w:val="normal1"/>
+        <w:numPr>
+          <w:ilvl w:val="0"/>
+          <w:numId w:val="1"/>
+        </w:numPr>
+        <w:ind w:hanging="360" w:left="720"/>
+        <w:rPr/>
+      </w:pPr>
+      <w:r>
+        <w:rPr/>
+        <w:t xml:space="preserve">GET </w:t>
+      </w:r>
+      <w:r>
+        <w:rPr/>
+        <w:t>PoolBrackets of Division</w:t>
+      </w:r>
+    </w:p>
+    <w:p>
+      <w:pPr>
+        <w:pStyle w:val="normal1"/>
+        <w:numPr>
+          <w:ilvl w:val="1"/>
+          <w:numId w:val="1"/>
+        </w:numPr>
+        <w:ind w:hanging="360" w:left="1440"/>
+        <w:rPr/>
+      </w:pPr>
+      <w:r>
+        <w:rPr/>
+        <w:t xml:space="preserve">built_including_tests: </w:t>
+      </w:r>
+      <w:r>
+        <w:rPr>
+          <w:b/>
+          <w:bCs/>
+        </w:rPr>
+        <w:t>true</w:t>
+      </w:r>
+    </w:p>
+    <w:p>
+      <w:pPr>
+        <w:pStyle w:val="normal1"/>
+        <w:numPr>
+          <w:ilvl w:val="1"/>
+          <w:numId w:val="1"/>
+        </w:numPr>
+        <w:ind w:hanging="360" w:left="1440"/>
+        <w:rPr/>
+      </w:pPr>
+      <w:r>
+        <w:rPr/>
+        <w:t>HTTP method: ‘GET’</w:t>
+      </w:r>
+    </w:p>
+    <w:p>
+      <w:pPr>
+        <w:pStyle w:val="normal1"/>
+        <w:numPr>
+          <w:ilvl w:val="1"/>
+          <w:numId w:val="1"/>
+        </w:numPr>
+        <w:ind w:hanging="360" w:left="1440"/>
+        <w:rPr/>
+      </w:pPr>
+      <w:r>
+        <w:rPr/>
+        <w:t>endpoint: {base_uri}/api/</w:t>
+      </w:r>
+      <w:r>
+        <w:rPr/>
+        <w:t>divisions</w:t>
+      </w:r>
+      <w:r>
+        <w:rPr/>
+        <w:t>/{id}/</w:t>
+      </w:r>
+      <w:r>
+        <w:rPr/>
+        <w:t>pool-brackets</w:t>
+      </w:r>
+      <w:r>
+        <w:rPr/>
+        <w:t>?page={page_num}&amp;page_size={num_of_rows}</w:t>
+      </w:r>
+    </w:p>
+    <w:p>
+      <w:pPr>
+        <w:pStyle w:val="normal1"/>
+        <w:numPr>
+          <w:ilvl w:val="1"/>
+          <w:numId w:val="1"/>
+        </w:numPr>
+        <w:ind w:hanging="360" w:left="1440"/>
+        <w:rPr/>
+      </w:pPr>
+      <w:r>
+        <w:rPr/>
+        <w:t xml:space="preserve">description: </w:t>
+      </w:r>
+    </w:p>
+    <w:p>
+      <w:pPr>
+        <w:pStyle w:val="normal1"/>
+        <w:numPr>
+          <w:ilvl w:val="1"/>
+          <w:numId w:val="1"/>
+        </w:numPr>
+        <w:ind w:hanging="360" w:left="1440"/>
+        <w:rPr/>
+      </w:pPr>
+      <w:r>
+        <w:rPr/>
+        <w:t>parameters:</w:t>
+      </w:r>
+    </w:p>
+    <w:p>
+      <w:pPr>
+        <w:pStyle w:val="normal1"/>
+        <w:numPr>
+          <w:ilvl w:val="2"/>
+          <w:numId w:val="1"/>
+        </w:numPr>
+        <w:ind w:hanging="360" w:left="2160"/>
+        <w:rPr/>
+      </w:pPr>
+      <w:r>
+        <w:rPr/>
+        <w:t>id</w:t>
+      </w:r>
+    </w:p>
+    <w:p>
+      <w:pPr>
+        <w:pStyle w:val="normal1"/>
+        <w:numPr>
+          <w:ilvl w:val="3"/>
+          <w:numId w:val="1"/>
+        </w:numPr>
+        <w:ind w:hanging="360" w:left="2880"/>
+        <w:rPr>
+          <w:color w:val="FF0000"/>
+        </w:rPr>
+      </w:pPr>
+      <w:r>
+        <w:rPr>
+          <w:color w:val="FF0000"/>
+        </w:rPr>
+        <w:t>Required</w:t>
+      </w:r>
+    </w:p>
+    <w:p>
+      <w:pPr>
+        <w:pStyle w:val="normal1"/>
+        <w:numPr>
+          <w:ilvl w:val="3"/>
+          <w:numId w:val="1"/>
+        </w:numPr>
+        <w:ind w:hanging="360" w:left="2880"/>
+        <w:rPr/>
+      </w:pPr>
+      <w:r>
+        <w:rPr/>
+        <w:t xml:space="preserve">ID of the </w:t>
+      </w:r>
+      <w:r>
+        <w:rPr/>
+        <w:t>Division</w:t>
+      </w:r>
+      <w:r>
+        <w:rPr/>
+        <w:t xml:space="preserve"> the </w:t>
+      </w:r>
+      <w:r>
+        <w:rPr/>
+        <w:t>PoolBrackets</w:t>
+      </w:r>
+      <w:r>
+        <w:rPr/>
+        <w:t xml:space="preserve"> belong to</w:t>
+      </w:r>
+    </w:p>
+    <w:p>
+      <w:pPr>
+        <w:pStyle w:val="normal1"/>
+        <w:numPr>
+          <w:ilvl w:val="2"/>
+          <w:numId w:val="1"/>
+        </w:numPr>
+        <w:ind w:hanging="360" w:left="2160"/>
+        <w:rPr/>
+      </w:pPr>
+      <w:r>
+        <w:rPr/>
+        <w:t>page={page_num}</w:t>
+      </w:r>
+    </w:p>
+    <w:p>
+      <w:pPr>
+        <w:pStyle w:val="normal1"/>
+        <w:numPr>
+          <w:ilvl w:val="3"/>
+          <w:numId w:val="1"/>
+        </w:numPr>
+        <w:ind w:hanging="360" w:left="2880"/>
+        <w:rPr>
+          <w:color w:val="FF0000"/>
+        </w:rPr>
+      </w:pPr>
+      <w:r>
+        <w:rPr>
+          <w:color w:val="FF0000"/>
+        </w:rPr>
+        <w:t>Required</w:t>
+      </w:r>
+    </w:p>
+    <w:p>
+      <w:pPr>
+        <w:pStyle w:val="normal1"/>
+        <w:numPr>
+          <w:ilvl w:val="3"/>
+          <w:numId w:val="1"/>
+        </w:numPr>
+        <w:ind w:hanging="360" w:left="2880"/>
+        <w:rPr/>
+      </w:pPr>
+      <w:r>
+        <w:rPr/>
+        <w:t>Defines which page to return</w:t>
+      </w:r>
+    </w:p>
+    <w:p>
+      <w:pPr>
+        <w:pStyle w:val="normal1"/>
+        <w:numPr>
+          <w:ilvl w:val="3"/>
+          <w:numId w:val="1"/>
+        </w:numPr>
+        <w:ind w:hanging="360" w:left="2880"/>
+        <w:rPr/>
+      </w:pPr>
+      <w:r>
+        <w:rPr/>
+        <w:t>First page = 0 (zero)</w:t>
+      </w:r>
+    </w:p>
+    <w:p>
+      <w:pPr>
+        <w:pStyle w:val="normal1"/>
+        <w:numPr>
+          <w:ilvl w:val="2"/>
+          <w:numId w:val="1"/>
+        </w:numPr>
+        <w:ind w:hanging="360" w:left="2160"/>
+        <w:rPr/>
+      </w:pPr>
+      <w:r>
+        <w:rPr/>
+        <w:t>page_size={num_of_rows}</w:t>
+      </w:r>
+    </w:p>
+    <w:p>
+      <w:pPr>
+        <w:pStyle w:val="normal1"/>
+        <w:numPr>
+          <w:ilvl w:val="3"/>
+          <w:numId w:val="1"/>
+        </w:numPr>
+        <w:ind w:hanging="360" w:left="2880"/>
+        <w:rPr>
+          <w:color w:val="FF0000"/>
+        </w:rPr>
+      </w:pPr>
+      <w:r>
+        <w:rPr>
+          <w:color w:val="FF0000"/>
+        </w:rPr>
+        <w:t>Required</w:t>
+      </w:r>
+    </w:p>
+    <w:p>
+      <w:pPr>
+        <w:pStyle w:val="normal1"/>
+        <w:numPr>
+          <w:ilvl w:val="3"/>
+          <w:numId w:val="1"/>
+        </w:numPr>
+        <w:ind w:hanging="360" w:left="2880"/>
+        <w:rPr/>
+      </w:pPr>
+      <w:r>
+        <w:rPr/>
+        <w:t>Defines how many rows to return for the selected page</w:t>
+      </w:r>
+    </w:p>
+    <w:p>
+      <w:pPr>
+        <w:pStyle w:val="normal1"/>
+        <w:numPr>
+          <w:ilvl w:val="1"/>
+          <w:numId w:val="1"/>
+        </w:numPr>
+        <w:ind w:hanging="360" w:left="1440"/>
+        <w:rPr/>
+      </w:pPr>
+      <w:r>
+        <w:rPr/>
+        <w:t xml:space="preserve">returns: </w:t>
+      </w:r>
+      <w:r>
+        <w:rPr>
+          <w:b w:val="false"/>
+          <w:bCs w:val="false"/>
+          <w:color w:val="000000"/>
+        </w:rPr>
+        <w:t>a list of PoolBrackets whose parent is the Division</w:t>
+      </w:r>
+    </w:p>
+    <w:p>
+      <w:pPr>
+        <w:pStyle w:val="normal1"/>
+        <w:widowControl/>
+        <w:suppressAutoHyphens w:val="true"/>
+        <w:bidi w:val="0"/>
+        <w:spacing w:lineRule="auto" w:line="276" w:before="0" w:after="0"/>
+        <w:ind w:hanging="360" w:left="360" w:right="0"/>
+        <w:jc w:val="left"/>
+        <w:rPr>
+          <w:b/>
+          <w:bCs/>
+        </w:rPr>
+      </w:pPr>
+      <w:r>
+        <w:rPr>
+          <w:b/>
+          <w:bCs/>
+          <w:color w:val="000000"/>
+        </w:rPr>
+      </w:r>
+    </w:p>
+    <w:p>
+      <w:pPr>
+        <w:pStyle w:val="normal1"/>
+        <w:widowControl/>
+        <w:suppressAutoHyphens w:val="true"/>
+        <w:bidi w:val="0"/>
+        <w:spacing w:lineRule="auto" w:line="276" w:before="0" w:after="0"/>
+        <w:ind w:hanging="360" w:left="360" w:right="0"/>
+        <w:jc w:val="left"/>
+        <w:rPr>
+          <w:b/>
+          <w:bCs/>
+        </w:rPr>
+      </w:pPr>
+      <w:r>
+        <w:rPr>
+          <w:b/>
+          <w:bCs/>
+          <w:color w:val="000000"/>
         </w:rPr>
       </w:r>
     </w:p>
@@ -42297,8 +42682,8 @@
       <w:u w:val="single"/>
     </w:rPr>
   </w:style>
-  <w:style w:type="character" w:styleId="Bullets">
-    <w:name w:val="Bullets"/>
+  <w:style w:type="character" w:styleId="Bulletsuser">
+    <w:name w:val="Bullets (user)"/>
     <w:qFormat/>
     <w:rPr>
       <w:rFonts w:ascii="OpenSymbol" w:hAnsi="OpenSymbol" w:eastAsia="OpenSymbol" w:cs="OpenSymbol"/>

</xml_diff>

<commit_message>
Moved 2 sections of QView v0.1.0.0 help center docs to the backend so that they are served from the backend only to authorized users. Using signed links for those docs images (using rust-embed crate). 9 new tests for the new 'help-docs' module. Updated the API docs for the newly-added endpoints. Updated the 'hel-center-docs' Claude skill to include docs served from the backend and what to do with them.
</commit_message>
<xml_diff>
--- a/docs/QView API Documentation.docx
+++ b/docs/QView API Documentation.docx
@@ -10,7 +10,7 @@
       </w:pPr>
       <w:r>
         <w:rPr/>
-        <w:t>QView API Documentation (v181_2026.10.26)</w:t>
+        <w:t>QView API Documentation (v182_2026.10.26)</w:t>
       </w:r>
     </w:p>
     <w:p>
@@ -17694,6 +17694,712 @@
       <w:r>
         <w:rPr/>
         <w:t>a 200 OK response only</w:t>
+      </w:r>
+    </w:p>
+    <w:p>
+      <w:pPr>
+        <w:pStyle w:val="normal1"/>
+        <w:widowControl/>
+        <w:suppressAutoHyphens w:val="true"/>
+        <w:bidi w:val="0"/>
+        <w:spacing w:lineRule="auto" w:line="276" w:before="0" w:after="0"/>
+        <w:ind w:hanging="360" w:left="360" w:right="0"/>
+        <w:jc w:val="left"/>
+        <w:rPr>
+          <w:color w:val="000000"/>
+        </w:rPr>
+      </w:pPr>
+      <w:r>
+        <w:rPr>
+          <w:color w:val="000000"/>
+        </w:rPr>
+      </w:r>
+    </w:p>
+    <w:p>
+      <w:pPr>
+        <w:pStyle w:val="normal1"/>
+        <w:widowControl/>
+        <w:suppressAutoHyphens w:val="true"/>
+        <w:bidi w:val="0"/>
+        <w:spacing w:lineRule="auto" w:line="276" w:before="0" w:after="0"/>
+        <w:ind w:hanging="360" w:left="360" w:right="0"/>
+        <w:jc w:val="left"/>
+        <w:rPr>
+          <w:color w:val="000000"/>
+        </w:rPr>
+      </w:pPr>
+      <w:r>
+        <w:rPr>
+          <w:color w:val="000000"/>
+        </w:rPr>
+      </w:r>
+    </w:p>
+    <w:p>
+      <w:pPr>
+        <w:pStyle w:val="normal1"/>
+        <w:widowControl/>
+        <w:suppressAutoHyphens w:val="true"/>
+        <w:bidi w:val="0"/>
+        <w:spacing w:lineRule="auto" w:line="276" w:before="0" w:after="0"/>
+        <w:ind w:hanging="360" w:left="360" w:right="0"/>
+        <w:jc w:val="left"/>
+        <w:rPr>
+          <w:b/>
+          <w:bCs/>
+        </w:rPr>
+      </w:pPr>
+      <w:r>
+        <w:rPr>
+          <w:b/>
+          <w:bCs/>
+        </w:rPr>
+        <w:t>Help Docs</w:t>
+      </w:r>
+    </w:p>
+    <w:p>
+      <w:pPr>
+        <w:pStyle w:val="normal1"/>
+        <w:numPr>
+          <w:ilvl w:val="0"/>
+          <w:numId w:val="1"/>
+        </w:numPr>
+        <w:ind w:hanging="360" w:left="720"/>
+        <w:rPr/>
+      </w:pPr>
+      <w:r>
+        <w:rPr/>
+        <w:t>GET Members-Only Help Article (by slug)</w:t>
+      </w:r>
+    </w:p>
+    <w:p>
+      <w:pPr>
+        <w:pStyle w:val="normal1"/>
+        <w:numPr>
+          <w:ilvl w:val="1"/>
+          <w:numId w:val="1"/>
+        </w:numPr>
+        <w:ind w:hanging="360" w:left="1440"/>
+        <w:rPr/>
+      </w:pPr>
+      <w:r>
+        <w:rPr/>
+        <w:t xml:space="preserve">built_including_tests: </w:t>
+      </w:r>
+      <w:r>
+        <w:rPr>
+          <w:b/>
+          <w:bCs/>
+        </w:rPr>
+        <w:t>true</w:t>
+      </w:r>
+    </w:p>
+    <w:p>
+      <w:pPr>
+        <w:pStyle w:val="normal1"/>
+        <w:numPr>
+          <w:ilvl w:val="1"/>
+          <w:numId w:val="1"/>
+        </w:numPr>
+        <w:ind w:hanging="360" w:left="1440"/>
+        <w:rPr/>
+      </w:pPr>
+      <w:r>
+        <w:rPr/>
+        <w:t>HTTP method: ‘GET’</w:t>
+      </w:r>
+    </w:p>
+    <w:p>
+      <w:pPr>
+        <w:pStyle w:val="normal1"/>
+        <w:numPr>
+          <w:ilvl w:val="1"/>
+          <w:numId w:val="1"/>
+        </w:numPr>
+        <w:ind w:hanging="360" w:left="1440"/>
+        <w:rPr/>
+      </w:pPr>
+      <w:r>
+        <w:rPr/>
+        <w:t>endpoint: {base_uri}/api/helpdocs/{category}/{version}/{slug}</w:t>
+      </w:r>
+    </w:p>
+    <w:p>
+      <w:pPr>
+        <w:pStyle w:val="normal1"/>
+        <w:numPr>
+          <w:ilvl w:val="1"/>
+          <w:numId w:val="1"/>
+        </w:numPr>
+        <w:ind w:hanging="360" w:left="1440"/>
+        <w:rPr/>
+      </w:pPr>
+      <w:r>
+        <w:rPr/>
+        <w:t>description: Requires a logged-in user (any; no particular permission), else 401. Serves the Help Center articles in backend/help-docs/ that are left out of the frontend bundle; screenshot links in the HTML are rewritten into signed, expiring links to the image endpoint below.</w:t>
+      </w:r>
+    </w:p>
+    <w:p>
+      <w:pPr>
+        <w:pStyle w:val="normal1"/>
+        <w:numPr>
+          <w:ilvl w:val="1"/>
+          <w:numId w:val="1"/>
+        </w:numPr>
+        <w:ind w:hanging="360" w:left="1440"/>
+        <w:rPr/>
+      </w:pPr>
+      <w:r>
+        <w:rPr/>
+        <w:t>parameters:</w:t>
+      </w:r>
+    </w:p>
+    <w:p>
+      <w:pPr>
+        <w:pStyle w:val="normal1"/>
+        <w:numPr>
+          <w:ilvl w:val="2"/>
+          <w:numId w:val="1"/>
+        </w:numPr>
+        <w:ind w:hanging="360" w:left="2160"/>
+        <w:rPr/>
+      </w:pPr>
+      <w:r>
+        <w:rPr/>
+        <w:t>category</w:t>
+      </w:r>
+    </w:p>
+    <w:p>
+      <w:pPr>
+        <w:pStyle w:val="normal1"/>
+        <w:numPr>
+          <w:ilvl w:val="3"/>
+          <w:numId w:val="1"/>
+        </w:numPr>
+        <w:ind w:hanging="360" w:left="2880"/>
+        <w:rPr>
+          <w:color w:val="FF0000"/>
+        </w:rPr>
+      </w:pPr>
+      <w:r>
+        <w:rPr>
+          <w:color w:val="FF0000"/>
+        </w:rPr>
+        <w:t>Required</w:t>
+      </w:r>
+    </w:p>
+    <w:p>
+      <w:pPr>
+        <w:pStyle w:val="normal1"/>
+        <w:numPr>
+          <w:ilvl w:val="3"/>
+          <w:numId w:val="1"/>
+        </w:numPr>
+        <w:ind w:hanging="360" w:left="2880"/>
+        <w:rPr/>
+      </w:pPr>
+      <w:r>
+        <w:rPr/>
+        <w:t>Help Center category, e.g. qview</w:t>
+      </w:r>
+    </w:p>
+    <w:p>
+      <w:pPr>
+        <w:pStyle w:val="normal1"/>
+        <w:numPr>
+          <w:ilvl w:val="2"/>
+          <w:numId w:val="1"/>
+        </w:numPr>
+        <w:ind w:hanging="360" w:left="2160"/>
+        <w:rPr/>
+      </w:pPr>
+      <w:r>
+        <w:rPr/>
+        <w:t>version</w:t>
+      </w:r>
+    </w:p>
+    <w:p>
+      <w:pPr>
+        <w:pStyle w:val="normal1"/>
+        <w:numPr>
+          <w:ilvl w:val="3"/>
+          <w:numId w:val="1"/>
+        </w:numPr>
+        <w:ind w:hanging="360" w:left="2880"/>
+        <w:rPr>
+          <w:color w:val="FF0000"/>
+        </w:rPr>
+      </w:pPr>
+      <w:r>
+        <w:rPr>
+          <w:color w:val="FF0000"/>
+        </w:rPr>
+        <w:t>Required</w:t>
+      </w:r>
+    </w:p>
+    <w:p>
+      <w:pPr>
+        <w:pStyle w:val="normal1"/>
+        <w:numPr>
+          <w:ilvl w:val="3"/>
+          <w:numId w:val="1"/>
+        </w:numPr>
+        <w:ind w:hanging="360" w:left="2880"/>
+        <w:rPr/>
+      </w:pPr>
+      <w:r>
+        <w:rPr/>
+        <w:t>Manual version, e.g. 0.1.0.0</w:t>
+      </w:r>
+    </w:p>
+    <w:p>
+      <w:pPr>
+        <w:pStyle w:val="normal1"/>
+        <w:numPr>
+          <w:ilvl w:val="2"/>
+          <w:numId w:val="1"/>
+        </w:numPr>
+        <w:ind w:hanging="360" w:left="2160"/>
+        <w:rPr/>
+      </w:pPr>
+      <w:r>
+        <w:rPr/>
+        <w:t>slug</w:t>
+      </w:r>
+    </w:p>
+    <w:p>
+      <w:pPr>
+        <w:pStyle w:val="normal1"/>
+        <w:numPr>
+          <w:ilvl w:val="3"/>
+          <w:numId w:val="1"/>
+        </w:numPr>
+        <w:ind w:hanging="360" w:left="2880"/>
+        <w:rPr>
+          <w:color w:val="FF0000"/>
+        </w:rPr>
+      </w:pPr>
+      <w:r>
+        <w:rPr>
+          <w:color w:val="FF0000"/>
+        </w:rPr>
+        <w:t>Required</w:t>
+      </w:r>
+    </w:p>
+    <w:p>
+      <w:pPr>
+        <w:pStyle w:val="normal1"/>
+        <w:numPr>
+          <w:ilvl w:val="3"/>
+          <w:numId w:val="1"/>
+        </w:numPr>
+        <w:ind w:hanging="360" w:left="2880"/>
+        <w:rPr/>
+      </w:pPr>
+      <w:r>
+        <w:rPr/>
+        <w:t>Slug of the article, e.g. monitoring-rooms</w:t>
+      </w:r>
+    </w:p>
+    <w:p>
+      <w:pPr>
+        <w:pStyle w:val="normal1"/>
+        <w:numPr>
+          <w:ilvl w:val="1"/>
+          <w:numId w:val="1"/>
+        </w:numPr>
+        <w:ind w:hanging="360" w:left="1440"/>
+        <w:rPr/>
+      </w:pPr>
+      <w:r>
+        <w:rPr/>
+        <w:t>returns:</w:t>
+      </w:r>
+    </w:p>
+    <w:p>
+      <w:pPr>
+        <w:pStyle w:val="normal1"/>
+        <w:numPr>
+          <w:ilvl w:val="2"/>
+          <w:numId w:val="1"/>
+        </w:numPr>
+        <w:ind w:hanging="360" w:left="2160"/>
+        <w:rPr/>
+      </w:pPr>
+      <w:r>
+        <w:rPr/>
+        <w:t>a single HelpDocResponse { html } (404 if the article doesn’t exist)</w:t>
+      </w:r>
+    </w:p>
+    <w:p>
+      <w:pPr>
+        <w:pStyle w:val="normal1"/>
+        <w:numPr>
+          <w:ilvl w:val="0"/>
+          <w:numId w:val="1"/>
+        </w:numPr>
+        <w:ind w:hanging="360" w:left="720"/>
+        <w:rPr/>
+      </w:pPr>
+      <w:r>
+        <w:rPr/>
+        <w:t>GET Members-Only Help Article Image (by signed link)</w:t>
+      </w:r>
+    </w:p>
+    <w:p>
+      <w:pPr>
+        <w:pStyle w:val="normal1"/>
+        <w:numPr>
+          <w:ilvl w:val="1"/>
+          <w:numId w:val="1"/>
+        </w:numPr>
+        <w:ind w:hanging="360" w:left="1440"/>
+        <w:rPr/>
+      </w:pPr>
+      <w:r>
+        <w:rPr/>
+        <w:t xml:space="preserve">built_including_tests: </w:t>
+      </w:r>
+      <w:r>
+        <w:rPr>
+          <w:b/>
+          <w:bCs/>
+        </w:rPr>
+        <w:t>true</w:t>
+      </w:r>
+    </w:p>
+    <w:p>
+      <w:pPr>
+        <w:pStyle w:val="normal1"/>
+        <w:numPr>
+          <w:ilvl w:val="1"/>
+          <w:numId w:val="1"/>
+        </w:numPr>
+        <w:ind w:hanging="360" w:left="1440"/>
+        <w:rPr/>
+      </w:pPr>
+      <w:r>
+        <w:rPr/>
+        <w:t>HTTP method: ‘GET’</w:t>
+      </w:r>
+    </w:p>
+    <w:p>
+      <w:pPr>
+        <w:pStyle w:val="normal1"/>
+        <w:numPr>
+          <w:ilvl w:val="1"/>
+          <w:numId w:val="1"/>
+        </w:numPr>
+        <w:ind w:hanging="360" w:left="1440"/>
+        <w:rPr/>
+      </w:pPr>
+      <w:r>
+        <w:rPr/>
+        <w:t>endpoint: {base_uri}/api/helpdocs/{category}/{version}/images/{file}?exp={expiry}&amp;sig={signature}</w:t>
+      </w:r>
+    </w:p>
+    <w:p>
+      <w:pPr>
+        <w:pStyle w:val="normal1"/>
+        <w:numPr>
+          <w:ilvl w:val="1"/>
+          <w:numId w:val="1"/>
+        </w:numPr>
+        <w:ind w:hanging="360" w:left="1440"/>
+        <w:rPr/>
+      </w:pPr>
+      <w:r>
+        <w:rPr/>
+        <w:t>description: A screenshot from a members-only article. Needs no access token: the signed link from the article response is the authorization (403 if it was altered or has expired). Clients don’t build these links; use the ones in the article HTML.</w:t>
+      </w:r>
+    </w:p>
+    <w:p>
+      <w:pPr>
+        <w:pStyle w:val="normal1"/>
+        <w:numPr>
+          <w:ilvl w:val="1"/>
+          <w:numId w:val="1"/>
+        </w:numPr>
+        <w:ind w:hanging="360" w:left="1440"/>
+        <w:rPr/>
+      </w:pPr>
+      <w:r>
+        <w:rPr/>
+        <w:t>parameters:</w:t>
+      </w:r>
+    </w:p>
+    <w:p>
+      <w:pPr>
+        <w:pStyle w:val="normal1"/>
+        <w:numPr>
+          <w:ilvl w:val="2"/>
+          <w:numId w:val="1"/>
+        </w:numPr>
+        <w:ind w:hanging="360" w:left="2160"/>
+        <w:rPr/>
+      </w:pPr>
+      <w:r>
+        <w:rPr/>
+        <w:t>category</w:t>
+      </w:r>
+    </w:p>
+    <w:p>
+      <w:pPr>
+        <w:pStyle w:val="normal1"/>
+        <w:numPr>
+          <w:ilvl w:val="3"/>
+          <w:numId w:val="1"/>
+        </w:numPr>
+        <w:ind w:hanging="360" w:left="2880"/>
+        <w:rPr>
+          <w:color w:val="FF0000"/>
+        </w:rPr>
+      </w:pPr>
+      <w:r>
+        <w:rPr>
+          <w:color w:val="FF0000"/>
+        </w:rPr>
+        <w:t>Required</w:t>
+      </w:r>
+    </w:p>
+    <w:p>
+      <w:pPr>
+        <w:pStyle w:val="normal1"/>
+        <w:numPr>
+          <w:ilvl w:val="3"/>
+          <w:numId w:val="1"/>
+        </w:numPr>
+        <w:ind w:hanging="360" w:left="2880"/>
+        <w:rPr/>
+      </w:pPr>
+      <w:r>
+        <w:rPr/>
+        <w:t>Help Center category, e.g. qview</w:t>
+      </w:r>
+    </w:p>
+    <w:p>
+      <w:pPr>
+        <w:pStyle w:val="normal1"/>
+        <w:numPr>
+          <w:ilvl w:val="2"/>
+          <w:numId w:val="1"/>
+        </w:numPr>
+        <w:ind w:hanging="360" w:left="2160"/>
+        <w:rPr/>
+      </w:pPr>
+      <w:r>
+        <w:rPr/>
+        <w:t>version</w:t>
+      </w:r>
+    </w:p>
+    <w:p>
+      <w:pPr>
+        <w:pStyle w:val="normal1"/>
+        <w:numPr>
+          <w:ilvl w:val="3"/>
+          <w:numId w:val="1"/>
+        </w:numPr>
+        <w:ind w:hanging="360" w:left="2880"/>
+        <w:rPr>
+          <w:color w:val="FF0000"/>
+        </w:rPr>
+      </w:pPr>
+      <w:r>
+        <w:rPr>
+          <w:color w:val="FF0000"/>
+        </w:rPr>
+        <w:t>Required</w:t>
+      </w:r>
+    </w:p>
+    <w:p>
+      <w:pPr>
+        <w:pStyle w:val="normal1"/>
+        <w:numPr>
+          <w:ilvl w:val="3"/>
+          <w:numId w:val="1"/>
+        </w:numPr>
+        <w:ind w:hanging="360" w:left="2880"/>
+        <w:rPr/>
+      </w:pPr>
+      <w:r>
+        <w:rPr/>
+        <w:t>Manual version, e.g. 0.1.0.0</w:t>
+      </w:r>
+    </w:p>
+    <w:p>
+      <w:pPr>
+        <w:pStyle w:val="normal1"/>
+        <w:numPr>
+          <w:ilvl w:val="2"/>
+          <w:numId w:val="1"/>
+        </w:numPr>
+        <w:ind w:hanging="360" w:left="2160"/>
+        <w:rPr/>
+      </w:pPr>
+      <w:r>
+        <w:rPr/>
+        <w:t>file</w:t>
+      </w:r>
+    </w:p>
+    <w:p>
+      <w:pPr>
+        <w:pStyle w:val="normal1"/>
+        <w:numPr>
+          <w:ilvl w:val="3"/>
+          <w:numId w:val="1"/>
+        </w:numPr>
+        <w:ind w:hanging="360" w:left="2880"/>
+        <w:rPr>
+          <w:color w:val="FF0000"/>
+        </w:rPr>
+      </w:pPr>
+      <w:r>
+        <w:rPr>
+          <w:color w:val="FF0000"/>
+        </w:rPr>
+        <w:t>Required</w:t>
+      </w:r>
+    </w:p>
+    <w:p>
+      <w:pPr>
+        <w:pStyle w:val="normal1"/>
+        <w:numPr>
+          <w:ilvl w:val="3"/>
+          <w:numId w:val="1"/>
+        </w:numPr>
+        <w:ind w:hanging="360" w:left="2880"/>
+        <w:rPr/>
+      </w:pPr>
+      <w:r>
+        <w:rPr/>
+        <w:t>Image file name, e.g. monitoring-rooms-2.webp</w:t>
+      </w:r>
+    </w:p>
+    <w:p>
+      <w:pPr>
+        <w:pStyle w:val="normal1"/>
+        <w:numPr>
+          <w:ilvl w:val="2"/>
+          <w:numId w:val="1"/>
+        </w:numPr>
+        <w:ind w:hanging="360" w:left="2160"/>
+        <w:rPr/>
+      </w:pPr>
+      <w:r>
+        <w:rPr/>
+        <w:t>exp={expiry}</w:t>
+      </w:r>
+    </w:p>
+    <w:p>
+      <w:pPr>
+        <w:pStyle w:val="normal1"/>
+        <w:numPr>
+          <w:ilvl w:val="3"/>
+          <w:numId w:val="1"/>
+        </w:numPr>
+        <w:ind w:hanging="360" w:left="2880"/>
+        <w:rPr>
+          <w:color w:val="FF0000"/>
+        </w:rPr>
+      </w:pPr>
+      <w:r>
+        <w:rPr>
+          <w:color w:val="FF0000"/>
+        </w:rPr>
+        <w:t>Required</w:t>
+      </w:r>
+    </w:p>
+    <w:p>
+      <w:pPr>
+        <w:pStyle w:val="normal1"/>
+        <w:numPr>
+          <w:ilvl w:val="3"/>
+          <w:numId w:val="1"/>
+        </w:numPr>
+        <w:ind w:hanging="360" w:left="2880"/>
+        <w:rPr/>
+      </w:pPr>
+      <w:r>
+        <w:rPr/>
+        <w:t>Unix time the link expires, as issued in the article HTML</w:t>
+      </w:r>
+    </w:p>
+    <w:p>
+      <w:pPr>
+        <w:pStyle w:val="normal1"/>
+        <w:numPr>
+          <w:ilvl w:val="2"/>
+          <w:numId w:val="1"/>
+        </w:numPr>
+        <w:ind w:hanging="360" w:left="2160"/>
+        <w:rPr/>
+      </w:pPr>
+      <w:r>
+        <w:rPr/>
+        <w:t>sig={signature}</w:t>
+      </w:r>
+    </w:p>
+    <w:p>
+      <w:pPr>
+        <w:pStyle w:val="normal1"/>
+        <w:numPr>
+          <w:ilvl w:val="3"/>
+          <w:numId w:val="1"/>
+        </w:numPr>
+        <w:ind w:hanging="360" w:left="2880"/>
+        <w:rPr>
+          <w:color w:val="FF0000"/>
+        </w:rPr>
+      </w:pPr>
+      <w:r>
+        <w:rPr>
+          <w:color w:val="FF0000"/>
+        </w:rPr>
+        <w:t>Required</w:t>
+      </w:r>
+    </w:p>
+    <w:p>
+      <w:pPr>
+        <w:pStyle w:val="normal1"/>
+        <w:numPr>
+          <w:ilvl w:val="3"/>
+          <w:numId w:val="1"/>
+        </w:numPr>
+        <w:ind w:hanging="360" w:left="2880"/>
+        <w:rPr/>
+      </w:pPr>
+      <w:r>
+        <w:rPr/>
+        <w:t>Signature of the image path and expiry, as issued in the article HTML</w:t>
+      </w:r>
+    </w:p>
+    <w:p>
+      <w:pPr>
+        <w:pStyle w:val="normal1"/>
+        <w:numPr>
+          <w:ilvl w:val="1"/>
+          <w:numId w:val="1"/>
+        </w:numPr>
+        <w:ind w:hanging="360" w:left="1440"/>
+        <w:rPr/>
+      </w:pPr>
+      <w:r>
+        <w:rPr/>
+        <w:t>returns:</w:t>
+      </w:r>
+    </w:p>
+    <w:p>
+      <w:pPr>
+        <w:pStyle w:val="normal1"/>
+        <w:numPr>
+          <w:ilvl w:val="2"/>
+          <w:numId w:val="1"/>
+        </w:numPr>
+        <w:ind w:hanging="360" w:left="2160"/>
+        <w:rPr/>
+      </w:pPr>
+      <w:r>
+        <w:rPr/>
+        <w:t>the image bytes, with its image/* Content-Type</w:t>
       </w:r>
     </w:p>
     <w:p>

</xml_diff>

<commit_message>
Removed Sessions from the domain model, from FE and BE. Eliminated Advanced Mode for scheduling. Updated the API docs to remove deleted endpoints. Updated the Help Center docs. Added integraiton tests for the removed cleanup behvaior of two modified endpoints. Other related changes.
</commit_message>
<xml_diff>
--- a/docs/QView API Documentation.docx
+++ b/docs/QView API Documentation.docx
@@ -10,7 +10,7 @@
       </w:pPr>
       <w:r>
         <w:rPr/>
-        <w:t>QView API Documentation (v182_2026.10.26)</w:t>
+        <w:t>QView API Documentation (v183_2026.10.27)</w:t>
       </w:r>
     </w:p>
     <w:p>
@@ -15577,256 +15577,6 @@
       </w:pPr>
       <w:r>
         <w:rPr/>
-        <w:t>GET Game Rows of RoundGroup</w:t>
-      </w:r>
-    </w:p>
-    <w:p>
-      <w:pPr>
-        <w:pStyle w:val="normal1"/>
-        <w:numPr>
-          <w:ilvl w:val="1"/>
-          <w:numId w:val="1"/>
-        </w:numPr>
-        <w:ind w:hanging="360" w:left="1440"/>
-        <w:rPr/>
-      </w:pPr>
-      <w:r>
-        <w:rPr/>
-        <w:t xml:space="preserve">built_including_tests: </w:t>
-      </w:r>
-      <w:r>
-        <w:rPr>
-          <w:b/>
-          <w:bCs/>
-        </w:rPr>
-        <w:t>true</w:t>
-      </w:r>
-    </w:p>
-    <w:p>
-      <w:pPr>
-        <w:pStyle w:val="normal1"/>
-        <w:numPr>
-          <w:ilvl w:val="1"/>
-          <w:numId w:val="1"/>
-        </w:numPr>
-        <w:ind w:hanging="360" w:left="1440"/>
-        <w:rPr/>
-      </w:pPr>
-      <w:r>
-        <w:rPr/>
-        <w:t>HTTP method: ‘GET’</w:t>
-      </w:r>
-    </w:p>
-    <w:p>
-      <w:pPr>
-        <w:pStyle w:val="normal1"/>
-        <w:numPr>
-          <w:ilvl w:val="1"/>
-          <w:numId w:val="1"/>
-        </w:numPr>
-        <w:ind w:hanging="360" w:left="1440"/>
-        <w:rPr/>
-      </w:pPr>
-      <w:r>
-        <w:rPr/>
-        <w:t>endpoint: {base_uri}/api/roundgroups/{id}/game-rows?page={page_num}&amp;page_size={num_of_rows}</w:t>
-      </w:r>
-    </w:p>
-    <w:p>
-      <w:pPr>
-        <w:pStyle w:val="normal1"/>
-        <w:numPr>
-          <w:ilvl w:val="1"/>
-          <w:numId w:val="1"/>
-        </w:numPr>
-        <w:ind w:hanging="360" w:left="1440"/>
-        <w:rPr/>
-      </w:pPr>
-      <w:r>
-        <w:rPr/>
-        <w:t xml:space="preserve">description: </w:t>
-      </w:r>
-    </w:p>
-    <w:p>
-      <w:pPr>
-        <w:pStyle w:val="normal1"/>
-        <w:widowControl/>
-        <w:numPr>
-          <w:ilvl w:val="2"/>
-          <w:numId w:val="1"/>
-        </w:numPr>
-        <w:suppressAutoHyphens w:val="true"/>
-        <w:bidi w:val="0"/>
-        <w:spacing w:lineRule="auto" w:line="276" w:before="0" w:after="0"/>
-        <w:ind w:hanging="360" w:left="2160" w:right="0"/>
-        <w:jc w:val="left"/>
-        <w:rPr/>
-      </w:pPr>
-      <w:r>
-        <w:rPr/>
-        <w:t>Designed so that a single API call could be made for use by the Games UI data table when scoped to the RoundGroup profile.</w:t>
-      </w:r>
-    </w:p>
-    <w:p>
-      <w:pPr>
-        <w:pStyle w:val="normal1"/>
-        <w:numPr>
-          <w:ilvl w:val="1"/>
-          <w:numId w:val="1"/>
-        </w:numPr>
-        <w:ind w:hanging="360" w:left="1440"/>
-        <w:rPr/>
-      </w:pPr>
-      <w:r>
-        <w:rPr/>
-        <w:t xml:space="preserve">parameters: </w:t>
-      </w:r>
-    </w:p>
-    <w:p>
-      <w:pPr>
-        <w:pStyle w:val="normal1"/>
-        <w:numPr>
-          <w:ilvl w:val="2"/>
-          <w:numId w:val="1"/>
-        </w:numPr>
-        <w:ind w:hanging="360" w:left="2160"/>
-        <w:rPr/>
-      </w:pPr>
-      <w:r>
-        <w:rPr/>
-        <w:t>page={page_num}</w:t>
-      </w:r>
-    </w:p>
-    <w:p>
-      <w:pPr>
-        <w:pStyle w:val="normal1"/>
-        <w:numPr>
-          <w:ilvl w:val="3"/>
-          <w:numId w:val="1"/>
-        </w:numPr>
-        <w:ind w:hanging="360" w:left="2880"/>
-        <w:rPr>
-          <w:color w:val="FF0000"/>
-        </w:rPr>
-      </w:pPr>
-      <w:r>
-        <w:rPr>
-          <w:color w:val="FF0000"/>
-        </w:rPr>
-        <w:t>Required</w:t>
-      </w:r>
-    </w:p>
-    <w:p>
-      <w:pPr>
-        <w:pStyle w:val="normal1"/>
-        <w:numPr>
-          <w:ilvl w:val="3"/>
-          <w:numId w:val="1"/>
-        </w:numPr>
-        <w:ind w:hanging="360" w:left="2880"/>
-        <w:rPr/>
-      </w:pPr>
-      <w:r>
-        <w:rPr/>
-        <w:t>Defines which page to return</w:t>
-      </w:r>
-    </w:p>
-    <w:p>
-      <w:pPr>
-        <w:pStyle w:val="normal1"/>
-        <w:numPr>
-          <w:ilvl w:val="3"/>
-          <w:numId w:val="1"/>
-        </w:numPr>
-        <w:ind w:hanging="360" w:left="2880"/>
-        <w:rPr/>
-      </w:pPr>
-      <w:r>
-        <w:rPr/>
-        <w:t>First page = 0 (zero)</w:t>
-      </w:r>
-    </w:p>
-    <w:p>
-      <w:pPr>
-        <w:pStyle w:val="normal1"/>
-        <w:numPr>
-          <w:ilvl w:val="2"/>
-          <w:numId w:val="1"/>
-        </w:numPr>
-        <w:ind w:hanging="360" w:left="2160"/>
-        <w:rPr/>
-      </w:pPr>
-      <w:r>
-        <w:rPr/>
-        <w:t>page_size={num_of_rows}</w:t>
-      </w:r>
-    </w:p>
-    <w:p>
-      <w:pPr>
-        <w:pStyle w:val="normal1"/>
-        <w:numPr>
-          <w:ilvl w:val="3"/>
-          <w:numId w:val="1"/>
-        </w:numPr>
-        <w:ind w:hanging="360" w:left="2880"/>
-        <w:rPr>
-          <w:color w:val="FF0000"/>
-        </w:rPr>
-      </w:pPr>
-      <w:r>
-        <w:rPr>
-          <w:color w:val="FF0000"/>
-        </w:rPr>
-        <w:t>Required</w:t>
-      </w:r>
-    </w:p>
-    <w:p>
-      <w:pPr>
-        <w:pStyle w:val="normal1"/>
-        <w:numPr>
-          <w:ilvl w:val="3"/>
-          <w:numId w:val="1"/>
-        </w:numPr>
-        <w:ind w:hanging="360" w:left="2880"/>
-        <w:rPr/>
-      </w:pPr>
-      <w:r>
-        <w:rPr/>
-        <w:t>Defines how many rows to return for the selected page</w:t>
-      </w:r>
-    </w:p>
-    <w:p>
-      <w:pPr>
-        <w:pStyle w:val="normal1"/>
-        <w:widowControl/>
-        <w:numPr>
-          <w:ilvl w:val="2"/>
-          <w:numId w:val="1"/>
-        </w:numPr>
-        <w:suppressAutoHyphens w:val="true"/>
-        <w:bidi w:val="0"/>
-        <w:spacing w:lineRule="auto" w:line="276" w:before="0" w:after="0"/>
-        <w:ind w:hanging="360" w:left="2160" w:right="0"/>
-        <w:jc w:val="left"/>
-        <w:rPr/>
-      </w:pPr>
-      <w:r>
-        <w:rPr/>
-        <w:t>returns:</w:t>
-      </w:r>
-    </w:p>
-    <w:p>
-      <w:pPr>
-        <w:pStyle w:val="normal1"/>
-        <w:numPr>
-          <w:ilvl w:val="0"/>
-          <w:numId w:val="1"/>
-        </w:numPr>
-        <w:ind w:hanging="360" w:left="720"/>
-        <w:rPr/>
-      </w:pPr>
-      <w:r>
-        <w:rPr/>
         <w:t>GET Game Rows of PoolBrackets</w:t>
       </w:r>
     </w:p>
@@ -39585,7 +39335,7 @@
       </w:pPr>
       <w:r>
         <w:rPr/>
-        <w:t>GET Rounds of RoundGroup</w:t>
+        <w:t>POST/Create Round</w:t>
       </w:r>
     </w:p>
     <w:p>
@@ -39607,37 +39357,37 @@
           <w:b/>
           <w:bCs/>
         </w:rPr>
-        <w:t>false</w:t>
-      </w:r>
-    </w:p>
-    <w:p>
-      <w:pPr>
-        <w:pStyle w:val="normal1"/>
-        <w:numPr>
-          <w:ilvl w:val="1"/>
-          <w:numId w:val="1"/>
-        </w:numPr>
-        <w:ind w:hanging="360" w:left="1440"/>
-        <w:rPr/>
-      </w:pPr>
-      <w:r>
-        <w:rPr/>
-        <w:t>HTTP method: ‘GET’</w:t>
-      </w:r>
-    </w:p>
-    <w:p>
-      <w:pPr>
-        <w:pStyle w:val="normal1"/>
-        <w:numPr>
-          <w:ilvl w:val="1"/>
-          <w:numId w:val="1"/>
-        </w:numPr>
-        <w:ind w:hanging="360" w:left="1440"/>
-        <w:rPr/>
-      </w:pPr>
-      <w:r>
-        <w:rPr/>
-        <w:t>endpoint: {base_uri}/api/roundgroups/{id}/rounds?page={page_num}&amp;page_size={num_of_rows}</w:t>
+        <w:t>true</w:t>
+      </w:r>
+    </w:p>
+    <w:p>
+      <w:pPr>
+        <w:pStyle w:val="normal1"/>
+        <w:numPr>
+          <w:ilvl w:val="1"/>
+          <w:numId w:val="1"/>
+        </w:numPr>
+        <w:ind w:hanging="360" w:left="1440"/>
+        <w:rPr/>
+      </w:pPr>
+      <w:r>
+        <w:rPr/>
+        <w:t>HTTP method: ‘POST’</w:t>
+      </w:r>
+    </w:p>
+    <w:p>
+      <w:pPr>
+        <w:pStyle w:val="normal1"/>
+        <w:numPr>
+          <w:ilvl w:val="1"/>
+          <w:numId w:val="1"/>
+        </w:numPr>
+        <w:ind w:hanging="360" w:left="1440"/>
+        <w:rPr/>
+      </w:pPr>
+      <w:r>
+        <w:rPr/>
+        <w:t>endpoint: {base_uri}/api/rounds</w:t>
       </w:r>
     </w:p>
     <w:p>
@@ -39667,184 +39417,7 @@
       </w:pPr>
       <w:r>
         <w:rPr/>
-        <w:t>parameters:</w:t>
-      </w:r>
-    </w:p>
-    <w:p>
-      <w:pPr>
-        <w:pStyle w:val="normal1"/>
-        <w:numPr>
-          <w:ilvl w:val="2"/>
-          <w:numId w:val="1"/>
-        </w:numPr>
-        <w:ind w:hanging="360" w:left="2160"/>
-        <w:rPr/>
-      </w:pPr>
-      <w:r>
-        <w:rPr/>
-        <w:t>id</w:t>
-      </w:r>
-    </w:p>
-    <w:p>
-      <w:pPr>
-        <w:pStyle w:val="normal1"/>
-        <w:numPr>
-          <w:ilvl w:val="3"/>
-          <w:numId w:val="1"/>
-        </w:numPr>
-        <w:ind w:hanging="360" w:left="2880"/>
-        <w:rPr>
-          <w:color w:val="FF0000"/>
-        </w:rPr>
-      </w:pPr>
-      <w:r>
-        <w:rPr>
-          <w:color w:val="FF0000"/>
-        </w:rPr>
-        <w:t>Required</w:t>
-      </w:r>
-    </w:p>
-    <w:p>
-      <w:pPr>
-        <w:pStyle w:val="normal1"/>
-        <w:numPr>
-          <w:ilvl w:val="3"/>
-          <w:numId w:val="1"/>
-        </w:numPr>
-        <w:ind w:hanging="360" w:left="2880"/>
-        <w:rPr/>
-      </w:pPr>
-      <w:r>
-        <w:rPr/>
-        <w:t>ID of the RoundGroup</w:t>
-      </w:r>
-    </w:p>
-    <w:p>
-      <w:pPr>
-        <w:pStyle w:val="normal1"/>
-        <w:numPr>
-          <w:ilvl w:val="2"/>
-          <w:numId w:val="1"/>
-        </w:numPr>
-        <w:ind w:hanging="360" w:left="2160"/>
-        <w:rPr/>
-      </w:pPr>
-      <w:r>
-        <w:rPr/>
-        <w:t>page={page_num}</w:t>
-      </w:r>
-    </w:p>
-    <w:p>
-      <w:pPr>
-        <w:pStyle w:val="normal1"/>
-        <w:numPr>
-          <w:ilvl w:val="3"/>
-          <w:numId w:val="1"/>
-        </w:numPr>
-        <w:ind w:hanging="360" w:left="2880"/>
-        <w:rPr>
-          <w:color w:val="FF0000"/>
-        </w:rPr>
-      </w:pPr>
-      <w:r>
-        <w:rPr>
-          <w:color w:val="FF0000"/>
-        </w:rPr>
-        <w:t>Required</w:t>
-      </w:r>
-    </w:p>
-    <w:p>
-      <w:pPr>
-        <w:pStyle w:val="normal1"/>
-        <w:numPr>
-          <w:ilvl w:val="3"/>
-          <w:numId w:val="1"/>
-        </w:numPr>
-        <w:ind w:hanging="360" w:left="2880"/>
-        <w:rPr/>
-      </w:pPr>
-      <w:r>
-        <w:rPr/>
-        <w:t>Defines which page to return</w:t>
-      </w:r>
-    </w:p>
-    <w:p>
-      <w:pPr>
-        <w:pStyle w:val="normal1"/>
-        <w:numPr>
-          <w:ilvl w:val="3"/>
-          <w:numId w:val="1"/>
-        </w:numPr>
-        <w:ind w:hanging="360" w:left="2880"/>
-        <w:rPr/>
-      </w:pPr>
-      <w:r>
-        <w:rPr/>
-        <w:t>First page = 0 (zero)</w:t>
-      </w:r>
-    </w:p>
-    <w:p>
-      <w:pPr>
-        <w:pStyle w:val="normal1"/>
-        <w:numPr>
-          <w:ilvl w:val="2"/>
-          <w:numId w:val="1"/>
-        </w:numPr>
-        <w:ind w:hanging="360" w:left="2160"/>
-        <w:rPr/>
-      </w:pPr>
-      <w:r>
-        <w:rPr/>
-        <w:t>page_size={num_of_rows}</w:t>
-      </w:r>
-    </w:p>
-    <w:p>
-      <w:pPr>
-        <w:pStyle w:val="normal1"/>
-        <w:numPr>
-          <w:ilvl w:val="3"/>
-          <w:numId w:val="1"/>
-        </w:numPr>
-        <w:ind w:hanging="360" w:left="2880"/>
-        <w:rPr>
-          <w:color w:val="FF0000"/>
-        </w:rPr>
-      </w:pPr>
-      <w:r>
-        <w:rPr>
-          <w:color w:val="FF0000"/>
-        </w:rPr>
-        <w:t>Required</w:t>
-      </w:r>
-    </w:p>
-    <w:p>
-      <w:pPr>
-        <w:pStyle w:val="normal1"/>
-        <w:numPr>
-          <w:ilvl w:val="3"/>
-          <w:numId w:val="1"/>
-        </w:numPr>
-        <w:ind w:hanging="360" w:left="2880"/>
-        <w:rPr/>
-      </w:pPr>
-      <w:r>
-        <w:rPr/>
-        <w:t>Defines how many rows to return for the selected page</w:t>
-      </w:r>
-    </w:p>
-    <w:p>
-      <w:pPr>
-        <w:pStyle w:val="normal1"/>
-        <w:numPr>
-          <w:ilvl w:val="1"/>
-          <w:numId w:val="1"/>
-        </w:numPr>
-        <w:ind w:hanging="360" w:left="1440"/>
-        <w:rPr/>
-      </w:pPr>
-      <w:r>
-        <w:rPr/>
-        <w:t xml:space="preserve">returns: </w:t>
+        <w:t xml:space="preserve">body: </w:t>
       </w:r>
     </w:p>
     <w:p>
@@ -39860,273 +39433,26 @@
         <w:spacing w:lineRule="auto" w:line="276" w:before="0" w:after="0"/>
         <w:ind w:hanging="360" w:left="2160" w:right="0"/>
         <w:jc w:val="left"/>
-        <w:rPr>
-          <w:b/>
-          <w:bCs/>
-        </w:rPr>
-      </w:pPr>
-      <w:r>
-        <w:rPr/>
-        <w:t>an array of Rounds</w:t>
-      </w:r>
-    </w:p>
-    <w:p>
-      <w:pPr>
-        <w:pStyle w:val="normal1"/>
-        <w:numPr>
-          <w:ilvl w:val="0"/>
-          <w:numId w:val="1"/>
-        </w:numPr>
-        <w:ind w:hanging="360" w:left="720"/>
-        <w:rPr/>
-      </w:pPr>
-      <w:r>
-        <w:rPr/>
-        <w:t>GET Round Rows of RoundGroup</w:t>
-      </w:r>
-    </w:p>
-    <w:p>
-      <w:pPr>
-        <w:pStyle w:val="normal1"/>
-        <w:numPr>
-          <w:ilvl w:val="1"/>
-          <w:numId w:val="1"/>
-        </w:numPr>
-        <w:ind w:hanging="360" w:left="1440"/>
-        <w:rPr/>
-      </w:pPr>
-      <w:r>
-        <w:rPr/>
-        <w:t xml:space="preserve">built_including_tests: </w:t>
-      </w:r>
-      <w:r>
-        <w:rPr>
-          <w:b/>
-          <w:bCs/>
-        </w:rPr>
-        <w:t>true</w:t>
-      </w:r>
-    </w:p>
-    <w:p>
-      <w:pPr>
-        <w:pStyle w:val="normal1"/>
-        <w:numPr>
-          <w:ilvl w:val="1"/>
-          <w:numId w:val="1"/>
-        </w:numPr>
-        <w:ind w:hanging="360" w:left="1440"/>
-        <w:rPr/>
-      </w:pPr>
-      <w:r>
-        <w:rPr/>
-        <w:t>HTTP method: ‘GET’</w:t>
-      </w:r>
-    </w:p>
-    <w:p>
-      <w:pPr>
-        <w:pStyle w:val="normal1"/>
-        <w:numPr>
-          <w:ilvl w:val="1"/>
-          <w:numId w:val="1"/>
-        </w:numPr>
-        <w:ind w:hanging="360" w:left="1440"/>
-        <w:rPr/>
-      </w:pPr>
-      <w:r>
-        <w:rPr/>
-        <w:t>endpoint: {base_uri}/api/roundgroups/{id}/round-rows?page={page_num}&amp;page_size={num_of_rows}</w:t>
-      </w:r>
-    </w:p>
-    <w:p>
-      <w:pPr>
-        <w:pStyle w:val="normal1"/>
-        <w:numPr>
-          <w:ilvl w:val="1"/>
-          <w:numId w:val="1"/>
-        </w:numPr>
-        <w:ind w:hanging="360" w:left="1440"/>
-        <w:rPr/>
-      </w:pPr>
-      <w:r>
-        <w:rPr/>
-        <w:t>description: Design as a 1-call endpoint for Rounds when scoped to RoundGroup.</w:t>
-      </w:r>
-    </w:p>
-    <w:p>
-      <w:pPr>
-        <w:pStyle w:val="normal1"/>
-        <w:numPr>
-          <w:ilvl w:val="1"/>
-          <w:numId w:val="1"/>
-        </w:numPr>
-        <w:ind w:hanging="360" w:left="1440"/>
-        <w:rPr/>
-      </w:pPr>
-      <w:r>
-        <w:rPr/>
-        <w:t>parameters:</w:t>
-      </w:r>
-    </w:p>
-    <w:p>
-      <w:pPr>
-        <w:pStyle w:val="normal1"/>
-        <w:numPr>
-          <w:ilvl w:val="2"/>
-          <w:numId w:val="1"/>
-        </w:numPr>
-        <w:ind w:hanging="360" w:left="2160"/>
-        <w:rPr/>
-      </w:pPr>
-      <w:r>
-        <w:rPr/>
-        <w:t>id</w:t>
-      </w:r>
-    </w:p>
-    <w:p>
-      <w:pPr>
-        <w:pStyle w:val="normal1"/>
-        <w:numPr>
-          <w:ilvl w:val="3"/>
-          <w:numId w:val="1"/>
-        </w:numPr>
-        <w:ind w:hanging="360" w:left="2880"/>
-        <w:rPr>
-          <w:color w:val="FF0000"/>
-        </w:rPr>
-      </w:pPr>
-      <w:r>
-        <w:rPr>
-          <w:color w:val="FF0000"/>
-        </w:rPr>
-        <w:t>Required</w:t>
-      </w:r>
-    </w:p>
-    <w:p>
-      <w:pPr>
-        <w:pStyle w:val="normal1"/>
-        <w:numPr>
-          <w:ilvl w:val="3"/>
-          <w:numId w:val="1"/>
-        </w:numPr>
-        <w:ind w:hanging="360" w:left="2880"/>
-        <w:rPr/>
-      </w:pPr>
-      <w:r>
-        <w:rPr/>
-        <w:t>ID of the RoundGroup</w:t>
-      </w:r>
-    </w:p>
-    <w:p>
-      <w:pPr>
-        <w:pStyle w:val="normal1"/>
-        <w:numPr>
-          <w:ilvl w:val="2"/>
-          <w:numId w:val="1"/>
-        </w:numPr>
-        <w:ind w:hanging="360" w:left="2160"/>
-        <w:rPr/>
-      </w:pPr>
-      <w:r>
-        <w:rPr/>
-        <w:t>page={page_num}</w:t>
-      </w:r>
-    </w:p>
-    <w:p>
-      <w:pPr>
-        <w:pStyle w:val="normal1"/>
-        <w:numPr>
-          <w:ilvl w:val="3"/>
-          <w:numId w:val="1"/>
-        </w:numPr>
-        <w:ind w:hanging="360" w:left="2880"/>
-        <w:rPr>
-          <w:color w:val="FF0000"/>
-        </w:rPr>
-      </w:pPr>
-      <w:r>
-        <w:rPr>
-          <w:color w:val="FF0000"/>
-        </w:rPr>
-        <w:t>Required</w:t>
-      </w:r>
-    </w:p>
-    <w:p>
-      <w:pPr>
-        <w:pStyle w:val="normal1"/>
-        <w:numPr>
-          <w:ilvl w:val="3"/>
-          <w:numId w:val="1"/>
-        </w:numPr>
-        <w:ind w:hanging="360" w:left="2880"/>
-        <w:rPr/>
-      </w:pPr>
-      <w:r>
-        <w:rPr/>
-        <w:t>Defines which page to return</w:t>
-      </w:r>
-    </w:p>
-    <w:p>
-      <w:pPr>
-        <w:pStyle w:val="normal1"/>
-        <w:numPr>
-          <w:ilvl w:val="3"/>
-          <w:numId w:val="1"/>
-        </w:numPr>
-        <w:ind w:hanging="360" w:left="2880"/>
-        <w:rPr/>
-      </w:pPr>
-      <w:r>
-        <w:rPr/>
-        <w:t>First page = 0 (zero)</w:t>
-      </w:r>
-    </w:p>
-    <w:p>
-      <w:pPr>
-        <w:pStyle w:val="normal1"/>
-        <w:numPr>
-          <w:ilvl w:val="2"/>
-          <w:numId w:val="1"/>
-        </w:numPr>
-        <w:ind w:hanging="360" w:left="2160"/>
-        <w:rPr/>
-      </w:pPr>
-      <w:r>
-        <w:rPr/>
-        <w:t>page_size={num_of_rows}</w:t>
-      </w:r>
-    </w:p>
-    <w:p>
-      <w:pPr>
-        <w:pStyle w:val="normal1"/>
-        <w:numPr>
-          <w:ilvl w:val="3"/>
-          <w:numId w:val="1"/>
-        </w:numPr>
-        <w:ind w:hanging="360" w:left="2880"/>
-        <w:rPr>
-          <w:color w:val="FF0000"/>
-        </w:rPr>
-      </w:pPr>
-      <w:r>
-        <w:rPr>
-          <w:color w:val="FF0000"/>
-        </w:rPr>
-        <w:t>Required</w:t>
-      </w:r>
-    </w:p>
-    <w:p>
-      <w:pPr>
-        <w:pStyle w:val="normal1"/>
-        <w:numPr>
-          <w:ilvl w:val="3"/>
-          <w:numId w:val="1"/>
-        </w:numPr>
-        <w:ind w:hanging="360" w:left="2880"/>
-        <w:rPr/>
-      </w:pPr>
-      <w:r>
-        <w:rPr/>
-        <w:t>Defines how many rows to return for the selected page</w:t>
+        <w:rPr/>
+      </w:pPr>
+      <w:r>
+        <w:rPr/>
+        <w:t>NewRound: did (the Division the Round belongs to), name, scheduled_start_time</w:t>
+      </w:r>
+    </w:p>
+    <w:p>
+      <w:pPr>
+        <w:pStyle w:val="normal1"/>
+        <w:numPr>
+          <w:ilvl w:val="1"/>
+          <w:numId w:val="1"/>
+        </w:numPr>
+        <w:ind w:hanging="360" w:left="1440"/>
+        <w:rPr/>
+      </w:pPr>
+      <w:r>
+        <w:rPr/>
+        <w:t xml:space="preserve">parameters: </w:t>
       </w:r>
     </w:p>
     <w:p>
@@ -40161,7 +39487,7 @@
       </w:pPr>
       <w:r>
         <w:rPr/>
-        <w:t>an array of RoundRows</w:t>
+        <w:t>the created Round</w:t>
       </w:r>
     </w:p>
     <w:p>
@@ -40176,7 +39502,7 @@
       </w:pPr>
       <w:r>
         <w:rPr/>
-        <w:t>POST/Create Round</w:t>
+        <w:t>PUT/Update Round</w:t>
       </w:r>
     </w:p>
     <w:p>
@@ -40213,37 +39539,37 @@
       </w:pPr>
       <w:r>
         <w:rPr/>
-        <w:t>HTTP method: ‘POST’</w:t>
-      </w:r>
-    </w:p>
-    <w:p>
-      <w:pPr>
-        <w:pStyle w:val="normal1"/>
-        <w:numPr>
-          <w:ilvl w:val="1"/>
-          <w:numId w:val="1"/>
-        </w:numPr>
-        <w:ind w:hanging="360" w:left="1440"/>
-        <w:rPr/>
-      </w:pPr>
-      <w:r>
-        <w:rPr/>
-        <w:t>endpoint: {base_uri}/api/rounds</w:t>
-      </w:r>
-    </w:p>
-    <w:p>
-      <w:pPr>
-        <w:pStyle w:val="normal1"/>
-        <w:numPr>
-          <w:ilvl w:val="1"/>
-          <w:numId w:val="1"/>
-        </w:numPr>
-        <w:ind w:hanging="360" w:left="1440"/>
-        <w:rPr/>
-      </w:pPr>
-      <w:r>
-        <w:rPr/>
-        <w:t xml:space="preserve">description: </w:t>
+        <w:t>HTTP method: ‘PUT’</w:t>
+      </w:r>
+    </w:p>
+    <w:p>
+      <w:pPr>
+        <w:pStyle w:val="normal1"/>
+        <w:numPr>
+          <w:ilvl w:val="1"/>
+          <w:numId w:val="1"/>
+        </w:numPr>
+        <w:ind w:hanging="360" w:left="1440"/>
+        <w:rPr/>
+      </w:pPr>
+      <w:r>
+        <w:rPr/>
+        <w:t>endpoint: {base_uri}/api/rounds/{id}</w:t>
+      </w:r>
+    </w:p>
+    <w:p>
+      <w:pPr>
+        <w:pStyle w:val="normal1"/>
+        <w:numPr>
+          <w:ilvl w:val="1"/>
+          <w:numId w:val="1"/>
+        </w:numPr>
+        <w:ind w:hanging="360" w:left="1440"/>
+        <w:rPr/>
+      </w:pPr>
+      <w:r>
+        <w:rPr/>
+        <w:t xml:space="preserve">description: changes a Round’s name and/or scheduled_start_time (a Round can’t be moved to another Division)</w:t>
       </w:r>
     </w:p>
     <w:p>
@@ -40259,36 +39585,6 @@
       <w:r>
         <w:rPr/>
         <w:t xml:space="preserve">body: </w:t>
-      </w:r>
-    </w:p>
-    <w:p>
-      <w:pPr>
-        <w:pStyle w:val="normal1"/>
-        <w:numPr>
-          <w:ilvl w:val="1"/>
-          <w:numId w:val="1"/>
-        </w:numPr>
-        <w:ind w:hanging="360" w:left="1440"/>
-        <w:rPr/>
-      </w:pPr>
-      <w:r>
-        <w:rPr/>
-        <w:t xml:space="preserve">parameters: </w:t>
-      </w:r>
-    </w:p>
-    <w:p>
-      <w:pPr>
-        <w:pStyle w:val="normal1"/>
-        <w:numPr>
-          <w:ilvl w:val="1"/>
-          <w:numId w:val="1"/>
-        </w:numPr>
-        <w:ind w:hanging="360" w:left="1440"/>
-        <w:rPr/>
-      </w:pPr>
-      <w:r>
-        <w:rPr/>
-        <w:t xml:space="preserve">returns: </w:t>
       </w:r>
     </w:p>
     <w:p>
@@ -40308,104 +39604,97 @@
       </w:pPr>
       <w:r>
         <w:rPr/>
-        <w:t>the created Round</w:t>
-      </w:r>
-    </w:p>
-    <w:p>
-      <w:pPr>
-        <w:pStyle w:val="normal1"/>
-        <w:numPr>
-          <w:ilvl w:val="0"/>
-          <w:numId w:val="1"/>
-        </w:numPr>
-        <w:ind w:hanging="360" w:left="720"/>
-        <w:rPr/>
-      </w:pPr>
-      <w:r>
-        <w:rPr/>
-        <w:t>PUT/Update Round</w:t>
-      </w:r>
-    </w:p>
-    <w:p>
-      <w:pPr>
-        <w:pStyle w:val="normal1"/>
-        <w:numPr>
-          <w:ilvl w:val="1"/>
-          <w:numId w:val="1"/>
-        </w:numPr>
-        <w:ind w:hanging="360" w:left="1440"/>
-        <w:rPr/>
-      </w:pPr>
-      <w:r>
-        <w:rPr/>
-        <w:t xml:space="preserve">built_including_tests: </w:t>
-      </w:r>
-      <w:r>
-        <w:rPr>
-          <w:b/>
-          <w:bCs/>
-        </w:rPr>
-        <w:t>true</w:t>
-      </w:r>
-    </w:p>
-    <w:p>
-      <w:pPr>
-        <w:pStyle w:val="normal1"/>
-        <w:numPr>
-          <w:ilvl w:val="1"/>
-          <w:numId w:val="1"/>
-        </w:numPr>
-        <w:ind w:hanging="360" w:left="1440"/>
-        <w:rPr/>
-      </w:pPr>
-      <w:r>
-        <w:rPr/>
-        <w:t>HTTP method: ‘PUT’</w:t>
-      </w:r>
-    </w:p>
-    <w:p>
-      <w:pPr>
-        <w:pStyle w:val="normal1"/>
-        <w:numPr>
-          <w:ilvl w:val="1"/>
-          <w:numId w:val="1"/>
-        </w:numPr>
-        <w:ind w:hanging="360" w:left="1440"/>
-        <w:rPr/>
-      </w:pPr>
-      <w:r>
-        <w:rPr/>
-        <w:t>endpoint: {base_uri}/api/rounds/{id}</w:t>
-      </w:r>
-    </w:p>
-    <w:p>
-      <w:pPr>
-        <w:pStyle w:val="normal1"/>
-        <w:numPr>
-          <w:ilvl w:val="1"/>
-          <w:numId w:val="1"/>
-        </w:numPr>
-        <w:ind w:hanging="360" w:left="1440"/>
-        <w:rPr/>
-      </w:pPr>
-      <w:r>
-        <w:rPr/>
-        <w:t xml:space="preserve">description: </w:t>
-      </w:r>
-    </w:p>
-    <w:p>
-      <w:pPr>
-        <w:pStyle w:val="normal1"/>
-        <w:numPr>
-          <w:ilvl w:val="1"/>
-          <w:numId w:val="1"/>
-        </w:numPr>
-        <w:ind w:hanging="360" w:left="1440"/>
-        <w:rPr/>
-      </w:pPr>
-      <w:r>
-        <w:rPr/>
-        <w:t xml:space="preserve">body: </w:t>
+        <w:t>only fields that you want to update (other than ID in the URI path) need to be provided</w:t>
+      </w:r>
+    </w:p>
+    <w:p>
+      <w:pPr>
+        <w:pStyle w:val="normal1"/>
+        <w:numPr>
+          <w:ilvl w:val="1"/>
+          <w:numId w:val="1"/>
+        </w:numPr>
+        <w:ind w:hanging="360" w:left="1440"/>
+        <w:rPr/>
+      </w:pPr>
+      <w:r>
+        <w:rPr/>
+        <w:t>parameters:</w:t>
+      </w:r>
+    </w:p>
+    <w:p>
+      <w:pPr>
+        <w:pStyle w:val="normal1"/>
+        <w:numPr>
+          <w:ilvl w:val="2"/>
+          <w:numId w:val="1"/>
+        </w:numPr>
+        <w:ind w:hanging="360" w:left="2160"/>
+        <w:rPr/>
+      </w:pPr>
+      <w:r>
+        <w:rPr/>
+        <w:t>id</w:t>
+      </w:r>
+    </w:p>
+    <w:p>
+      <w:pPr>
+        <w:pStyle w:val="normal1"/>
+        <w:numPr>
+          <w:ilvl w:val="3"/>
+          <w:numId w:val="1"/>
+        </w:numPr>
+        <w:ind w:hanging="360" w:left="2880"/>
+        <w:rPr>
+          <w:color w:val="FF0000"/>
+        </w:rPr>
+      </w:pPr>
+      <w:r>
+        <w:rPr>
+          <w:color w:val="FF0000"/>
+        </w:rPr>
+        <w:t>Required</w:t>
+      </w:r>
+    </w:p>
+    <w:p>
+      <w:pPr>
+        <w:pStyle w:val="normal1"/>
+        <w:widowControl/>
+        <w:numPr>
+          <w:ilvl w:val="3"/>
+          <w:numId w:val="1"/>
+        </w:numPr>
+        <w:suppressAutoHyphens w:val="true"/>
+        <w:bidi w:val="0"/>
+        <w:spacing w:lineRule="auto" w:line="276" w:before="0" w:after="0"/>
+        <w:ind w:hanging="360" w:left="2880" w:right="0"/>
+        <w:jc w:val="left"/>
+        <w:rPr>
+          <w:color w:val="000000"/>
+        </w:rPr>
+      </w:pPr>
+      <w:r>
+        <w:rPr>
+          <w:color w:val="000000"/>
+        </w:rPr>
+        <w:t>ID of the Round to be updated</w:t>
+      </w:r>
+    </w:p>
+    <w:p>
+      <w:pPr>
+        <w:pStyle w:val="normal1"/>
+        <w:numPr>
+          <w:ilvl w:val="1"/>
+          <w:numId w:val="1"/>
+        </w:numPr>
+        <w:ind w:hanging="360" w:left="1440"/>
+        <w:rPr>
+          <w:color w:val="000000"/>
+        </w:rPr>
+      </w:pPr>
+      <w:r>
+        <w:rPr/>
+        <w:t xml:space="preserve">returns: </w:t>
       </w:r>
     </w:p>
     <w:p>
@@ -40421,116 +39710,6 @@
         <w:spacing w:lineRule="auto" w:line="276" w:before="0" w:after="0"/>
         <w:ind w:hanging="360" w:left="2160" w:right="0"/>
         <w:jc w:val="left"/>
-        <w:rPr/>
-      </w:pPr>
-      <w:r>
-        <w:rPr/>
-        <w:t>only fields that you want to update (other than ID in the URI path) need to be provided</w:t>
-      </w:r>
-    </w:p>
-    <w:p>
-      <w:pPr>
-        <w:pStyle w:val="normal1"/>
-        <w:numPr>
-          <w:ilvl w:val="1"/>
-          <w:numId w:val="1"/>
-        </w:numPr>
-        <w:ind w:hanging="360" w:left="1440"/>
-        <w:rPr/>
-      </w:pPr>
-      <w:r>
-        <w:rPr/>
-        <w:t>parameters:</w:t>
-      </w:r>
-    </w:p>
-    <w:p>
-      <w:pPr>
-        <w:pStyle w:val="normal1"/>
-        <w:numPr>
-          <w:ilvl w:val="2"/>
-          <w:numId w:val="1"/>
-        </w:numPr>
-        <w:ind w:hanging="360" w:left="2160"/>
-        <w:rPr/>
-      </w:pPr>
-      <w:r>
-        <w:rPr/>
-        <w:t>id</w:t>
-      </w:r>
-    </w:p>
-    <w:p>
-      <w:pPr>
-        <w:pStyle w:val="normal1"/>
-        <w:numPr>
-          <w:ilvl w:val="3"/>
-          <w:numId w:val="1"/>
-        </w:numPr>
-        <w:ind w:hanging="360" w:left="2880"/>
-        <w:rPr>
-          <w:color w:val="FF0000"/>
-        </w:rPr>
-      </w:pPr>
-      <w:r>
-        <w:rPr>
-          <w:color w:val="FF0000"/>
-        </w:rPr>
-        <w:t>Required</w:t>
-      </w:r>
-    </w:p>
-    <w:p>
-      <w:pPr>
-        <w:pStyle w:val="normal1"/>
-        <w:widowControl/>
-        <w:numPr>
-          <w:ilvl w:val="3"/>
-          <w:numId w:val="1"/>
-        </w:numPr>
-        <w:suppressAutoHyphens w:val="true"/>
-        <w:bidi w:val="0"/>
-        <w:spacing w:lineRule="auto" w:line="276" w:before="0" w:after="0"/>
-        <w:ind w:hanging="360" w:left="2880" w:right="0"/>
-        <w:jc w:val="left"/>
-        <w:rPr>
-          <w:color w:val="000000"/>
-        </w:rPr>
-      </w:pPr>
-      <w:r>
-        <w:rPr>
-          <w:color w:val="000000"/>
-        </w:rPr>
-        <w:t>ID of the Round to be updated</w:t>
-      </w:r>
-    </w:p>
-    <w:p>
-      <w:pPr>
-        <w:pStyle w:val="normal1"/>
-        <w:numPr>
-          <w:ilvl w:val="1"/>
-          <w:numId w:val="1"/>
-        </w:numPr>
-        <w:ind w:hanging="360" w:left="1440"/>
-        <w:rPr>
-          <w:color w:val="000000"/>
-        </w:rPr>
-      </w:pPr>
-      <w:r>
-        <w:rPr/>
-        <w:t xml:space="preserve">returns: </w:t>
-      </w:r>
-    </w:p>
-    <w:p>
-      <w:pPr>
-        <w:pStyle w:val="normal1"/>
-        <w:widowControl/>
-        <w:numPr>
-          <w:ilvl w:val="2"/>
-          <w:numId w:val="1"/>
-        </w:numPr>
-        <w:suppressAutoHyphens w:val="true"/>
-        <w:bidi w:val="0"/>
-        <w:spacing w:lineRule="auto" w:line="276" w:before="0" w:after="0"/>
-        <w:ind w:hanging="360" w:left="2160" w:right="0"/>
-        <w:jc w:val="left"/>
         <w:rPr>
           <w:color w:val="000000"/>
         </w:rPr>
@@ -40621,7 +39800,7 @@
       </w:pPr>
       <w:r>
         <w:rPr/>
-        <w:t xml:space="preserve">description: </w:t>
+        <w:t xml:space="preserve">description: soft-deletes the Round and every Game in it; PoolBracketGroups, their pools and the pools’ Team placements are left untouched</w:t>
       </w:r>
     </w:p>
     <w:p>
@@ -40726,24 +39905,6 @@
     <w:p>
       <w:pPr>
         <w:pStyle w:val="normal1"/>
-        <w:rPr/>
-      </w:pPr>
-      <w:r>
-        <w:rPr/>
-      </w:r>
-    </w:p>
-    <w:p>
-      <w:pPr>
-        <w:pStyle w:val="normal1"/>
-        <w:rPr/>
-      </w:pPr>
-      <w:r>
-        <w:rPr/>
-      </w:r>
-    </w:p>
-    <w:p>
-      <w:pPr>
-        <w:pStyle w:val="normal1"/>
         <w:rPr>
           <w:b/>
           <w:bCs/>
@@ -40754,7 +39915,7 @@
           <w:b/>
           <w:bCs/>
         </w:rPr>
-        <w:t>RoundGroups</w:t>
+        <w:t>Schedules</w:t>
       </w:r>
     </w:p>
     <w:p>
@@ -40769,7 +39930,7 @@
       </w:pPr>
       <w:r>
         <w:rPr/>
-        <w:t>GET All RoundGroups</w:t>
+        <w:t>POST/Create Schedule for Division</w:t>
       </w:r>
     </w:p>
     <w:p>
@@ -40791,67 +39952,67 @@
           <w:b/>
           <w:bCs/>
         </w:rPr>
-        <w:t>false</w:t>
-      </w:r>
-    </w:p>
-    <w:p>
-      <w:pPr>
-        <w:pStyle w:val="normal1"/>
-        <w:numPr>
-          <w:ilvl w:val="1"/>
-          <w:numId w:val="1"/>
-        </w:numPr>
-        <w:ind w:hanging="360" w:left="1440"/>
-        <w:rPr/>
-      </w:pPr>
-      <w:r>
-        <w:rPr/>
-        <w:t>HTTP method: ‘GET’</w:t>
-      </w:r>
-    </w:p>
-    <w:p>
-      <w:pPr>
-        <w:pStyle w:val="normal1"/>
-        <w:numPr>
-          <w:ilvl w:val="1"/>
-          <w:numId w:val="1"/>
-        </w:numPr>
-        <w:ind w:hanging="360" w:left="1440"/>
-        <w:rPr/>
-      </w:pPr>
-      <w:r>
-        <w:rPr/>
-        <w:t>endpoint: {base_uri}/api/roundgroups?page={page_num}&amp;page_size={num_of_rows}</w:t>
-      </w:r>
-    </w:p>
-    <w:p>
-      <w:pPr>
-        <w:pStyle w:val="normal1"/>
-        <w:numPr>
-          <w:ilvl w:val="1"/>
-          <w:numId w:val="1"/>
-        </w:numPr>
-        <w:ind w:hanging="360" w:left="1440"/>
-        <w:rPr/>
-      </w:pPr>
-      <w:r>
-        <w:rPr/>
-        <w:t xml:space="preserve">description: </w:t>
-      </w:r>
-    </w:p>
-    <w:p>
-      <w:pPr>
-        <w:pStyle w:val="normal1"/>
-        <w:numPr>
-          <w:ilvl w:val="1"/>
-          <w:numId w:val="1"/>
-        </w:numPr>
-        <w:ind w:hanging="360" w:left="1440"/>
-        <w:rPr/>
-      </w:pPr>
-      <w:r>
-        <w:rPr/>
-        <w:t xml:space="preserve">parameters: </w:t>
+        <w:t>true</w:t>
+      </w:r>
+    </w:p>
+    <w:p>
+      <w:pPr>
+        <w:pStyle w:val="normal1"/>
+        <w:numPr>
+          <w:ilvl w:val="1"/>
+          <w:numId w:val="1"/>
+        </w:numPr>
+        <w:ind w:hanging="360" w:left="1440"/>
+        <w:rPr/>
+      </w:pPr>
+      <w:r>
+        <w:rPr/>
+        <w:t>HTTP method: ‘POST’</w:t>
+      </w:r>
+    </w:p>
+    <w:p>
+      <w:pPr>
+        <w:pStyle w:val="normal1"/>
+        <w:numPr>
+          <w:ilvl w:val="1"/>
+          <w:numId w:val="1"/>
+        </w:numPr>
+        <w:ind w:hanging="360" w:left="1440"/>
+        <w:rPr/>
+      </w:pPr>
+      <w:r>
+        <w:rPr/>
+        <w:t>endpoint: {base_uri}/api/schedule</w:t>
+      </w:r>
+    </w:p>
+    <w:p>
+      <w:pPr>
+        <w:pStyle w:val="normal1"/>
+        <w:numPr>
+          <w:ilvl w:val="1"/>
+          <w:numId w:val="1"/>
+        </w:numPr>
+        <w:ind w:hanging="360" w:left="1440"/>
+        <w:rPr/>
+      </w:pPr>
+      <w:r>
+        <w:rPr/>
+        <w:t>description: generates a Division’s schedule in one call: one PoolBracketGroup (with its pools and Team placements) per name in pool_group_names, plus the Rounds and Games</w:t>
+      </w:r>
+    </w:p>
+    <w:p>
+      <w:pPr>
+        <w:pStyle w:val="normal1"/>
+        <w:numPr>
+          <w:ilvl w:val="1"/>
+          <w:numId w:val="1"/>
+        </w:numPr>
+        <w:ind w:hanging="360" w:left="1440"/>
+        <w:rPr/>
+      </w:pPr>
+      <w:r>
+        <w:rPr/>
+        <w:t xml:space="preserve">body: </w:t>
       </w:r>
     </w:p>
     <w:p>
@@ -40866,2006 +40027,7 @@
       </w:pPr>
       <w:r>
         <w:rPr/>
-        <w:t>page={page_num}</w:t>
-      </w:r>
-    </w:p>
-    <w:p>
-      <w:pPr>
-        <w:pStyle w:val="normal1"/>
-        <w:numPr>
-          <w:ilvl w:val="3"/>
-          <w:numId w:val="1"/>
-        </w:numPr>
-        <w:ind w:hanging="360" w:left="2880"/>
-        <w:rPr>
-          <w:color w:val="FF0000"/>
-        </w:rPr>
-      </w:pPr>
-      <w:r>
-        <w:rPr>
-          <w:color w:val="FF0000"/>
-        </w:rPr>
-        <w:t>Required</w:t>
-      </w:r>
-    </w:p>
-    <w:p>
-      <w:pPr>
-        <w:pStyle w:val="normal1"/>
-        <w:numPr>
-          <w:ilvl w:val="3"/>
-          <w:numId w:val="1"/>
-        </w:numPr>
-        <w:ind w:hanging="360" w:left="2880"/>
-        <w:rPr/>
-      </w:pPr>
-      <w:r>
-        <w:rPr/>
-        <w:t>Defines which page to return</w:t>
-      </w:r>
-    </w:p>
-    <w:p>
-      <w:pPr>
-        <w:pStyle w:val="normal1"/>
-        <w:numPr>
-          <w:ilvl w:val="3"/>
-          <w:numId w:val="1"/>
-        </w:numPr>
-        <w:ind w:hanging="360" w:left="2880"/>
-        <w:rPr/>
-      </w:pPr>
-      <w:r>
-        <w:rPr/>
-        <w:t>First page = 0 (zero)</w:t>
-      </w:r>
-    </w:p>
-    <w:p>
-      <w:pPr>
-        <w:pStyle w:val="normal1"/>
-        <w:numPr>
-          <w:ilvl w:val="2"/>
-          <w:numId w:val="1"/>
-        </w:numPr>
-        <w:ind w:hanging="360" w:left="2160"/>
-        <w:rPr/>
-      </w:pPr>
-      <w:r>
-        <w:rPr/>
-        <w:t>page_size={num_of_rows}</w:t>
-      </w:r>
-    </w:p>
-    <w:p>
-      <w:pPr>
-        <w:pStyle w:val="normal1"/>
-        <w:numPr>
-          <w:ilvl w:val="3"/>
-          <w:numId w:val="1"/>
-        </w:numPr>
-        <w:ind w:hanging="360" w:left="2880"/>
-        <w:rPr>
-          <w:color w:val="FF0000"/>
-        </w:rPr>
-      </w:pPr>
-      <w:r>
-        <w:rPr>
-          <w:color w:val="FF0000"/>
-        </w:rPr>
-        <w:t>Required</w:t>
-      </w:r>
-    </w:p>
-    <w:p>
-      <w:pPr>
-        <w:pStyle w:val="normal1"/>
-        <w:numPr>
-          <w:ilvl w:val="3"/>
-          <w:numId w:val="1"/>
-        </w:numPr>
-        <w:ind w:hanging="360" w:left="2880"/>
-        <w:rPr/>
-      </w:pPr>
-      <w:r>
-        <w:rPr/>
-        <w:t>Defines how many rows to return for the selected page</w:t>
-      </w:r>
-    </w:p>
-    <w:p>
-      <w:pPr>
-        <w:pStyle w:val="normal1"/>
-        <w:numPr>
-          <w:ilvl w:val="1"/>
-          <w:numId w:val="1"/>
-        </w:numPr>
-        <w:ind w:hanging="360" w:left="1440"/>
-        <w:rPr/>
-      </w:pPr>
-      <w:r>
-        <w:rPr/>
-        <w:t xml:space="preserve">returns: </w:t>
-      </w:r>
-    </w:p>
-    <w:p>
-      <w:pPr>
-        <w:pStyle w:val="normal1"/>
-        <w:numPr>
-          <w:ilvl w:val="0"/>
-          <w:numId w:val="1"/>
-        </w:numPr>
-        <w:ind w:hanging="360" w:left="720"/>
-        <w:rPr/>
-      </w:pPr>
-      <w:r>
-        <w:rPr/>
-        <w:t>GET RoundGroup by ID</w:t>
-      </w:r>
-    </w:p>
-    <w:p>
-      <w:pPr>
-        <w:pStyle w:val="normal1"/>
-        <w:numPr>
-          <w:ilvl w:val="1"/>
-          <w:numId w:val="1"/>
-        </w:numPr>
-        <w:ind w:hanging="360" w:left="1440"/>
-        <w:rPr/>
-      </w:pPr>
-      <w:r>
-        <w:rPr/>
-        <w:t xml:space="preserve">built_including_tests: </w:t>
-      </w:r>
-      <w:r>
-        <w:rPr>
-          <w:b/>
-          <w:bCs/>
-        </w:rPr>
-        <w:t>true</w:t>
-      </w:r>
-    </w:p>
-    <w:p>
-      <w:pPr>
-        <w:pStyle w:val="normal1"/>
-        <w:numPr>
-          <w:ilvl w:val="1"/>
-          <w:numId w:val="1"/>
-        </w:numPr>
-        <w:ind w:hanging="360" w:left="1440"/>
-        <w:rPr/>
-      </w:pPr>
-      <w:r>
-        <w:rPr/>
-        <w:t>HTTP method: ‘GET’</w:t>
-      </w:r>
-    </w:p>
-    <w:p>
-      <w:pPr>
-        <w:pStyle w:val="normal1"/>
-        <w:numPr>
-          <w:ilvl w:val="1"/>
-          <w:numId w:val="1"/>
-        </w:numPr>
-        <w:ind w:hanging="360" w:left="1440"/>
-        <w:rPr/>
-      </w:pPr>
-      <w:r>
-        <w:rPr/>
-        <w:t>endpoint: {base_uri}/api/roundgroups/{id}</w:t>
-      </w:r>
-    </w:p>
-    <w:p>
-      <w:pPr>
-        <w:pStyle w:val="normal1"/>
-        <w:numPr>
-          <w:ilvl w:val="1"/>
-          <w:numId w:val="1"/>
-        </w:numPr>
-        <w:ind w:hanging="360" w:left="1440"/>
-        <w:rPr/>
-      </w:pPr>
-      <w:r>
-        <w:rPr/>
-        <w:t xml:space="preserve">description: </w:t>
-      </w:r>
-    </w:p>
-    <w:p>
-      <w:pPr>
-        <w:pStyle w:val="normal1"/>
-        <w:numPr>
-          <w:ilvl w:val="1"/>
-          <w:numId w:val="1"/>
-        </w:numPr>
-        <w:ind w:hanging="360" w:left="1440"/>
-        <w:rPr/>
-      </w:pPr>
-      <w:r>
-        <w:rPr/>
-        <w:t xml:space="preserve">parameters: </w:t>
-      </w:r>
-    </w:p>
-    <w:p>
-      <w:pPr>
-        <w:pStyle w:val="normal1"/>
-        <w:numPr>
-          <w:ilvl w:val="2"/>
-          <w:numId w:val="1"/>
-        </w:numPr>
-        <w:ind w:hanging="360" w:left="2160"/>
-        <w:rPr/>
-      </w:pPr>
-      <w:r>
-        <w:rPr/>
-        <w:t>id</w:t>
-      </w:r>
-    </w:p>
-    <w:p>
-      <w:pPr>
-        <w:pStyle w:val="normal1"/>
-        <w:numPr>
-          <w:ilvl w:val="3"/>
-          <w:numId w:val="1"/>
-        </w:numPr>
-        <w:ind w:hanging="360" w:left="2880"/>
-        <w:rPr>
-          <w:color w:val="FF0000"/>
-        </w:rPr>
-      </w:pPr>
-      <w:r>
-        <w:rPr>
-          <w:color w:val="FF0000"/>
-        </w:rPr>
-        <w:t>Required</w:t>
-      </w:r>
-    </w:p>
-    <w:p>
-      <w:pPr>
-        <w:pStyle w:val="normal1"/>
-        <w:numPr>
-          <w:ilvl w:val="3"/>
-          <w:numId w:val="1"/>
-        </w:numPr>
-        <w:ind w:hanging="360" w:left="2880"/>
-        <w:rPr/>
-      </w:pPr>
-      <w:r>
-        <w:rPr/>
-        <w:t>ID of the RoundGroup to receive</w:t>
-      </w:r>
-    </w:p>
-    <w:p>
-      <w:pPr>
-        <w:pStyle w:val="normal1"/>
-        <w:numPr>
-          <w:ilvl w:val="1"/>
-          <w:numId w:val="1"/>
-        </w:numPr>
-        <w:ind w:hanging="360" w:left="1440"/>
-        <w:rPr>
-          <w:b/>
-          <w:bCs/>
-        </w:rPr>
-      </w:pPr>
-      <w:r>
-        <w:rPr/>
-        <w:t xml:space="preserve">returns: </w:t>
-      </w:r>
-    </w:p>
-    <w:p>
-      <w:pPr>
-        <w:pStyle w:val="normal1"/>
-        <w:numPr>
-          <w:ilvl w:val="0"/>
-          <w:numId w:val="1"/>
-        </w:numPr>
-        <w:ind w:hanging="360" w:left="720"/>
-        <w:rPr/>
-      </w:pPr>
-      <w:r>
-        <w:rPr/>
-        <w:t>GET RoundGroup Rows of Tournament</w:t>
-      </w:r>
-    </w:p>
-    <w:p>
-      <w:pPr>
-        <w:pStyle w:val="normal1"/>
-        <w:numPr>
-          <w:ilvl w:val="1"/>
-          <w:numId w:val="1"/>
-        </w:numPr>
-        <w:ind w:hanging="360" w:left="1440"/>
-        <w:rPr/>
-      </w:pPr>
-      <w:r>
-        <w:rPr/>
-        <w:t xml:space="preserve">built_including_tests: </w:t>
-      </w:r>
-      <w:r>
-        <w:rPr>
-          <w:b/>
-          <w:bCs/>
-        </w:rPr>
-        <w:t>true</w:t>
-      </w:r>
-    </w:p>
-    <w:p>
-      <w:pPr>
-        <w:pStyle w:val="normal1"/>
-        <w:numPr>
-          <w:ilvl w:val="1"/>
-          <w:numId w:val="1"/>
-        </w:numPr>
-        <w:ind w:hanging="360" w:left="1440"/>
-        <w:rPr/>
-      </w:pPr>
-      <w:r>
-        <w:rPr/>
-        <w:t>HTTP method: ‘GET’</w:t>
-      </w:r>
-    </w:p>
-    <w:p>
-      <w:pPr>
-        <w:pStyle w:val="normal1"/>
-        <w:numPr>
-          <w:ilvl w:val="1"/>
-          <w:numId w:val="1"/>
-        </w:numPr>
-        <w:ind w:hanging="360" w:left="1440"/>
-        <w:rPr/>
-      </w:pPr>
-      <w:r>
-        <w:rPr/>
-        <w:t>endpoint: {base_uri}/api/tournaments/{id}/roundgroup-rows?page={page_num}&amp;page_size={num_of_rows}</w:t>
-      </w:r>
-    </w:p>
-    <w:p>
-      <w:pPr>
-        <w:pStyle w:val="normal1"/>
-        <w:numPr>
-          <w:ilvl w:val="1"/>
-          <w:numId w:val="1"/>
-        </w:numPr>
-        <w:ind w:hanging="360" w:left="1440"/>
-        <w:rPr/>
-      </w:pPr>
-      <w:r>
-        <w:rPr/>
-        <w:t xml:space="preserve">description: </w:t>
-      </w:r>
-    </w:p>
-    <w:p>
-      <w:pPr>
-        <w:pStyle w:val="normal1"/>
-        <w:numPr>
-          <w:ilvl w:val="1"/>
-          <w:numId w:val="1"/>
-        </w:numPr>
-        <w:ind w:hanging="360" w:left="1440"/>
-        <w:rPr/>
-      </w:pPr>
-      <w:r>
-        <w:rPr/>
-        <w:t>parameters:</w:t>
-      </w:r>
-    </w:p>
-    <w:p>
-      <w:pPr>
-        <w:pStyle w:val="normal1"/>
-        <w:numPr>
-          <w:ilvl w:val="2"/>
-          <w:numId w:val="1"/>
-        </w:numPr>
-        <w:ind w:hanging="360" w:left="2160"/>
-        <w:rPr/>
-      </w:pPr>
-      <w:r>
-        <w:rPr/>
-        <w:t>id</w:t>
-      </w:r>
-    </w:p>
-    <w:p>
-      <w:pPr>
-        <w:pStyle w:val="normal1"/>
-        <w:numPr>
-          <w:ilvl w:val="3"/>
-          <w:numId w:val="1"/>
-        </w:numPr>
-        <w:ind w:hanging="360" w:left="2880"/>
-        <w:rPr>
-          <w:color w:val="FF0000"/>
-        </w:rPr>
-      </w:pPr>
-      <w:r>
-        <w:rPr>
-          <w:color w:val="FF0000"/>
-        </w:rPr>
-        <w:t>Required</w:t>
-      </w:r>
-    </w:p>
-    <w:p>
-      <w:pPr>
-        <w:pStyle w:val="normal1"/>
-        <w:numPr>
-          <w:ilvl w:val="3"/>
-          <w:numId w:val="1"/>
-        </w:numPr>
-        <w:ind w:hanging="360" w:left="2880"/>
-        <w:rPr/>
-      </w:pPr>
-      <w:r>
-        <w:rPr/>
-        <w:t>ID of the Tournament the RoundGroup Rows belong to</w:t>
-      </w:r>
-    </w:p>
-    <w:p>
-      <w:pPr>
-        <w:pStyle w:val="normal1"/>
-        <w:numPr>
-          <w:ilvl w:val="2"/>
-          <w:numId w:val="1"/>
-        </w:numPr>
-        <w:ind w:hanging="360" w:left="2160"/>
-        <w:rPr/>
-      </w:pPr>
-      <w:r>
-        <w:rPr/>
-        <w:t>page={page_num}</w:t>
-      </w:r>
-    </w:p>
-    <w:p>
-      <w:pPr>
-        <w:pStyle w:val="normal1"/>
-        <w:numPr>
-          <w:ilvl w:val="3"/>
-          <w:numId w:val="1"/>
-        </w:numPr>
-        <w:ind w:hanging="360" w:left="2880"/>
-        <w:rPr>
-          <w:color w:val="FF0000"/>
-        </w:rPr>
-      </w:pPr>
-      <w:r>
-        <w:rPr>
-          <w:color w:val="FF0000"/>
-        </w:rPr>
-        <w:t>Required</w:t>
-      </w:r>
-    </w:p>
-    <w:p>
-      <w:pPr>
-        <w:pStyle w:val="normal1"/>
-        <w:numPr>
-          <w:ilvl w:val="3"/>
-          <w:numId w:val="1"/>
-        </w:numPr>
-        <w:ind w:hanging="360" w:left="2880"/>
-        <w:rPr/>
-      </w:pPr>
-      <w:r>
-        <w:rPr/>
-        <w:t>Defines which page to return</w:t>
-      </w:r>
-    </w:p>
-    <w:p>
-      <w:pPr>
-        <w:pStyle w:val="normal1"/>
-        <w:numPr>
-          <w:ilvl w:val="3"/>
-          <w:numId w:val="1"/>
-        </w:numPr>
-        <w:ind w:hanging="360" w:left="2880"/>
-        <w:rPr/>
-      </w:pPr>
-      <w:r>
-        <w:rPr/>
-        <w:t>First page = 0 (zero)</w:t>
-      </w:r>
-    </w:p>
-    <w:p>
-      <w:pPr>
-        <w:pStyle w:val="normal1"/>
-        <w:numPr>
-          <w:ilvl w:val="2"/>
-          <w:numId w:val="1"/>
-        </w:numPr>
-        <w:ind w:hanging="360" w:left="2160"/>
-        <w:rPr/>
-      </w:pPr>
-      <w:r>
-        <w:rPr/>
-        <w:t>page_size={num_of_rows}</w:t>
-      </w:r>
-    </w:p>
-    <w:p>
-      <w:pPr>
-        <w:pStyle w:val="normal1"/>
-        <w:numPr>
-          <w:ilvl w:val="3"/>
-          <w:numId w:val="1"/>
-        </w:numPr>
-        <w:ind w:hanging="360" w:left="2880"/>
-        <w:rPr>
-          <w:color w:val="FF0000"/>
-        </w:rPr>
-      </w:pPr>
-      <w:r>
-        <w:rPr>
-          <w:color w:val="FF0000"/>
-        </w:rPr>
-        <w:t>Required</w:t>
-      </w:r>
-    </w:p>
-    <w:p>
-      <w:pPr>
-        <w:pStyle w:val="normal1"/>
-        <w:numPr>
-          <w:ilvl w:val="3"/>
-          <w:numId w:val="1"/>
-        </w:numPr>
-        <w:ind w:hanging="360" w:left="2880"/>
-        <w:rPr/>
-      </w:pPr>
-      <w:r>
-        <w:rPr/>
-        <w:t>Defines how many rows to return for the selected page</w:t>
-      </w:r>
-    </w:p>
-    <w:p>
-      <w:pPr>
-        <w:pStyle w:val="normal1"/>
-        <w:numPr>
-          <w:ilvl w:val="1"/>
-          <w:numId w:val="1"/>
-        </w:numPr>
-        <w:ind w:hanging="360" w:left="1440"/>
-        <w:rPr/>
-      </w:pPr>
-      <w:r>
-        <w:rPr/>
-        <w:t xml:space="preserve">returns: </w:t>
-      </w:r>
-    </w:p>
-    <w:p>
-      <w:pPr>
-        <w:pStyle w:val="normal1"/>
-        <w:widowControl/>
-        <w:numPr>
-          <w:ilvl w:val="2"/>
-          <w:numId w:val="1"/>
-        </w:numPr>
-        <w:suppressAutoHyphens w:val="true"/>
-        <w:bidi w:val="0"/>
-        <w:spacing w:lineRule="auto" w:line="276" w:before="0" w:after="0"/>
-        <w:ind w:hanging="360" w:left="2160" w:right="0"/>
-        <w:jc w:val="left"/>
-        <w:rPr>
-          <w:b w:val="false"/>
-          <w:bCs w:val="false"/>
-        </w:rPr>
-      </w:pPr>
-      <w:r>
-        <w:rPr>
-          <w:b w:val="false"/>
-          <w:bCs w:val="false"/>
-          <w:color w:val="000000"/>
-        </w:rPr>
-        <w:t>a list of RoundGroup Rows for the Tournament scope</w:t>
-      </w:r>
-    </w:p>
-    <w:p>
-      <w:pPr>
-        <w:pStyle w:val="normal1"/>
-        <w:numPr>
-          <w:ilvl w:val="0"/>
-          <w:numId w:val="1"/>
-        </w:numPr>
-        <w:ind w:hanging="360" w:left="720"/>
-        <w:rPr/>
-      </w:pPr>
-      <w:r>
-        <w:rPr/>
-        <w:t>GET RoundGroups of Division</w:t>
-      </w:r>
-    </w:p>
-    <w:p>
-      <w:pPr>
-        <w:pStyle w:val="normal1"/>
-        <w:numPr>
-          <w:ilvl w:val="1"/>
-          <w:numId w:val="1"/>
-        </w:numPr>
-        <w:ind w:hanging="360" w:left="1440"/>
-        <w:rPr/>
-      </w:pPr>
-      <w:r>
-        <w:rPr/>
-        <w:t xml:space="preserve">built_including_tests: </w:t>
-      </w:r>
-      <w:r>
-        <w:rPr>
-          <w:b/>
-          <w:bCs/>
-        </w:rPr>
-        <w:t>true</w:t>
-      </w:r>
-    </w:p>
-    <w:p>
-      <w:pPr>
-        <w:pStyle w:val="normal1"/>
-        <w:numPr>
-          <w:ilvl w:val="1"/>
-          <w:numId w:val="1"/>
-        </w:numPr>
-        <w:ind w:hanging="360" w:left="1440"/>
-        <w:rPr/>
-      </w:pPr>
-      <w:r>
-        <w:rPr/>
-        <w:t>HTTP method: ‘GET’</w:t>
-      </w:r>
-    </w:p>
-    <w:p>
-      <w:pPr>
-        <w:pStyle w:val="normal1"/>
-        <w:numPr>
-          <w:ilvl w:val="1"/>
-          <w:numId w:val="1"/>
-        </w:numPr>
-        <w:ind w:hanging="360" w:left="1440"/>
-        <w:rPr/>
-      </w:pPr>
-      <w:r>
-        <w:rPr/>
-        <w:t>endpoint: {base_uri}/api/divisions/{id}/roundgroups?page={page_num}&amp;page_size={num_of_rows}</w:t>
-      </w:r>
-    </w:p>
-    <w:p>
-      <w:pPr>
-        <w:pStyle w:val="normal1"/>
-        <w:numPr>
-          <w:ilvl w:val="1"/>
-          <w:numId w:val="1"/>
-        </w:numPr>
-        <w:ind w:hanging="360" w:left="1440"/>
-        <w:rPr/>
-      </w:pPr>
-      <w:r>
-        <w:rPr/>
-        <w:t xml:space="preserve">description: </w:t>
-      </w:r>
-    </w:p>
-    <w:p>
-      <w:pPr>
-        <w:pStyle w:val="normal1"/>
-        <w:numPr>
-          <w:ilvl w:val="1"/>
-          <w:numId w:val="1"/>
-        </w:numPr>
-        <w:ind w:hanging="360" w:left="1440"/>
-        <w:rPr/>
-      </w:pPr>
-      <w:r>
-        <w:rPr/>
-        <w:t>parameters:</w:t>
-      </w:r>
-    </w:p>
-    <w:p>
-      <w:pPr>
-        <w:pStyle w:val="normal1"/>
-        <w:numPr>
-          <w:ilvl w:val="2"/>
-          <w:numId w:val="1"/>
-        </w:numPr>
-        <w:ind w:hanging="360" w:left="2160"/>
-        <w:rPr/>
-      </w:pPr>
-      <w:r>
-        <w:rPr/>
-        <w:t>id</w:t>
-      </w:r>
-    </w:p>
-    <w:p>
-      <w:pPr>
-        <w:pStyle w:val="normal1"/>
-        <w:numPr>
-          <w:ilvl w:val="3"/>
-          <w:numId w:val="1"/>
-        </w:numPr>
-        <w:ind w:hanging="360" w:left="2880"/>
-        <w:rPr>
-          <w:color w:val="FF0000"/>
-        </w:rPr>
-      </w:pPr>
-      <w:r>
-        <w:rPr>
-          <w:color w:val="FF0000"/>
-        </w:rPr>
-        <w:t>Required</w:t>
-      </w:r>
-    </w:p>
-    <w:p>
-      <w:pPr>
-        <w:pStyle w:val="normal1"/>
-        <w:numPr>
-          <w:ilvl w:val="3"/>
-          <w:numId w:val="1"/>
-        </w:numPr>
-        <w:ind w:hanging="360" w:left="2880"/>
-        <w:rPr/>
-      </w:pPr>
-      <w:r>
-        <w:rPr/>
-        <w:t>ID of the Division the RoundGroups belong to</w:t>
-      </w:r>
-    </w:p>
-    <w:p>
-      <w:pPr>
-        <w:pStyle w:val="normal1"/>
-        <w:numPr>
-          <w:ilvl w:val="2"/>
-          <w:numId w:val="1"/>
-        </w:numPr>
-        <w:ind w:hanging="360" w:left="2160"/>
-        <w:rPr/>
-      </w:pPr>
-      <w:r>
-        <w:rPr/>
-        <w:t>page={page_num}</w:t>
-      </w:r>
-    </w:p>
-    <w:p>
-      <w:pPr>
-        <w:pStyle w:val="normal1"/>
-        <w:numPr>
-          <w:ilvl w:val="3"/>
-          <w:numId w:val="1"/>
-        </w:numPr>
-        <w:ind w:hanging="360" w:left="2880"/>
-        <w:rPr>
-          <w:color w:val="FF0000"/>
-        </w:rPr>
-      </w:pPr>
-      <w:r>
-        <w:rPr>
-          <w:color w:val="FF0000"/>
-        </w:rPr>
-        <w:t>Required</w:t>
-      </w:r>
-    </w:p>
-    <w:p>
-      <w:pPr>
-        <w:pStyle w:val="normal1"/>
-        <w:numPr>
-          <w:ilvl w:val="3"/>
-          <w:numId w:val="1"/>
-        </w:numPr>
-        <w:ind w:hanging="360" w:left="2880"/>
-        <w:rPr/>
-      </w:pPr>
-      <w:r>
-        <w:rPr/>
-        <w:t>Defines which page to return</w:t>
-      </w:r>
-    </w:p>
-    <w:p>
-      <w:pPr>
-        <w:pStyle w:val="normal1"/>
-        <w:numPr>
-          <w:ilvl w:val="3"/>
-          <w:numId w:val="1"/>
-        </w:numPr>
-        <w:ind w:hanging="360" w:left="2880"/>
-        <w:rPr/>
-      </w:pPr>
-      <w:r>
-        <w:rPr/>
-        <w:t>First page = 0 (zero)</w:t>
-      </w:r>
-    </w:p>
-    <w:p>
-      <w:pPr>
-        <w:pStyle w:val="normal1"/>
-        <w:numPr>
-          <w:ilvl w:val="2"/>
-          <w:numId w:val="1"/>
-        </w:numPr>
-        <w:ind w:hanging="360" w:left="2160"/>
-        <w:rPr/>
-      </w:pPr>
-      <w:r>
-        <w:rPr/>
-        <w:t>page_size={num_of_rows}</w:t>
-      </w:r>
-    </w:p>
-    <w:p>
-      <w:pPr>
-        <w:pStyle w:val="normal1"/>
-        <w:numPr>
-          <w:ilvl w:val="3"/>
-          <w:numId w:val="1"/>
-        </w:numPr>
-        <w:ind w:hanging="360" w:left="2880"/>
-        <w:rPr>
-          <w:color w:val="FF0000"/>
-        </w:rPr>
-      </w:pPr>
-      <w:r>
-        <w:rPr>
-          <w:color w:val="FF0000"/>
-        </w:rPr>
-        <w:t>Required</w:t>
-      </w:r>
-    </w:p>
-    <w:p>
-      <w:pPr>
-        <w:pStyle w:val="normal1"/>
-        <w:numPr>
-          <w:ilvl w:val="3"/>
-          <w:numId w:val="1"/>
-        </w:numPr>
-        <w:ind w:hanging="360" w:left="2880"/>
-        <w:rPr/>
-      </w:pPr>
-      <w:r>
-        <w:rPr/>
-        <w:t>Defines how many rows to return for the selected page</w:t>
-      </w:r>
-    </w:p>
-    <w:p>
-      <w:pPr>
-        <w:pStyle w:val="normal1"/>
-        <w:numPr>
-          <w:ilvl w:val="1"/>
-          <w:numId w:val="1"/>
-        </w:numPr>
-        <w:ind w:hanging="360" w:left="1440"/>
-        <w:rPr/>
-      </w:pPr>
-      <w:r>
-        <w:rPr/>
-        <w:t xml:space="preserve">returns: </w:t>
-      </w:r>
-    </w:p>
-    <w:p>
-      <w:pPr>
-        <w:pStyle w:val="normal1"/>
-        <w:widowControl/>
-        <w:numPr>
-          <w:ilvl w:val="2"/>
-          <w:numId w:val="1"/>
-        </w:numPr>
-        <w:suppressAutoHyphens w:val="true"/>
-        <w:bidi w:val="0"/>
-        <w:spacing w:lineRule="auto" w:line="276" w:before="0" w:after="0"/>
-        <w:ind w:hanging="360" w:left="2160" w:right="0"/>
-        <w:jc w:val="left"/>
-        <w:rPr>
-          <w:b w:val="false"/>
-          <w:bCs w:val="false"/>
-        </w:rPr>
-      </w:pPr>
-      <w:r>
-        <w:rPr>
-          <w:b w:val="false"/>
-          <w:bCs w:val="false"/>
-          <w:color w:val="000000"/>
-        </w:rPr>
-        <w:t>a list of RoundGroups for the Division</w:t>
-      </w:r>
-    </w:p>
-    <w:p>
-      <w:pPr>
-        <w:pStyle w:val="normal1"/>
-        <w:numPr>
-          <w:ilvl w:val="0"/>
-          <w:numId w:val="1"/>
-        </w:numPr>
-        <w:ind w:hanging="360" w:left="720"/>
-        <w:rPr/>
-      </w:pPr>
-      <w:r>
-        <w:rPr/>
-        <w:t>GET RoundGroup Rows of Division</w:t>
-      </w:r>
-    </w:p>
-    <w:p>
-      <w:pPr>
-        <w:pStyle w:val="normal1"/>
-        <w:numPr>
-          <w:ilvl w:val="1"/>
-          <w:numId w:val="1"/>
-        </w:numPr>
-        <w:ind w:hanging="360" w:left="1440"/>
-        <w:rPr/>
-      </w:pPr>
-      <w:r>
-        <w:rPr/>
-        <w:t xml:space="preserve">built_including_tests: </w:t>
-      </w:r>
-      <w:r>
-        <w:rPr>
-          <w:b/>
-          <w:bCs/>
-        </w:rPr>
-        <w:t>true</w:t>
-      </w:r>
-    </w:p>
-    <w:p>
-      <w:pPr>
-        <w:pStyle w:val="normal1"/>
-        <w:numPr>
-          <w:ilvl w:val="1"/>
-          <w:numId w:val="1"/>
-        </w:numPr>
-        <w:ind w:hanging="360" w:left="1440"/>
-        <w:rPr/>
-      </w:pPr>
-      <w:r>
-        <w:rPr/>
-        <w:t>HTTP method: ‘GET’</w:t>
-      </w:r>
-    </w:p>
-    <w:p>
-      <w:pPr>
-        <w:pStyle w:val="normal1"/>
-        <w:numPr>
-          <w:ilvl w:val="1"/>
-          <w:numId w:val="1"/>
-        </w:numPr>
-        <w:ind w:hanging="360" w:left="1440"/>
-        <w:rPr/>
-      </w:pPr>
-      <w:r>
-        <w:rPr/>
-        <w:t>endpoint: {base_uri}/api/divisions/{id}/roundgroup-rows?page={page_num}&amp;page_size={num_of_rows}</w:t>
-      </w:r>
-    </w:p>
-    <w:p>
-      <w:pPr>
-        <w:pStyle w:val="normal1"/>
-        <w:numPr>
-          <w:ilvl w:val="1"/>
-          <w:numId w:val="1"/>
-        </w:numPr>
-        <w:ind w:hanging="360" w:left="1440"/>
-        <w:rPr/>
-      </w:pPr>
-      <w:r>
-        <w:rPr/>
-        <w:t xml:space="preserve">description: </w:t>
-      </w:r>
-    </w:p>
-    <w:p>
-      <w:pPr>
-        <w:pStyle w:val="normal1"/>
-        <w:numPr>
-          <w:ilvl w:val="1"/>
-          <w:numId w:val="1"/>
-        </w:numPr>
-        <w:ind w:hanging="360" w:left="1440"/>
-        <w:rPr/>
-      </w:pPr>
-      <w:r>
-        <w:rPr/>
-        <w:t>parameters:</w:t>
-      </w:r>
-    </w:p>
-    <w:p>
-      <w:pPr>
-        <w:pStyle w:val="normal1"/>
-        <w:numPr>
-          <w:ilvl w:val="2"/>
-          <w:numId w:val="1"/>
-        </w:numPr>
-        <w:ind w:hanging="360" w:left="2160"/>
-        <w:rPr/>
-      </w:pPr>
-      <w:r>
-        <w:rPr/>
-        <w:t>id</w:t>
-      </w:r>
-    </w:p>
-    <w:p>
-      <w:pPr>
-        <w:pStyle w:val="normal1"/>
-        <w:numPr>
-          <w:ilvl w:val="3"/>
-          <w:numId w:val="1"/>
-        </w:numPr>
-        <w:ind w:hanging="360" w:left="2880"/>
-        <w:rPr>
-          <w:color w:val="FF0000"/>
-        </w:rPr>
-      </w:pPr>
-      <w:r>
-        <w:rPr>
-          <w:color w:val="FF0000"/>
-        </w:rPr>
-        <w:t>Required</w:t>
-      </w:r>
-    </w:p>
-    <w:p>
-      <w:pPr>
-        <w:pStyle w:val="normal1"/>
-        <w:numPr>
-          <w:ilvl w:val="3"/>
-          <w:numId w:val="1"/>
-        </w:numPr>
-        <w:ind w:hanging="360" w:left="2880"/>
-        <w:rPr/>
-      </w:pPr>
-      <w:r>
-        <w:rPr/>
-        <w:t>ID of the Division the RoundGroup Rows belong to</w:t>
-      </w:r>
-    </w:p>
-    <w:p>
-      <w:pPr>
-        <w:pStyle w:val="normal1"/>
-        <w:numPr>
-          <w:ilvl w:val="2"/>
-          <w:numId w:val="1"/>
-        </w:numPr>
-        <w:ind w:hanging="360" w:left="2160"/>
-        <w:rPr/>
-      </w:pPr>
-      <w:r>
-        <w:rPr/>
-        <w:t>page={page_num}</w:t>
-      </w:r>
-    </w:p>
-    <w:p>
-      <w:pPr>
-        <w:pStyle w:val="normal1"/>
-        <w:numPr>
-          <w:ilvl w:val="3"/>
-          <w:numId w:val="1"/>
-        </w:numPr>
-        <w:ind w:hanging="360" w:left="2880"/>
-        <w:rPr>
-          <w:color w:val="FF0000"/>
-        </w:rPr>
-      </w:pPr>
-      <w:r>
-        <w:rPr>
-          <w:color w:val="FF0000"/>
-        </w:rPr>
-        <w:t>Required</w:t>
-      </w:r>
-    </w:p>
-    <w:p>
-      <w:pPr>
-        <w:pStyle w:val="normal1"/>
-        <w:numPr>
-          <w:ilvl w:val="3"/>
-          <w:numId w:val="1"/>
-        </w:numPr>
-        <w:ind w:hanging="360" w:left="2880"/>
-        <w:rPr/>
-      </w:pPr>
-      <w:r>
-        <w:rPr/>
-        <w:t>Defines which page to return</w:t>
-      </w:r>
-    </w:p>
-    <w:p>
-      <w:pPr>
-        <w:pStyle w:val="normal1"/>
-        <w:numPr>
-          <w:ilvl w:val="3"/>
-          <w:numId w:val="1"/>
-        </w:numPr>
-        <w:ind w:hanging="360" w:left="2880"/>
-        <w:rPr/>
-      </w:pPr>
-      <w:r>
-        <w:rPr/>
-        <w:t>First page = 0 (zero)</w:t>
-      </w:r>
-    </w:p>
-    <w:p>
-      <w:pPr>
-        <w:pStyle w:val="normal1"/>
-        <w:numPr>
-          <w:ilvl w:val="2"/>
-          <w:numId w:val="1"/>
-        </w:numPr>
-        <w:ind w:hanging="360" w:left="2160"/>
-        <w:rPr/>
-      </w:pPr>
-      <w:r>
-        <w:rPr/>
-        <w:t>page_size={num_of_rows}</w:t>
-      </w:r>
-    </w:p>
-    <w:p>
-      <w:pPr>
-        <w:pStyle w:val="normal1"/>
-        <w:numPr>
-          <w:ilvl w:val="3"/>
-          <w:numId w:val="1"/>
-        </w:numPr>
-        <w:ind w:hanging="360" w:left="2880"/>
-        <w:rPr>
-          <w:color w:val="FF0000"/>
-        </w:rPr>
-      </w:pPr>
-      <w:r>
-        <w:rPr>
-          <w:color w:val="FF0000"/>
-        </w:rPr>
-        <w:t>Required</w:t>
-      </w:r>
-    </w:p>
-    <w:p>
-      <w:pPr>
-        <w:pStyle w:val="normal1"/>
-        <w:numPr>
-          <w:ilvl w:val="3"/>
-          <w:numId w:val="1"/>
-        </w:numPr>
-        <w:ind w:hanging="360" w:left="2880"/>
-        <w:rPr/>
-      </w:pPr>
-      <w:r>
-        <w:rPr/>
-        <w:t>Defines how many rows to return for the selected page</w:t>
-      </w:r>
-    </w:p>
-    <w:p>
-      <w:pPr>
-        <w:pStyle w:val="normal1"/>
-        <w:numPr>
-          <w:ilvl w:val="1"/>
-          <w:numId w:val="1"/>
-        </w:numPr>
-        <w:ind w:hanging="360" w:left="1440"/>
-        <w:rPr/>
-      </w:pPr>
-      <w:r>
-        <w:rPr/>
-        <w:t xml:space="preserve">returns: </w:t>
-      </w:r>
-    </w:p>
-    <w:p>
-      <w:pPr>
-        <w:pStyle w:val="normal1"/>
-        <w:widowControl/>
-        <w:numPr>
-          <w:ilvl w:val="2"/>
-          <w:numId w:val="1"/>
-        </w:numPr>
-        <w:suppressAutoHyphens w:val="true"/>
-        <w:bidi w:val="0"/>
-        <w:spacing w:lineRule="auto" w:line="276" w:before="0" w:after="0"/>
-        <w:ind w:hanging="360" w:left="2160" w:right="0"/>
-        <w:jc w:val="left"/>
-        <w:rPr>
-          <w:b w:val="false"/>
-          <w:bCs w:val="false"/>
-        </w:rPr>
-      </w:pPr>
-      <w:r>
-        <w:rPr>
-          <w:b w:val="false"/>
-          <w:bCs w:val="false"/>
-          <w:color w:val="000000"/>
-        </w:rPr>
-        <w:t>a list of RoundGroup Rows for the Division</w:t>
-      </w:r>
-    </w:p>
-    <w:p>
-      <w:pPr>
-        <w:pStyle w:val="normal1"/>
-        <w:numPr>
-          <w:ilvl w:val="0"/>
-          <w:numId w:val="1"/>
-        </w:numPr>
-        <w:ind w:hanging="360" w:left="720"/>
-        <w:rPr/>
-      </w:pPr>
-      <w:r>
-        <w:rPr/>
-        <w:t>POST/Create RoundGroup</w:t>
-      </w:r>
-    </w:p>
-    <w:p>
-      <w:pPr>
-        <w:pStyle w:val="normal1"/>
-        <w:numPr>
-          <w:ilvl w:val="1"/>
-          <w:numId w:val="1"/>
-        </w:numPr>
-        <w:ind w:hanging="360" w:left="1440"/>
-        <w:rPr/>
-      </w:pPr>
-      <w:r>
-        <w:rPr/>
-        <w:t xml:space="preserve">built_including_tests: </w:t>
-      </w:r>
-      <w:r>
-        <w:rPr>
-          <w:b/>
-          <w:bCs/>
-        </w:rPr>
-        <w:t>true</w:t>
-      </w:r>
-    </w:p>
-    <w:p>
-      <w:pPr>
-        <w:pStyle w:val="normal1"/>
-        <w:numPr>
-          <w:ilvl w:val="1"/>
-          <w:numId w:val="1"/>
-        </w:numPr>
-        <w:ind w:hanging="360" w:left="1440"/>
-        <w:rPr/>
-      </w:pPr>
-      <w:r>
-        <w:rPr/>
-        <w:t>HTTP method: ‘POST’</w:t>
-      </w:r>
-    </w:p>
-    <w:p>
-      <w:pPr>
-        <w:pStyle w:val="normal1"/>
-        <w:numPr>
-          <w:ilvl w:val="1"/>
-          <w:numId w:val="1"/>
-        </w:numPr>
-        <w:ind w:hanging="360" w:left="1440"/>
-        <w:rPr/>
-      </w:pPr>
-      <w:r>
-        <w:rPr/>
-        <w:t>endpoint: {base_uri}/api/roundgroups</w:t>
-      </w:r>
-    </w:p>
-    <w:p>
-      <w:pPr>
-        <w:pStyle w:val="normal1"/>
-        <w:numPr>
-          <w:ilvl w:val="1"/>
-          <w:numId w:val="1"/>
-        </w:numPr>
-        <w:ind w:hanging="360" w:left="1440"/>
-        <w:rPr/>
-      </w:pPr>
-      <w:r>
-        <w:rPr/>
-        <w:t xml:space="preserve">description: </w:t>
-      </w:r>
-    </w:p>
-    <w:p>
-      <w:pPr>
-        <w:pStyle w:val="normal1"/>
-        <w:numPr>
-          <w:ilvl w:val="1"/>
-          <w:numId w:val="1"/>
-        </w:numPr>
-        <w:ind w:hanging="360" w:left="1440"/>
-        <w:rPr/>
-      </w:pPr>
-      <w:r>
-        <w:rPr/>
-        <w:t xml:space="preserve">body: </w:t>
-      </w:r>
-    </w:p>
-    <w:p>
-      <w:pPr>
-        <w:pStyle w:val="normal1"/>
-        <w:numPr>
-          <w:ilvl w:val="1"/>
-          <w:numId w:val="1"/>
-        </w:numPr>
-        <w:ind w:hanging="360" w:left="1440"/>
-        <w:rPr/>
-      </w:pPr>
-      <w:r>
-        <w:rPr/>
-        <w:t xml:space="preserve">parameters: </w:t>
-      </w:r>
-    </w:p>
-    <w:p>
-      <w:pPr>
-        <w:pStyle w:val="normal1"/>
-        <w:numPr>
-          <w:ilvl w:val="1"/>
-          <w:numId w:val="1"/>
-        </w:numPr>
-        <w:ind w:hanging="360" w:left="1440"/>
-        <w:rPr/>
-      </w:pPr>
-      <w:r>
-        <w:rPr/>
-        <w:t xml:space="preserve">returns: </w:t>
-      </w:r>
-    </w:p>
-    <w:p>
-      <w:pPr>
-        <w:pStyle w:val="normal1"/>
-        <w:widowControl/>
-        <w:numPr>
-          <w:ilvl w:val="2"/>
-          <w:numId w:val="1"/>
-        </w:numPr>
-        <w:suppressAutoHyphens w:val="true"/>
-        <w:bidi w:val="0"/>
-        <w:spacing w:lineRule="auto" w:line="276" w:before="0" w:after="0"/>
-        <w:ind w:hanging="360" w:left="2160" w:right="0"/>
-        <w:jc w:val="left"/>
-        <w:rPr/>
-      </w:pPr>
-      <w:r>
-        <w:rPr/>
-        <w:t>the created RoundGroup</w:t>
-      </w:r>
-    </w:p>
-    <w:p>
-      <w:pPr>
-        <w:pStyle w:val="normal1"/>
-        <w:numPr>
-          <w:ilvl w:val="0"/>
-          <w:numId w:val="1"/>
-        </w:numPr>
-        <w:ind w:hanging="360" w:left="720"/>
-        <w:rPr/>
-      </w:pPr>
-      <w:r>
-        <w:rPr/>
-        <w:t>PUT/Update RoundGroup</w:t>
-      </w:r>
-    </w:p>
-    <w:p>
-      <w:pPr>
-        <w:pStyle w:val="normal1"/>
-        <w:numPr>
-          <w:ilvl w:val="1"/>
-          <w:numId w:val="1"/>
-        </w:numPr>
-        <w:ind w:hanging="360" w:left="1440"/>
-        <w:rPr/>
-      </w:pPr>
-      <w:r>
-        <w:rPr/>
-        <w:t xml:space="preserve">built_including_tests: </w:t>
-      </w:r>
-      <w:r>
-        <w:rPr>
-          <w:b/>
-          <w:bCs/>
-        </w:rPr>
-        <w:t>true</w:t>
-      </w:r>
-    </w:p>
-    <w:p>
-      <w:pPr>
-        <w:pStyle w:val="normal1"/>
-        <w:numPr>
-          <w:ilvl w:val="1"/>
-          <w:numId w:val="1"/>
-        </w:numPr>
-        <w:ind w:hanging="360" w:left="1440"/>
-        <w:rPr/>
-      </w:pPr>
-      <w:r>
-        <w:rPr/>
-        <w:t>HTTP method: ‘PUT’</w:t>
-      </w:r>
-    </w:p>
-    <w:p>
-      <w:pPr>
-        <w:pStyle w:val="normal1"/>
-        <w:numPr>
-          <w:ilvl w:val="1"/>
-          <w:numId w:val="1"/>
-        </w:numPr>
-        <w:ind w:hanging="360" w:left="1440"/>
-        <w:rPr/>
-      </w:pPr>
-      <w:r>
-        <w:rPr/>
-        <w:t>endpoint: {base_uri}/api/roundgroups/{id}</w:t>
-      </w:r>
-    </w:p>
-    <w:p>
-      <w:pPr>
-        <w:pStyle w:val="normal1"/>
-        <w:numPr>
-          <w:ilvl w:val="1"/>
-          <w:numId w:val="1"/>
-        </w:numPr>
-        <w:ind w:hanging="360" w:left="1440"/>
-        <w:rPr/>
-      </w:pPr>
-      <w:r>
-        <w:rPr/>
-        <w:t xml:space="preserve">description: </w:t>
-      </w:r>
-    </w:p>
-    <w:p>
-      <w:pPr>
-        <w:pStyle w:val="normal1"/>
-        <w:numPr>
-          <w:ilvl w:val="1"/>
-          <w:numId w:val="1"/>
-        </w:numPr>
-        <w:ind w:hanging="360" w:left="1440"/>
-        <w:rPr/>
-      </w:pPr>
-      <w:r>
-        <w:rPr/>
-        <w:t xml:space="preserve">body: </w:t>
-      </w:r>
-    </w:p>
-    <w:p>
-      <w:pPr>
-        <w:pStyle w:val="normal1"/>
-        <w:widowControl/>
-        <w:numPr>
-          <w:ilvl w:val="2"/>
-          <w:numId w:val="1"/>
-        </w:numPr>
-        <w:suppressAutoHyphens w:val="true"/>
-        <w:bidi w:val="0"/>
-        <w:spacing w:lineRule="auto" w:line="276" w:before="0" w:after="0"/>
-        <w:ind w:hanging="360" w:left="2160" w:right="0"/>
-        <w:jc w:val="left"/>
-        <w:rPr/>
-      </w:pPr>
-      <w:r>
-        <w:rPr/>
-        <w:t>only fields that you want to update (other than ID in the URI path) need to be provided</w:t>
-      </w:r>
-    </w:p>
-    <w:p>
-      <w:pPr>
-        <w:pStyle w:val="normal1"/>
-        <w:numPr>
-          <w:ilvl w:val="1"/>
-          <w:numId w:val="1"/>
-        </w:numPr>
-        <w:ind w:hanging="360" w:left="1440"/>
-        <w:rPr/>
-      </w:pPr>
-      <w:r>
-        <w:rPr/>
-        <w:t>parameters:</w:t>
-      </w:r>
-    </w:p>
-    <w:p>
-      <w:pPr>
-        <w:pStyle w:val="normal1"/>
-        <w:numPr>
-          <w:ilvl w:val="2"/>
-          <w:numId w:val="1"/>
-        </w:numPr>
-        <w:ind w:hanging="360" w:left="2160"/>
-        <w:rPr/>
-      </w:pPr>
-      <w:r>
-        <w:rPr/>
-        <w:t>id</w:t>
-      </w:r>
-    </w:p>
-    <w:p>
-      <w:pPr>
-        <w:pStyle w:val="normal1"/>
-        <w:numPr>
-          <w:ilvl w:val="3"/>
-          <w:numId w:val="1"/>
-        </w:numPr>
-        <w:ind w:hanging="360" w:left="2880"/>
-        <w:rPr>
-          <w:color w:val="FF0000"/>
-        </w:rPr>
-      </w:pPr>
-      <w:r>
-        <w:rPr>
-          <w:color w:val="FF0000"/>
-        </w:rPr>
-        <w:t>Required</w:t>
-      </w:r>
-    </w:p>
-    <w:p>
-      <w:pPr>
-        <w:pStyle w:val="normal1"/>
-        <w:widowControl/>
-        <w:numPr>
-          <w:ilvl w:val="3"/>
-          <w:numId w:val="1"/>
-        </w:numPr>
-        <w:suppressAutoHyphens w:val="true"/>
-        <w:bidi w:val="0"/>
-        <w:spacing w:lineRule="auto" w:line="276" w:before="0" w:after="0"/>
-        <w:ind w:hanging="360" w:left="2880" w:right="0"/>
-        <w:jc w:val="left"/>
-        <w:rPr>
-          <w:color w:val="000000"/>
-        </w:rPr>
-      </w:pPr>
-      <w:r>
-        <w:rPr>
-          <w:color w:val="000000"/>
-        </w:rPr>
-        <w:t>ID of the RoundGroup to be updated</w:t>
-      </w:r>
-    </w:p>
-    <w:p>
-      <w:pPr>
-        <w:pStyle w:val="normal1"/>
-        <w:numPr>
-          <w:ilvl w:val="1"/>
-          <w:numId w:val="1"/>
-        </w:numPr>
-        <w:ind w:hanging="360" w:left="1440"/>
-        <w:rPr>
-          <w:color w:val="000000"/>
-        </w:rPr>
-      </w:pPr>
-      <w:r>
-        <w:rPr/>
-        <w:t xml:space="preserve">returns: </w:t>
-      </w:r>
-    </w:p>
-    <w:p>
-      <w:pPr>
-        <w:pStyle w:val="normal1"/>
-        <w:widowControl/>
-        <w:numPr>
-          <w:ilvl w:val="2"/>
-          <w:numId w:val="1"/>
-        </w:numPr>
-        <w:suppressAutoHyphens w:val="true"/>
-        <w:bidi w:val="0"/>
-        <w:spacing w:lineRule="auto" w:line="276" w:before="0" w:after="0"/>
-        <w:ind w:hanging="360" w:left="2160" w:right="0"/>
-        <w:jc w:val="left"/>
-        <w:rPr>
-          <w:color w:val="000000"/>
-        </w:rPr>
-      </w:pPr>
-      <w:r>
-        <w:rPr>
-          <w:color w:val="000000"/>
-        </w:rPr>
-        <w:t>the updated RoundGroup</w:t>
-      </w:r>
-    </w:p>
-    <w:p>
-      <w:pPr>
-        <w:pStyle w:val="normal1"/>
-        <w:numPr>
-          <w:ilvl w:val="0"/>
-          <w:numId w:val="1"/>
-        </w:numPr>
-        <w:ind w:hanging="360" w:left="720"/>
-        <w:rPr/>
-      </w:pPr>
-      <w:r>
-        <w:rPr/>
-        <w:t>DELETE RoundGroup (by ID)</w:t>
-      </w:r>
-    </w:p>
-    <w:p>
-      <w:pPr>
-        <w:pStyle w:val="normal1"/>
-        <w:numPr>
-          <w:ilvl w:val="1"/>
-          <w:numId w:val="1"/>
-        </w:numPr>
-        <w:ind w:hanging="360" w:left="1440"/>
-        <w:rPr/>
-      </w:pPr>
-      <w:r>
-        <w:rPr/>
-        <w:t xml:space="preserve">built_including_tests: </w:t>
-      </w:r>
-      <w:r>
-        <w:rPr>
-          <w:b/>
-          <w:bCs/>
-        </w:rPr>
-        <w:t>true</w:t>
-      </w:r>
-    </w:p>
-    <w:p>
-      <w:pPr>
-        <w:pStyle w:val="normal1"/>
-        <w:numPr>
-          <w:ilvl w:val="1"/>
-          <w:numId w:val="1"/>
-        </w:numPr>
-        <w:ind w:hanging="360" w:left="1440"/>
-        <w:rPr/>
-      </w:pPr>
-      <w:r>
-        <w:rPr/>
-        <w:t>HTTP method: ‘DELETE’</w:t>
-      </w:r>
-    </w:p>
-    <w:p>
-      <w:pPr>
-        <w:pStyle w:val="normal1"/>
-        <w:numPr>
-          <w:ilvl w:val="1"/>
-          <w:numId w:val="1"/>
-        </w:numPr>
-        <w:ind w:hanging="360" w:left="1440"/>
-        <w:rPr/>
-      </w:pPr>
-      <w:r>
-        <w:rPr/>
-        <w:t>endpoint: {base_uri}/api/roundgroups/{id}</w:t>
-      </w:r>
-    </w:p>
-    <w:p>
-      <w:pPr>
-        <w:pStyle w:val="normal1"/>
-        <w:numPr>
-          <w:ilvl w:val="1"/>
-          <w:numId w:val="1"/>
-        </w:numPr>
-        <w:ind w:hanging="360" w:left="1440"/>
-        <w:rPr/>
-      </w:pPr>
-      <w:r>
-        <w:rPr/>
-        <w:t>description: sets ‘del_fl’ flag to ‘true’</w:t>
-      </w:r>
-    </w:p>
-    <w:p>
-      <w:pPr>
-        <w:pStyle w:val="normal1"/>
-        <w:numPr>
-          <w:ilvl w:val="1"/>
-          <w:numId w:val="1"/>
-        </w:numPr>
-        <w:ind w:hanging="360" w:left="1440"/>
-        <w:rPr/>
-      </w:pPr>
-      <w:r>
-        <w:rPr/>
-        <w:t xml:space="preserve">parameters: </w:t>
-      </w:r>
-    </w:p>
-    <w:p>
-      <w:pPr>
-        <w:pStyle w:val="normal1"/>
-        <w:numPr>
-          <w:ilvl w:val="1"/>
-          <w:numId w:val="1"/>
-        </w:numPr>
-        <w:ind w:hanging="360" w:left="1440"/>
-        <w:rPr/>
-      </w:pPr>
-      <w:r>
-        <w:rPr/>
-        <w:t xml:space="preserve">returns: </w:t>
-      </w:r>
-    </w:p>
-    <w:p>
-      <w:pPr>
-        <w:pStyle w:val="normal1"/>
-        <w:widowControl/>
-        <w:numPr>
-          <w:ilvl w:val="2"/>
-          <w:numId w:val="1"/>
-        </w:numPr>
-        <w:suppressAutoHyphens w:val="true"/>
-        <w:bidi w:val="0"/>
-        <w:spacing w:lineRule="auto" w:line="276" w:before="0" w:after="0"/>
-        <w:ind w:hanging="360" w:left="2160" w:right="0"/>
-        <w:jc w:val="left"/>
-        <w:rPr>
-          <w:b w:val="false"/>
-          <w:bCs w:val="false"/>
-        </w:rPr>
-      </w:pPr>
-      <w:r>
-        <w:rPr>
-          <w:b w:val="false"/>
-          <w:bCs w:val="false"/>
-          <w:color w:val="000000"/>
-        </w:rPr>
-        <w:t>a 200 OK response only</w:t>
-      </w:r>
-    </w:p>
-    <w:p>
-      <w:pPr>
-        <w:pStyle w:val="normal1"/>
-        <w:numPr>
-          <w:ilvl w:val="0"/>
-          <w:numId w:val="1"/>
-        </w:numPr>
-        <w:ind w:hanging="360" w:left="720"/>
-        <w:rPr/>
-      </w:pPr>
-      <w:r>
-        <w:rPr/>
-        <w:t>DELETE/Purge RoundGroup (by ID)</w:t>
-      </w:r>
-    </w:p>
-    <w:p>
-      <w:pPr>
-        <w:pStyle w:val="normal1"/>
-        <w:numPr>
-          <w:ilvl w:val="1"/>
-          <w:numId w:val="1"/>
-        </w:numPr>
-        <w:ind w:hanging="360" w:left="1440"/>
-        <w:rPr/>
-      </w:pPr>
-      <w:r>
-        <w:rPr/>
-        <w:t xml:space="preserve">built_including_tests: </w:t>
-      </w:r>
-      <w:r>
-        <w:rPr>
-          <w:b/>
-          <w:bCs/>
-        </w:rPr>
-        <w:t>true</w:t>
-      </w:r>
-    </w:p>
-    <w:p>
-      <w:pPr>
-        <w:pStyle w:val="normal1"/>
-        <w:numPr>
-          <w:ilvl w:val="1"/>
-          <w:numId w:val="1"/>
-        </w:numPr>
-        <w:ind w:hanging="360" w:left="1440"/>
-        <w:rPr/>
-      </w:pPr>
-      <w:r>
-        <w:rPr/>
-        <w:t>HTTP method: ‘DELETE’</w:t>
-      </w:r>
-    </w:p>
-    <w:p>
-      <w:pPr>
-        <w:pStyle w:val="normal1"/>
-        <w:numPr>
-          <w:ilvl w:val="1"/>
-          <w:numId w:val="1"/>
-        </w:numPr>
-        <w:ind w:hanging="360" w:left="1440"/>
-        <w:rPr/>
-      </w:pPr>
-      <w:r>
-        <w:rPr/>
-        <w:t>endpoint: {base_uri}/api/roundgroups/{id}/purge</w:t>
-      </w:r>
-    </w:p>
-    <w:p>
-      <w:pPr>
-        <w:pStyle w:val="normal1"/>
-        <w:numPr>
-          <w:ilvl w:val="1"/>
-          <w:numId w:val="1"/>
-        </w:numPr>
-        <w:ind w:hanging="360" w:left="1440"/>
-        <w:rPr/>
-      </w:pPr>
-      <w:r>
-        <w:rPr/>
-        <w:t>description: destroys data in DB for this RoundGroup</w:t>
-      </w:r>
-    </w:p>
-    <w:p>
-      <w:pPr>
-        <w:pStyle w:val="normal1"/>
-        <w:numPr>
-          <w:ilvl w:val="1"/>
-          <w:numId w:val="1"/>
-        </w:numPr>
-        <w:ind w:hanging="360" w:left="1440"/>
-        <w:rPr/>
-      </w:pPr>
-      <w:r>
-        <w:rPr/>
-        <w:t xml:space="preserve">parameters: </w:t>
-      </w:r>
-    </w:p>
-    <w:p>
-      <w:pPr>
-        <w:pStyle w:val="normal1"/>
-        <w:numPr>
-          <w:ilvl w:val="1"/>
-          <w:numId w:val="1"/>
-        </w:numPr>
-        <w:ind w:hanging="360" w:left="1440"/>
-        <w:rPr/>
-      </w:pPr>
-      <w:r>
-        <w:rPr/>
-        <w:t xml:space="preserve">returns: </w:t>
-      </w:r>
-    </w:p>
-    <w:p>
-      <w:pPr>
-        <w:pStyle w:val="normal1"/>
-        <w:widowControl/>
-        <w:numPr>
-          <w:ilvl w:val="2"/>
-          <w:numId w:val="1"/>
-        </w:numPr>
-        <w:suppressAutoHyphens w:val="true"/>
-        <w:bidi w:val="0"/>
-        <w:spacing w:lineRule="auto" w:line="276" w:before="0" w:after="0"/>
-        <w:ind w:hanging="360" w:left="2160" w:right="0"/>
-        <w:jc w:val="left"/>
-        <w:rPr/>
-      </w:pPr>
-      <w:r>
-        <w:rPr>
-          <w:b w:val="false"/>
-          <w:bCs w:val="false"/>
-          <w:color w:val="000000"/>
-        </w:rPr>
-        <w:t>a 200 OK response only</w:t>
-      </w:r>
-    </w:p>
-    <w:p>
-      <w:pPr>
-        <w:pStyle w:val="normal1"/>
-        <w:widowControl/>
-        <w:suppressAutoHyphens w:val="true"/>
-        <w:bidi w:val="0"/>
-        <w:spacing w:lineRule="auto" w:line="276" w:before="0" w:after="0"/>
-        <w:ind w:hanging="360" w:left="360" w:right="0"/>
-        <w:jc w:val="left"/>
-        <w:rPr>
-          <w:color w:val="000000"/>
-        </w:rPr>
-      </w:pPr>
-      <w:r>
-        <w:rPr>
-          <w:color w:val="000000"/>
-        </w:rPr>
-      </w:r>
-    </w:p>
-    <w:p>
-      <w:pPr>
-        <w:pStyle w:val="normal1"/>
-        <w:widowControl/>
-        <w:suppressAutoHyphens w:val="true"/>
-        <w:bidi w:val="0"/>
-        <w:spacing w:lineRule="auto" w:line="276" w:before="0" w:after="0"/>
-        <w:ind w:hanging="360" w:left="360" w:right="0"/>
-        <w:jc w:val="left"/>
-        <w:rPr>
-          <w:color w:val="000000"/>
-        </w:rPr>
-      </w:pPr>
-      <w:r>
-        <w:rPr>
-          <w:color w:val="000000"/>
-        </w:rPr>
-      </w:r>
-    </w:p>
-    <w:p>
-      <w:pPr>
-        <w:pStyle w:val="normal1"/>
-        <w:rPr>
-          <w:b/>
-          <w:bCs/>
-        </w:rPr>
-      </w:pPr>
-      <w:r>
-        <w:rPr>
-          <w:b/>
-          <w:bCs/>
-        </w:rPr>
-        <w:t>Schedules</w:t>
-      </w:r>
-    </w:p>
-    <w:p>
-      <w:pPr>
-        <w:pStyle w:val="normal1"/>
-        <w:numPr>
-          <w:ilvl w:val="0"/>
-          <w:numId w:val="1"/>
-        </w:numPr>
-        <w:ind w:hanging="360" w:left="720"/>
-        <w:rPr/>
-      </w:pPr>
-      <w:r>
-        <w:rPr/>
-        <w:t>POST/Create Schedule for Division</w:t>
-      </w:r>
-    </w:p>
-    <w:p>
-      <w:pPr>
-        <w:pStyle w:val="normal1"/>
-        <w:numPr>
-          <w:ilvl w:val="1"/>
-          <w:numId w:val="1"/>
-        </w:numPr>
-        <w:ind w:hanging="360" w:left="1440"/>
-        <w:rPr/>
-      </w:pPr>
-      <w:r>
-        <w:rPr/>
-        <w:t xml:space="preserve">built_including_tests: </w:t>
-      </w:r>
-      <w:r>
-        <w:rPr>
-          <w:b/>
-          <w:bCs/>
-        </w:rPr>
-        <w:t>true</w:t>
-      </w:r>
-    </w:p>
-    <w:p>
-      <w:pPr>
-        <w:pStyle w:val="normal1"/>
-        <w:numPr>
-          <w:ilvl w:val="1"/>
-          <w:numId w:val="1"/>
-        </w:numPr>
-        <w:ind w:hanging="360" w:left="1440"/>
-        <w:rPr/>
-      </w:pPr>
-      <w:r>
-        <w:rPr/>
-        <w:t>HTTP method: ‘POST’</w:t>
-      </w:r>
-    </w:p>
-    <w:p>
-      <w:pPr>
-        <w:pStyle w:val="normal1"/>
-        <w:numPr>
-          <w:ilvl w:val="1"/>
-          <w:numId w:val="1"/>
-        </w:numPr>
-        <w:ind w:hanging="360" w:left="1440"/>
-        <w:rPr/>
-      </w:pPr>
-      <w:r>
-        <w:rPr/>
-        <w:t>endpoint: {base_uri}/api/schedule</w:t>
-      </w:r>
-    </w:p>
-    <w:p>
-      <w:pPr>
-        <w:pStyle w:val="normal1"/>
-        <w:numPr>
-          <w:ilvl w:val="1"/>
-          <w:numId w:val="1"/>
-        </w:numPr>
-        <w:ind w:hanging="360" w:left="1440"/>
-        <w:rPr/>
-      </w:pPr>
-      <w:r>
-        <w:rPr/>
-        <w:t>description: generates a Division’s schedule in one call: sessions (RoundGroups), PoolBracketGroups, pools and Team placements</w:t>
-      </w:r>
-    </w:p>
-    <w:p>
-      <w:pPr>
-        <w:pStyle w:val="normal1"/>
-        <w:numPr>
-          <w:ilvl w:val="1"/>
-          <w:numId w:val="1"/>
-        </w:numPr>
-        <w:ind w:hanging="360" w:left="1440"/>
-        <w:rPr/>
-      </w:pPr>
-      <w:r>
-        <w:rPr/>
-        <w:t xml:space="preserve">body: </w:t>
-      </w:r>
-    </w:p>
-    <w:p>
-      <w:pPr>
-        <w:pStyle w:val="normal1"/>
-        <w:numPr>
-          <w:ilvl w:val="2"/>
-          <w:numId w:val="1"/>
-        </w:numPr>
-        <w:ind w:hanging="360" w:left="2160"/>
-        <w:rPr/>
-      </w:pPr>
-      <w:r>
-        <w:rPr/>
-        <w:t>CreateScheduleRequest: did, session_names, num_pools, minutes between rounds, …</w:t>
+        <w:t>CreateScheduleRequest: did, pool_group_names, num_pools, minutes between rounds, …</w:t>
       </w:r>
     </w:p>
     <w:p>

</xml_diff>

<commit_message>
Added data foundation for features that depend on question type data per Round.
</commit_message>
<xml_diff>
--- a/docs/QView API Documentation.docx
+++ b/docs/QView API Documentation.docx
@@ -10,7 +10,7 @@
       </w:pPr>
       <w:r>
         <w:rPr/>
-        <w:t>QView API Documentation (v183_2026.10.27)</w:t>
+        <w:t>QView API Documentation (v184_2026.10.27)</w:t>
       </w:r>
     </w:p>
     <w:p>
@@ -39199,6 +39199,55 @@
       </w:pPr>
       <w:r>
         <w:rPr/>
+        <w:t xml:space="preserve">id</w:t>
+      </w:r>
+    </w:p>
+    <w:p>
+      <w:pPr>
+        <w:pStyle w:val="normal1"/>
+        <w:numPr>
+          <w:ilvl w:val="3"/>
+          <w:numId w:val="1"/>
+        </w:numPr>
+        <w:ind w:hanging="360" w:left="2880"/>
+        <w:rPr>
+          <w:color w:val="FF0000"/>
+        </w:rPr>
+      </w:pPr>
+      <w:r>
+        <w:rPr>
+          <w:color w:val="FF0000"/>
+        </w:rPr>
+        <w:t xml:space="preserve">Required</w:t>
+      </w:r>
+    </w:p>
+    <w:p>
+      <w:pPr>
+        <w:pStyle w:val="normal1"/>
+        <w:numPr>
+          <w:ilvl w:val="3"/>
+          <w:numId w:val="1"/>
+        </w:numPr>
+        <w:ind w:hanging="360" w:left="2880"/>
+        <w:rPr/>
+      </w:pPr>
+      <w:r>
+        <w:rPr/>
+        <w:t xml:space="preserve">ID of the Division</w:t>
+      </w:r>
+    </w:p>
+    <w:p>
+      <w:pPr>
+        <w:pStyle w:val="normal1"/>
+        <w:numPr>
+          <w:ilvl w:val="2"/>
+          <w:numId w:val="1"/>
+        </w:numPr>
+        <w:ind w:hanging="360" w:left="2160"/>
+        <w:rPr/>
+      </w:pPr>
+      <w:r>
+        <w:rPr/>
         <w:t>page={page_num}</w:t>
       </w:r>
     </w:p>
@@ -39298,6 +39347,309 @@
       <w:r>
         <w:rPr/>
         <w:t>Defines how many rows to return for the selected page</w:t>
+      </w:r>
+    </w:p>
+    <w:p>
+      <w:pPr>
+        <w:pStyle w:val="normal1"/>
+        <w:numPr>
+          <w:ilvl w:val="1"/>
+          <w:numId w:val="1"/>
+        </w:numPr>
+        <w:ind w:hanging="360" w:left="1440"/>
+        <w:rPr/>
+      </w:pPr>
+      <w:r>
+        <w:rPr/>
+        <w:t xml:space="preserve">returns: </w:t>
+      </w:r>
+    </w:p>
+    <w:p>
+      <w:pPr>
+        <w:pStyle w:val="normal1"/>
+        <w:numPr>
+          <w:ilvl w:val="2"/>
+          <w:numId w:val="1"/>
+        </w:numPr>
+        <w:ind w:hanging="360" w:left="2160"/>
+        <w:rPr/>
+      </w:pPr>
+      <w:r>
+        <w:rPr/>
+        <w:t xml:space="preserve">a PagedResponse (count + items) of RoundRows</w:t>
+      </w:r>
+    </w:p>
+    <w:p>
+      <w:pPr>
+        <w:pStyle w:val="normal1"/>
+        <w:numPr>
+          <w:ilvl w:val="0"/>
+          <w:numId w:val="1"/>
+        </w:numPr>
+        <w:ind w:hanging="360" w:left="720"/>
+        <w:rPr/>
+      </w:pPr>
+      <w:r>
+        <w:rPr/>
+        <w:t xml:space="preserve">GET Round Question Types of Division</w:t>
+      </w:r>
+    </w:p>
+    <w:p>
+      <w:pPr>
+        <w:pStyle w:val="normal1"/>
+        <w:numPr>
+          <w:ilvl w:val="1"/>
+          <w:numId w:val="1"/>
+        </w:numPr>
+        <w:ind w:hanging="360" w:left="1440"/>
+        <w:rPr/>
+      </w:pPr>
+      <w:r>
+        <w:rPr/>
+        <w:t xml:space="preserve">built_including_tests: </w:t>
+      </w:r>
+      <w:r>
+        <w:rPr>
+          <w:b/>
+          <w:bCs/>
+        </w:rPr>
+        <w:t>true</w:t>
+      </w:r>
+    </w:p>
+    <w:p>
+      <w:pPr>
+        <w:pStyle w:val="normal1"/>
+        <w:numPr>
+          <w:ilvl w:val="1"/>
+          <w:numId w:val="1"/>
+        </w:numPr>
+        <w:ind w:hanging="360" w:left="1440"/>
+        <w:rPr/>
+      </w:pPr>
+      <w:r>
+        <w:rPr/>
+        <w:t xml:space="preserve">HTTP method: ‘GET’</w:t>
+      </w:r>
+    </w:p>
+    <w:p>
+      <w:pPr>
+        <w:pStyle w:val="normal1"/>
+        <w:numPr>
+          <w:ilvl w:val="1"/>
+          <w:numId w:val="1"/>
+        </w:numPr>
+        <w:ind w:hanging="360" w:left="1440"/>
+        <w:rPr/>
+      </w:pPr>
+      <w:r>
+        <w:rPr/>
+        <w:t xml:space="preserve">endpoint: {base_uri}/api/divisions/{id}/round-question-types</w:t>
+      </w:r>
+    </w:p>
+    <w:p>
+      <w:pPr>
+        <w:pStyle w:val="normal1"/>
+        <w:numPr>
+          <w:ilvl w:val="1"/>
+          <w:numId w:val="1"/>
+        </w:numPr>
+        <w:ind w:hanging="360" w:left="1440"/>
+        <w:rPr/>
+      </w:pPr>
+      <w:r>
+        <w:rPr/>
+        <w:t xml:space="preserve">description: every Round of the Division (in schedule order) with its question_types and using_standard_question_types, plus complete: true only when every Round has a question type for all 20 questions. Features built on question types (e.g. stats) should only be usable when complete is true.</w:t>
+      </w:r>
+    </w:p>
+    <w:p>
+      <w:pPr>
+        <w:pStyle w:val="normal1"/>
+        <w:numPr>
+          <w:ilvl w:val="1"/>
+          <w:numId w:val="1"/>
+        </w:numPr>
+        <w:ind w:hanging="360" w:left="1440"/>
+        <w:rPr/>
+      </w:pPr>
+      <w:r>
+        <w:rPr/>
+        <w:t xml:space="preserve">parameters:</w:t>
+      </w:r>
+    </w:p>
+    <w:p>
+      <w:pPr>
+        <w:pStyle w:val="normal1"/>
+        <w:numPr>
+          <w:ilvl w:val="2"/>
+          <w:numId w:val="1"/>
+        </w:numPr>
+        <w:ind w:hanging="360" w:left="2160"/>
+        <w:rPr/>
+      </w:pPr>
+      <w:r>
+        <w:rPr/>
+        <w:t xml:space="preserve">id</w:t>
+      </w:r>
+    </w:p>
+    <w:p>
+      <w:pPr>
+        <w:pStyle w:val="normal1"/>
+        <w:numPr>
+          <w:ilvl w:val="3"/>
+          <w:numId w:val="1"/>
+        </w:numPr>
+        <w:ind w:hanging="360" w:left="2880"/>
+        <w:rPr>
+          <w:color w:val="FF0000"/>
+        </w:rPr>
+      </w:pPr>
+      <w:r>
+        <w:rPr>
+          <w:color w:val="FF0000"/>
+        </w:rPr>
+        <w:t xml:space="preserve">Required</w:t>
+      </w:r>
+    </w:p>
+    <w:p>
+      <w:pPr>
+        <w:pStyle w:val="normal1"/>
+        <w:numPr>
+          <w:ilvl w:val="3"/>
+          <w:numId w:val="1"/>
+        </w:numPr>
+        <w:ind w:hanging="360" w:left="2880"/>
+        <w:rPr/>
+      </w:pPr>
+      <w:r>
+        <w:rPr/>
+        <w:t xml:space="preserve">ID of the Division</w:t>
+      </w:r>
+    </w:p>
+    <w:p>
+      <w:pPr>
+        <w:pStyle w:val="normal1"/>
+        <w:numPr>
+          <w:ilvl w:val="1"/>
+          <w:numId w:val="1"/>
+        </w:numPr>
+        <w:ind w:hanging="360" w:left="1440"/>
+        <w:rPr/>
+      </w:pPr>
+      <w:r>
+        <w:rPr/>
+        <w:t xml:space="preserve">returns: </w:t>
+      </w:r>
+    </w:p>
+    <w:p>
+      <w:pPr>
+        <w:pStyle w:val="normal1"/>
+        <w:numPr>
+          <w:ilvl w:val="2"/>
+          <w:numId w:val="1"/>
+        </w:numPr>
+        <w:ind w:hanging="360" w:left="2160"/>
+        <w:rPr/>
+      </w:pPr>
+      <w:r>
+        <w:rPr/>
+        <w:t xml:space="preserve">DivisionQuestionTypes: complete, rounds (an array of RoundQuestionTypes: roundid, name, scheduled_start_time, question_types, using_standard_question_types)</w:t>
+      </w:r>
+    </w:p>
+    <w:p>
+      <w:pPr>
+        <w:pStyle w:val="normal1"/>
+        <w:numPr>
+          <w:ilvl w:val="0"/>
+          <w:numId w:val="1"/>
+        </w:numPr>
+        <w:ind w:hanging="360" w:left="720"/>
+        <w:rPr/>
+      </w:pPr>
+      <w:r>
+        <w:rPr/>
+        <w:t>POST/Create Round</w:t>
+      </w:r>
+    </w:p>
+    <w:p>
+      <w:pPr>
+        <w:pStyle w:val="normal1"/>
+        <w:numPr>
+          <w:ilvl w:val="1"/>
+          <w:numId w:val="1"/>
+        </w:numPr>
+        <w:ind w:hanging="360" w:left="1440"/>
+        <w:rPr/>
+      </w:pPr>
+      <w:r>
+        <w:rPr/>
+        <w:t xml:space="preserve">built_including_tests: </w:t>
+      </w:r>
+      <w:r>
+        <w:rPr>
+          <w:b/>
+          <w:bCs/>
+        </w:rPr>
+        <w:t>true</w:t>
+      </w:r>
+    </w:p>
+    <w:p>
+      <w:pPr>
+        <w:pStyle w:val="normal1"/>
+        <w:numPr>
+          <w:ilvl w:val="1"/>
+          <w:numId w:val="1"/>
+        </w:numPr>
+        <w:ind w:hanging="360" w:left="1440"/>
+        <w:rPr/>
+      </w:pPr>
+      <w:r>
+        <w:rPr/>
+        <w:t>HTTP method: ‘POST’</w:t>
+      </w:r>
+    </w:p>
+    <w:p>
+      <w:pPr>
+        <w:pStyle w:val="normal1"/>
+        <w:numPr>
+          <w:ilvl w:val="1"/>
+          <w:numId w:val="1"/>
+        </w:numPr>
+        <w:ind w:hanging="360" w:left="1440"/>
+        <w:rPr/>
+      </w:pPr>
+      <w:r>
+        <w:rPr/>
+        <w:t>endpoint: {base_uri}/api/rounds</w:t>
+      </w:r>
+    </w:p>
+    <w:p>
+      <w:pPr>
+        <w:pStyle w:val="normal1"/>
+        <w:numPr>
+          <w:ilvl w:val="1"/>
+          <w:numId w:val="1"/>
+        </w:numPr>
+        <w:ind w:hanging="360" w:left="1440"/>
+        <w:rPr/>
+      </w:pPr>
+      <w:r>
+        <w:rPr/>
+        <w:t xml:space="preserve">description: </w:t>
+      </w:r>
+    </w:p>
+    <w:p>
+      <w:pPr>
+        <w:pStyle w:val="normal1"/>
+        <w:numPr>
+          <w:ilvl w:val="1"/>
+          <w:numId w:val="1"/>
+        </w:numPr>
+        <w:ind w:hanging="360" w:left="1440"/>
+        <w:rPr/>
+      </w:pPr>
+      <w:r>
+        <w:rPr/>
+        <w:t xml:space="preserve">body: </w:t>
       </w:r>
     </w:p>
     <w:p>
@@ -39313,111 +39665,41 @@
         <w:spacing w:lineRule="auto" w:line="276" w:before="0" w:after="0"/>
         <w:ind w:hanging="360" w:left="2160" w:right="0"/>
         <w:jc w:val="left"/>
-        <w:rPr>
-          <w:b/>
-          <w:bCs/>
-        </w:rPr>
+        <w:rPr/>
+      </w:pPr>
+      <w:r>
+        <w:rPr/>
+        <w:t>NewRound: did (the Division the Round belongs to), name, scheduled_start_time, optional question_types (20 type codes or ""; default "") and using_standard_question_types (default true); invalid question types return 422</w:t>
+      </w:r>
+    </w:p>
+    <w:p>
+      <w:pPr>
+        <w:pStyle w:val="normal1"/>
+        <w:numPr>
+          <w:ilvl w:val="1"/>
+          <w:numId w:val="1"/>
+        </w:numPr>
+        <w:ind w:hanging="360" w:left="1440"/>
+        <w:rPr/>
+      </w:pPr>
+      <w:r>
+        <w:rPr/>
+        <w:t xml:space="preserve">parameters: </w:t>
+      </w:r>
+    </w:p>
+    <w:p>
+      <w:pPr>
+        <w:pStyle w:val="normal1"/>
+        <w:numPr>
+          <w:ilvl w:val="1"/>
+          <w:numId w:val="1"/>
+        </w:numPr>
+        <w:ind w:hanging="360" w:left="1440"/>
+        <w:rPr/>
       </w:pPr>
       <w:r>
         <w:rPr/>
         <w:t xml:space="preserve">returns: </w:t>
-      </w:r>
-    </w:p>
-    <w:p>
-      <w:pPr>
-        <w:pStyle w:val="normal1"/>
-        <w:numPr>
-          <w:ilvl w:val="0"/>
-          <w:numId w:val="1"/>
-        </w:numPr>
-        <w:ind w:hanging="360" w:left="720"/>
-        <w:rPr/>
-      </w:pPr>
-      <w:r>
-        <w:rPr/>
-        <w:t>POST/Create Round</w:t>
-      </w:r>
-    </w:p>
-    <w:p>
-      <w:pPr>
-        <w:pStyle w:val="normal1"/>
-        <w:numPr>
-          <w:ilvl w:val="1"/>
-          <w:numId w:val="1"/>
-        </w:numPr>
-        <w:ind w:hanging="360" w:left="1440"/>
-        <w:rPr/>
-      </w:pPr>
-      <w:r>
-        <w:rPr/>
-        <w:t xml:space="preserve">built_including_tests: </w:t>
-      </w:r>
-      <w:r>
-        <w:rPr>
-          <w:b/>
-          <w:bCs/>
-        </w:rPr>
-        <w:t>true</w:t>
-      </w:r>
-    </w:p>
-    <w:p>
-      <w:pPr>
-        <w:pStyle w:val="normal1"/>
-        <w:numPr>
-          <w:ilvl w:val="1"/>
-          <w:numId w:val="1"/>
-        </w:numPr>
-        <w:ind w:hanging="360" w:left="1440"/>
-        <w:rPr/>
-      </w:pPr>
-      <w:r>
-        <w:rPr/>
-        <w:t>HTTP method: ‘POST’</w:t>
-      </w:r>
-    </w:p>
-    <w:p>
-      <w:pPr>
-        <w:pStyle w:val="normal1"/>
-        <w:numPr>
-          <w:ilvl w:val="1"/>
-          <w:numId w:val="1"/>
-        </w:numPr>
-        <w:ind w:hanging="360" w:left="1440"/>
-        <w:rPr/>
-      </w:pPr>
-      <w:r>
-        <w:rPr/>
-        <w:t>endpoint: {base_uri}/api/rounds</w:t>
-      </w:r>
-    </w:p>
-    <w:p>
-      <w:pPr>
-        <w:pStyle w:val="normal1"/>
-        <w:numPr>
-          <w:ilvl w:val="1"/>
-          <w:numId w:val="1"/>
-        </w:numPr>
-        <w:ind w:hanging="360" w:left="1440"/>
-        <w:rPr/>
-      </w:pPr>
-      <w:r>
-        <w:rPr/>
-        <w:t xml:space="preserve">description: </w:t>
-      </w:r>
-    </w:p>
-    <w:p>
-      <w:pPr>
-        <w:pStyle w:val="normal1"/>
-        <w:numPr>
-          <w:ilvl w:val="1"/>
-          <w:numId w:val="1"/>
-        </w:numPr>
-        <w:ind w:hanging="360" w:left="1440"/>
-        <w:rPr/>
-      </w:pPr>
-      <w:r>
-        <w:rPr/>
-        <w:t xml:space="preserve">body: </w:t>
       </w:r>
     </w:p>
     <w:p>
@@ -39437,22 +39719,183 @@
       </w:pPr>
       <w:r>
         <w:rPr/>
-        <w:t>NewRound: did (the Division the Round belongs to), name, scheduled_start_time</w:t>
-      </w:r>
-    </w:p>
-    <w:p>
-      <w:pPr>
-        <w:pStyle w:val="normal1"/>
-        <w:numPr>
-          <w:ilvl w:val="1"/>
-          <w:numId w:val="1"/>
-        </w:numPr>
-        <w:ind w:hanging="360" w:left="1440"/>
-        <w:rPr/>
-      </w:pPr>
-      <w:r>
-        <w:rPr/>
-        <w:t xml:space="preserve">parameters: </w:t>
+        <w:t>the created Round</w:t>
+      </w:r>
+    </w:p>
+    <w:p>
+      <w:pPr>
+        <w:pStyle w:val="normal1"/>
+        <w:numPr>
+          <w:ilvl w:val="0"/>
+          <w:numId w:val="1"/>
+        </w:numPr>
+        <w:ind w:hanging="360" w:left="720"/>
+        <w:rPr/>
+      </w:pPr>
+      <w:r>
+        <w:rPr/>
+        <w:t xml:space="preserve">POST/Read Question Types from a Question Set File</w:t>
+      </w:r>
+    </w:p>
+    <w:p>
+      <w:pPr>
+        <w:pStyle w:val="normal1"/>
+        <w:numPr>
+          <w:ilvl w:val="1"/>
+          <w:numId w:val="1"/>
+        </w:numPr>
+        <w:ind w:hanging="360" w:left="1440"/>
+        <w:rPr/>
+      </w:pPr>
+      <w:r>
+        <w:rPr/>
+        <w:t xml:space="preserve">built_including_tests: </w:t>
+      </w:r>
+      <w:r>
+        <w:rPr>
+          <w:b/>
+          <w:bCs/>
+        </w:rPr>
+        <w:t>true</w:t>
+      </w:r>
+    </w:p>
+    <w:p>
+      <w:pPr>
+        <w:pStyle w:val="normal1"/>
+        <w:numPr>
+          <w:ilvl w:val="1"/>
+          <w:numId w:val="1"/>
+        </w:numPr>
+        <w:ind w:hanging="360" w:left="1440"/>
+        <w:rPr/>
+      </w:pPr>
+      <w:r>
+        <w:rPr/>
+        <w:t xml:space="preserve">HTTP method: ‘POST’</w:t>
+      </w:r>
+    </w:p>
+    <w:p>
+      <w:pPr>
+        <w:pStyle w:val="normal1"/>
+        <w:numPr>
+          <w:ilvl w:val="1"/>
+          <w:numId w:val="1"/>
+        </w:numPr>
+        <w:ind w:hanging="360" w:left="1440"/>
+        <w:rPr/>
+      </w:pPr>
+      <w:r>
+        <w:rPr/>
+        <w:t xml:space="preserve">endpoint: {base_uri}/api/divisions/{id}/round-question-types/parse</w:t>
+      </w:r>
+    </w:p>
+    <w:p>
+      <w:pPr>
+        <w:pStyle w:val="normal1"/>
+        <w:numPr>
+          <w:ilvl w:val="1"/>
+          <w:numId w:val="1"/>
+        </w:numPr>
+        <w:ind w:hanging="360" w:left="1440"/>
+        <w:rPr/>
+      </w:pPr>
+      <w:r>
+        <w:rPr/>
+        <w:t xml:space="preserve">description: reads the question types out of an uploaded question set file (.rtf or .csv) without saving anything, so they can be reviewed before saving. Requires round:upload_question_types plus round:update as the Tournament’s owner or one of its admins.</w:t>
+      </w:r>
+    </w:p>
+    <w:p>
+      <w:pPr>
+        <w:pStyle w:val="normal1"/>
+        <w:numPr>
+          <w:ilvl w:val="1"/>
+          <w:numId w:val="1"/>
+        </w:numPr>
+        <w:ind w:hanging="360" w:left="1440"/>
+        <w:rPr/>
+      </w:pPr>
+      <w:r>
+        <w:rPr/>
+        <w:t xml:space="preserve">body: </w:t>
+      </w:r>
+    </w:p>
+    <w:p>
+      <w:pPr>
+        <w:pStyle w:val="normal1"/>
+        <w:numPr>
+          <w:ilvl w:val="2"/>
+          <w:numId w:val="1"/>
+        </w:numPr>
+        <w:ind w:hanging="360" w:left="2160"/>
+        <w:rPr/>
+      </w:pPr>
+      <w:r>
+        <w:rPr/>
+        <w:t xml:space="preserve">filename (its extension picks the format), content (the file’s text)</w:t>
+      </w:r>
+    </w:p>
+    <w:p>
+      <w:pPr>
+        <w:pStyle w:val="normal1"/>
+        <w:numPr>
+          <w:ilvl w:val="1"/>
+          <w:numId w:val="1"/>
+        </w:numPr>
+        <w:ind w:hanging="360" w:left="1440"/>
+        <w:rPr/>
+      </w:pPr>
+      <w:r>
+        <w:rPr/>
+        <w:t xml:space="preserve">parameters:</w:t>
+      </w:r>
+    </w:p>
+    <w:p>
+      <w:pPr>
+        <w:pStyle w:val="normal1"/>
+        <w:numPr>
+          <w:ilvl w:val="2"/>
+          <w:numId w:val="1"/>
+        </w:numPr>
+        <w:ind w:hanging="360" w:left="2160"/>
+        <w:rPr/>
+      </w:pPr>
+      <w:r>
+        <w:rPr/>
+        <w:t xml:space="preserve">id</w:t>
+      </w:r>
+    </w:p>
+    <w:p>
+      <w:pPr>
+        <w:pStyle w:val="normal1"/>
+        <w:numPr>
+          <w:ilvl w:val="3"/>
+          <w:numId w:val="1"/>
+        </w:numPr>
+        <w:ind w:hanging="360" w:left="2880"/>
+        <w:rPr>
+          <w:color w:val="FF0000"/>
+        </w:rPr>
+      </w:pPr>
+      <w:r>
+        <w:rPr>
+          <w:color w:val="FF0000"/>
+        </w:rPr>
+        <w:t xml:space="preserve">Required</w:t>
+      </w:r>
+    </w:p>
+    <w:p>
+      <w:pPr>
+        <w:pStyle w:val="normal1"/>
+        <w:numPr>
+          <w:ilvl w:val="3"/>
+          <w:numId w:val="1"/>
+        </w:numPr>
+        <w:ind w:hanging="360" w:left="2880"/>
+        <w:rPr/>
+      </w:pPr>
+      <w:r>
+        <w:rPr/>
+        <w:t xml:space="preserve">ID of the Division</w:t>
       </w:r>
     </w:p>
     <w:p>
@@ -39468,6 +39911,118 @@
       <w:r>
         <w:rPr/>
         <w:t xml:space="preserve">returns: </w:t>
+      </w:r>
+    </w:p>
+    <w:p>
+      <w:pPr>
+        <w:pStyle w:val="normal1"/>
+        <w:numPr>
+          <w:ilvl w:val="2"/>
+          <w:numId w:val="1"/>
+        </w:numPr>
+        <w:ind w:hanging="360" w:left="2160"/>
+        <w:rPr/>
+      </w:pPr>
+      <w:r>
+        <w:rPr/>
+        <w:t xml:space="preserve">ParsedQuestionSetFile: sets (an array of ParsedQuestionSet: name, question_types, errors) and file-level errors</w:t>
+      </w:r>
+    </w:p>
+    <w:p>
+      <w:pPr>
+        <w:pStyle w:val="normal1"/>
+        <w:numPr>
+          <w:ilvl w:val="0"/>
+          <w:numId w:val="1"/>
+        </w:numPr>
+        <w:ind w:hanging="360" w:left="720"/>
+        <w:rPr/>
+      </w:pPr>
+      <w:r>
+        <w:rPr/>
+        <w:t>PUT/Update Round</w:t>
+      </w:r>
+    </w:p>
+    <w:p>
+      <w:pPr>
+        <w:pStyle w:val="normal1"/>
+        <w:numPr>
+          <w:ilvl w:val="1"/>
+          <w:numId w:val="1"/>
+        </w:numPr>
+        <w:ind w:hanging="360" w:left="1440"/>
+        <w:rPr/>
+      </w:pPr>
+      <w:r>
+        <w:rPr/>
+        <w:t xml:space="preserve">built_including_tests: </w:t>
+      </w:r>
+      <w:r>
+        <w:rPr>
+          <w:b/>
+          <w:bCs/>
+        </w:rPr>
+        <w:t>true</w:t>
+      </w:r>
+    </w:p>
+    <w:p>
+      <w:pPr>
+        <w:pStyle w:val="normal1"/>
+        <w:numPr>
+          <w:ilvl w:val="1"/>
+          <w:numId w:val="1"/>
+        </w:numPr>
+        <w:ind w:hanging="360" w:left="1440"/>
+        <w:rPr/>
+      </w:pPr>
+      <w:r>
+        <w:rPr/>
+        <w:t>HTTP method: ‘PUT’</w:t>
+      </w:r>
+    </w:p>
+    <w:p>
+      <w:pPr>
+        <w:pStyle w:val="normal1"/>
+        <w:numPr>
+          <w:ilvl w:val="1"/>
+          <w:numId w:val="1"/>
+        </w:numPr>
+        <w:ind w:hanging="360" w:left="1440"/>
+        <w:rPr/>
+      </w:pPr>
+      <w:r>
+        <w:rPr/>
+        <w:t>endpoint: {base_uri}/api/rounds/{id}</w:t>
+      </w:r>
+    </w:p>
+    <w:p>
+      <w:pPr>
+        <w:pStyle w:val="normal1"/>
+        <w:numPr>
+          <w:ilvl w:val="1"/>
+          <w:numId w:val="1"/>
+        </w:numPr>
+        <w:ind w:hanging="360" w:left="1440"/>
+        <w:rPr/>
+      </w:pPr>
+      <w:r>
+        <w:rPr/>
+        <w:t xml:space="preserve">description: changes a Round’s name, scheduled_start_time, question_types (20 type codes in question order, or "" to clear) and/or using_standard_question_types (a Round can’t be moved to another Division); invalid question types return 422 with the reasons</w:t>
+      </w:r>
+    </w:p>
+    <w:p>
+      <w:pPr>
+        <w:pStyle w:val="normal1"/>
+        <w:numPr>
+          <w:ilvl w:val="1"/>
+          <w:numId w:val="1"/>
+        </w:numPr>
+        <w:ind w:hanging="360" w:left="1440"/>
+        <w:rPr/>
+      </w:pPr>
+      <w:r>
+        <w:rPr/>
+        <w:t xml:space="preserve">body: </w:t>
       </w:r>
     </w:p>
     <w:p>
@@ -39487,104 +40042,97 @@
       </w:pPr>
       <w:r>
         <w:rPr/>
-        <w:t>the created Round</w:t>
-      </w:r>
-    </w:p>
-    <w:p>
-      <w:pPr>
-        <w:pStyle w:val="normal1"/>
-        <w:numPr>
-          <w:ilvl w:val="0"/>
-          <w:numId w:val="1"/>
-        </w:numPr>
-        <w:ind w:hanging="360" w:left="720"/>
-        <w:rPr/>
-      </w:pPr>
-      <w:r>
-        <w:rPr/>
-        <w:t>PUT/Update Round</w:t>
-      </w:r>
-    </w:p>
-    <w:p>
-      <w:pPr>
-        <w:pStyle w:val="normal1"/>
-        <w:numPr>
-          <w:ilvl w:val="1"/>
-          <w:numId w:val="1"/>
-        </w:numPr>
-        <w:ind w:hanging="360" w:left="1440"/>
-        <w:rPr/>
-      </w:pPr>
-      <w:r>
-        <w:rPr/>
-        <w:t xml:space="preserve">built_including_tests: </w:t>
-      </w:r>
-      <w:r>
-        <w:rPr>
-          <w:b/>
-          <w:bCs/>
-        </w:rPr>
-        <w:t>true</w:t>
-      </w:r>
-    </w:p>
-    <w:p>
-      <w:pPr>
-        <w:pStyle w:val="normal1"/>
-        <w:numPr>
-          <w:ilvl w:val="1"/>
-          <w:numId w:val="1"/>
-        </w:numPr>
-        <w:ind w:hanging="360" w:left="1440"/>
-        <w:rPr/>
-      </w:pPr>
-      <w:r>
-        <w:rPr/>
-        <w:t>HTTP method: ‘PUT’</w:t>
-      </w:r>
-    </w:p>
-    <w:p>
-      <w:pPr>
-        <w:pStyle w:val="normal1"/>
-        <w:numPr>
-          <w:ilvl w:val="1"/>
-          <w:numId w:val="1"/>
-        </w:numPr>
-        <w:ind w:hanging="360" w:left="1440"/>
-        <w:rPr/>
-      </w:pPr>
-      <w:r>
-        <w:rPr/>
-        <w:t>endpoint: {base_uri}/api/rounds/{id}</w:t>
-      </w:r>
-    </w:p>
-    <w:p>
-      <w:pPr>
-        <w:pStyle w:val="normal1"/>
-        <w:numPr>
-          <w:ilvl w:val="1"/>
-          <w:numId w:val="1"/>
-        </w:numPr>
-        <w:ind w:hanging="360" w:left="1440"/>
-        <w:rPr/>
-      </w:pPr>
-      <w:r>
-        <w:rPr/>
-        <w:t xml:space="preserve">description: changes a Round’s name and/or scheduled_start_time (a Round can’t be moved to another Division)</w:t>
-      </w:r>
-    </w:p>
-    <w:p>
-      <w:pPr>
-        <w:pStyle w:val="normal1"/>
-        <w:numPr>
-          <w:ilvl w:val="1"/>
-          <w:numId w:val="1"/>
-        </w:numPr>
-        <w:ind w:hanging="360" w:left="1440"/>
-        <w:rPr/>
-      </w:pPr>
-      <w:r>
-        <w:rPr/>
-        <w:t xml:space="preserve">body: </w:t>
+        <w:t>only fields that you want to update (other than ID in the URI path) need to be provided</w:t>
+      </w:r>
+    </w:p>
+    <w:p>
+      <w:pPr>
+        <w:pStyle w:val="normal1"/>
+        <w:numPr>
+          <w:ilvl w:val="1"/>
+          <w:numId w:val="1"/>
+        </w:numPr>
+        <w:ind w:hanging="360" w:left="1440"/>
+        <w:rPr/>
+      </w:pPr>
+      <w:r>
+        <w:rPr/>
+        <w:t>parameters:</w:t>
+      </w:r>
+    </w:p>
+    <w:p>
+      <w:pPr>
+        <w:pStyle w:val="normal1"/>
+        <w:numPr>
+          <w:ilvl w:val="2"/>
+          <w:numId w:val="1"/>
+        </w:numPr>
+        <w:ind w:hanging="360" w:left="2160"/>
+        <w:rPr/>
+      </w:pPr>
+      <w:r>
+        <w:rPr/>
+        <w:t>id</w:t>
+      </w:r>
+    </w:p>
+    <w:p>
+      <w:pPr>
+        <w:pStyle w:val="normal1"/>
+        <w:numPr>
+          <w:ilvl w:val="3"/>
+          <w:numId w:val="1"/>
+        </w:numPr>
+        <w:ind w:hanging="360" w:left="2880"/>
+        <w:rPr>
+          <w:color w:val="FF0000"/>
+        </w:rPr>
+      </w:pPr>
+      <w:r>
+        <w:rPr>
+          <w:color w:val="FF0000"/>
+        </w:rPr>
+        <w:t>Required</w:t>
+      </w:r>
+    </w:p>
+    <w:p>
+      <w:pPr>
+        <w:pStyle w:val="normal1"/>
+        <w:widowControl/>
+        <w:numPr>
+          <w:ilvl w:val="3"/>
+          <w:numId w:val="1"/>
+        </w:numPr>
+        <w:suppressAutoHyphens w:val="true"/>
+        <w:bidi w:val="0"/>
+        <w:spacing w:lineRule="auto" w:line="276" w:before="0" w:after="0"/>
+        <w:ind w:hanging="360" w:left="2880" w:right="0"/>
+        <w:jc w:val="left"/>
+        <w:rPr>
+          <w:color w:val="000000"/>
+        </w:rPr>
+      </w:pPr>
+      <w:r>
+        <w:rPr>
+          <w:color w:val="000000"/>
+        </w:rPr>
+        <w:t>ID of the Round to be updated</w:t>
+      </w:r>
+    </w:p>
+    <w:p>
+      <w:pPr>
+        <w:pStyle w:val="normal1"/>
+        <w:numPr>
+          <w:ilvl w:val="1"/>
+          <w:numId w:val="1"/>
+        </w:numPr>
+        <w:ind w:hanging="360" w:left="1440"/>
+        <w:rPr>
+          <w:color w:val="000000"/>
+        </w:rPr>
+      </w:pPr>
+      <w:r>
+        <w:rPr/>
+        <w:t xml:space="preserve">returns: </w:t>
       </w:r>
     </w:p>
     <w:p>
@@ -39600,26 +40148,112 @@
         <w:spacing w:lineRule="auto" w:line="276" w:before="0" w:after="0"/>
         <w:ind w:hanging="360" w:left="2160" w:right="0"/>
         <w:jc w:val="left"/>
-        <w:rPr/>
-      </w:pPr>
-      <w:r>
-        <w:rPr/>
-        <w:t>only fields that you want to update (other than ID in the URI path) need to be provided</w:t>
-      </w:r>
-    </w:p>
-    <w:p>
-      <w:pPr>
-        <w:pStyle w:val="normal1"/>
-        <w:numPr>
-          <w:ilvl w:val="1"/>
-          <w:numId w:val="1"/>
-        </w:numPr>
-        <w:ind w:hanging="360" w:left="1440"/>
-        <w:rPr/>
-      </w:pPr>
-      <w:r>
-        <w:rPr/>
-        <w:t>parameters:</w:t>
+        <w:rPr>
+          <w:color w:val="000000"/>
+        </w:rPr>
+      </w:pPr>
+      <w:r>
+        <w:rPr>
+          <w:color w:val="000000"/>
+        </w:rPr>
+        <w:t>the updated Round</w:t>
+      </w:r>
+    </w:p>
+    <w:p>
+      <w:pPr>
+        <w:pStyle w:val="normal1"/>
+        <w:numPr>
+          <w:ilvl w:val="0"/>
+          <w:numId w:val="1"/>
+        </w:numPr>
+        <w:ind w:hanging="360" w:left="720"/>
+        <w:rPr/>
+      </w:pPr>
+      <w:r>
+        <w:rPr/>
+        <w:t xml:space="preserve">PUT/Update Question Types of a Division’s Rounds</w:t>
+      </w:r>
+    </w:p>
+    <w:p>
+      <w:pPr>
+        <w:pStyle w:val="normal1"/>
+        <w:numPr>
+          <w:ilvl w:val="1"/>
+          <w:numId w:val="1"/>
+        </w:numPr>
+        <w:ind w:hanging="360" w:left="1440"/>
+        <w:rPr/>
+      </w:pPr>
+      <w:r>
+        <w:rPr/>
+        <w:t xml:space="preserve">built_including_tests: </w:t>
+      </w:r>
+      <w:r>
+        <w:rPr>
+          <w:b/>
+          <w:bCs/>
+        </w:rPr>
+        <w:t>true</w:t>
+      </w:r>
+    </w:p>
+    <w:p>
+      <w:pPr>
+        <w:pStyle w:val="normal1"/>
+        <w:numPr>
+          <w:ilvl w:val="1"/>
+          <w:numId w:val="1"/>
+        </w:numPr>
+        <w:ind w:hanging="360" w:left="1440"/>
+        <w:rPr/>
+      </w:pPr>
+      <w:r>
+        <w:rPr/>
+        <w:t xml:space="preserve">HTTP method: ‘PUT’</w:t>
+      </w:r>
+    </w:p>
+    <w:p>
+      <w:pPr>
+        <w:pStyle w:val="normal1"/>
+        <w:numPr>
+          <w:ilvl w:val="1"/>
+          <w:numId w:val="1"/>
+        </w:numPr>
+        <w:ind w:hanging="360" w:left="1440"/>
+        <w:rPr/>
+      </w:pPr>
+      <w:r>
+        <w:rPr/>
+        <w:t xml:space="preserve">endpoint: {base_uri}/api/divisions/{id}/round-question-types</w:t>
+      </w:r>
+    </w:p>
+    <w:p>
+      <w:pPr>
+        <w:pStyle w:val="normal1"/>
+        <w:numPr>
+          <w:ilvl w:val="1"/>
+          <w:numId w:val="1"/>
+        </w:numPr>
+        <w:ind w:hanging="360" w:left="1440"/>
+        <w:rPr/>
+      </w:pPr>
+      <w:r>
+        <w:rPr/>
+        <w:t xml:space="preserve">description: saves question types for several of the Division’s Rounds in one transaction: if any Round’s question types are invalid, nothing is saved (422 with per-Round errors). Requires round:upload_question_types plus round:update as the Tournament’s owner or one of its admins.</w:t>
+      </w:r>
+    </w:p>
+    <w:p>
+      <w:pPr>
+        <w:pStyle w:val="normal1"/>
+        <w:numPr>
+          <w:ilvl w:val="1"/>
+          <w:numId w:val="1"/>
+        </w:numPr>
+        <w:ind w:hanging="360" w:left="1440"/>
+        <w:rPr/>
+      </w:pPr>
+      <w:r>
+        <w:rPr/>
+        <w:t xml:space="preserve">body: </w:t>
       </w:r>
     </w:p>
     <w:p>
@@ -39634,63 +40268,82 @@
       </w:pPr>
       <w:r>
         <w:rPr/>
-        <w:t>id</w:t>
-      </w:r>
-    </w:p>
-    <w:p>
-      <w:pPr>
-        <w:pStyle w:val="normal1"/>
-        <w:numPr>
-          <w:ilvl w:val="3"/>
-          <w:numId w:val="1"/>
-        </w:numPr>
-        <w:ind w:hanging="360" w:left="2880"/>
-        <w:rPr>
-          <w:color w:val="FF0000"/>
-        </w:rPr>
-      </w:pPr>
-      <w:r>
-        <w:rPr>
-          <w:color w:val="FF0000"/>
-        </w:rPr>
-        <w:t>Required</w:t>
-      </w:r>
-    </w:p>
-    <w:p>
-      <w:pPr>
-        <w:pStyle w:val="normal1"/>
-        <w:widowControl/>
-        <w:numPr>
-          <w:ilvl w:val="3"/>
-          <w:numId w:val="1"/>
-        </w:numPr>
-        <w:suppressAutoHyphens w:val="true"/>
-        <w:bidi w:val="0"/>
-        <w:spacing w:lineRule="auto" w:line="276" w:before="0" w:after="0"/>
-        <w:ind w:hanging="360" w:left="2880" w:right="0"/>
-        <w:jc w:val="left"/>
-        <w:rPr>
-          <w:color w:val="000000"/>
-        </w:rPr>
-      </w:pPr>
-      <w:r>
-        <w:rPr>
-          <w:color w:val="000000"/>
-        </w:rPr>
-        <w:t>ID of the Round to be updated</w:t>
-      </w:r>
-    </w:p>
-    <w:p>
-      <w:pPr>
-        <w:pStyle w:val="normal1"/>
-        <w:numPr>
-          <w:ilvl w:val="1"/>
-          <w:numId w:val="1"/>
-        </w:numPr>
-        <w:ind w:hanging="360" w:left="1440"/>
-        <w:rPr>
-          <w:color w:val="000000"/>
-        </w:rPr>
+        <w:t xml:space="preserve">an array of RoundQuestionTypesUpdate: roundid, question_types (20 type codes, or "" to clear), using_standard_question_types (defaults to true)</w:t>
+      </w:r>
+    </w:p>
+    <w:p>
+      <w:pPr>
+        <w:pStyle w:val="normal1"/>
+        <w:numPr>
+          <w:ilvl w:val="1"/>
+          <w:numId w:val="1"/>
+        </w:numPr>
+        <w:ind w:hanging="360" w:left="1440"/>
+        <w:rPr/>
+      </w:pPr>
+      <w:r>
+        <w:rPr/>
+        <w:t xml:space="preserve">parameters:</w:t>
+      </w:r>
+    </w:p>
+    <w:p>
+      <w:pPr>
+        <w:pStyle w:val="normal1"/>
+        <w:numPr>
+          <w:ilvl w:val="2"/>
+          <w:numId w:val="1"/>
+        </w:numPr>
+        <w:ind w:hanging="360" w:left="2160"/>
+        <w:rPr/>
+      </w:pPr>
+      <w:r>
+        <w:rPr/>
+        <w:t xml:space="preserve">id</w:t>
+      </w:r>
+    </w:p>
+    <w:p>
+      <w:pPr>
+        <w:pStyle w:val="normal1"/>
+        <w:numPr>
+          <w:ilvl w:val="3"/>
+          <w:numId w:val="1"/>
+        </w:numPr>
+        <w:ind w:hanging="360" w:left="2880"/>
+        <w:rPr>
+          <w:color w:val="FF0000"/>
+        </w:rPr>
+      </w:pPr>
+      <w:r>
+        <w:rPr>
+          <w:color w:val="FF0000"/>
+        </w:rPr>
+        <w:t xml:space="preserve">Required</w:t>
+      </w:r>
+    </w:p>
+    <w:p>
+      <w:pPr>
+        <w:pStyle w:val="normal1"/>
+        <w:numPr>
+          <w:ilvl w:val="3"/>
+          <w:numId w:val="1"/>
+        </w:numPr>
+        <w:ind w:hanging="360" w:left="2880"/>
+        <w:rPr/>
+      </w:pPr>
+      <w:r>
+        <w:rPr/>
+        <w:t xml:space="preserve">ID of the Division</w:t>
+      </w:r>
+    </w:p>
+    <w:p>
+      <w:pPr>
+        <w:pStyle w:val="normal1"/>
+        <w:numPr>
+          <w:ilvl w:val="1"/>
+          <w:numId w:val="1"/>
+        </w:numPr>
+        <w:ind w:hanging="360" w:left="1440"/>
+        <w:rPr/>
       </w:pPr>
       <w:r>
         <w:rPr/>
@@ -39700,25 +40353,16 @@
     <w:p>
       <w:pPr>
         <w:pStyle w:val="normal1"/>
-        <w:widowControl/>
         <w:numPr>
           <w:ilvl w:val="2"/>
           <w:numId w:val="1"/>
         </w:numPr>
-        <w:suppressAutoHyphens w:val="true"/>
-        <w:bidi w:val="0"/>
-        <w:spacing w:lineRule="auto" w:line="276" w:before="0" w:after="0"/>
-        <w:ind w:hanging="360" w:left="2160" w:right="0"/>
-        <w:jc w:val="left"/>
-        <w:rPr>
-          <w:color w:val="000000"/>
-        </w:rPr>
-      </w:pPr>
-      <w:r>
-        <w:rPr>
-          <w:color w:val="000000"/>
-        </w:rPr>
-        <w:t>the updated Round</w:t>
+        <w:ind w:hanging="360" w:left="2160"/>
+        <w:rPr/>
+      </w:pPr>
+      <w:r>
+        <w:rPr/>
+        <w:t xml:space="preserve">an array of the updated Rounds</w:t>
       </w:r>
     </w:p>
     <w:p>

</xml_diff>

<commit_message>
Added a tie-breaker rule to Team stats that is based on number of memory questions each team got right overall. Is greyed-out when data is insufficient and deselected by default. Also added the question type import button next to the tie-breaker rules button (3rd location). Also changed the question type dialog so that the import is in the dialog instead of the button triggering the import window and then the dialog (more intuitive for showing users that they can enter these manually and not just via import). Updated the API docs for these changes.
</commit_message>
<xml_diff>
--- a/docs/QView API Documentation.docx
+++ b/docs/QView API Documentation.docx
@@ -10,7 +10,7 @@
       </w:pPr>
       <w:r>
         <w:rPr/>
-        <w:t>QView API Documentation (v184_2026.10.27)</w:t>
+        <w:t>QView API Documentation (v185_2026.10.27)</w:t>
       </w:r>
     </w:p>
     <w:p>
@@ -41136,7 +41136,7 @@
       </w:pPr>
       <w:r>
         <w:rPr/>
-        <w:t>description: the tie-breaking criteria in the order they are applied; disabled ones keep their slot</w:t>
+        <w:t>description: the tie-breaking criteria (rule, enabled, available) in the order they are applied; disabled ones keep their slot. Rules: team_wl, memory_verse, head_to_head, total_points, avg_points, olympic, mod_olympic. memory_verse (correct tossups on R/Q/V questions; bonuses don’t count) is unchecked by default; unless every Round of every Division the StatsGroup covers has question types, it comes back with available: false and unchecked, and is skipped when ranking</w:t>
       </w:r>
     </w:p>
     <w:p>
@@ -41312,7 +41312,7 @@
       </w:pPr>
       <w:r>
         <w:rPr/>
-        <w:t>description: replaces the criteria; their order decides how team standings sort</w:t>
+        <w:t>description: replaces the criteria; their order decides how team standings sort. A criterion missing from the list is added with its default (memory_verse unchecked, right below team_wl); an unavailable criterion is saved unchecked whatever was sent; available in the body is ignored</w:t>
       </w:r>
     </w:p>
     <w:p>
@@ -45041,7 +45041,7 @@
       </w:pPr>
       <w:r>
         <w:rPr/>
-        <w:t xml:space="preserve">description: </w:t>
+        <w:t xml:space="preserve">description: each row also carries memory_verse_correct (correct tossups, not bonuses, on M questions, i.e. those of type R, Q or V, across finished Games; 0 when the memory_verse criterion is unavailable)</w:t>
       </w:r>
     </w:p>
     <w:p>

</xml_diff>

<commit_message>
Added stats for QO, EO, FO and Fouls stats to Team and Individual data tables. Also updated the API docs.
</commit_message>
<xml_diff>
--- a/docs/QView API Documentation.docx
+++ b/docs/QView API Documentation.docx
@@ -10,7 +10,7 @@
       </w:pPr>
       <w:r>
         <w:rPr/>
-        <w:t>QView API Documentation (v185_2026.10.27)</w:t>
+        <w:t>QView API Documentation (v186_2026.10.28)</w:t>
       </w:r>
     </w:p>
     <w:p>
@@ -18291,7 +18291,7 @@
       </w:pPr>
       <w:r>
         <w:rPr/>
-        <w:t xml:space="preserve">description: </w:t>
+        <w:t xml:space="preserve">description: finished Games only; each row also carries question_types (for each question type G, A, M, R, Q, V, X, I, S: attempted, correct, bonus_attempted, bonus_correct; M re-counts R, Q and V) and outs_and_fouls (quiz_outs_without_errors, quiz_outs_with_errors, error_outs, foul_outs, quizzer_fouls; team_fouls and coach_fouls are always 0)</w:t>
       </w:r>
     </w:p>
     <w:p>
@@ -18484,6 +18484,21 @@
       <w:r>
         <w:rPr/>
         <w:t>returns:</w:t>
+      </w:r>
+    </w:p>
+    <w:p>
+      <w:pPr>
+        <w:pStyle w:val="normal1"/>
+        <w:numPr>
+          <w:ilvl w:val="2"/>
+          <w:numId w:val="1"/>
+        </w:numPr>
+        <w:ind w:hanging="360" w:left="2160"/>
+        <w:rPr/>
+      </w:pPr>
+      <w:r>
+        <w:rPr/>
+        <w:t>an array of IndividualStats</w:t>
       </w:r>
     </w:p>
     <w:p>
@@ -45041,7 +45056,7 @@
       </w:pPr>
       <w:r>
         <w:rPr/>
-        <w:t xml:space="preserve">description: each row also carries memory_verse_correct (correct tossups, not bonuses, on M questions, i.e. those of type R, Q or V, across finished Games; 0 when the memory_verse criterion is unavailable)</w:t>
+        <w:t xml:space="preserve">description: each row also carries memory_verse_correct (correct tossups, not bonuses, on M questions, i.e. those of type R, Q or V, across finished Games; 0 when the memory_verse criterion is unavailable), question_types (for each question type G, A, M, R, Q, V, X, I, S: attempted, correct, bonus_attempted, bonus_correct; M re-counts R, Q and V), summed over the team’s Quizzers, and outs_and_fouls (quiz_outs_without_errors, quiz_outs_with_errors, error_outs, foul_outs and quizzer_fouls summed over the team’s Quizzers, plus the team’s own team_fouls and coach_fouls)</w:t>
       </w:r>
     </w:p>
     <w:p>
@@ -45239,6 +45254,21 @@
       <w:r>
         <w:rPr/>
         <w:t>returns:</w:t>
+      </w:r>
+    </w:p>
+    <w:p>
+      <w:pPr>
+        <w:pStyle w:val="normal1"/>
+        <w:numPr>
+          <w:ilvl w:val="2"/>
+          <w:numId w:val="1"/>
+        </w:numPr>
+        <w:ind w:hanging="360" w:left="2160"/>
+        <w:rPr/>
+      </w:pPr>
+      <w:r>
+        <w:rPr/>
+        <w:t>an array of TeamStats</w:t>
       </w:r>
     </w:p>
     <w:p>

</xml_diff>